<commit_message>
CHANGELOG: commit del documento v3
Co-Authored-By: Claude Opus 5.5 (1M context) <noreply@anthropic.com>
Claude-Session: https://claude.ai/code/session_01VkQm5RLcZiQMKLCS3EK3og
</commit_message>
<xml_diff>
--- a/docs/Historial_de_versiones.docx
+++ b/docs/Historial_de_versiones.docx
@@ -41,49 +41,43 @@
           <w:bCs/>
           <w:b/>
         </w:rPr>
-        <w:t xml:space="preserve">Documento de diseño:</w:t>
-      </w:r>
-      <w:r>
-        <w:t xml:space="preserve"> </w:t>
-      </w:r>
-      <w:r>
-        <w:rPr>
-          <w:rStyle w:val="VerbatimChar"/>
-        </w:rPr>
-        <w:t xml:space="preserve">vX.Y</w:t>
-      </w:r>
-      <w:r>
-        <w:t xml:space="preserve">. Sube</w:t>
-      </w:r>
-      <w:r>
-        <w:t xml:space="preserve"> </w:t>
-      </w:r>
-      <w:r>
-        <w:rPr>
-          <w:rStyle w:val="VerbatimChar"/>
-        </w:rPr>
-        <w:t xml:space="preserve">Y</w:t>
-      </w:r>
-      <w:r>
-        <w:t xml:space="preserve"> </w:t>
-      </w:r>
-      <w:r>
-        <w:t xml:space="preserve">con cada iteración; sube</w:t>
-      </w:r>
-      <w:r>
-        <w:t xml:space="preserve"> </w:t>
-      </w:r>
-      <w:r>
-        <w:rPr>
-          <w:rStyle w:val="VerbatimChar"/>
-        </w:rPr>
-        <w:t xml:space="preserve">X</w:t>
-      </w:r>
-      <w:r>
-        <w:t xml:space="preserve"> </w:t>
-      </w:r>
-      <w:r>
-        <w:t xml:space="preserve">con cada nuevo avance del proyecto.</w:t>
+        <w:t xml:space="preserve">Numeración:</w:t>
+      </w:r>
+      <w:r>
+        <w:t xml:space="preserve"> </w:t>
+      </w:r>
+      <w:r>
+        <w:rPr>
+          <w:rStyle w:val="VerbatimChar"/>
+        </w:rPr>
+        <w:t xml:space="preserve">v1</w:t>
+      </w:r>
+      <w:r>
+        <w:t xml:space="preserve">,</w:t>
+      </w:r>
+      <w:r>
+        <w:t xml:space="preserve"> </w:t>
+      </w:r>
+      <w:r>
+        <w:rPr>
+          <w:rStyle w:val="VerbatimChar"/>
+        </w:rPr>
+        <w:t xml:space="preserve">v2</w:t>
+      </w:r>
+      <w:r>
+        <w:t xml:space="preserve">,</w:t>
+      </w:r>
+      <w:r>
+        <w:t xml:space="preserve"> </w:t>
+      </w:r>
+      <w:r>
+        <w:rPr>
+          <w:rStyle w:val="VerbatimChar"/>
+        </w:rPr>
+        <w:t xml:space="preserve">v3</w:t>
+      </w:r>
+      <w:r>
+        <w:t xml:space="preserve">… Sube en uno con cada cambio, por separado para el documento y para el código.</w:t>
       </w:r>
     </w:p>
     <w:p>
@@ -99,64 +93,40 @@
           <w:bCs/>
           <w:b/>
         </w:rPr>
-        <w:t xml:space="preserve">Código:</w:t>
-      </w:r>
-      <w:r>
-        <w:t xml:space="preserve"> </w:t>
-      </w:r>
-      <w:r>
-        <w:rPr>
-          <w:rStyle w:val="VerbatimChar"/>
-        </w:rPr>
-        <w:t xml:space="preserve">vX.Y.Z</w:t>
-      </w:r>
-      <w:r>
-        <w:t xml:space="preserve">. Sube</w:t>
-      </w:r>
-      <w:r>
-        <w:t xml:space="preserve"> </w:t>
-      </w:r>
-      <w:r>
-        <w:rPr>
-          <w:rStyle w:val="VerbatimChar"/>
-        </w:rPr>
-        <w:t xml:space="preserve">Z</w:t>
-      </w:r>
-      <w:r>
-        <w:t xml:space="preserve"> </w:t>
-      </w:r>
-      <w:r>
-        <w:t xml:space="preserve">con correcciones,</w:t>
-      </w:r>
-      <w:r>
-        <w:t xml:space="preserve"> </w:t>
-      </w:r>
-      <w:r>
-        <w:rPr>
-          <w:rStyle w:val="VerbatimChar"/>
-        </w:rPr>
-        <w:t xml:space="preserve">Y</w:t>
-      </w:r>
-      <w:r>
-        <w:t xml:space="preserve"> </w:t>
-      </w:r>
-      <w:r>
-        <w:t xml:space="preserve">con funcionalidad nueva y</w:t>
-      </w:r>
-      <w:r>
-        <w:t xml:space="preserve"> </w:t>
-      </w:r>
-      <w:r>
-        <w:rPr>
-          <w:rStyle w:val="VerbatimChar"/>
-        </w:rPr>
-        <w:t xml:space="preserve">X</w:t>
-      </w:r>
-      <w:r>
-        <w:t xml:space="preserve"> </w:t>
-      </w:r>
-      <w:r>
-        <w:t xml:space="preserve">con cada entrega mayor.</w:t>
+        <w:t xml:space="preserve">Nombre de archivo:</w:t>
+      </w:r>
+      <w:r>
+        <w:t xml:space="preserve"> </w:t>
+      </w:r>
+      <w:r>
+        <w:t xml:space="preserve">la versión va en el nombre, por ejemplo</w:t>
+      </w:r>
+      <w:r>
+        <w:t xml:space="preserve"> </w:t>
+      </w:r>
+      <w:r>
+        <w:rPr>
+          <w:rStyle w:val="VerbatimChar"/>
+        </w:rPr>
+        <w:t xml:space="preserve">Avance1_Documento_Diseno_v3.docx</w:t>
+      </w:r>
+      <w:r>
+        <w:t xml:space="preserve"> </w:t>
+      </w:r>
+      <w:r>
+        <w:t xml:space="preserve">o</w:t>
+      </w:r>
+      <w:r>
+        <w:t xml:space="preserve"> </w:t>
+      </w:r>
+      <w:r>
+        <w:rPr>
+          <w:rStyle w:val="VerbatimChar"/>
+        </w:rPr>
+        <w:t xml:space="preserve">Fidecompro-codigo_v1.zip</w:t>
+      </w:r>
+      <w:r>
+        <w:t xml:space="preserve">.</w:t>
       </w:r>
     </w:p>
     <w:p>
@@ -192,22 +162,22 @@
         <w:t xml:space="preserve">Documento de diseño</w:t>
       </w:r>
     </w:p>
-    <w:bookmarkStart w:id="20" w:name="documento-v1.2-2026-10-08-commit-442187a"/>
+    <w:bookmarkStart w:id="20" w:name="documento-v3-2026-10-08-commit-bf66b07"/>
     <w:p>
       <w:pPr>
         <w:pStyle w:val="Heading3"/>
       </w:pPr>
       <w:r>
-        <w:t xml:space="preserve">Documento v1.2 · 2026-10-08 · commit</w:t>
-      </w:r>
-      <w:r>
-        <w:t xml:space="preserve"> </w:t>
-      </w:r>
-      <w:r>
-        <w:rPr>
-          <w:rStyle w:val="VerbatimChar"/>
-        </w:rPr>
-        <w:t xml:space="preserve">442187a</w:t>
+        <w:t xml:space="preserve">Documento v3 · 2026-10-08 · commit</w:t>
+      </w:r>
+      <w:r>
+        <w:t xml:space="preserve"> </w:t>
+      </w:r>
+      <w:r>
+        <w:rPr>
+          <w:rStyle w:val="VerbatimChar"/>
+        </w:rPr>
+        <w:t xml:space="preserve">bf66b07</w:t>
       </w:r>
     </w:p>
     <w:p>
@@ -222,14 +192,26 @@
         <w:t xml:space="preserve">Se agrega la tabla de control de versiones al inicio del documento y la versión en la portada.</w:t>
       </w:r>
     </w:p>
+    <w:p>
+      <w:pPr>
+        <w:numPr>
+          <w:ilvl w:val="0"/>
+          <w:numId w:val="1002"/>
+        </w:numPr>
+        <w:pStyle w:val="Compact"/>
+      </w:pPr>
+      <w:r>
+        <w:t xml:space="preserve">La versión va en el nombre del archivo y la numeración pasa a v1, v2, v3…</w:t>
+      </w:r>
+    </w:p>
     <w:bookmarkEnd w:id="20"/>
-    <w:bookmarkStart w:id="21" w:name="documento-v1.1-2026-10-08-commit-07de778"/>
+    <w:bookmarkStart w:id="21" w:name="documento-v2-2026-10-08-commit-07de778"/>
     <w:p>
       <w:pPr>
         <w:pStyle w:val="Heading3"/>
       </w:pPr>
       <w:r>
-        <w:t xml:space="preserve">Documento v1.1 · 2026-10-08 · commit</w:t>
+        <w:t xml:space="preserve">Documento v2 · 2026-10-08 · commit</w:t>
       </w:r>
       <w:r>
         <w:t xml:space="preserve"> </w:t>
@@ -560,13 +542,13 @@
       </w:r>
     </w:p>
     <w:bookmarkEnd w:id="21"/>
-    <w:bookmarkStart w:id="22" w:name="documento-v1.0-2026-10-06-commit-9be1af4"/>
+    <w:bookmarkStart w:id="22" w:name="documento-v1-2026-10-06-commit-9be1af4"/>
     <w:p>
       <w:pPr>
         <w:pStyle w:val="Heading3"/>
       </w:pPr>
       <w:r>
-        <w:t xml:space="preserve">Documento v1.0 · 2026-10-06 · commit</w:t>
+        <w:t xml:space="preserve">Documento v1 · 2026-10-06 · commit</w:t>
       </w:r>
       <w:r>
         <w:t xml:space="preserve"> </w:t>
@@ -601,13 +583,13 @@
         <w:t xml:space="preserve">Código</w:t>
       </w:r>
     </w:p>
-    <w:bookmarkStart w:id="24" w:name="código-v0.1.0-2026-10-08-commit-442187a"/>
+    <w:bookmarkStart w:id="24" w:name="código-v1-2026-10-08-commit-442187a"/>
     <w:p>
       <w:pPr>
         <w:pStyle w:val="Heading3"/>
       </w:pPr>
       <w:r>
-        <w:t xml:space="preserve">Código v0.1.0 · 2026-10-08 · commit</w:t>
+        <w:t xml:space="preserve">Código v1 · 2026-10-08 · commit</w:t>
       </w:r>
       <w:r>
         <w:t xml:space="preserve"> </w:t>
@@ -643,7 +625,7 @@
         <w:t xml:space="preserve"> </w:t>
       </w:r>
       <w:r>
-        <w:t xml:space="preserve">(Java 17) con las clases del modelo de dominio del documento v1.1.</w:t>
+        <w:t xml:space="preserve">(Java 17) con las clases del modelo de dominio del documento v2.</w:t>
       </w:r>
     </w:p>
     <w:p>

</xml_diff>

<commit_message>
CHANGELOG: commit del documento v4
Co-Authored-By: Claude Opus 5.5 (1M context) <noreply@anthropic.com>
Claude-Session: https://claude.ai/code/session_01VkQm5RLcZiQMKLCS3EK3og
</commit_message>
<xml_diff>
--- a/docs/Historial_de_versiones.docx
+++ b/docs/Historial_de_versiones.docx
@@ -2,7 +2,7 @@
 <file path=word/document.xml><?xml version="1.0" encoding="utf-8"?>
 <w:document xmlns:w="http://schemas.openxmlformats.org/wordprocessingml/2006/main" xmlns:m="http://schemas.openxmlformats.org/officeDocument/2006/math" xmlns:r="http://schemas.openxmlformats.org/officeDocument/2006/relationships" xmlns:o="urn:schemas-microsoft-com:office:office" xmlns:v="urn:schemas-microsoft-com:vml" xmlns:w10="urn:schemas-microsoft-com:office:word" xmlns:a="http://schemas.openxmlformats.org/drawingml/2006/main" xmlns:pic="http://schemas.openxmlformats.org/drawingml/2006/picture" xmlns:wp="http://schemas.openxmlformats.org/drawingml/2006/wordprocessingDrawing">
   <w:body>
-    <w:bookmarkStart w:id="26" w:name="historial-de-versiones"/>
+    <w:bookmarkStart w:id="27" w:name="historial-de-versiones"/>
     <w:p>
       <w:pPr>
         <w:pStyle w:val="Heading1"/>
@@ -153,7 +153,7 @@
         <w:t xml:space="preserve">.</w:t>
       </w:r>
     </w:p>
-    <w:bookmarkStart w:id="23" w:name="documento-de-diseño"/>
+    <w:bookmarkStart w:id="24" w:name="documento-de-diseño"/>
     <w:p>
       <w:pPr>
         <w:pStyle w:val="Heading2"/>
@@ -162,22 +162,22 @@
         <w:t xml:space="preserve">Documento de diseño</w:t>
       </w:r>
     </w:p>
-    <w:bookmarkStart w:id="20" w:name="documento-v3-2026-10-08-commit-bf66b07"/>
+    <w:bookmarkStart w:id="20" w:name="documento-v4-2026-10-08-commit-b3e7477"/>
     <w:p>
       <w:pPr>
         <w:pStyle w:val="Heading3"/>
       </w:pPr>
       <w:r>
-        <w:t xml:space="preserve">Documento v3 · 2026-10-08 · commit</w:t>
-      </w:r>
-      <w:r>
-        <w:t xml:space="preserve"> </w:t>
-      </w:r>
-      <w:r>
-        <w:rPr>
-          <w:rStyle w:val="VerbatimChar"/>
-        </w:rPr>
-        <w:t xml:space="preserve">bf66b07</w:t>
+        <w:t xml:space="preserve">Documento v4 · 2026-10-08 · commit</w:t>
+      </w:r>
+      <w:r>
+        <w:t xml:space="preserve"> </w:t>
+      </w:r>
+      <w:r>
+        <w:rPr>
+          <w:rStyle w:val="VerbatimChar"/>
+        </w:rPr>
+        <w:t xml:space="preserve">b3e7477</w:t>
       </w:r>
     </w:p>
     <w:p>
@@ -189,7 +189,7 @@
         <w:pStyle w:val="Compact"/>
       </w:pPr>
       <w:r>
-        <w:t xml:space="preserve">Se agrega la tabla de control de versiones al inicio del documento y la versión en la portada.</w:t>
+        <w:t xml:space="preserve">Las 15 historias de usuario pasan al formato de tabla pedido: ID, rol, característica, razón y escenarios de aceptación con número, título, contexto (Dado que), evento (Cuando) y resultado esperado. Son 57 escenarios en total.</w:t>
       </w:r>
     </w:p>
     <w:p>
@@ -201,26 +201,77 @@
         <w:pStyle w:val="Compact"/>
       </w:pPr>
       <w:r>
-        <w:t xml:space="preserve">La versión va en el nombre del archivo y la numeración pasa a v1, v2, v3…</w:t>
+        <w:t xml:space="preserve">La sección 3 va en páginas horizontales para que la tabla se lea bien.</w:t>
+      </w:r>
+    </w:p>
+    <w:p>
+      <w:pPr>
+        <w:numPr>
+          <w:ilvl w:val="0"/>
+          <w:numId w:val="1002"/>
+        </w:numPr>
+        <w:pStyle w:val="Compact"/>
+      </w:pPr>
+      <w:r>
+        <w:t xml:space="preserve">Los identificadores pasan de HU-01 a HU 1 en todo el documento.</w:t>
+      </w:r>
+    </w:p>
+    <w:p>
+      <w:pPr>
+        <w:numPr>
+          <w:ilvl w:val="0"/>
+          <w:numId w:val="1002"/>
+        </w:numPr>
+        <w:pStyle w:val="Compact"/>
+      </w:pPr>
+      <w:r>
+        <w:t xml:space="preserve">El documento se genera con</w:t>
+      </w:r>
+      <w:r>
+        <w:t xml:space="preserve"> </w:t>
+      </w:r>
+      <w:r>
+        <w:rPr>
+          <w:rStyle w:val="VerbatimChar"/>
+        </w:rPr>
+        <w:t xml:space="preserve">docs/construir_documento.py</w:t>
+      </w:r>
+      <w:r>
+        <w:t xml:space="preserve"> </w:t>
+      </w:r>
+      <w:r>
+        <w:t xml:space="preserve">y las historias se editan en</w:t>
+      </w:r>
+      <w:r>
+        <w:t xml:space="preserve"> </w:t>
+      </w:r>
+      <w:r>
+        <w:rPr>
+          <w:rStyle w:val="VerbatimChar"/>
+        </w:rPr>
+        <w:t xml:space="preserve">docs/historias_usuario.json</w:t>
+      </w:r>
+      <w:r>
+        <w:t xml:space="preserve">.</w:t>
       </w:r>
     </w:p>
     <w:bookmarkEnd w:id="20"/>
-    <w:bookmarkStart w:id="21" w:name="documento-v2-2026-10-08-commit-07de778"/>
+    <w:bookmarkStart w:id="21" w:name="documento-v3-2026-10-08-commit-bf66b07"/>
     <w:p>
       <w:pPr>
         <w:pStyle w:val="Heading3"/>
       </w:pPr>
       <w:r>
-        <w:t xml:space="preserve">Documento v2 · 2026-10-08 · commit</w:t>
-      </w:r>
-      <w:r>
-        <w:t xml:space="preserve"> </w:t>
-      </w:r>
-      <w:r>
-        <w:rPr>
-          <w:rStyle w:val="VerbatimChar"/>
-        </w:rPr>
-        <w:t xml:space="preserve">07de778</w:t>
+        <w:t xml:space="preserve">Documento v3 · 2026-10-08 · commit</w:t>
+      </w:r>
+      <w:r>
+        <w:t xml:space="preserve"> </w:t>
+      </w:r>
+      <w:r>
+        <w:rPr>
+          <w:rStyle w:val="VerbatimChar"/>
+        </w:rPr>
+        <w:t xml:space="preserve">bf66b07</w:t>
       </w:r>
     </w:p>
     <w:p>
@@ -232,208 +283,7 @@
         <w:pStyle w:val="Compact"/>
       </w:pPr>
       <w:r>
-        <w:t xml:space="preserve">Modelo de clases rehecho con el estilo de las semanas 1 a 5 del curso (práctica MultiSports):</w:t>
-      </w:r>
-      <w:r>
-        <w:t xml:space="preserve"> </w:t>
-      </w:r>
-      <w:r>
-        <w:rPr>
-          <w:rStyle w:val="VerbatimChar"/>
-        </w:rPr>
-        <w:t xml:space="preserve">Producto</w:t>
-      </w:r>
-      <w:r>
-        <w:t xml:space="preserve"> </w:t>
-      </w:r>
-      <w:r>
-        <w:t xml:space="preserve">abstracto con</w:t>
-      </w:r>
-      <w:r>
-        <w:t xml:space="preserve"> </w:t>
-      </w:r>
-      <w:r>
-        <w:rPr>
-          <w:rStyle w:val="VerbatimChar"/>
-        </w:rPr>
-        <w:t xml:space="preserve">Abarrote</w:t>
-      </w:r>
-      <w:r>
-        <w:t xml:space="preserve">,</w:t>
-      </w:r>
-      <w:r>
-        <w:t xml:space="preserve"> </w:t>
-      </w:r>
-      <w:r>
-        <w:rPr>
-          <w:rStyle w:val="VerbatimChar"/>
-        </w:rPr>
-        <w:t xml:space="preserve">Bebida</w:t>
-      </w:r>
-      <w:r>
-        <w:t xml:space="preserve"> </w:t>
-      </w:r>
-      <w:r>
-        <w:t xml:space="preserve">y</w:t>
-      </w:r>
-      <w:r>
-        <w:t xml:space="preserve"> </w:t>
-      </w:r>
-      <w:r>
-        <w:rPr>
-          <w:rStyle w:val="VerbatimChar"/>
-        </w:rPr>
-        <w:t xml:space="preserve">ArticuloHogar</w:t>
-      </w:r>
-      <w:r>
-        <w:t xml:space="preserve">;</w:t>
-      </w:r>
-      <w:r>
-        <w:t xml:space="preserve"> </w:t>
-      </w:r>
-      <w:r>
-        <w:rPr>
-          <w:rStyle w:val="VerbatimChar"/>
-        </w:rPr>
-        <w:t xml:space="preserve">Persona</w:t>
-      </w:r>
-      <w:r>
-        <w:t xml:space="preserve"> </w:t>
-      </w:r>
-      <w:r>
-        <w:t xml:space="preserve">abstracta con</w:t>
-      </w:r>
-      <w:r>
-        <w:t xml:space="preserve"> </w:t>
-      </w:r>
-      <w:r>
-        <w:rPr>
-          <w:rStyle w:val="VerbatimChar"/>
-        </w:rPr>
-        <w:t xml:space="preserve">Usuario</w:t>
-      </w:r>
-      <w:r>
-        <w:t xml:space="preserve"> </w:t>
-      </w:r>
-      <w:r>
-        <w:t xml:space="preserve">y</w:t>
-      </w:r>
-      <w:r>
-        <w:t xml:space="preserve"> </w:t>
-      </w:r>
-      <w:r>
-        <w:rPr>
-          <w:rStyle w:val="VerbatimChar"/>
-        </w:rPr>
-        <w:t xml:space="preserve">Cliente</w:t>
-      </w:r>
-      <w:r>
-        <w:t xml:space="preserve">; interface</w:t>
-      </w:r>
-      <w:r>
-        <w:t xml:space="preserve"> </w:t>
-      </w:r>
-      <w:r>
-        <w:rPr>
-          <w:rStyle w:val="VerbatimChar"/>
-        </w:rPr>
-        <w:t xml:space="preserve">Mostrable</w:t>
-      </w:r>
-      <w:r>
-        <w:t xml:space="preserve">; ids</w:t>
-      </w:r>
-      <w:r>
-        <w:t xml:space="preserve"> </w:t>
-      </w:r>
-      <w:r>
-        <w:rPr>
-          <w:rStyle w:val="VerbatimChar"/>
-        </w:rPr>
-        <w:t xml:space="preserve">static</w:t>
-      </w:r>
-      <w:r>
-        <w:t xml:space="preserve"> </w:t>
-      </w:r>
-      <w:r>
-        <w:t xml:space="preserve">autoincrementales;</w:t>
-      </w:r>
-      <w:r>
-        <w:t xml:space="preserve"> </w:t>
-      </w:r>
-      <w:r>
-        <w:rPr>
-          <w:rStyle w:val="VerbatimChar"/>
-        </w:rPr>
-        <w:t xml:space="preserve">Inventario</w:t>
-      </w:r>
-      <w:r>
-        <w:t xml:space="preserve"> </w:t>
-      </w:r>
-      <w:r>
-        <w:t xml:space="preserve">y</w:t>
-      </w:r>
-      <w:r>
-        <w:t xml:space="preserve"> </w:t>
-      </w:r>
-      <w:r>
-        <w:rPr>
-          <w:rStyle w:val="VerbatimChar"/>
-        </w:rPr>
-        <w:t xml:space="preserve">Categoria</w:t>
-      </w:r>
-      <w:r>
-        <w:t xml:space="preserve"> </w:t>
-      </w:r>
-      <w:r>
-        <w:t xml:space="preserve">con CRUD por id;</w:t>
-      </w:r>
-      <w:r>
-        <w:t xml:space="preserve"> </w:t>
-      </w:r>
-      <w:r>
-        <w:rPr>
-          <w:rStyle w:val="VerbatimChar"/>
-        </w:rPr>
-        <w:t xml:space="preserve">Registro…</w:t>
-      </w:r>
-      <w:r>
-        <w:t xml:space="preserve"> </w:t>
-      </w:r>
-      <w:r>
-        <w:t xml:space="preserve">con</w:t>
-      </w:r>
-      <w:r>
-        <w:t xml:space="preserve"> </w:t>
-      </w:r>
-      <w:r>
-        <w:rPr>
-          <w:rStyle w:val="VerbatimChar"/>
-        </w:rPr>
-        <w:t xml:space="preserve">ArrayList</w:t>
-      </w:r>
-      <w:r>
-        <w:t xml:space="preserve">;</w:t>
-      </w:r>
-      <w:r>
-        <w:t xml:space="preserve"> </w:t>
-      </w:r>
-      <w:r>
-        <w:rPr>
-          <w:rStyle w:val="VerbatimChar"/>
-        </w:rPr>
-        <w:t xml:space="preserve">Comparable</w:t>
-      </w:r>
-      <w:r>
-        <w:t xml:space="preserve">/</w:t>
-      </w:r>
-      <w:r>
-        <w:rPr>
-          <w:rStyle w:val="VerbatimChar"/>
-        </w:rPr>
-        <w:t xml:space="preserve">Comparator</w:t>
-      </w:r>
-      <w:r>
-        <w:t xml:space="preserve">; excepciones propias.</w:t>
+        <w:t xml:space="preserve">Se agrega la tabla de control de versiones al inicio del documento y la versión en la portada.</w:t>
       </w:r>
     </w:p>
     <w:p>
@@ -445,119 +295,26 @@
         <w:pStyle w:val="Compact"/>
       </w:pPr>
       <w:r>
-        <w:t xml:space="preserve">Tabla que relaciona cada tema de cada semana con las clases donde se aplica.</w:t>
-      </w:r>
-    </w:p>
-    <w:p>
-      <w:pPr>
-        <w:numPr>
-          <w:ilvl w:val="0"/>
-          <w:numId w:val="1003"/>
-        </w:numPr>
-        <w:pStyle w:val="Compact"/>
-      </w:pPr>
-      <w:r>
-        <w:t xml:space="preserve">El diagrama de dominio se divide en dos (inventario y facturación) para que se lea mejor.</w:t>
-      </w:r>
-    </w:p>
-    <w:p>
-      <w:pPr>
-        <w:numPr>
-          <w:ilvl w:val="0"/>
-          <w:numId w:val="1003"/>
-        </w:numPr>
-        <w:pStyle w:val="Compact"/>
-      </w:pPr>
-      <w:r>
-        <w:t xml:space="preserve">Hilos, sockets, Swing y base de datos pasan a</w:t>
-      </w:r>
-      <w:r>
-        <w:t xml:space="preserve"> </w:t>
-      </w:r>
-      <w:r>
-        <w:t xml:space="preserve">“</w:t>
-      </w:r>
-      <w:r>
-        <w:t xml:space="preserve">arquitectura prevista</w:t>
-      </w:r>
-      <w:r>
-        <w:t xml:space="preserve">”</w:t>
-      </w:r>
-      <w:r>
-        <w:t xml:space="preserve">, porque el curso aún no los cubre.</w:t>
-      </w:r>
-    </w:p>
-    <w:p>
-      <w:pPr>
-        <w:numPr>
-          <w:ilvl w:val="0"/>
-          <w:numId w:val="1003"/>
-        </w:numPr>
-        <w:pStyle w:val="Compact"/>
-      </w:pPr>
-      <w:r>
-        <w:t xml:space="preserve">Historias HU-07, HU-08, HU-09 y HU-15 y prototipo P4 ajustados al tipo de producto.</w:t>
-      </w:r>
-    </w:p>
-    <w:p>
-      <w:pPr>
-        <w:numPr>
-          <w:ilvl w:val="0"/>
-          <w:numId w:val="1003"/>
-        </w:numPr>
-        <w:pStyle w:val="Compact"/>
-      </w:pPr>
-      <w:r>
-        <w:t xml:space="preserve">Se elimina</w:t>
-      </w:r>
-      <w:r>
-        <w:t xml:space="preserve"> </w:t>
-      </w:r>
-      <w:r>
-        <w:rPr>
-          <w:rStyle w:val="VerbatimChar"/>
-        </w:rPr>
-        <w:t xml:space="preserve">MovimientoInventario</w:t>
-      </w:r>
-      <w:r>
-        <w:t xml:space="preserve"> </w:t>
-      </w:r>
-      <w:r>
-        <w:t xml:space="preserve">y</w:t>
-      </w:r>
-      <w:r>
-        <w:t xml:space="preserve"> </w:t>
-      </w:r>
-      <w:r>
-        <w:rPr>
-          <w:rStyle w:val="VerbatimChar"/>
-        </w:rPr>
-        <w:t xml:space="preserve">CategoriaProducto</w:t>
-      </w:r>
-      <w:r>
-        <w:t xml:space="preserve"> </w:t>
-      </w:r>
-      <w:r>
-        <w:t xml:space="preserve">(el impuesto lo define cada tipo de producto).</w:t>
+        <w:t xml:space="preserve">La versión va en el nombre del archivo y la numeración pasa a v1, v2, v3…</w:t>
       </w:r>
     </w:p>
     <w:bookmarkEnd w:id="21"/>
-    <w:bookmarkStart w:id="22" w:name="documento-v1-2026-10-06-commit-9be1af4"/>
+    <w:bookmarkStart w:id="22" w:name="documento-v2-2026-10-08-commit-07de778"/>
     <w:p>
       <w:pPr>
         <w:pStyle w:val="Heading3"/>
       </w:pPr>
       <w:r>
-        <w:t xml:space="preserve">Documento v1 · 2026-10-06 · commit</w:t>
-      </w:r>
-      <w:r>
-        <w:t xml:space="preserve"> </w:t>
-      </w:r>
-      <w:r>
-        <w:rPr>
-          <w:rStyle w:val="VerbatimChar"/>
-        </w:rPr>
-        <w:t xml:space="preserve">9be1af4</w:t>
+        <w:t xml:space="preserve">Documento v2 · 2026-10-08 · commit</w:t>
+      </w:r>
+      <w:r>
+        <w:t xml:space="preserve"> </w:t>
+      </w:r>
+      <w:r>
+        <w:rPr>
+          <w:rStyle w:val="VerbatimChar"/>
+        </w:rPr>
+        <w:t xml:space="preserve">07de778</w:t>
       </w:r>
     </w:p>
     <w:p>
@@ -569,36 +326,332 @@
         <w:pStyle w:val="Compact"/>
       </w:pPr>
       <w:r>
-        <w:t xml:space="preserve">Primera versión del documento de diseño del Avance 1 (Proyecto 1, Fidecompro): clases con atributos, métodos y relaciones; 15 historias de usuario; 8 prototipos de pantalla; diagramas de arquitectura, secuencia y navegación.</w:t>
+        <w:t xml:space="preserve">Modelo de clases rehecho con el estilo de las semanas 1 a 5 del curso (práctica MultiSports):</w:t>
+      </w:r>
+      <w:r>
+        <w:t xml:space="preserve"> </w:t>
+      </w:r>
+      <w:r>
+        <w:rPr>
+          <w:rStyle w:val="VerbatimChar"/>
+        </w:rPr>
+        <w:t xml:space="preserve">Producto</w:t>
+      </w:r>
+      <w:r>
+        <w:t xml:space="preserve"> </w:t>
+      </w:r>
+      <w:r>
+        <w:t xml:space="preserve">abstracto con</w:t>
+      </w:r>
+      <w:r>
+        <w:t xml:space="preserve"> </w:t>
+      </w:r>
+      <w:r>
+        <w:rPr>
+          <w:rStyle w:val="VerbatimChar"/>
+        </w:rPr>
+        <w:t xml:space="preserve">Abarrote</w:t>
+      </w:r>
+      <w:r>
+        <w:t xml:space="preserve">,</w:t>
+      </w:r>
+      <w:r>
+        <w:t xml:space="preserve"> </w:t>
+      </w:r>
+      <w:r>
+        <w:rPr>
+          <w:rStyle w:val="VerbatimChar"/>
+        </w:rPr>
+        <w:t xml:space="preserve">Bebida</w:t>
+      </w:r>
+      <w:r>
+        <w:t xml:space="preserve"> </w:t>
+      </w:r>
+      <w:r>
+        <w:t xml:space="preserve">y</w:t>
+      </w:r>
+      <w:r>
+        <w:t xml:space="preserve"> </w:t>
+      </w:r>
+      <w:r>
+        <w:rPr>
+          <w:rStyle w:val="VerbatimChar"/>
+        </w:rPr>
+        <w:t xml:space="preserve">ArticuloHogar</w:t>
+      </w:r>
+      <w:r>
+        <w:t xml:space="preserve">;</w:t>
+      </w:r>
+      <w:r>
+        <w:t xml:space="preserve"> </w:t>
+      </w:r>
+      <w:r>
+        <w:rPr>
+          <w:rStyle w:val="VerbatimChar"/>
+        </w:rPr>
+        <w:t xml:space="preserve">Persona</w:t>
+      </w:r>
+      <w:r>
+        <w:t xml:space="preserve"> </w:t>
+      </w:r>
+      <w:r>
+        <w:t xml:space="preserve">abstracta con</w:t>
+      </w:r>
+      <w:r>
+        <w:t xml:space="preserve"> </w:t>
+      </w:r>
+      <w:r>
+        <w:rPr>
+          <w:rStyle w:val="VerbatimChar"/>
+        </w:rPr>
+        <w:t xml:space="preserve">Usuario</w:t>
+      </w:r>
+      <w:r>
+        <w:t xml:space="preserve"> </w:t>
+      </w:r>
+      <w:r>
+        <w:t xml:space="preserve">y</w:t>
+      </w:r>
+      <w:r>
+        <w:t xml:space="preserve"> </w:t>
+      </w:r>
+      <w:r>
+        <w:rPr>
+          <w:rStyle w:val="VerbatimChar"/>
+        </w:rPr>
+        <w:t xml:space="preserve">Cliente</w:t>
+      </w:r>
+      <w:r>
+        <w:t xml:space="preserve">; interface</w:t>
+      </w:r>
+      <w:r>
+        <w:t xml:space="preserve"> </w:t>
+      </w:r>
+      <w:r>
+        <w:rPr>
+          <w:rStyle w:val="VerbatimChar"/>
+        </w:rPr>
+        <w:t xml:space="preserve">Mostrable</w:t>
+      </w:r>
+      <w:r>
+        <w:t xml:space="preserve">; ids</w:t>
+      </w:r>
+      <w:r>
+        <w:t xml:space="preserve"> </w:t>
+      </w:r>
+      <w:r>
+        <w:rPr>
+          <w:rStyle w:val="VerbatimChar"/>
+        </w:rPr>
+        <w:t xml:space="preserve">static</w:t>
+      </w:r>
+      <w:r>
+        <w:t xml:space="preserve"> </w:t>
+      </w:r>
+      <w:r>
+        <w:t xml:space="preserve">autoincrementales;</w:t>
+      </w:r>
+      <w:r>
+        <w:t xml:space="preserve"> </w:t>
+      </w:r>
+      <w:r>
+        <w:rPr>
+          <w:rStyle w:val="VerbatimChar"/>
+        </w:rPr>
+        <w:t xml:space="preserve">Inventario</w:t>
+      </w:r>
+      <w:r>
+        <w:t xml:space="preserve"> </w:t>
+      </w:r>
+      <w:r>
+        <w:t xml:space="preserve">y</w:t>
+      </w:r>
+      <w:r>
+        <w:t xml:space="preserve"> </w:t>
+      </w:r>
+      <w:r>
+        <w:rPr>
+          <w:rStyle w:val="VerbatimChar"/>
+        </w:rPr>
+        <w:t xml:space="preserve">Categoria</w:t>
+      </w:r>
+      <w:r>
+        <w:t xml:space="preserve"> </w:t>
+      </w:r>
+      <w:r>
+        <w:t xml:space="preserve">con CRUD por id;</w:t>
+      </w:r>
+      <w:r>
+        <w:t xml:space="preserve"> </w:t>
+      </w:r>
+      <w:r>
+        <w:rPr>
+          <w:rStyle w:val="VerbatimChar"/>
+        </w:rPr>
+        <w:t xml:space="preserve">Registro…</w:t>
+      </w:r>
+      <w:r>
+        <w:t xml:space="preserve"> </w:t>
+      </w:r>
+      <w:r>
+        <w:t xml:space="preserve">con</w:t>
+      </w:r>
+      <w:r>
+        <w:t xml:space="preserve"> </w:t>
+      </w:r>
+      <w:r>
+        <w:rPr>
+          <w:rStyle w:val="VerbatimChar"/>
+        </w:rPr>
+        <w:t xml:space="preserve">ArrayList</w:t>
+      </w:r>
+      <w:r>
+        <w:t xml:space="preserve">;</w:t>
+      </w:r>
+      <w:r>
+        <w:t xml:space="preserve"> </w:t>
+      </w:r>
+      <w:r>
+        <w:rPr>
+          <w:rStyle w:val="VerbatimChar"/>
+        </w:rPr>
+        <w:t xml:space="preserve">Comparable</w:t>
+      </w:r>
+      <w:r>
+        <w:t xml:space="preserve">/</w:t>
+      </w:r>
+      <w:r>
+        <w:rPr>
+          <w:rStyle w:val="VerbatimChar"/>
+        </w:rPr>
+        <w:t xml:space="preserve">Comparator</w:t>
+      </w:r>
+      <w:r>
+        <w:t xml:space="preserve">; excepciones propias.</w:t>
+      </w:r>
+    </w:p>
+    <w:p>
+      <w:pPr>
+        <w:numPr>
+          <w:ilvl w:val="0"/>
+          <w:numId w:val="1004"/>
+        </w:numPr>
+        <w:pStyle w:val="Compact"/>
+      </w:pPr>
+      <w:r>
+        <w:t xml:space="preserve">Tabla que relaciona cada tema de cada semana con las clases donde se aplica.</w:t>
+      </w:r>
+    </w:p>
+    <w:p>
+      <w:pPr>
+        <w:numPr>
+          <w:ilvl w:val="0"/>
+          <w:numId w:val="1004"/>
+        </w:numPr>
+        <w:pStyle w:val="Compact"/>
+      </w:pPr>
+      <w:r>
+        <w:t xml:space="preserve">El diagrama de dominio se divide en dos (inventario y facturación) para que se lea mejor.</w:t>
+      </w:r>
+    </w:p>
+    <w:p>
+      <w:pPr>
+        <w:numPr>
+          <w:ilvl w:val="0"/>
+          <w:numId w:val="1004"/>
+        </w:numPr>
+        <w:pStyle w:val="Compact"/>
+      </w:pPr>
+      <w:r>
+        <w:t xml:space="preserve">Hilos, sockets, Swing y base de datos pasan a</w:t>
+      </w:r>
+      <w:r>
+        <w:t xml:space="preserve"> </w:t>
+      </w:r>
+      <w:r>
+        <w:t xml:space="preserve">“</w:t>
+      </w:r>
+      <w:r>
+        <w:t xml:space="preserve">arquitectura prevista</w:t>
+      </w:r>
+      <w:r>
+        <w:t xml:space="preserve">”</w:t>
+      </w:r>
+      <w:r>
+        <w:t xml:space="preserve">, porque el curso aún no los cubre.</w:t>
+      </w:r>
+    </w:p>
+    <w:p>
+      <w:pPr>
+        <w:numPr>
+          <w:ilvl w:val="0"/>
+          <w:numId w:val="1004"/>
+        </w:numPr>
+        <w:pStyle w:val="Compact"/>
+      </w:pPr>
+      <w:r>
+        <w:t xml:space="preserve">Historias HU-07, HU-08, HU-09 y HU-15 y prototipo P4 ajustados al tipo de producto.</w:t>
+      </w:r>
+    </w:p>
+    <w:p>
+      <w:pPr>
+        <w:numPr>
+          <w:ilvl w:val="0"/>
+          <w:numId w:val="1004"/>
+        </w:numPr>
+        <w:pStyle w:val="Compact"/>
+      </w:pPr>
+      <w:r>
+        <w:t xml:space="preserve">Se elimina</w:t>
+      </w:r>
+      <w:r>
+        <w:t xml:space="preserve"> </w:t>
+      </w:r>
+      <w:r>
+        <w:rPr>
+          <w:rStyle w:val="VerbatimChar"/>
+        </w:rPr>
+        <w:t xml:space="preserve">MovimientoInventario</w:t>
+      </w:r>
+      <w:r>
+        <w:t xml:space="preserve"> </w:t>
+      </w:r>
+      <w:r>
+        <w:t xml:space="preserve">y</w:t>
+      </w:r>
+      <w:r>
+        <w:t xml:space="preserve"> </w:t>
+      </w:r>
+      <w:r>
+        <w:rPr>
+          <w:rStyle w:val="VerbatimChar"/>
+        </w:rPr>
+        <w:t xml:space="preserve">CategoriaProducto</w:t>
+      </w:r>
+      <w:r>
+        <w:t xml:space="preserve"> </w:t>
+      </w:r>
+      <w:r>
+        <w:t xml:space="preserve">(el impuesto lo define cada tipo de producto).</w:t>
       </w:r>
     </w:p>
     <w:bookmarkEnd w:id="22"/>
-    <w:bookmarkEnd w:id="23"/>
-    <w:bookmarkStart w:id="25" w:name="código"/>
-    <w:p>
-      <w:pPr>
-        <w:pStyle w:val="Heading2"/>
-      </w:pPr>
-      <w:r>
-        <w:t xml:space="preserve">Código</w:t>
-      </w:r>
-    </w:p>
-    <w:bookmarkStart w:id="24" w:name="código-v1-2026-10-08-commit-442187a"/>
+    <w:bookmarkStart w:id="23" w:name="documento-v1-2026-10-06-commit-9be1af4"/>
     <w:p>
       <w:pPr>
         <w:pStyle w:val="Heading3"/>
       </w:pPr>
       <w:r>
-        <w:t xml:space="preserve">Código v1 · 2026-10-08 · commit</w:t>
-      </w:r>
-      <w:r>
-        <w:t xml:space="preserve"> </w:t>
-      </w:r>
-      <w:r>
-        <w:rPr>
-          <w:rStyle w:val="VerbatimChar"/>
-        </w:rPr>
-        <w:t xml:space="preserve">442187a</w:t>
+        <w:t xml:space="preserve">Documento v1 · 2026-10-06 · commit</w:t>
+      </w:r>
+      <w:r>
+        <w:t xml:space="preserve"> </w:t>
+      </w:r>
+      <w:r>
+        <w:rPr>
+          <w:rStyle w:val="VerbatimChar"/>
+        </w:rPr>
+        <w:t xml:space="preserve">9be1af4</w:t>
       </w:r>
     </w:p>
     <w:p>
@@ -610,60 +663,101 @@
         <w:pStyle w:val="Compact"/>
       </w:pPr>
       <w:r>
-        <w:t xml:space="preserve">Proyecto Maven</w:t>
-      </w:r>
-      <w:r>
-        <w:t xml:space="preserve"> </w:t>
-      </w:r>
-      <w:r>
-        <w:rPr>
-          <w:rStyle w:val="VerbatimChar"/>
-        </w:rPr>
-        <w:t xml:space="preserve">Fidecompro</w:t>
-      </w:r>
-      <w:r>
-        <w:t xml:space="preserve"> </w:t>
-      </w:r>
-      <w:r>
-        <w:t xml:space="preserve">(Java 17) con las clases del modelo de dominio del documento v2.</w:t>
+        <w:t xml:space="preserve">Primera versión del documento de diseño del Avance 1 (Proyecto 1, Fidecompro): clases con atributos, métodos y relaciones; 15 historias de usuario; 8 prototipos de pantalla; diagramas de arquitectura, secuencia y navegación.</w:t>
+      </w:r>
+    </w:p>
+    <w:bookmarkEnd w:id="23"/>
+    <w:bookmarkEnd w:id="24"/>
+    <w:bookmarkStart w:id="26" w:name="código"/>
+    <w:p>
+      <w:pPr>
+        <w:pStyle w:val="Heading2"/>
+      </w:pPr>
+      <w:r>
+        <w:t xml:space="preserve">Código</w:t>
+      </w:r>
+    </w:p>
+    <w:bookmarkStart w:id="25" w:name="código-v1-2026-10-08-commit-442187a"/>
+    <w:p>
+      <w:pPr>
+        <w:pStyle w:val="Heading3"/>
+      </w:pPr>
+      <w:r>
+        <w:t xml:space="preserve">Código v1 · 2026-10-08 · commit</w:t>
+      </w:r>
+      <w:r>
+        <w:t xml:space="preserve"> </w:t>
+      </w:r>
+      <w:r>
+        <w:rPr>
+          <w:rStyle w:val="VerbatimChar"/>
+        </w:rPr>
+        <w:t xml:space="preserve">442187a</w:t>
       </w:r>
     </w:p>
     <w:p>
       <w:pPr>
         <w:numPr>
           <w:ilvl w:val="0"/>
-          <w:numId w:val="1005"/>
+          <w:numId w:val="1006"/>
         </w:numPr>
         <w:pStyle w:val="Compact"/>
       </w:pPr>
       <w:r>
-        <w:rPr>
-          <w:rStyle w:val="VerbatimChar"/>
-        </w:rPr>
-        <w:t xml:space="preserve">main</w:t>
-      </w:r>
-      <w:r>
-        <w:t xml:space="preserve"> </w:t>
-      </w:r>
-      <w:r>
-        <w:t xml:space="preserve">de consola que recorre las historias de usuario principales, incluida la venta simultánea desde dos cajas con hilos.</w:t>
+        <w:t xml:space="preserve">Proyecto Maven</w:t>
+      </w:r>
+      <w:r>
+        <w:t xml:space="preserve"> </w:t>
+      </w:r>
+      <w:r>
+        <w:rPr>
+          <w:rStyle w:val="VerbatimChar"/>
+        </w:rPr>
+        <w:t xml:space="preserve">Fidecompro</w:t>
+      </w:r>
+      <w:r>
+        <w:t xml:space="preserve"> </w:t>
+      </w:r>
+      <w:r>
+        <w:t xml:space="preserve">(Java 17) con las clases del modelo de dominio del documento v2.</w:t>
       </w:r>
     </w:p>
     <w:p>
       <w:pPr>
         <w:numPr>
           <w:ilvl w:val="0"/>
-          <w:numId w:val="1005"/>
+          <w:numId w:val="1006"/>
         </w:numPr>
         <w:pStyle w:val="Compact"/>
       </w:pPr>
       <w:r>
+        <w:rPr>
+          <w:rStyle w:val="VerbatimChar"/>
+        </w:rPr>
+        <w:t xml:space="preserve">main</w:t>
+      </w:r>
+      <w:r>
+        <w:t xml:space="preserve"> </w:t>
+      </w:r>
+      <w:r>
+        <w:t xml:space="preserve">de consola que recorre las historias de usuario principales, incluida la venta simultánea desde dos cajas con hilos.</w:t>
+      </w:r>
+    </w:p>
+    <w:p>
+      <w:pPr>
+        <w:numPr>
+          <w:ilvl w:val="0"/>
+          <w:numId w:val="1006"/>
+        </w:numPr>
+        <w:pStyle w:val="Compact"/>
+      </w:pPr>
+      <w:r>
         <w:t xml:space="preserve">Código de referencia para entender el diseño; no es un entregable.</w:t>
       </w:r>
     </w:p>
-    <w:bookmarkEnd w:id="24"/>
     <w:bookmarkEnd w:id="25"/>
     <w:bookmarkEnd w:id="26"/>
+    <w:bookmarkEnd w:id="27"/>
     <w:sectPr>
       <w:pgSz w:w="12240" w:h="15840"/>
       <w:pgMar w:left="1134" w:right="1134"/>
@@ -865,6 +959,9 @@
     <w:abstractNumId w:val="991"/>
   </w:num>
   <w:num w:numId="1005">
+    <w:abstractNumId w:val="991"/>
+  </w:num>
+  <w:num w:numId="1006">
     <w:abstractNumId w:val="991"/>
   </w:num>
 </w:numbering>

</xml_diff>

<commit_message>
CHANGELOG y README: documento v5
Co-Authored-By: Claude Opus 5.5 (1M context) <noreply@anthropic.com>
Claude-Session: https://claude.ai/code/session_01VkQm5RLcZiQMKLCS3EK3og
</commit_message>
<xml_diff>
--- a/docs/Historial_de_versiones.docx
+++ b/docs/Historial_de_versiones.docx
@@ -2,7 +2,7 @@
 <file path=word/document.xml><?xml version="1.0" encoding="utf-8"?>
 <w:document xmlns:w="http://schemas.openxmlformats.org/wordprocessingml/2006/main" xmlns:m="http://schemas.openxmlformats.org/officeDocument/2006/math" xmlns:r="http://schemas.openxmlformats.org/officeDocument/2006/relationships" xmlns:o="urn:schemas-microsoft-com:office:office" xmlns:v="urn:schemas-microsoft-com:vml" xmlns:w10="urn:schemas-microsoft-com:office:word" xmlns:a="http://schemas.openxmlformats.org/drawingml/2006/main" xmlns:pic="http://schemas.openxmlformats.org/drawingml/2006/picture" xmlns:wp="http://schemas.openxmlformats.org/drawingml/2006/wordprocessingDrawing">
   <w:body>
-    <w:bookmarkStart w:id="27" w:name="historial-de-versiones"/>
+    <w:bookmarkStart w:id="28" w:name="historial-de-versiones"/>
     <w:p>
       <w:pPr>
         <w:pStyle w:val="Heading1"/>
@@ -153,7 +153,7 @@
         <w:t xml:space="preserve">.</w:t>
       </w:r>
     </w:p>
-    <w:bookmarkStart w:id="24" w:name="documento-de-diseño"/>
+    <w:bookmarkStart w:id="25" w:name="documento-de-diseño"/>
     <w:p>
       <w:pPr>
         <w:pStyle w:val="Heading2"/>
@@ -162,12 +162,123 @@
         <w:t xml:space="preserve">Documento de diseño</w:t>
       </w:r>
     </w:p>
-    <w:bookmarkStart w:id="20" w:name="documento-v4-2026-10-08-commit-b3e7477"/>
+    <w:bookmarkStart w:id="20" w:name="documento-v5-2026-10-08-commit-9a7a9a7"/>
     <w:p>
       <w:pPr>
         <w:pStyle w:val="Heading3"/>
       </w:pPr>
       <w:r>
+        <w:t xml:space="preserve">Documento v5 · 2026-10-08 · commit</w:t>
+      </w:r>
+      <w:r>
+        <w:t xml:space="preserve"> </w:t>
+      </w:r>
+      <w:r>
+        <w:rPr>
+          <w:rStyle w:val="VerbatimChar"/>
+        </w:rPr>
+        <w:t xml:space="preserve">9a7a9a7</w:t>
+      </w:r>
+    </w:p>
+    <w:p>
+      <w:pPr>
+        <w:numPr>
+          <w:ilvl w:val="0"/>
+          <w:numId w:val="1002"/>
+        </w:numPr>
+        <w:pStyle w:val="Compact"/>
+      </w:pPr>
+      <w:r>
+        <w:t xml:space="preserve">Se agregan dos capítulos nuevos con el formato pedido (tabla con #, Requerimiento, Descripción y Prioridad):</w:t>
+      </w:r>
+      <w:r>
+        <w:t xml:space="preserve"> </w:t>
+      </w:r>
+      <w:r>
+        <w:rPr>
+          <w:bCs/>
+          <w:b/>
+        </w:rPr>
+        <w:t xml:space="preserve">Lista de requerimientos funcionales</w:t>
+      </w:r>
+      <w:r>
+        <w:t xml:space="preserve"> </w:t>
+      </w:r>
+      <w:r>
+        <w:t xml:space="preserve">(10) y</w:t>
+      </w:r>
+      <w:r>
+        <w:t xml:space="preserve"> </w:t>
+      </w:r>
+      <w:r>
+        <w:rPr>
+          <w:bCs/>
+          <w:b/>
+        </w:rPr>
+        <w:t xml:space="preserve">Lista de requerimientos no funcionales</w:t>
+      </w:r>
+      <w:r>
+        <w:t xml:space="preserve"> </w:t>
+      </w:r>
+      <w:r>
+        <w:t xml:space="preserve">(8).</w:t>
+      </w:r>
+    </w:p>
+    <w:p>
+      <w:pPr>
+        <w:numPr>
+          <w:ilvl w:val="0"/>
+          <w:numId w:val="1002"/>
+        </w:numPr>
+        <w:pStyle w:val="Compact"/>
+      </w:pPr>
+      <w:r>
+        <w:t xml:space="preserve">Cada requerimiento funcional indica qué historias de usuario lo cubren.</w:t>
+      </w:r>
+    </w:p>
+    <w:p>
+      <w:pPr>
+        <w:numPr>
+          <w:ilvl w:val="0"/>
+          <w:numId w:val="1002"/>
+        </w:numPr>
+        <w:pStyle w:val="Compact"/>
+      </w:pPr>
+      <w:r>
+        <w:t xml:space="preserve">Las secciones siguientes se renumeran: Entidades y clases pasa a 4, Historias de usuario a 5, Prototipos a 6 y Trazabilidad a 7.</w:t>
+      </w:r>
+    </w:p>
+    <w:p>
+      <w:pPr>
+        <w:numPr>
+          <w:ilvl w:val="0"/>
+          <w:numId w:val="1002"/>
+        </w:numPr>
+        <w:pStyle w:val="Compact"/>
+      </w:pPr>
+      <w:r>
+        <w:t xml:space="preserve">Los requerimientos se editan en</w:t>
+      </w:r>
+      <w:r>
+        <w:t xml:space="preserve"> </w:t>
+      </w:r>
+      <w:r>
+        <w:rPr>
+          <w:rStyle w:val="VerbatimChar"/>
+        </w:rPr>
+        <w:t xml:space="preserve">docs/requerimientos.json</w:t>
+      </w:r>
+      <w:r>
+        <w:t xml:space="preserve">.</w:t>
+      </w:r>
+    </w:p>
+    <w:bookmarkEnd w:id="20"/>
+    <w:bookmarkStart w:id="21" w:name="documento-v4-2026-10-08-commit-b3e7477"/>
+    <w:p>
+      <w:pPr>
+        <w:pStyle w:val="Heading3"/>
+      </w:pPr>
+      <w:r>
         <w:t xml:space="preserve">Documento v4 · 2026-10-08 · commit</w:t>
       </w:r>
       <w:r>
@@ -184,7 +295,7 @@
       <w:pPr>
         <w:numPr>
           <w:ilvl w:val="0"/>
-          <w:numId w:val="1002"/>
+          <w:numId w:val="1003"/>
         </w:numPr>
         <w:pStyle w:val="Compact"/>
       </w:pPr>
@@ -196,7 +307,7 @@
       <w:pPr>
         <w:numPr>
           <w:ilvl w:val="0"/>
-          <w:numId w:val="1002"/>
+          <w:numId w:val="1003"/>
         </w:numPr>
         <w:pStyle w:val="Compact"/>
       </w:pPr>
@@ -208,7 +319,7 @@
       <w:pPr>
         <w:numPr>
           <w:ilvl w:val="0"/>
-          <w:numId w:val="1002"/>
+          <w:numId w:val="1003"/>
         </w:numPr>
         <w:pStyle w:val="Compact"/>
       </w:pPr>
@@ -220,7 +331,7 @@
       <w:pPr>
         <w:numPr>
           <w:ilvl w:val="0"/>
-          <w:numId w:val="1002"/>
+          <w:numId w:val="1003"/>
         </w:numPr>
         <w:pStyle w:val="Compact"/>
       </w:pPr>
@@ -255,8 +366,8 @@
         <w:t xml:space="preserve">.</w:t>
       </w:r>
     </w:p>
-    <w:bookmarkEnd w:id="20"/>
-    <w:bookmarkStart w:id="21" w:name="documento-v3-2026-10-08-commit-bf66b07"/>
+    <w:bookmarkEnd w:id="21"/>
+    <w:bookmarkStart w:id="22" w:name="documento-v3-2026-10-08-commit-bf66b07"/>
     <w:p>
       <w:pPr>
         <w:pStyle w:val="Heading3"/>
@@ -278,7 +389,7 @@
       <w:pPr>
         <w:numPr>
           <w:ilvl w:val="0"/>
-          <w:numId w:val="1003"/>
+          <w:numId w:val="1004"/>
         </w:numPr>
         <w:pStyle w:val="Compact"/>
       </w:pPr>
@@ -290,7 +401,7 @@
       <w:pPr>
         <w:numPr>
           <w:ilvl w:val="0"/>
-          <w:numId w:val="1003"/>
+          <w:numId w:val="1004"/>
         </w:numPr>
         <w:pStyle w:val="Compact"/>
       </w:pPr>
@@ -298,8 +409,8 @@
         <w:t xml:space="preserve">La versión va en el nombre del archivo y la numeración pasa a v1, v2, v3…</w:t>
       </w:r>
     </w:p>
-    <w:bookmarkEnd w:id="21"/>
-    <w:bookmarkStart w:id="22" w:name="documento-v2-2026-10-08-commit-07de778"/>
+    <w:bookmarkEnd w:id="22"/>
+    <w:bookmarkStart w:id="23" w:name="documento-v2-2026-10-08-commit-07de778"/>
     <w:p>
       <w:pPr>
         <w:pStyle w:val="Heading3"/>
@@ -321,7 +432,7 @@
       <w:pPr>
         <w:numPr>
           <w:ilvl w:val="0"/>
-          <w:numId w:val="1004"/>
+          <w:numId w:val="1005"/>
         </w:numPr>
         <w:pStyle w:val="Compact"/>
       </w:pPr>
@@ -534,7 +645,7 @@
       <w:pPr>
         <w:numPr>
           <w:ilvl w:val="0"/>
-          <w:numId w:val="1004"/>
+          <w:numId w:val="1005"/>
         </w:numPr>
         <w:pStyle w:val="Compact"/>
       </w:pPr>
@@ -546,7 +657,7 @@
       <w:pPr>
         <w:numPr>
           <w:ilvl w:val="0"/>
-          <w:numId w:val="1004"/>
+          <w:numId w:val="1005"/>
         </w:numPr>
         <w:pStyle w:val="Compact"/>
       </w:pPr>
@@ -558,7 +669,7 @@
       <w:pPr>
         <w:numPr>
           <w:ilvl w:val="0"/>
-          <w:numId w:val="1004"/>
+          <w:numId w:val="1005"/>
         </w:numPr>
         <w:pStyle w:val="Compact"/>
       </w:pPr>
@@ -585,7 +696,7 @@
       <w:pPr>
         <w:numPr>
           <w:ilvl w:val="0"/>
-          <w:numId w:val="1004"/>
+          <w:numId w:val="1005"/>
         </w:numPr>
         <w:pStyle w:val="Compact"/>
       </w:pPr>
@@ -597,7 +708,7 @@
       <w:pPr>
         <w:numPr>
           <w:ilvl w:val="0"/>
-          <w:numId w:val="1004"/>
+          <w:numId w:val="1005"/>
         </w:numPr>
         <w:pStyle w:val="Compact"/>
       </w:pPr>
@@ -635,8 +746,8 @@
         <w:t xml:space="preserve">(el impuesto lo define cada tipo de producto).</w:t>
       </w:r>
     </w:p>
-    <w:bookmarkEnd w:id="22"/>
-    <w:bookmarkStart w:id="23" w:name="documento-v1-2026-10-06-commit-9be1af4"/>
+    <w:bookmarkEnd w:id="23"/>
+    <w:bookmarkStart w:id="24" w:name="documento-v1-2026-10-06-commit-9be1af4"/>
     <w:p>
       <w:pPr>
         <w:pStyle w:val="Heading3"/>
@@ -658,7 +769,7 @@
       <w:pPr>
         <w:numPr>
           <w:ilvl w:val="0"/>
-          <w:numId w:val="1005"/>
+          <w:numId w:val="1006"/>
         </w:numPr>
         <w:pStyle w:val="Compact"/>
       </w:pPr>
@@ -666,9 +777,9 @@
         <w:t xml:space="preserve">Primera versión del documento de diseño del Avance 1 (Proyecto 1, Fidecompro): clases con atributos, métodos y relaciones; 15 historias de usuario; 8 prototipos de pantalla; diagramas de arquitectura, secuencia y navegación.</w:t>
       </w:r>
     </w:p>
-    <w:bookmarkEnd w:id="23"/>
     <w:bookmarkEnd w:id="24"/>
-    <w:bookmarkStart w:id="26" w:name="código"/>
+    <w:bookmarkEnd w:id="25"/>
+    <w:bookmarkStart w:id="27" w:name="código"/>
     <w:p>
       <w:pPr>
         <w:pStyle w:val="Heading2"/>
@@ -677,7 +788,7 @@
         <w:t xml:space="preserve">Código</w:t>
       </w:r>
     </w:p>
-    <w:bookmarkStart w:id="25" w:name="código-v1-2026-10-08-commit-442187a"/>
+    <w:bookmarkStart w:id="26" w:name="código-v1-2026-10-08-commit-442187a"/>
     <w:p>
       <w:pPr>
         <w:pStyle w:val="Heading3"/>
@@ -699,7 +810,7 @@
       <w:pPr>
         <w:numPr>
           <w:ilvl w:val="0"/>
-          <w:numId w:val="1006"/>
+          <w:numId w:val="1007"/>
         </w:numPr>
         <w:pStyle w:val="Compact"/>
       </w:pPr>
@@ -726,7 +837,7 @@
       <w:pPr>
         <w:numPr>
           <w:ilvl w:val="0"/>
-          <w:numId w:val="1006"/>
+          <w:numId w:val="1007"/>
         </w:numPr>
         <w:pStyle w:val="Compact"/>
       </w:pPr>
@@ -747,7 +858,7 @@
       <w:pPr>
         <w:numPr>
           <w:ilvl w:val="0"/>
-          <w:numId w:val="1006"/>
+          <w:numId w:val="1007"/>
         </w:numPr>
         <w:pStyle w:val="Compact"/>
       </w:pPr>
@@ -755,9 +866,9 @@
         <w:t xml:space="preserve">Código de referencia para entender el diseño; no es un entregable.</w:t>
       </w:r>
     </w:p>
-    <w:bookmarkEnd w:id="25"/>
     <w:bookmarkEnd w:id="26"/>
     <w:bookmarkEnd w:id="27"/>
+    <w:bookmarkEnd w:id="28"/>
     <w:sectPr>
       <w:pgSz w:w="12240" w:h="15840"/>
       <w:pgMar w:left="1134" w:right="1134"/>
@@ -962,6 +1073,9 @@
     <w:abstractNumId w:val="991"/>
   </w:num>
   <w:num w:numId="1006">
+    <w:abstractNumId w:val="991"/>
+  </w:num>
+  <w:num w:numId="1007">
     <w:abstractNumId w:val="991"/>
   </w:num>
 </w:numbering>

</xml_diff>

<commit_message>
CHANGELOG y README: documento v6 y código v2
Co-Authored-By: Claude Opus 5.5 (1M context) <noreply@anthropic.com>
Claude-Session: https://claude.ai/code/session_01VkQm5RLcZiQMKLCS3EK3og
</commit_message>
<xml_diff>
--- a/docs/Historial_de_versiones.docx
+++ b/docs/Historial_de_versiones.docx
@@ -2,7 +2,7 @@
 <file path=word/document.xml><?xml version="1.0" encoding="utf-8"?>
 <w:document xmlns:w="http://schemas.openxmlformats.org/wordprocessingml/2006/main" xmlns:m="http://schemas.openxmlformats.org/officeDocument/2006/math" xmlns:r="http://schemas.openxmlformats.org/officeDocument/2006/relationships" xmlns:o="urn:schemas-microsoft-com:office:office" xmlns:v="urn:schemas-microsoft-com:vml" xmlns:w10="urn:schemas-microsoft-com:office:word" xmlns:a="http://schemas.openxmlformats.org/drawingml/2006/main" xmlns:pic="http://schemas.openxmlformats.org/drawingml/2006/picture" xmlns:wp="http://schemas.openxmlformats.org/drawingml/2006/wordprocessingDrawing">
   <w:body>
-    <w:bookmarkStart w:id="28" w:name="historial-de-versiones"/>
+    <w:bookmarkStart w:id="30" w:name="historial-de-versiones"/>
     <w:p>
       <w:pPr>
         <w:pStyle w:val="Heading1"/>
@@ -153,7 +153,7 @@
         <w:t xml:space="preserve">.</w:t>
       </w:r>
     </w:p>
-    <w:bookmarkStart w:id="25" w:name="documento-de-diseño"/>
+    <w:bookmarkStart w:id="26" w:name="documento-de-diseño"/>
     <w:p>
       <w:pPr>
         <w:pStyle w:val="Heading2"/>
@@ -162,22 +162,22 @@
         <w:t xml:space="preserve">Documento de diseño</w:t>
       </w:r>
     </w:p>
-    <w:bookmarkStart w:id="20" w:name="documento-v5-2026-10-08-commit-9a7a9a7"/>
+    <w:bookmarkStart w:id="20" w:name="documento-v6-2026-10-08-commit-99f55d4"/>
     <w:p>
       <w:pPr>
         <w:pStyle w:val="Heading3"/>
       </w:pPr>
       <w:r>
-        <w:t xml:space="preserve">Documento v5 · 2026-10-08 · commit</w:t>
-      </w:r>
-      <w:r>
-        <w:t xml:space="preserve"> </w:t>
-      </w:r>
-      <w:r>
-        <w:rPr>
-          <w:rStyle w:val="VerbatimChar"/>
-        </w:rPr>
-        <w:t xml:space="preserve">9a7a9a7</w:t>
+        <w:t xml:space="preserve">Documento v6 · 2026-10-08 · commit</w:t>
+      </w:r>
+      <w:r>
+        <w:t xml:space="preserve"> </w:t>
+      </w:r>
+      <w:r>
+        <w:rPr>
+          <w:rStyle w:val="VerbatimChar"/>
+        </w:rPr>
+        <w:t xml:space="preserve">99f55d4</w:t>
       </w:r>
     </w:p>
     <w:p>
@@ -189,7 +189,31 @@
         <w:pStyle w:val="Compact"/>
       </w:pPr>
       <w:r>
-        <w:t xml:space="preserve">Se agregan dos capítulos nuevos con el formato pedido (tabla con #, Requerimiento, Descripción y Prioridad):</w:t>
+        <w:t xml:space="preserve">Diseño alineado con lo que el profesor pidió para el proyecto final: sockets, hilos, pantallas JFrame, base de datos MySQL o Derby, CRUD completo desde pantallas, varios clientes a la vez y un video final.</w:t>
+      </w:r>
+    </w:p>
+    <w:p>
+      <w:pPr>
+        <w:numPr>
+          <w:ilvl w:val="0"/>
+          <w:numId w:val="1002"/>
+        </w:numPr>
+        <w:pStyle w:val="Compact"/>
+      </w:pPr>
+      <w:r>
+        <w:t xml:space="preserve">Nueva sección 1.2 con esos requisitos y dónde los cumple el diseño.</w:t>
+      </w:r>
+    </w:p>
+    <w:p>
+      <w:pPr>
+        <w:numPr>
+          <w:ilvl w:val="0"/>
+          <w:numId w:val="1002"/>
+        </w:numPr>
+        <w:pStyle w:val="Compact"/>
+      </w:pPr>
+      <w:r>
+        <w:t xml:space="preserve">CRUD completo: usuarios, clientes, categorías y productos ahora se pueden</w:t>
       </w:r>
       <w:r>
         <w:t xml:space="preserve"> </w:t>
@@ -199,13 +223,130 @@
           <w:bCs/>
           <w:b/>
         </w:rPr>
-        <w:t xml:space="preserve">Lista de requerimientos funcionales</w:t>
-      </w:r>
-      <w:r>
-        <w:t xml:space="preserve"> </w:t>
-      </w:r>
-      <w:r>
-        <w:t xml:space="preserve">(10) y</w:t>
+        <w:t xml:space="preserve">eliminar</w:t>
+      </w:r>
+      <w:r>
+        <w:t xml:space="preserve">. Si un registro ya está en facturas, se desactiva para no perder el historial. HU 3, HU 6 y HU 8 actualizadas; botones</w:t>
+      </w:r>
+      <w:r>
+        <w:t xml:space="preserve"> </w:t>
+      </w:r>
+      <w:r>
+        <w:rPr>
+          <w:iCs/>
+          <w:i/>
+        </w:rPr>
+        <w:t xml:space="preserve">Eliminar</w:t>
+      </w:r>
+      <w:r>
+        <w:t xml:space="preserve"> </w:t>
+      </w:r>
+      <w:r>
+        <w:t xml:space="preserve">y</w:t>
+      </w:r>
+      <w:r>
+        <w:t xml:space="preserve"> </w:t>
+      </w:r>
+      <w:r>
+        <w:rPr>
+          <w:iCs/>
+          <w:i/>
+        </w:rPr>
+        <w:t xml:space="preserve">Actualizar lista</w:t>
+      </w:r>
+      <w:r>
+        <w:t xml:space="preserve"> </w:t>
+      </w:r>
+      <w:r>
+        <w:t xml:space="preserve">en P3, P4 y P8.</w:t>
+      </w:r>
+    </w:p>
+    <w:p>
+      <w:pPr>
+        <w:numPr>
+          <w:ilvl w:val="0"/>
+          <w:numId w:val="1002"/>
+        </w:numPr>
+        <w:pStyle w:val="Compact"/>
+      </w:pPr>
+      <w:r>
+        <w:t xml:space="preserve">Ventana del servidor (</w:t>
+      </w:r>
+      <w:r>
+        <w:rPr>
+          <w:rStyle w:val="VerbatimChar"/>
+        </w:rPr>
+        <w:t xml:space="preserve">VentanaServidor</w:t>
+      </w:r>
+      <w:r>
+        <w:t xml:space="preserve">): nueva historia HU 16, nuevo requerimiento funcional 11 y nuevo prototipo P9 con clientes conectados y bitácora.</w:t>
+      </w:r>
+    </w:p>
+    <w:p>
+      <w:pPr>
+        <w:numPr>
+          <w:ilvl w:val="0"/>
+          <w:numId w:val="1002"/>
+        </w:numPr>
+        <w:pStyle w:val="Compact"/>
+      </w:pPr>
+      <w:r>
+        <w:t xml:space="preserve">Nueva sección 4.6 con el modelo de la base de datos (seis tablas).</w:t>
+      </w:r>
+    </w:p>
+    <w:p>
+      <w:pPr>
+        <w:numPr>
+          <w:ilvl w:val="0"/>
+          <w:numId w:val="1002"/>
+        </w:numPr>
+        <w:pStyle w:val="Compact"/>
+      </w:pPr>
+      <w:r>
+        <w:t xml:space="preserve">Nueva sección 8 con la matriz del CRUD y el guion del video final.</w:t>
+      </w:r>
+    </w:p>
+    <w:p>
+      <w:pPr>
+        <w:numPr>
+          <w:ilvl w:val="0"/>
+          <w:numId w:val="1002"/>
+        </w:numPr>
+        <w:pStyle w:val="Compact"/>
+      </w:pPr>
+      <w:r>
+        <w:t xml:space="preserve">Requerimientos no funcionales de pantallas, sockets, concurrencia y base de datos ajustados.</w:t>
+      </w:r>
+    </w:p>
+    <w:bookmarkEnd w:id="20"/>
+    <w:bookmarkStart w:id="21" w:name="documento-v5-2026-10-08-commit-9a7a9a7"/>
+    <w:p>
+      <w:pPr>
+        <w:pStyle w:val="Heading3"/>
+      </w:pPr>
+      <w:r>
+        <w:t xml:space="preserve">Documento v5 · 2026-10-08 · commit</w:t>
+      </w:r>
+      <w:r>
+        <w:t xml:space="preserve"> </w:t>
+      </w:r>
+      <w:r>
+        <w:rPr>
+          <w:rStyle w:val="VerbatimChar"/>
+        </w:rPr>
+        <w:t xml:space="preserve">9a7a9a7</w:t>
+      </w:r>
+    </w:p>
+    <w:p>
+      <w:pPr>
+        <w:numPr>
+          <w:ilvl w:val="0"/>
+          <w:numId w:val="1003"/>
+        </w:numPr>
+        <w:pStyle w:val="Compact"/>
+      </w:pPr>
+      <w:r>
+        <w:t xml:space="preserve">Se agregan dos capítulos nuevos con el formato pedido (tabla con #, Requerimiento, Descripción y Prioridad):</w:t>
       </w:r>
       <w:r>
         <w:t xml:space="preserve"> </w:t>
@@ -215,6 +356,22 @@
           <w:bCs/>
           <w:b/>
         </w:rPr>
+        <w:t xml:space="preserve">Lista de requerimientos funcionales</w:t>
+      </w:r>
+      <w:r>
+        <w:t xml:space="preserve"> </w:t>
+      </w:r>
+      <w:r>
+        <w:t xml:space="preserve">(10) y</w:t>
+      </w:r>
+      <w:r>
+        <w:t xml:space="preserve"> </w:t>
+      </w:r>
+      <w:r>
+        <w:rPr>
+          <w:bCs/>
+          <w:b/>
+        </w:rPr>
         <w:t xml:space="preserve">Lista de requerimientos no funcionales</w:t>
       </w:r>
       <w:r>
@@ -228,7 +385,7 @@
       <w:pPr>
         <w:numPr>
           <w:ilvl w:val="0"/>
-          <w:numId w:val="1002"/>
+          <w:numId w:val="1003"/>
         </w:numPr>
         <w:pStyle w:val="Compact"/>
       </w:pPr>
@@ -240,7 +397,7 @@
       <w:pPr>
         <w:numPr>
           <w:ilvl w:val="0"/>
-          <w:numId w:val="1002"/>
+          <w:numId w:val="1003"/>
         </w:numPr>
         <w:pStyle w:val="Compact"/>
       </w:pPr>
@@ -252,7 +409,7 @@
       <w:pPr>
         <w:numPr>
           <w:ilvl w:val="0"/>
-          <w:numId w:val="1002"/>
+          <w:numId w:val="1003"/>
         </w:numPr>
         <w:pStyle w:val="Compact"/>
       </w:pPr>
@@ -272,8 +429,8 @@
         <w:t xml:space="preserve">.</w:t>
       </w:r>
     </w:p>
-    <w:bookmarkEnd w:id="20"/>
-    <w:bookmarkStart w:id="21" w:name="documento-v4-2026-10-08-commit-b3e7477"/>
+    <w:bookmarkEnd w:id="21"/>
+    <w:bookmarkStart w:id="22" w:name="documento-v4-2026-10-08-commit-b3e7477"/>
     <w:p>
       <w:pPr>
         <w:pStyle w:val="Heading3"/>
@@ -295,7 +452,7 @@
       <w:pPr>
         <w:numPr>
           <w:ilvl w:val="0"/>
-          <w:numId w:val="1003"/>
+          <w:numId w:val="1004"/>
         </w:numPr>
         <w:pStyle w:val="Compact"/>
       </w:pPr>
@@ -307,7 +464,7 @@
       <w:pPr>
         <w:numPr>
           <w:ilvl w:val="0"/>
-          <w:numId w:val="1003"/>
+          <w:numId w:val="1004"/>
         </w:numPr>
         <w:pStyle w:val="Compact"/>
       </w:pPr>
@@ -319,7 +476,7 @@
       <w:pPr>
         <w:numPr>
           <w:ilvl w:val="0"/>
-          <w:numId w:val="1003"/>
+          <w:numId w:val="1004"/>
         </w:numPr>
         <w:pStyle w:val="Compact"/>
       </w:pPr>
@@ -331,7 +488,7 @@
       <w:pPr>
         <w:numPr>
           <w:ilvl w:val="0"/>
-          <w:numId w:val="1003"/>
+          <w:numId w:val="1004"/>
         </w:numPr>
         <w:pStyle w:val="Compact"/>
       </w:pPr>
@@ -366,8 +523,8 @@
         <w:t xml:space="preserve">.</w:t>
       </w:r>
     </w:p>
-    <w:bookmarkEnd w:id="21"/>
-    <w:bookmarkStart w:id="22" w:name="documento-v3-2026-10-08-commit-bf66b07"/>
+    <w:bookmarkEnd w:id="22"/>
+    <w:bookmarkStart w:id="23" w:name="documento-v3-2026-10-08-commit-bf66b07"/>
     <w:p>
       <w:pPr>
         <w:pStyle w:val="Heading3"/>
@@ -389,7 +546,7 @@
       <w:pPr>
         <w:numPr>
           <w:ilvl w:val="0"/>
-          <w:numId w:val="1004"/>
+          <w:numId w:val="1005"/>
         </w:numPr>
         <w:pStyle w:val="Compact"/>
       </w:pPr>
@@ -401,7 +558,7 @@
       <w:pPr>
         <w:numPr>
           <w:ilvl w:val="0"/>
-          <w:numId w:val="1004"/>
+          <w:numId w:val="1005"/>
         </w:numPr>
         <w:pStyle w:val="Compact"/>
       </w:pPr>
@@ -409,8 +566,8 @@
         <w:t xml:space="preserve">La versión va en el nombre del archivo y la numeración pasa a v1, v2, v3…</w:t>
       </w:r>
     </w:p>
-    <w:bookmarkEnd w:id="22"/>
-    <w:bookmarkStart w:id="23" w:name="documento-v2-2026-10-08-commit-07de778"/>
+    <w:bookmarkEnd w:id="23"/>
+    <w:bookmarkStart w:id="24" w:name="documento-v2-2026-10-08-commit-07de778"/>
     <w:p>
       <w:pPr>
         <w:pStyle w:val="Heading3"/>
@@ -432,7 +589,7 @@
       <w:pPr>
         <w:numPr>
           <w:ilvl w:val="0"/>
-          <w:numId w:val="1005"/>
+          <w:numId w:val="1006"/>
         </w:numPr>
         <w:pStyle w:val="Compact"/>
       </w:pPr>
@@ -645,7 +802,7 @@
       <w:pPr>
         <w:numPr>
           <w:ilvl w:val="0"/>
-          <w:numId w:val="1005"/>
+          <w:numId w:val="1006"/>
         </w:numPr>
         <w:pStyle w:val="Compact"/>
       </w:pPr>
@@ -657,7 +814,7 @@
       <w:pPr>
         <w:numPr>
           <w:ilvl w:val="0"/>
-          <w:numId w:val="1005"/>
+          <w:numId w:val="1006"/>
         </w:numPr>
         <w:pStyle w:val="Compact"/>
       </w:pPr>
@@ -669,7 +826,7 @@
       <w:pPr>
         <w:numPr>
           <w:ilvl w:val="0"/>
-          <w:numId w:val="1005"/>
+          <w:numId w:val="1006"/>
         </w:numPr>
         <w:pStyle w:val="Compact"/>
       </w:pPr>
@@ -696,7 +853,7 @@
       <w:pPr>
         <w:numPr>
           <w:ilvl w:val="0"/>
-          <w:numId w:val="1005"/>
+          <w:numId w:val="1006"/>
         </w:numPr>
         <w:pStyle w:val="Compact"/>
       </w:pPr>
@@ -708,7 +865,7 @@
       <w:pPr>
         <w:numPr>
           <w:ilvl w:val="0"/>
-          <w:numId w:val="1005"/>
+          <w:numId w:val="1006"/>
         </w:numPr>
         <w:pStyle w:val="Compact"/>
       </w:pPr>
@@ -746,8 +903,8 @@
         <w:t xml:space="preserve">(el impuesto lo define cada tipo de producto).</w:t>
       </w:r>
     </w:p>
-    <w:bookmarkEnd w:id="23"/>
-    <w:bookmarkStart w:id="24" w:name="documento-v1-2026-10-06-commit-9be1af4"/>
+    <w:bookmarkEnd w:id="24"/>
+    <w:bookmarkStart w:id="25" w:name="documento-v1-2026-10-06-commit-9be1af4"/>
     <w:p>
       <w:pPr>
         <w:pStyle w:val="Heading3"/>
@@ -769,7 +926,7 @@
       <w:pPr>
         <w:numPr>
           <w:ilvl w:val="0"/>
-          <w:numId w:val="1006"/>
+          <w:numId w:val="1007"/>
         </w:numPr>
         <w:pStyle w:val="Compact"/>
       </w:pPr>
@@ -777,9 +934,9 @@
         <w:t xml:space="preserve">Primera versión del documento de diseño del Avance 1 (Proyecto 1, Fidecompro): clases con atributos, métodos y relaciones; 15 historias de usuario; 8 prototipos de pantalla; diagramas de arquitectura, secuencia y navegación.</w:t>
       </w:r>
     </w:p>
-    <w:bookmarkEnd w:id="24"/>
     <w:bookmarkEnd w:id="25"/>
-    <w:bookmarkStart w:id="27" w:name="código"/>
+    <w:bookmarkEnd w:id="26"/>
+    <w:bookmarkStart w:id="29" w:name="código"/>
     <w:p>
       <w:pPr>
         <w:pStyle w:val="Heading2"/>
@@ -788,12 +945,136 @@
         <w:t xml:space="preserve">Código</w:t>
       </w:r>
     </w:p>
-    <w:bookmarkStart w:id="26" w:name="código-v1-2026-10-08-commit-442187a"/>
+    <w:bookmarkStart w:id="27" w:name="código-v2-2026-10-08-commit-99f55d4"/>
     <w:p>
       <w:pPr>
         <w:pStyle w:val="Heading3"/>
       </w:pPr>
       <w:r>
+        <w:t xml:space="preserve">Código v2 · 2026-10-08 · commit</w:t>
+      </w:r>
+      <w:r>
+        <w:t xml:space="preserve"> </w:t>
+      </w:r>
+      <w:r>
+        <w:rPr>
+          <w:rStyle w:val="VerbatimChar"/>
+        </w:rPr>
+        <w:t xml:space="preserve">99f55d4</w:t>
+      </w:r>
+    </w:p>
+    <w:p>
+      <w:pPr>
+        <w:numPr>
+          <w:ilvl w:val="0"/>
+          <w:numId w:val="1008"/>
+        </w:numPr>
+        <w:pStyle w:val="Compact"/>
+      </w:pPr>
+      <w:r>
+        <w:rPr>
+          <w:rStyle w:val="VerbatimChar"/>
+        </w:rPr>
+        <w:t xml:space="preserve">eliminarCliente</w:t>
+      </w:r>
+      <w:r>
+        <w:t xml:space="preserve"> </w:t>
+      </w:r>
+      <w:r>
+        <w:t xml:space="preserve">y</w:t>
+      </w:r>
+      <w:r>
+        <w:t xml:space="preserve"> </w:t>
+      </w:r>
+      <w:r>
+        <w:rPr>
+          <w:rStyle w:val="VerbatimChar"/>
+        </w:rPr>
+        <w:t xml:space="preserve">eliminarUsuario</w:t>
+      </w:r>
+      <w:r>
+        <w:t xml:space="preserve"> </w:t>
+      </w:r>
+      <w:r>
+        <w:t xml:space="preserve">en los registros;</w:t>
+      </w:r>
+      <w:r>
+        <w:t xml:space="preserve"> </w:t>
+      </w:r>
+      <w:r>
+        <w:rPr>
+          <w:rStyle w:val="VerbatimChar"/>
+        </w:rPr>
+        <w:t xml:space="preserve">tieneFacturasCliente</w:t>
+      </w:r>
+      <w:r>
+        <w:t xml:space="preserve"> </w:t>
+      </w:r>
+      <w:r>
+        <w:t xml:space="preserve">y</w:t>
+      </w:r>
+      <w:r>
+        <w:t xml:space="preserve"> </w:t>
+      </w:r>
+      <w:r>
+        <w:rPr>
+          <w:rStyle w:val="VerbatimChar"/>
+        </w:rPr>
+        <w:t xml:space="preserve">tieneFacturasUsuario</w:t>
+      </w:r>
+      <w:r>
+        <w:t xml:space="preserve"> </w:t>
+      </w:r>
+      <w:r>
+        <w:t xml:space="preserve">en</w:t>
+      </w:r>
+      <w:r>
+        <w:t xml:space="preserve"> </w:t>
+      </w:r>
+      <w:r>
+        <w:rPr>
+          <w:rStyle w:val="VerbatimChar"/>
+        </w:rPr>
+        <w:t xml:space="preserve">RegistroFacturas</w:t>
+      </w:r>
+      <w:r>
+        <w:t xml:space="preserve">.</w:t>
+      </w:r>
+    </w:p>
+    <w:p>
+      <w:pPr>
+        <w:numPr>
+          <w:ilvl w:val="0"/>
+          <w:numId w:val="1008"/>
+        </w:numPr>
+        <w:pStyle w:val="Compact"/>
+      </w:pPr>
+      <w:r>
+        <w:t xml:space="preserve">El</w:t>
+      </w:r>
+      <w:r>
+        <w:t xml:space="preserve"> </w:t>
+      </w:r>
+      <w:r>
+        <w:rPr>
+          <w:rStyle w:val="VerbatimChar"/>
+        </w:rPr>
+        <w:t xml:space="preserve">main</w:t>
+      </w:r>
+      <w:r>
+        <w:t xml:space="preserve"> </w:t>
+      </w:r>
+      <w:r>
+        <w:t xml:space="preserve">muestra la regla: un cliente con facturas se desactiva y uno sin facturas se elimina.</w:t>
+      </w:r>
+    </w:p>
+    <w:bookmarkEnd w:id="27"/>
+    <w:bookmarkStart w:id="28" w:name="código-v1-2026-10-08-commit-442187a"/>
+    <w:p>
+      <w:pPr>
+        <w:pStyle w:val="Heading3"/>
+      </w:pPr>
+      <w:r>
         <w:t xml:space="preserve">Código v1 · 2026-10-08 · commit</w:t>
       </w:r>
       <w:r>
@@ -810,7 +1091,7 @@
       <w:pPr>
         <w:numPr>
           <w:ilvl w:val="0"/>
-          <w:numId w:val="1007"/>
+          <w:numId w:val="1009"/>
         </w:numPr>
         <w:pStyle w:val="Compact"/>
       </w:pPr>
@@ -837,7 +1118,7 @@
       <w:pPr>
         <w:numPr>
           <w:ilvl w:val="0"/>
-          <w:numId w:val="1007"/>
+          <w:numId w:val="1009"/>
         </w:numPr>
         <w:pStyle w:val="Compact"/>
       </w:pPr>
@@ -858,7 +1139,7 @@
       <w:pPr>
         <w:numPr>
           <w:ilvl w:val="0"/>
-          <w:numId w:val="1007"/>
+          <w:numId w:val="1009"/>
         </w:numPr>
         <w:pStyle w:val="Compact"/>
       </w:pPr>
@@ -866,9 +1147,9 @@
         <w:t xml:space="preserve">Código de referencia para entender el diseño; no es un entregable.</w:t>
       </w:r>
     </w:p>
-    <w:bookmarkEnd w:id="26"/>
-    <w:bookmarkEnd w:id="27"/>
     <w:bookmarkEnd w:id="28"/>
+    <w:bookmarkEnd w:id="29"/>
+    <w:bookmarkEnd w:id="30"/>
     <w:sectPr>
       <w:pgSz w:w="12240" w:h="15840"/>
       <w:pgMar w:left="1134" w:right="1134"/>
@@ -1076,6 +1357,12 @@
     <w:abstractNumId w:val="991"/>
   </w:num>
   <w:num w:numId="1007">
+    <w:abstractNumId w:val="991"/>
+  </w:num>
+  <w:num w:numId="1008">
+    <w:abstractNumId w:val="991"/>
+  </w:num>
+  <w:num w:numId="1009">
     <w:abstractNumId w:val="991"/>
   </w:num>
 </w:numbering>

</xml_diff>

<commit_message>
CHANGELOG y README: documento v7
Co-Authored-By: Claude Opus 5.5 (1M context) <noreply@anthropic.com>
Claude-Session: https://claude.ai/code/session_01VkQm5RLcZiQMKLCS3EK3og
</commit_message>
<xml_diff>
--- a/docs/Historial_de_versiones.docx
+++ b/docs/Historial_de_versiones.docx
@@ -2,7 +2,7 @@
 <file path=word/document.xml><?xml version="1.0" encoding="utf-8"?>
 <w:document xmlns:w="http://schemas.openxmlformats.org/wordprocessingml/2006/main" xmlns:m="http://schemas.openxmlformats.org/officeDocument/2006/math" xmlns:r="http://schemas.openxmlformats.org/officeDocument/2006/relationships" xmlns:o="urn:schemas-microsoft-com:office:office" xmlns:v="urn:schemas-microsoft-com:vml" xmlns:w10="urn:schemas-microsoft-com:office:word" xmlns:a="http://schemas.openxmlformats.org/drawingml/2006/main" xmlns:pic="http://schemas.openxmlformats.org/drawingml/2006/picture" xmlns:wp="http://schemas.openxmlformats.org/drawingml/2006/wordprocessingDrawing">
   <w:body>
-    <w:bookmarkStart w:id="30" w:name="historial-de-versiones"/>
+    <w:bookmarkStart w:id="31" w:name="historial-de-versiones"/>
     <w:p>
       <w:pPr>
         <w:pStyle w:val="Heading1"/>
@@ -153,7 +153,7 @@
         <w:t xml:space="preserve">.</w:t>
       </w:r>
     </w:p>
-    <w:bookmarkStart w:id="26" w:name="documento-de-diseño"/>
+    <w:bookmarkStart w:id="27" w:name="documento-de-diseño"/>
     <w:p>
       <w:pPr>
         <w:pStyle w:val="Heading2"/>
@@ -162,12 +162,109 @@
         <w:t xml:space="preserve">Documento de diseño</w:t>
       </w:r>
     </w:p>
-    <w:bookmarkStart w:id="20" w:name="documento-v6-2026-10-08-commit-99f55d4"/>
+    <w:bookmarkStart w:id="20" w:name="documento-v7-2026-10-08-commit-047b31c"/>
     <w:p>
       <w:pPr>
         <w:pStyle w:val="Heading3"/>
       </w:pPr>
       <w:r>
+        <w:t xml:space="preserve">Documento v7 · 2026-10-08 · commit</w:t>
+      </w:r>
+      <w:r>
+        <w:t xml:space="preserve"> </w:t>
+      </w:r>
+      <w:r>
+        <w:rPr>
+          <w:rStyle w:val="VerbatimChar"/>
+        </w:rPr>
+        <w:t xml:space="preserve">047b31c</w:t>
+      </w:r>
+    </w:p>
+    <w:p>
+      <w:pPr>
+        <w:numPr>
+          <w:ilvl w:val="0"/>
+          <w:numId w:val="1002"/>
+        </w:numPr>
+        <w:pStyle w:val="Compact"/>
+      </w:pPr>
+      <w:r>
+        <w:t xml:space="preserve">El profesor indicó que el Avance 1 es conceptual y pide tres partes: historias de usuario, diagrama de clases y bocetos (login, menú y pantallas CRUD de las clases). Se agrega al inicio una tabla que indica dónde está cada una.</w:t>
+      </w:r>
+    </w:p>
+    <w:p>
+      <w:pPr>
+        <w:numPr>
+          <w:ilvl w:val="0"/>
+          <w:numId w:val="1002"/>
+        </w:numPr>
+        <w:pStyle w:val="Compact"/>
+      </w:pPr>
+      <w:r>
+        <w:t xml:space="preserve">La sección 6 abre con una tabla que relaciona cada pantalla con la clase que administra y sus operaciones CRUD.</w:t>
+      </w:r>
+    </w:p>
+    <w:p>
+      <w:pPr>
+        <w:numPr>
+          <w:ilvl w:val="0"/>
+          <w:numId w:val="1002"/>
+        </w:numPr>
+        <w:pStyle w:val="Compact"/>
+      </w:pPr>
+      <w:r>
+        <w:t xml:space="preserve">Nuevo boceto P10 de gestión de categorías (antes solo se mencionaba como diálogo).</w:t>
+      </w:r>
+    </w:p>
+    <w:p>
+      <w:pPr>
+        <w:numPr>
+          <w:ilvl w:val="0"/>
+          <w:numId w:val="1002"/>
+        </w:numPr>
+        <w:pStyle w:val="Compact"/>
+      </w:pPr>
+      <w:r>
+        <w:t xml:space="preserve">La HU 7 se llama ahora</w:t>
+      </w:r>
+      <w:r>
+        <w:t xml:space="preserve"> </w:t>
+      </w:r>
+      <w:r>
+        <w:t xml:space="preserve">“</w:t>
+      </w:r>
+      <w:r>
+        <w:t xml:space="preserve">Administrar categorías</w:t>
+      </w:r>
+      <w:r>
+        <w:t xml:space="preserve">”</w:t>
+      </w:r>
+      <w:r>
+        <w:t xml:space="preserve"> </w:t>
+      </w:r>
+      <w:r>
+        <w:t xml:space="preserve">en el resumen.</w:t>
+      </w:r>
+    </w:p>
+    <w:p>
+      <w:pPr>
+        <w:numPr>
+          <w:ilvl w:val="0"/>
+          <w:numId w:val="1002"/>
+        </w:numPr>
+        <w:pStyle w:val="Compact"/>
+      </w:pPr>
+      <w:r>
+        <w:t xml:space="preserve">El nombre del profesor (Mario Alberto Vargas Montes) queda en la portada.</w:t>
+      </w:r>
+    </w:p>
+    <w:bookmarkEnd w:id="20"/>
+    <w:bookmarkStart w:id="21" w:name="documento-v6-2026-10-08-commit-99f55d4"/>
+    <w:p>
+      <w:pPr>
+        <w:pStyle w:val="Heading3"/>
+      </w:pPr>
+      <w:r>
         <w:t xml:space="preserve">Documento v6 · 2026-10-08 · commit</w:t>
       </w:r>
       <w:r>
@@ -184,7 +281,7 @@
       <w:pPr>
         <w:numPr>
           <w:ilvl w:val="0"/>
-          <w:numId w:val="1002"/>
+          <w:numId w:val="1003"/>
         </w:numPr>
         <w:pStyle w:val="Compact"/>
       </w:pPr>
@@ -196,7 +293,7 @@
       <w:pPr>
         <w:numPr>
           <w:ilvl w:val="0"/>
-          <w:numId w:val="1002"/>
+          <w:numId w:val="1003"/>
         </w:numPr>
         <w:pStyle w:val="Compact"/>
       </w:pPr>
@@ -208,7 +305,7 @@
       <w:pPr>
         <w:numPr>
           <w:ilvl w:val="0"/>
-          <w:numId w:val="1002"/>
+          <w:numId w:val="1003"/>
         </w:numPr>
         <w:pStyle w:val="Compact"/>
       </w:pPr>
@@ -265,7 +362,7 @@
       <w:pPr>
         <w:numPr>
           <w:ilvl w:val="0"/>
-          <w:numId w:val="1002"/>
+          <w:numId w:val="1003"/>
         </w:numPr>
         <w:pStyle w:val="Compact"/>
       </w:pPr>
@@ -286,7 +383,7 @@
       <w:pPr>
         <w:numPr>
           <w:ilvl w:val="0"/>
-          <w:numId w:val="1002"/>
+          <w:numId w:val="1003"/>
         </w:numPr>
         <w:pStyle w:val="Compact"/>
       </w:pPr>
@@ -298,7 +395,7 @@
       <w:pPr>
         <w:numPr>
           <w:ilvl w:val="0"/>
-          <w:numId w:val="1002"/>
+          <w:numId w:val="1003"/>
         </w:numPr>
         <w:pStyle w:val="Compact"/>
       </w:pPr>
@@ -310,7 +407,7 @@
       <w:pPr>
         <w:numPr>
           <w:ilvl w:val="0"/>
-          <w:numId w:val="1002"/>
+          <w:numId w:val="1003"/>
         </w:numPr>
         <w:pStyle w:val="Compact"/>
       </w:pPr>
@@ -318,8 +415,8 @@
         <w:t xml:space="preserve">Requerimientos no funcionales de pantallas, sockets, concurrencia y base de datos ajustados.</w:t>
       </w:r>
     </w:p>
-    <w:bookmarkEnd w:id="20"/>
-    <w:bookmarkStart w:id="21" w:name="documento-v5-2026-10-08-commit-9a7a9a7"/>
+    <w:bookmarkEnd w:id="21"/>
+    <w:bookmarkStart w:id="22" w:name="documento-v5-2026-10-08-commit-9a7a9a7"/>
     <w:p>
       <w:pPr>
         <w:pStyle w:val="Heading3"/>
@@ -341,7 +438,7 @@
       <w:pPr>
         <w:numPr>
           <w:ilvl w:val="0"/>
-          <w:numId w:val="1003"/>
+          <w:numId w:val="1004"/>
         </w:numPr>
         <w:pStyle w:val="Compact"/>
       </w:pPr>
@@ -385,7 +482,7 @@
       <w:pPr>
         <w:numPr>
           <w:ilvl w:val="0"/>
-          <w:numId w:val="1003"/>
+          <w:numId w:val="1004"/>
         </w:numPr>
         <w:pStyle w:val="Compact"/>
       </w:pPr>
@@ -397,7 +494,7 @@
       <w:pPr>
         <w:numPr>
           <w:ilvl w:val="0"/>
-          <w:numId w:val="1003"/>
+          <w:numId w:val="1004"/>
         </w:numPr>
         <w:pStyle w:val="Compact"/>
       </w:pPr>
@@ -409,7 +506,7 @@
       <w:pPr>
         <w:numPr>
           <w:ilvl w:val="0"/>
-          <w:numId w:val="1003"/>
+          <w:numId w:val="1004"/>
         </w:numPr>
         <w:pStyle w:val="Compact"/>
       </w:pPr>
@@ -429,8 +526,8 @@
         <w:t xml:space="preserve">.</w:t>
       </w:r>
     </w:p>
-    <w:bookmarkEnd w:id="21"/>
-    <w:bookmarkStart w:id="22" w:name="documento-v4-2026-10-08-commit-b3e7477"/>
+    <w:bookmarkEnd w:id="22"/>
+    <w:bookmarkStart w:id="23" w:name="documento-v4-2026-10-08-commit-b3e7477"/>
     <w:p>
       <w:pPr>
         <w:pStyle w:val="Heading3"/>
@@ -452,7 +549,7 @@
       <w:pPr>
         <w:numPr>
           <w:ilvl w:val="0"/>
-          <w:numId w:val="1004"/>
+          <w:numId w:val="1005"/>
         </w:numPr>
         <w:pStyle w:val="Compact"/>
       </w:pPr>
@@ -464,7 +561,7 @@
       <w:pPr>
         <w:numPr>
           <w:ilvl w:val="0"/>
-          <w:numId w:val="1004"/>
+          <w:numId w:val="1005"/>
         </w:numPr>
         <w:pStyle w:val="Compact"/>
       </w:pPr>
@@ -476,7 +573,7 @@
       <w:pPr>
         <w:numPr>
           <w:ilvl w:val="0"/>
-          <w:numId w:val="1004"/>
+          <w:numId w:val="1005"/>
         </w:numPr>
         <w:pStyle w:val="Compact"/>
       </w:pPr>
@@ -488,7 +585,7 @@
       <w:pPr>
         <w:numPr>
           <w:ilvl w:val="0"/>
-          <w:numId w:val="1004"/>
+          <w:numId w:val="1005"/>
         </w:numPr>
         <w:pStyle w:val="Compact"/>
       </w:pPr>
@@ -523,8 +620,8 @@
         <w:t xml:space="preserve">.</w:t>
       </w:r>
     </w:p>
-    <w:bookmarkEnd w:id="22"/>
-    <w:bookmarkStart w:id="23" w:name="documento-v3-2026-10-08-commit-bf66b07"/>
+    <w:bookmarkEnd w:id="23"/>
+    <w:bookmarkStart w:id="24" w:name="documento-v3-2026-10-08-commit-bf66b07"/>
     <w:p>
       <w:pPr>
         <w:pStyle w:val="Heading3"/>
@@ -546,7 +643,7 @@
       <w:pPr>
         <w:numPr>
           <w:ilvl w:val="0"/>
-          <w:numId w:val="1005"/>
+          <w:numId w:val="1006"/>
         </w:numPr>
         <w:pStyle w:val="Compact"/>
       </w:pPr>
@@ -558,7 +655,7 @@
       <w:pPr>
         <w:numPr>
           <w:ilvl w:val="0"/>
-          <w:numId w:val="1005"/>
+          <w:numId w:val="1006"/>
         </w:numPr>
         <w:pStyle w:val="Compact"/>
       </w:pPr>
@@ -566,8 +663,8 @@
         <w:t xml:space="preserve">La versión va en el nombre del archivo y la numeración pasa a v1, v2, v3…</w:t>
       </w:r>
     </w:p>
-    <w:bookmarkEnd w:id="23"/>
-    <w:bookmarkStart w:id="24" w:name="documento-v2-2026-10-08-commit-07de778"/>
+    <w:bookmarkEnd w:id="24"/>
+    <w:bookmarkStart w:id="25" w:name="documento-v2-2026-10-08-commit-07de778"/>
     <w:p>
       <w:pPr>
         <w:pStyle w:val="Heading3"/>
@@ -589,7 +686,7 @@
       <w:pPr>
         <w:numPr>
           <w:ilvl w:val="0"/>
-          <w:numId w:val="1006"/>
+          <w:numId w:val="1007"/>
         </w:numPr>
         <w:pStyle w:val="Compact"/>
       </w:pPr>
@@ -802,7 +899,7 @@
       <w:pPr>
         <w:numPr>
           <w:ilvl w:val="0"/>
-          <w:numId w:val="1006"/>
+          <w:numId w:val="1007"/>
         </w:numPr>
         <w:pStyle w:val="Compact"/>
       </w:pPr>
@@ -814,7 +911,7 @@
       <w:pPr>
         <w:numPr>
           <w:ilvl w:val="0"/>
-          <w:numId w:val="1006"/>
+          <w:numId w:val="1007"/>
         </w:numPr>
         <w:pStyle w:val="Compact"/>
       </w:pPr>
@@ -826,7 +923,7 @@
       <w:pPr>
         <w:numPr>
           <w:ilvl w:val="0"/>
-          <w:numId w:val="1006"/>
+          <w:numId w:val="1007"/>
         </w:numPr>
         <w:pStyle w:val="Compact"/>
       </w:pPr>
@@ -853,7 +950,7 @@
       <w:pPr>
         <w:numPr>
           <w:ilvl w:val="0"/>
-          <w:numId w:val="1006"/>
+          <w:numId w:val="1007"/>
         </w:numPr>
         <w:pStyle w:val="Compact"/>
       </w:pPr>
@@ -865,7 +962,7 @@
       <w:pPr>
         <w:numPr>
           <w:ilvl w:val="0"/>
-          <w:numId w:val="1006"/>
+          <w:numId w:val="1007"/>
         </w:numPr>
         <w:pStyle w:val="Compact"/>
       </w:pPr>
@@ -903,8 +1000,8 @@
         <w:t xml:space="preserve">(el impuesto lo define cada tipo de producto).</w:t>
       </w:r>
     </w:p>
-    <w:bookmarkEnd w:id="24"/>
-    <w:bookmarkStart w:id="25" w:name="documento-v1-2026-10-06-commit-9be1af4"/>
+    <w:bookmarkEnd w:id="25"/>
+    <w:bookmarkStart w:id="26" w:name="documento-v1-2026-10-06-commit-9be1af4"/>
     <w:p>
       <w:pPr>
         <w:pStyle w:val="Heading3"/>
@@ -926,7 +1023,7 @@
       <w:pPr>
         <w:numPr>
           <w:ilvl w:val="0"/>
-          <w:numId w:val="1007"/>
+          <w:numId w:val="1008"/>
         </w:numPr>
         <w:pStyle w:val="Compact"/>
       </w:pPr>
@@ -934,9 +1031,9 @@
         <w:t xml:space="preserve">Primera versión del documento de diseño del Avance 1 (Proyecto 1, Fidecompro): clases con atributos, métodos y relaciones; 15 historias de usuario; 8 prototipos de pantalla; diagramas de arquitectura, secuencia y navegación.</w:t>
       </w:r>
     </w:p>
-    <w:bookmarkEnd w:id="25"/>
     <w:bookmarkEnd w:id="26"/>
-    <w:bookmarkStart w:id="29" w:name="código"/>
+    <w:bookmarkEnd w:id="27"/>
+    <w:bookmarkStart w:id="30" w:name="código"/>
     <w:p>
       <w:pPr>
         <w:pStyle w:val="Heading2"/>
@@ -945,7 +1042,7 @@
         <w:t xml:space="preserve">Código</w:t>
       </w:r>
     </w:p>
-    <w:bookmarkStart w:id="27" w:name="código-v2-2026-10-08-commit-99f55d4"/>
+    <w:bookmarkStart w:id="28" w:name="código-v2-2026-10-08-commit-99f55d4"/>
     <w:p>
       <w:pPr>
         <w:pStyle w:val="Heading3"/>
@@ -967,7 +1064,7 @@
       <w:pPr>
         <w:numPr>
           <w:ilvl w:val="0"/>
-          <w:numId w:val="1008"/>
+          <w:numId w:val="1009"/>
         </w:numPr>
         <w:pStyle w:val="Compact"/>
       </w:pPr>
@@ -1045,7 +1142,7 @@
       <w:pPr>
         <w:numPr>
           <w:ilvl w:val="0"/>
-          <w:numId w:val="1008"/>
+          <w:numId w:val="1009"/>
         </w:numPr>
         <w:pStyle w:val="Compact"/>
       </w:pPr>
@@ -1068,8 +1165,8 @@
         <w:t xml:space="preserve">muestra la regla: un cliente con facturas se desactiva y uno sin facturas se elimina.</w:t>
       </w:r>
     </w:p>
-    <w:bookmarkEnd w:id="27"/>
-    <w:bookmarkStart w:id="28" w:name="código-v1-2026-10-08-commit-442187a"/>
+    <w:bookmarkEnd w:id="28"/>
+    <w:bookmarkStart w:id="29" w:name="código-v1-2026-10-08-commit-442187a"/>
     <w:p>
       <w:pPr>
         <w:pStyle w:val="Heading3"/>
@@ -1091,7 +1188,7 @@
       <w:pPr>
         <w:numPr>
           <w:ilvl w:val="0"/>
-          <w:numId w:val="1009"/>
+          <w:numId w:val="1010"/>
         </w:numPr>
         <w:pStyle w:val="Compact"/>
       </w:pPr>
@@ -1118,7 +1215,7 @@
       <w:pPr>
         <w:numPr>
           <w:ilvl w:val="0"/>
-          <w:numId w:val="1009"/>
+          <w:numId w:val="1010"/>
         </w:numPr>
         <w:pStyle w:val="Compact"/>
       </w:pPr>
@@ -1139,7 +1236,7 @@
       <w:pPr>
         <w:numPr>
           <w:ilvl w:val="0"/>
-          <w:numId w:val="1009"/>
+          <w:numId w:val="1010"/>
         </w:numPr>
         <w:pStyle w:val="Compact"/>
       </w:pPr>
@@ -1147,9 +1244,9 @@
         <w:t xml:space="preserve">Código de referencia para entender el diseño; no es un entregable.</w:t>
       </w:r>
     </w:p>
-    <w:bookmarkEnd w:id="28"/>
     <w:bookmarkEnd w:id="29"/>
     <w:bookmarkEnd w:id="30"/>
+    <w:bookmarkEnd w:id="31"/>
     <w:sectPr>
       <w:pgSz w:w="12240" w:h="15840"/>
       <w:pgMar w:left="1134" w:right="1134"/>
@@ -1363,6 +1460,9 @@
     <w:abstractNumId w:val="991"/>
   </w:num>
   <w:num w:numId="1009">
+    <w:abstractNumId w:val="991"/>
+  </w:num>
+  <w:num w:numId="1010">
     <w:abstractNumId w:val="991"/>
   </w:num>
 </w:numbering>

</xml_diff>

<commit_message>
CHANGELOG y README: diagrama de clases v1
Co-Authored-By: Claude Opus 5.5 (1M context) <noreply@anthropic.com>
Claude-Session: https://claude.ai/code/session_01VkQm5RLcZiQMKLCS3EK3og
</commit_message>
<xml_diff>
--- a/docs/Historial_de_versiones.docx
+++ b/docs/Historial_de_versiones.docx
@@ -2,7 +2,7 @@
 <file path=word/document.xml><?xml version="1.0" encoding="utf-8"?>
 <w:document xmlns:w="http://schemas.openxmlformats.org/wordprocessingml/2006/main" xmlns:m="http://schemas.openxmlformats.org/officeDocument/2006/math" xmlns:r="http://schemas.openxmlformats.org/officeDocument/2006/relationships" xmlns:o="urn:schemas-microsoft-com:office:office" xmlns:v="urn:schemas-microsoft-com:vml" xmlns:w10="urn:schemas-microsoft-com:office:word" xmlns:a="http://schemas.openxmlformats.org/drawingml/2006/main" xmlns:pic="http://schemas.openxmlformats.org/drawingml/2006/picture" xmlns:wp="http://schemas.openxmlformats.org/drawingml/2006/wordprocessingDrawing">
   <w:body>
-    <w:bookmarkStart w:id="31" w:name="historial-de-versiones"/>
+    <w:bookmarkStart w:id="33" w:name="historial-de-versiones"/>
     <w:p>
       <w:pPr>
         <w:pStyle w:val="Heading1"/>
@@ -1033,16 +1033,102 @@
     </w:p>
     <w:bookmarkEnd w:id="26"/>
     <w:bookmarkEnd w:id="27"/>
-    <w:bookmarkStart w:id="30" w:name="código"/>
+    <w:bookmarkStart w:id="29" w:name="diagrama-de-clases-word-aparte"/>
     <w:p>
       <w:pPr>
         <w:pStyle w:val="Heading2"/>
       </w:pPr>
       <w:r>
+        <w:t xml:space="preserve">Diagrama de clases (Word aparte)</w:t>
+      </w:r>
+    </w:p>
+    <w:bookmarkStart w:id="28" w:name="Xd9ab462069bc781e05750197a0b9dcc21416b9b"/>
+    <w:p>
+      <w:pPr>
+        <w:pStyle w:val="Heading3"/>
+      </w:pPr>
+      <w:r>
+        <w:t xml:space="preserve">Diagrama de clases v1 · 2026-10-08 · commit</w:t>
+      </w:r>
+      <w:r>
+        <w:t xml:space="preserve"> </w:t>
+      </w:r>
+      <w:r>
+        <w:rPr>
+          <w:rStyle w:val="VerbatimChar"/>
+        </w:rPr>
+        <w:t xml:space="preserve">7900a76</w:t>
+      </w:r>
+    </w:p>
+    <w:p>
+      <w:pPr>
+        <w:numPr>
+          <w:ilvl w:val="0"/>
+          <w:numId w:val="1009"/>
+        </w:numPr>
+        <w:pStyle w:val="Compact"/>
+      </w:pPr>
+      <w:r>
+        <w:t xml:space="preserve">Word aparte con solo la parte de clases del Avance 1: entidades o clases identificadas, sus atributos, métodos y relaciones (diagramas y descripción de cada clase, del dominio y cliente-servidor).</w:t>
+      </w:r>
+    </w:p>
+    <w:p>
+      <w:pPr>
+        <w:numPr>
+          <w:ilvl w:val="0"/>
+          <w:numId w:val="1009"/>
+        </w:numPr>
+        <w:pStyle w:val="Compact"/>
+      </w:pPr>
+      <w:r>
+        <w:t xml:space="preserve">Se genera con</w:t>
+      </w:r>
+      <w:r>
+        <w:t xml:space="preserve"> </w:t>
+      </w:r>
+      <w:r>
+        <w:rPr>
+          <w:rStyle w:val="VerbatimChar"/>
+        </w:rPr>
+        <w:t xml:space="preserve">docs/construir_diagrama_clases.py</w:t>
+      </w:r>
+      <w:r>
+        <w:t xml:space="preserve"> </w:t>
+      </w:r>
+      <w:r>
+        <w:t xml:space="preserve">a partir de la sección</w:t>
+      </w:r>
+      <w:r>
+        <w:t xml:space="preserve"> </w:t>
+      </w:r>
+      <w:r>
+        <w:t xml:space="preserve">“</w:t>
+      </w:r>
+      <w:r>
+        <w:t xml:space="preserve">Entidades y clases</w:t>
+      </w:r>
+      <w:r>
+        <w:t xml:space="preserve">”</w:t>
+      </w:r>
+      <w:r>
+        <w:t xml:space="preserve"> </w:t>
+      </w:r>
+      <w:r>
+        <w:t xml:space="preserve">del documento de diseño v7, así que siempre coincide con él.</w:t>
+      </w:r>
+    </w:p>
+    <w:bookmarkEnd w:id="28"/>
+    <w:bookmarkEnd w:id="29"/>
+    <w:bookmarkStart w:id="32" w:name="código"/>
+    <w:p>
+      <w:pPr>
+        <w:pStyle w:val="Heading2"/>
+      </w:pPr>
+      <w:r>
         <w:t xml:space="preserve">Código</w:t>
       </w:r>
     </w:p>
-    <w:bookmarkStart w:id="28" w:name="código-v2-2026-10-08-commit-99f55d4"/>
+    <w:bookmarkStart w:id="30" w:name="código-v2-2026-10-08-commit-99f55d4"/>
     <w:p>
       <w:pPr>
         <w:pStyle w:val="Heading3"/>
@@ -1064,7 +1150,7 @@
       <w:pPr>
         <w:numPr>
           <w:ilvl w:val="0"/>
-          <w:numId w:val="1009"/>
+          <w:numId w:val="1010"/>
         </w:numPr>
         <w:pStyle w:val="Compact"/>
       </w:pPr>
@@ -1142,7 +1228,7 @@
       <w:pPr>
         <w:numPr>
           <w:ilvl w:val="0"/>
-          <w:numId w:val="1009"/>
+          <w:numId w:val="1010"/>
         </w:numPr>
         <w:pStyle w:val="Compact"/>
       </w:pPr>
@@ -1165,8 +1251,8 @@
         <w:t xml:space="preserve">muestra la regla: un cliente con facturas se desactiva y uno sin facturas se elimina.</w:t>
       </w:r>
     </w:p>
-    <w:bookmarkEnd w:id="28"/>
-    <w:bookmarkStart w:id="29" w:name="código-v1-2026-10-08-commit-442187a"/>
+    <w:bookmarkEnd w:id="30"/>
+    <w:bookmarkStart w:id="31" w:name="código-v1-2026-10-08-commit-442187a"/>
     <w:p>
       <w:pPr>
         <w:pStyle w:val="Heading3"/>
@@ -1188,7 +1274,7 @@
       <w:pPr>
         <w:numPr>
           <w:ilvl w:val="0"/>
-          <w:numId w:val="1010"/>
+          <w:numId w:val="1011"/>
         </w:numPr>
         <w:pStyle w:val="Compact"/>
       </w:pPr>
@@ -1215,7 +1301,7 @@
       <w:pPr>
         <w:numPr>
           <w:ilvl w:val="0"/>
-          <w:numId w:val="1010"/>
+          <w:numId w:val="1011"/>
         </w:numPr>
         <w:pStyle w:val="Compact"/>
       </w:pPr>
@@ -1236,7 +1322,7 @@
       <w:pPr>
         <w:numPr>
           <w:ilvl w:val="0"/>
-          <w:numId w:val="1010"/>
+          <w:numId w:val="1011"/>
         </w:numPr>
         <w:pStyle w:val="Compact"/>
       </w:pPr>
@@ -1244,9 +1330,9 @@
         <w:t xml:space="preserve">Código de referencia para entender el diseño; no es un entregable.</w:t>
       </w:r>
     </w:p>
-    <w:bookmarkEnd w:id="29"/>
-    <w:bookmarkEnd w:id="30"/>
     <w:bookmarkEnd w:id="31"/>
+    <w:bookmarkEnd w:id="32"/>
+    <w:bookmarkEnd w:id="33"/>
     <w:sectPr>
       <w:pgSz w:w="12240" w:h="15840"/>
       <w:pgMar w:left="1134" w:right="1134"/>
@@ -1463,6 +1549,9 @@
     <w:abstractNumId w:val="991"/>
   </w:num>
   <w:num w:numId="1010">
+    <w:abstractNumId w:val="991"/>
+  </w:num>
+  <w:num w:numId="1011">
     <w:abstractNumId w:val="991"/>
   </w:num>
 </w:numbering>

</xml_diff>

<commit_message>
CHANGELOG y README: diagrama de clases en draw.io
Co-Authored-By: Claude Opus 5.5 (1M context) <noreply@anthropic.com>
Claude-Session: https://claude.ai/code/session_01VkQm5RLcZiQMKLCS3EK3og
</commit_message>
<xml_diff>
--- a/docs/Historial_de_versiones.docx
+++ b/docs/Historial_de_versiones.docx
@@ -1115,6 +1115,54 @@
       </w:r>
       <w:r>
         <w:t xml:space="preserve">del documento de diseño v7, así que siempre coincide con él.</w:t>
+      </w:r>
+    </w:p>
+    <w:p>
+      <w:pPr>
+        <w:numPr>
+          <w:ilvl w:val="0"/>
+          <w:numId w:val="1009"/>
+        </w:numPr>
+        <w:pStyle w:val="Compact"/>
+      </w:pPr>
+      <w:r>
+        <w:t xml:space="preserve">Versión editable en draw.io (</w:t>
+      </w:r>
+      <w:r>
+        <w:rPr>
+          <w:rStyle w:val="VerbatimChar"/>
+        </w:rPr>
+        <w:t xml:space="preserve">Avance1_Diagrama_de_Clases_v1.drawio</w:t>
+      </w:r>
+      <w:r>
+        <w:t xml:space="preserve">, commit</w:t>
+      </w:r>
+      <w:r>
+        <w:t xml:space="preserve"> </w:t>
+      </w:r>
+      <w:r>
+        <w:rPr>
+          <w:rStyle w:val="VerbatimChar"/>
+        </w:rPr>
+        <w:t xml:space="preserve">e137e8c</w:t>
+      </w:r>
+      <w:r>
+        <w:t xml:space="preserve">) con tres páginas: inventario y excepciones, personas y facturación, y cliente-servidor. Se genera con</w:t>
+      </w:r>
+      <w:r>
+        <w:t xml:space="preserve"> </w:t>
+      </w:r>
+      <w:r>
+        <w:rPr>
+          <w:rStyle w:val="VerbatimChar"/>
+        </w:rPr>
+        <w:t xml:space="preserve">docs/exportar_drawio.py</w:t>
+      </w:r>
+      <w:r>
+        <w:t xml:space="preserve"> </w:t>
+      </w:r>
+      <w:r>
+        <w:t xml:space="preserve">desde los diagramas de Mermaid.</w:t>
       </w:r>
     </w:p>
     <w:bookmarkEnd w:id="28"/>

</xml_diff>

<commit_message>
CHANGELOG y README: diagrama de clases simplificado v1
Co-Authored-By: Claude Opus 5.5 (1M context) <noreply@anthropic.com>
Claude-Session: https://claude.ai/code/session_01VkQm5RLcZiQMKLCS3EK3og
</commit_message>
<xml_diff>
--- a/docs/Historial_de_versiones.docx
+++ b/docs/Historial_de_versiones.docx
@@ -2,7 +2,7 @@
 <file path=word/document.xml><?xml version="1.0" encoding="utf-8"?>
 <w:document xmlns:w="http://schemas.openxmlformats.org/wordprocessingml/2006/main" xmlns:m="http://schemas.openxmlformats.org/officeDocument/2006/math" xmlns:r="http://schemas.openxmlformats.org/officeDocument/2006/relationships" xmlns:o="urn:schemas-microsoft-com:office:office" xmlns:v="urn:schemas-microsoft-com:vml" xmlns:w10="urn:schemas-microsoft-com:office:word" xmlns:a="http://schemas.openxmlformats.org/drawingml/2006/main" xmlns:pic="http://schemas.openxmlformats.org/drawingml/2006/picture" xmlns:wp="http://schemas.openxmlformats.org/drawingml/2006/wordprocessingDrawing">
   <w:body>
-    <w:bookmarkStart w:id="33" w:name="historial-de-versiones"/>
+    <w:bookmarkStart w:id="34" w:name="historial-de-versiones"/>
     <w:p>
       <w:pPr>
         <w:pStyle w:val="Heading1"/>
@@ -1033,7 +1033,7 @@
     </w:p>
     <w:bookmarkEnd w:id="26"/>
     <w:bookmarkEnd w:id="27"/>
-    <w:bookmarkStart w:id="29" w:name="diagrama-de-clases-word-aparte"/>
+    <w:bookmarkStart w:id="30" w:name="diagrama-de-clases-word-aparte"/>
     <w:p>
       <w:pPr>
         <w:pStyle w:val="Heading2"/>
@@ -1166,8 +1166,90 @@
       </w:r>
     </w:p>
     <w:bookmarkEnd w:id="28"/>
+    <w:bookmarkStart w:id="29" w:name="X861f067dae0e8a264748fdbddc6a638f1e0d1d0"/>
+    <w:p>
+      <w:pPr>
+        <w:pStyle w:val="Heading3"/>
+      </w:pPr>
+      <w:r>
+        <w:t xml:space="preserve">Diagrama de clases simplificado v1 · 2026-10-08 · commit</w:t>
+      </w:r>
+      <w:r>
+        <w:t xml:space="preserve"> </w:t>
+      </w:r>
+      <w:r>
+        <w:rPr>
+          <w:rStyle w:val="VerbatimChar"/>
+        </w:rPr>
+        <w:t xml:space="preserve">6942679</w:t>
+      </w:r>
+    </w:p>
+    <w:p>
+      <w:pPr>
+        <w:numPr>
+          <w:ilvl w:val="0"/>
+          <w:numId w:val="1010"/>
+        </w:numPr>
+        <w:pStyle w:val="Compact"/>
+      </w:pPr>
+      <w:r>
+        <w:t xml:space="preserve">Un solo diagrama, en una página, con las 12 clases principales del dominio (personas, productos, inventario y facturación), sus atributos y métodos más importantes y sus relaciones. Deja fuera los registros, las excepciones, las enumeraciones y las clases cliente-servidor.</w:t>
+      </w:r>
+    </w:p>
+    <w:p>
+      <w:pPr>
+        <w:numPr>
+          <w:ilvl w:val="0"/>
+          <w:numId w:val="1010"/>
+        </w:numPr>
+        <w:pStyle w:val="Compact"/>
+      </w:pPr>
+      <w:r>
+        <w:t xml:space="preserve">Archivo editable</w:t>
+      </w:r>
+      <w:r>
+        <w:t xml:space="preserve"> </w:t>
+      </w:r>
+      <w:r>
+        <w:rPr>
+          <w:rStyle w:val="VerbatimChar"/>
+        </w:rPr>
+        <w:t xml:space="preserve">Avance1_Diagrama_de_Clases_Simplificado_v1.drawio</w:t>
+      </w:r>
+      <w:r>
+        <w:t xml:space="preserve"> </w:t>
+      </w:r>
+      <w:r>
+        <w:t xml:space="preserve">e imagen</w:t>
+      </w:r>
+      <w:r>
+        <w:t xml:space="preserve"> </w:t>
+      </w:r>
+      <w:r>
+        <w:rPr>
+          <w:rStyle w:val="VerbatimChar"/>
+        </w:rPr>
+        <w:t xml:space="preserve">.png</w:t>
+      </w:r>
+      <w:r>
+        <w:t xml:space="preserve">. Fuente:</w:t>
+      </w:r>
+      <w:r>
+        <w:t xml:space="preserve"> </w:t>
+      </w:r>
+      <w:r>
+        <w:rPr>
+          <w:rStyle w:val="VerbatimChar"/>
+        </w:rPr>
+        <w:t xml:space="preserve">docs/diagramas/00_clases_simplificado.mmd</w:t>
+      </w:r>
+      <w:r>
+        <w:t xml:space="preserve">.</w:t>
+      </w:r>
+    </w:p>
     <w:bookmarkEnd w:id="29"/>
-    <w:bookmarkStart w:id="32" w:name="código"/>
+    <w:bookmarkEnd w:id="30"/>
+    <w:bookmarkStart w:id="33" w:name="código"/>
     <w:p>
       <w:pPr>
         <w:pStyle w:val="Heading2"/>
@@ -1176,7 +1258,7 @@
         <w:t xml:space="preserve">Código</w:t>
       </w:r>
     </w:p>
-    <w:bookmarkStart w:id="30" w:name="código-v2-2026-10-08-commit-99f55d4"/>
+    <w:bookmarkStart w:id="31" w:name="código-v2-2026-10-08-commit-99f55d4"/>
     <w:p>
       <w:pPr>
         <w:pStyle w:val="Heading3"/>
@@ -1198,7 +1280,7 @@
       <w:pPr>
         <w:numPr>
           <w:ilvl w:val="0"/>
-          <w:numId w:val="1010"/>
+          <w:numId w:val="1011"/>
         </w:numPr>
         <w:pStyle w:val="Compact"/>
       </w:pPr>
@@ -1276,7 +1358,7 @@
       <w:pPr>
         <w:numPr>
           <w:ilvl w:val="0"/>
-          <w:numId w:val="1010"/>
+          <w:numId w:val="1011"/>
         </w:numPr>
         <w:pStyle w:val="Compact"/>
       </w:pPr>
@@ -1299,8 +1381,8 @@
         <w:t xml:space="preserve">muestra la regla: un cliente con facturas se desactiva y uno sin facturas se elimina.</w:t>
       </w:r>
     </w:p>
-    <w:bookmarkEnd w:id="30"/>
-    <w:bookmarkStart w:id="31" w:name="código-v1-2026-10-08-commit-442187a"/>
+    <w:bookmarkEnd w:id="31"/>
+    <w:bookmarkStart w:id="32" w:name="código-v1-2026-10-08-commit-442187a"/>
     <w:p>
       <w:pPr>
         <w:pStyle w:val="Heading3"/>
@@ -1322,7 +1404,7 @@
       <w:pPr>
         <w:numPr>
           <w:ilvl w:val="0"/>
-          <w:numId w:val="1011"/>
+          <w:numId w:val="1012"/>
         </w:numPr>
         <w:pStyle w:val="Compact"/>
       </w:pPr>
@@ -1349,7 +1431,7 @@
       <w:pPr>
         <w:numPr>
           <w:ilvl w:val="0"/>
-          <w:numId w:val="1011"/>
+          <w:numId w:val="1012"/>
         </w:numPr>
         <w:pStyle w:val="Compact"/>
       </w:pPr>
@@ -1370,7 +1452,7 @@
       <w:pPr>
         <w:numPr>
           <w:ilvl w:val="0"/>
-          <w:numId w:val="1011"/>
+          <w:numId w:val="1012"/>
         </w:numPr>
         <w:pStyle w:val="Compact"/>
       </w:pPr>
@@ -1378,9 +1460,9 @@
         <w:t xml:space="preserve">Código de referencia para entender el diseño; no es un entregable.</w:t>
       </w:r>
     </w:p>
-    <w:bookmarkEnd w:id="31"/>
     <w:bookmarkEnd w:id="32"/>
     <w:bookmarkEnd w:id="33"/>
+    <w:bookmarkEnd w:id="34"/>
     <w:sectPr>
       <w:pgSz w:w="12240" w:h="15840"/>
       <w:pgMar w:left="1134" w:right="1134"/>
@@ -1600,6 +1682,9 @@
     <w:abstractNumId w:val="991"/>
   </w:num>
   <w:num w:numId="1011">
+    <w:abstractNumId w:val="991"/>
+  </w:num>
+  <w:num w:numId="1012">
     <w:abstractNumId w:val="991"/>
   </w:num>
 </w:numbering>

</xml_diff>

<commit_message>
CHANGELOG y README: diagrama de clases simplificado v2
Co-Authored-By: Claude Opus 5.5 (1M context) <noreply@anthropic.com>
Claude-Session: https://claude.ai/code/session_01VkQm5RLcZiQMKLCS3EK3og
</commit_message>
<xml_diff>
--- a/docs/Historial_de_versiones.docx
+++ b/docs/Historial_de_versiones.docx
@@ -2,7 +2,7 @@
 <file path=word/document.xml><?xml version="1.0" encoding="utf-8"?>
 <w:document xmlns:w="http://schemas.openxmlformats.org/wordprocessingml/2006/main" xmlns:m="http://schemas.openxmlformats.org/officeDocument/2006/math" xmlns:r="http://schemas.openxmlformats.org/officeDocument/2006/relationships" xmlns:o="urn:schemas-microsoft-com:office:office" xmlns:v="urn:schemas-microsoft-com:vml" xmlns:w10="urn:schemas-microsoft-com:office:word" xmlns:a="http://schemas.openxmlformats.org/drawingml/2006/main" xmlns:pic="http://schemas.openxmlformats.org/drawingml/2006/picture" xmlns:wp="http://schemas.openxmlformats.org/drawingml/2006/wordprocessingDrawing">
   <w:body>
-    <w:bookmarkStart w:id="34" w:name="historial-de-versiones"/>
+    <w:bookmarkStart w:id="35" w:name="historial-de-versiones"/>
     <w:p>
       <w:pPr>
         <w:pStyle w:val="Heading1"/>
@@ -1033,7 +1033,7 @@
     </w:p>
     <w:bookmarkEnd w:id="26"/>
     <w:bookmarkEnd w:id="27"/>
-    <w:bookmarkStart w:id="30" w:name="diagrama-de-clases-word-aparte"/>
+    <w:bookmarkStart w:id="31" w:name="diagrama-de-clases-word-aparte"/>
     <w:p>
       <w:pPr>
         <w:pStyle w:val="Heading2"/>
@@ -1166,12 +1166,72 @@
       </w:r>
     </w:p>
     <w:bookmarkEnd w:id="28"/>
-    <w:bookmarkStart w:id="29" w:name="X861f067dae0e8a264748fdbddc6a638f1e0d1d0"/>
+    <w:bookmarkStart w:id="29" w:name="Xc4a290eef64159bbb850880299580525a5d9206"/>
     <w:p>
       <w:pPr>
         <w:pStyle w:val="Heading3"/>
       </w:pPr>
       <w:r>
+        <w:t xml:space="preserve">Diagrama de clases simplificado v2 · 2026-10-08 · commit</w:t>
+      </w:r>
+      <w:r>
+        <w:t xml:space="preserve"> </w:t>
+      </w:r>
+      <w:r>
+        <w:rPr>
+          <w:rStyle w:val="VerbatimChar"/>
+        </w:rPr>
+        <w:t xml:space="preserve">75f343e</w:t>
+      </w:r>
+    </w:p>
+    <w:p>
+      <w:pPr>
+        <w:numPr>
+          <w:ilvl w:val="0"/>
+          <w:numId w:val="1010"/>
+        </w:numPr>
+        <w:pStyle w:val="Compact"/>
+      </w:pPr>
+      <w:r>
+        <w:t xml:space="preserve">Se agrega al lado del diagrama un cuadro de</w:t>
+      </w:r>
+      <w:r>
+        <w:t xml:space="preserve"> </w:t>
+      </w:r>
+      <w:r>
+        <w:rPr>
+          <w:bCs/>
+          <w:b/>
+        </w:rPr>
+        <w:t xml:space="preserve">simbología</w:t>
+      </w:r>
+      <w:r>
+        <w:t xml:space="preserve"> </w:t>
+      </w:r>
+      <w:r>
+        <w:t xml:space="preserve">que explica cada símbolo: partes de la clase, visibilidad (+, -, #), subrayado (static), cursiva (abstracto), «abstract» e «interface», multiplicidad (1,</w:t>
+      </w:r>
+      <w:r>
+        <w:t xml:space="preserve"> </w:t>
+      </w:r>
+      <w:r>
+        <w:rPr>
+          <w:iCs/>
+          <w:i/>
+        </w:rPr>
+        <w:t xml:space="preserve">, 1..</w:t>
+      </w:r>
+      <w:r>
+        <w:t xml:space="preserve">) con un ejemplo, y cada tipo de flecha (herencia, implementación, composición, agregación y asociación).</w:t>
+      </w:r>
+    </w:p>
+    <w:bookmarkEnd w:id="29"/>
+    <w:bookmarkStart w:id="30" w:name="X861f067dae0e8a264748fdbddc6a638f1e0d1d0"/>
+    <w:p>
+      <w:pPr>
+        <w:pStyle w:val="Heading3"/>
+      </w:pPr>
+      <w:r>
         <w:t xml:space="preserve">Diagrama de clases simplificado v1 · 2026-10-08 · commit</w:t>
       </w:r>
       <w:r>
@@ -1188,7 +1248,7 @@
       <w:pPr>
         <w:numPr>
           <w:ilvl w:val="0"/>
-          <w:numId w:val="1010"/>
+          <w:numId w:val="1011"/>
         </w:numPr>
         <w:pStyle w:val="Compact"/>
       </w:pPr>
@@ -1200,7 +1260,7 @@
       <w:pPr>
         <w:numPr>
           <w:ilvl w:val="0"/>
-          <w:numId w:val="1010"/>
+          <w:numId w:val="1011"/>
         </w:numPr>
         <w:pStyle w:val="Compact"/>
       </w:pPr>
@@ -1247,9 +1307,9 @@
         <w:t xml:space="preserve">.</w:t>
       </w:r>
     </w:p>
-    <w:bookmarkEnd w:id="29"/>
     <w:bookmarkEnd w:id="30"/>
-    <w:bookmarkStart w:id="33" w:name="código"/>
+    <w:bookmarkEnd w:id="31"/>
+    <w:bookmarkStart w:id="34" w:name="código"/>
     <w:p>
       <w:pPr>
         <w:pStyle w:val="Heading2"/>
@@ -1258,7 +1318,7 @@
         <w:t xml:space="preserve">Código</w:t>
       </w:r>
     </w:p>
-    <w:bookmarkStart w:id="31" w:name="código-v2-2026-10-08-commit-99f55d4"/>
+    <w:bookmarkStart w:id="32" w:name="código-v2-2026-10-08-commit-99f55d4"/>
     <w:p>
       <w:pPr>
         <w:pStyle w:val="Heading3"/>
@@ -1280,7 +1340,7 @@
       <w:pPr>
         <w:numPr>
           <w:ilvl w:val="0"/>
-          <w:numId w:val="1011"/>
+          <w:numId w:val="1012"/>
         </w:numPr>
         <w:pStyle w:val="Compact"/>
       </w:pPr>
@@ -1358,7 +1418,7 @@
       <w:pPr>
         <w:numPr>
           <w:ilvl w:val="0"/>
-          <w:numId w:val="1011"/>
+          <w:numId w:val="1012"/>
         </w:numPr>
         <w:pStyle w:val="Compact"/>
       </w:pPr>
@@ -1381,8 +1441,8 @@
         <w:t xml:space="preserve">muestra la regla: un cliente con facturas se desactiva y uno sin facturas se elimina.</w:t>
       </w:r>
     </w:p>
-    <w:bookmarkEnd w:id="31"/>
-    <w:bookmarkStart w:id="32" w:name="código-v1-2026-10-08-commit-442187a"/>
+    <w:bookmarkEnd w:id="32"/>
+    <w:bookmarkStart w:id="33" w:name="código-v1-2026-10-08-commit-442187a"/>
     <w:p>
       <w:pPr>
         <w:pStyle w:val="Heading3"/>
@@ -1404,7 +1464,7 @@
       <w:pPr>
         <w:numPr>
           <w:ilvl w:val="0"/>
-          <w:numId w:val="1012"/>
+          <w:numId w:val="1013"/>
         </w:numPr>
         <w:pStyle w:val="Compact"/>
       </w:pPr>
@@ -1431,7 +1491,7 @@
       <w:pPr>
         <w:numPr>
           <w:ilvl w:val="0"/>
-          <w:numId w:val="1012"/>
+          <w:numId w:val="1013"/>
         </w:numPr>
         <w:pStyle w:val="Compact"/>
       </w:pPr>
@@ -1452,7 +1512,7 @@
       <w:pPr>
         <w:numPr>
           <w:ilvl w:val="0"/>
-          <w:numId w:val="1012"/>
+          <w:numId w:val="1013"/>
         </w:numPr>
         <w:pStyle w:val="Compact"/>
       </w:pPr>
@@ -1460,9 +1520,9 @@
         <w:t xml:space="preserve">Código de referencia para entender el diseño; no es un entregable.</w:t>
       </w:r>
     </w:p>
-    <w:bookmarkEnd w:id="32"/>
     <w:bookmarkEnd w:id="33"/>
     <w:bookmarkEnd w:id="34"/>
+    <w:bookmarkEnd w:id="35"/>
     <w:sectPr>
       <w:pgSz w:w="12240" w:h="15840"/>
       <w:pgMar w:left="1134" w:right="1134"/>
@@ -1685,6 +1745,9 @@
     <w:abstractNumId w:val="991"/>
   </w:num>
   <w:num w:numId="1012">
+    <w:abstractNumId w:val="991"/>
+  </w:num>
+  <w:num w:numId="1013">
     <w:abstractNumId w:val="991"/>
   </w:num>
 </w:numbering>

</xml_diff>

<commit_message>
CHANGELOG y README: diagrama de clases simplificado v3
Co-Authored-By: Claude Opus 5.5 (1M context) <noreply@anthropic.com>
Claude-Session: https://claude.ai/code/session_01VkQm5RLcZiQMKLCS3EK3og
</commit_message>
<xml_diff>
--- a/docs/Historial_de_versiones.docx
+++ b/docs/Historial_de_versiones.docx
@@ -2,7 +2,7 @@
 <file path=word/document.xml><?xml version="1.0" encoding="utf-8"?>
 <w:document xmlns:w="http://schemas.openxmlformats.org/wordprocessingml/2006/main" xmlns:m="http://schemas.openxmlformats.org/officeDocument/2006/math" xmlns:r="http://schemas.openxmlformats.org/officeDocument/2006/relationships" xmlns:o="urn:schemas-microsoft-com:office:office" xmlns:v="urn:schemas-microsoft-com:vml" xmlns:w10="urn:schemas-microsoft-com:office:word" xmlns:a="http://schemas.openxmlformats.org/drawingml/2006/main" xmlns:pic="http://schemas.openxmlformats.org/drawingml/2006/picture" xmlns:wp="http://schemas.openxmlformats.org/drawingml/2006/wordprocessingDrawing">
   <w:body>
-    <w:bookmarkStart w:id="35" w:name="historial-de-versiones"/>
+    <w:bookmarkStart w:id="36" w:name="historial-de-versiones"/>
     <w:p>
       <w:pPr>
         <w:pStyle w:val="Heading1"/>
@@ -1033,7 +1033,7 @@
     </w:p>
     <w:bookmarkEnd w:id="26"/>
     <w:bookmarkEnd w:id="27"/>
-    <w:bookmarkStart w:id="31" w:name="diagrama-de-clases-word-aparte"/>
+    <w:bookmarkStart w:id="32" w:name="diagrama-de-clases-word-aparte"/>
     <w:p>
       <w:pPr>
         <w:pStyle w:val="Heading2"/>
@@ -1166,12 +1166,67 @@
       </w:r>
     </w:p>
     <w:bookmarkEnd w:id="28"/>
-    <w:bookmarkStart w:id="29" w:name="Xc4a290eef64159bbb850880299580525a5d9206"/>
+    <w:bookmarkStart w:id="29" w:name="X391512b3d0076f68eba38bfbe03fbe6da9ec0d0"/>
     <w:p>
       <w:pPr>
         <w:pStyle w:val="Heading3"/>
       </w:pPr>
       <w:r>
+        <w:t xml:space="preserve">Diagrama de clases simplificado v3 · 2026-10-08 · commit</w:t>
+      </w:r>
+      <w:r>
+        <w:t xml:space="preserve"> </w:t>
+      </w:r>
+      <w:r>
+        <w:rPr>
+          <w:rStyle w:val="VerbatimChar"/>
+        </w:rPr>
+        <w:t xml:space="preserve">4438bd1</w:t>
+      </w:r>
+    </w:p>
+    <w:p>
+      <w:pPr>
+        <w:numPr>
+          <w:ilvl w:val="0"/>
+          <w:numId w:val="1010"/>
+        </w:numPr>
+        <w:pStyle w:val="Compact"/>
+      </w:pPr>
+      <w:r>
+        <w:t xml:space="preserve">Formato vertical para poner la imagen en una página completa de Word: la simbología pasa debajo del diagrama, en dos columnas, y la imagen queda con la proporción de una página carta con márgenes de 2 cm (ancho/alto = 0,8).</w:t>
+      </w:r>
+    </w:p>
+    <w:p>
+      <w:pPr>
+        <w:numPr>
+          <w:ilvl w:val="0"/>
+          <w:numId w:val="1010"/>
+        </w:numPr>
+        <w:pStyle w:val="Compact"/>
+      </w:pPr>
+      <w:r>
+        <w:t xml:space="preserve">Los métodos muestran solo los tipos de sus parámetros, por ejemplo</w:t>
+      </w:r>
+      <w:r>
+        <w:t xml:space="preserve"> </w:t>
+      </w:r>
+      <w:r>
+        <w:rPr>
+          <w:rStyle w:val="VerbatimChar"/>
+        </w:rPr>
+        <w:t xml:space="preserve">agregarDetalle(Producto, int)</w:t>
+      </w:r>
+      <w:r>
+        <w:t xml:space="preserve">, para que las clases sean más angostas.</w:t>
+      </w:r>
+    </w:p>
+    <w:bookmarkEnd w:id="29"/>
+    <w:bookmarkStart w:id="30" w:name="Xc4a290eef64159bbb850880299580525a5d9206"/>
+    <w:p>
+      <w:pPr>
+        <w:pStyle w:val="Heading3"/>
+      </w:pPr>
+      <w:r>
         <w:t xml:space="preserve">Diagrama de clases simplificado v2 · 2026-10-08 · commit</w:t>
       </w:r>
       <w:r>
@@ -1188,7 +1243,7 @@
       <w:pPr>
         <w:numPr>
           <w:ilvl w:val="0"/>
-          <w:numId w:val="1010"/>
+          <w:numId w:val="1011"/>
         </w:numPr>
         <w:pStyle w:val="Compact"/>
       </w:pPr>
@@ -1225,8 +1280,8 @@
         <w:t xml:space="preserve">) con un ejemplo, y cada tipo de flecha (herencia, implementación, composición, agregación y asociación).</w:t>
       </w:r>
     </w:p>
-    <w:bookmarkEnd w:id="29"/>
-    <w:bookmarkStart w:id="30" w:name="X861f067dae0e8a264748fdbddc6a638f1e0d1d0"/>
+    <w:bookmarkEnd w:id="30"/>
+    <w:bookmarkStart w:id="31" w:name="X861f067dae0e8a264748fdbddc6a638f1e0d1d0"/>
     <w:p>
       <w:pPr>
         <w:pStyle w:val="Heading3"/>
@@ -1248,7 +1303,7 @@
       <w:pPr>
         <w:numPr>
           <w:ilvl w:val="0"/>
-          <w:numId w:val="1011"/>
+          <w:numId w:val="1012"/>
         </w:numPr>
         <w:pStyle w:val="Compact"/>
       </w:pPr>
@@ -1260,7 +1315,7 @@
       <w:pPr>
         <w:numPr>
           <w:ilvl w:val="0"/>
-          <w:numId w:val="1011"/>
+          <w:numId w:val="1012"/>
         </w:numPr>
         <w:pStyle w:val="Compact"/>
       </w:pPr>
@@ -1307,9 +1362,9 @@
         <w:t xml:space="preserve">.</w:t>
       </w:r>
     </w:p>
-    <w:bookmarkEnd w:id="30"/>
     <w:bookmarkEnd w:id="31"/>
-    <w:bookmarkStart w:id="34" w:name="código"/>
+    <w:bookmarkEnd w:id="32"/>
+    <w:bookmarkStart w:id="35" w:name="código"/>
     <w:p>
       <w:pPr>
         <w:pStyle w:val="Heading2"/>
@@ -1318,7 +1373,7 @@
         <w:t xml:space="preserve">Código</w:t>
       </w:r>
     </w:p>
-    <w:bookmarkStart w:id="32" w:name="código-v2-2026-10-08-commit-99f55d4"/>
+    <w:bookmarkStart w:id="33" w:name="código-v2-2026-10-08-commit-99f55d4"/>
     <w:p>
       <w:pPr>
         <w:pStyle w:val="Heading3"/>
@@ -1340,7 +1395,7 @@
       <w:pPr>
         <w:numPr>
           <w:ilvl w:val="0"/>
-          <w:numId w:val="1012"/>
+          <w:numId w:val="1013"/>
         </w:numPr>
         <w:pStyle w:val="Compact"/>
       </w:pPr>
@@ -1418,7 +1473,7 @@
       <w:pPr>
         <w:numPr>
           <w:ilvl w:val="0"/>
-          <w:numId w:val="1012"/>
+          <w:numId w:val="1013"/>
         </w:numPr>
         <w:pStyle w:val="Compact"/>
       </w:pPr>
@@ -1441,8 +1496,8 @@
         <w:t xml:space="preserve">muestra la regla: un cliente con facturas se desactiva y uno sin facturas se elimina.</w:t>
       </w:r>
     </w:p>
-    <w:bookmarkEnd w:id="32"/>
-    <w:bookmarkStart w:id="33" w:name="código-v1-2026-10-08-commit-442187a"/>
+    <w:bookmarkEnd w:id="33"/>
+    <w:bookmarkStart w:id="34" w:name="código-v1-2026-10-08-commit-442187a"/>
     <w:p>
       <w:pPr>
         <w:pStyle w:val="Heading3"/>
@@ -1464,7 +1519,7 @@
       <w:pPr>
         <w:numPr>
           <w:ilvl w:val="0"/>
-          <w:numId w:val="1013"/>
+          <w:numId w:val="1014"/>
         </w:numPr>
         <w:pStyle w:val="Compact"/>
       </w:pPr>
@@ -1491,7 +1546,7 @@
       <w:pPr>
         <w:numPr>
           <w:ilvl w:val="0"/>
-          <w:numId w:val="1013"/>
+          <w:numId w:val="1014"/>
         </w:numPr>
         <w:pStyle w:val="Compact"/>
       </w:pPr>
@@ -1512,7 +1567,7 @@
       <w:pPr>
         <w:numPr>
           <w:ilvl w:val="0"/>
-          <w:numId w:val="1013"/>
+          <w:numId w:val="1014"/>
         </w:numPr>
         <w:pStyle w:val="Compact"/>
       </w:pPr>
@@ -1520,9 +1575,9 @@
         <w:t xml:space="preserve">Código de referencia para entender el diseño; no es un entregable.</w:t>
       </w:r>
     </w:p>
-    <w:bookmarkEnd w:id="33"/>
     <w:bookmarkEnd w:id="34"/>
     <w:bookmarkEnd w:id="35"/>
+    <w:bookmarkEnd w:id="36"/>
     <w:sectPr>
       <w:pgSz w:w="12240" w:h="15840"/>
       <w:pgMar w:left="1134" w:right="1134"/>
@@ -1748,6 +1803,9 @@
     <w:abstractNumId w:val="991"/>
   </w:num>
   <w:num w:numId="1013">
+    <w:abstractNumId w:val="991"/>
+  </w:num>
+  <w:num w:numId="1014">
     <w:abstractNumId w:val="991"/>
   </w:num>
 </w:numbering>

</xml_diff>

<commit_message>
CHANGELOG y README: documento v8, código v3, diagrama de clases v2 y simplificado v4
Co-Authored-By: Claude Opus 5.5 (1M context) <noreply@anthropic.com>
Claude-Session: https://claude.ai/code/session_01VkQm5RLcZiQMKLCS3EK3og
</commit_message>
<xml_diff>
--- a/docs/Historial_de_versiones.docx
+++ b/docs/Historial_de_versiones.docx
@@ -2,7 +2,7 @@
 <file path=word/document.xml><?xml version="1.0" encoding="utf-8"?>
 <w:document xmlns:w="http://schemas.openxmlformats.org/wordprocessingml/2006/main" xmlns:m="http://schemas.openxmlformats.org/officeDocument/2006/math" xmlns:r="http://schemas.openxmlformats.org/officeDocument/2006/relationships" xmlns:o="urn:schemas-microsoft-com:office:office" xmlns:v="urn:schemas-microsoft-com:vml" xmlns:w10="urn:schemas-microsoft-com:office:word" xmlns:a="http://schemas.openxmlformats.org/drawingml/2006/main" xmlns:pic="http://schemas.openxmlformats.org/drawingml/2006/picture" xmlns:wp="http://schemas.openxmlformats.org/drawingml/2006/wordprocessingDrawing">
   <w:body>
-    <w:bookmarkStart w:id="36" w:name="historial-de-versiones"/>
+    <w:bookmarkStart w:id="40" w:name="historial-de-versiones"/>
     <w:p>
       <w:pPr>
         <w:pStyle w:val="Heading1"/>
@@ -153,7 +153,7 @@
         <w:t xml:space="preserve">.</w:t>
       </w:r>
     </w:p>
-    <w:bookmarkStart w:id="27" w:name="documento-de-diseño"/>
+    <w:bookmarkStart w:id="28" w:name="documento-de-diseño"/>
     <w:p>
       <w:pPr>
         <w:pStyle w:val="Heading2"/>
@@ -162,12 +162,283 @@
         <w:t xml:space="preserve">Documento de diseño</w:t>
       </w:r>
     </w:p>
-    <w:bookmarkStart w:id="20" w:name="documento-v7-2026-10-08-commit-047b31c"/>
+    <w:bookmarkStart w:id="20" w:name="documento-v8-2026-10-08-commit-626c373"/>
     <w:p>
       <w:pPr>
         <w:pStyle w:val="Heading3"/>
       </w:pPr>
       <w:r>
+        <w:t xml:space="preserve">Documento v8 · 2026-10-08 · commit</w:t>
+      </w:r>
+      <w:r>
+        <w:t xml:space="preserve"> </w:t>
+      </w:r>
+      <w:r>
+        <w:rPr>
+          <w:rStyle w:val="VerbatimChar"/>
+        </w:rPr>
+        <w:t xml:space="preserve">626c373</w:t>
+      </w:r>
+    </w:p>
+    <w:p>
+      <w:pPr>
+        <w:numPr>
+          <w:ilvl w:val="0"/>
+          <w:numId w:val="1002"/>
+        </w:numPr>
+        <w:pStyle w:val="Compact"/>
+      </w:pPr>
+      <w:r>
+        <w:t xml:space="preserve">El profesor explicó que un error común es usar listas para todo. Ahora cada colección se elige según su uso, como en sus ejemplos (</w:t>
+      </w:r>
+      <w:r>
+        <w:rPr>
+          <w:rStyle w:val="VerbatimChar"/>
+        </w:rPr>
+        <w:t xml:space="preserve">EjemploList</w:t>
+      </w:r>
+      <w:r>
+        <w:t xml:space="preserve">,</w:t>
+      </w:r>
+      <w:r>
+        <w:t xml:space="preserve"> </w:t>
+      </w:r>
+      <w:r>
+        <w:rPr>
+          <w:rStyle w:val="VerbatimChar"/>
+        </w:rPr>
+        <w:t xml:space="preserve">EjemploSet</w:t>
+      </w:r>
+      <w:r>
+        <w:t xml:space="preserve">,</w:t>
+      </w:r>
+      <w:r>
+        <w:t xml:space="preserve"> </w:t>
+      </w:r>
+      <w:r>
+        <w:rPr>
+          <w:rStyle w:val="VerbatimChar"/>
+        </w:rPr>
+        <w:t xml:space="preserve">EjemploMap</w:t>
+      </w:r>
+      <w:r>
+        <w:t xml:space="preserve">,</w:t>
+      </w:r>
+      <w:r>
+        <w:t xml:space="preserve"> </w:t>
+      </w:r>
+      <w:r>
+        <w:rPr>
+          <w:rStyle w:val="VerbatimChar"/>
+        </w:rPr>
+        <w:t xml:space="preserve">EjemploTreeMap</w:t>
+      </w:r>
+      <w:r>
+        <w:t xml:space="preserve">), y se declaran por su interface:</w:t>
+      </w:r>
+      <w:r>
+        <w:t xml:space="preserve"> </w:t>
+      </w:r>
+      <w:r>
+        <w:rPr>
+          <w:rStyle w:val="VerbatimChar"/>
+        </w:rPr>
+        <w:t xml:space="preserve">List&lt;T&gt; lista = new ArrayList&lt;&gt;()</w:t>
+      </w:r>
+      <w:r>
+        <w:t xml:space="preserve">.</w:t>
+      </w:r>
+    </w:p>
+    <w:p>
+      <w:pPr>
+        <w:numPr>
+          <w:ilvl w:val="0"/>
+          <w:numId w:val="1002"/>
+        </w:numPr>
+        <w:pStyle w:val="Compact"/>
+      </w:pPr>
+      <w:r>
+        <w:rPr>
+          <w:rStyle w:val="VerbatimChar"/>
+        </w:rPr>
+        <w:t xml:space="preserve">List</w:t>
+      </w:r>
+      <w:r>
+        <w:t xml:space="preserve"> </w:t>
+      </w:r>
+      <w:r>
+        <w:t xml:space="preserve">donde importa el orden: detalles de la factura, productos de la categoría, categorías del inventario y los resultados de las consultas.</w:t>
+      </w:r>
+    </w:p>
+    <w:p>
+      <w:pPr>
+        <w:numPr>
+          <w:ilvl w:val="0"/>
+          <w:numId w:val="1002"/>
+        </w:numPr>
+        <w:pStyle w:val="Compact"/>
+      </w:pPr>
+      <w:r>
+        <w:rPr>
+          <w:rStyle w:val="VerbatimChar"/>
+        </w:rPr>
+        <w:t xml:space="preserve">Set&lt;String&gt;</w:t>
+      </w:r>
+      <w:r>
+        <w:t xml:space="preserve"> </w:t>
+      </w:r>
+      <w:r>
+        <w:t xml:space="preserve">para las advertencias de</w:t>
+      </w:r>
+      <w:r>
+        <w:t xml:space="preserve"> </w:t>
+      </w:r>
+      <w:r>
+        <w:rPr>
+          <w:rStyle w:val="VerbatimChar"/>
+        </w:rPr>
+        <w:t xml:space="preserve">ArticuloHogar</w:t>
+      </w:r>
+      <w:r>
+        <w:t xml:space="preserve"> </w:t>
+      </w:r>
+      <w:r>
+        <w:t xml:space="preserve">(no se repiten).</w:t>
+      </w:r>
+    </w:p>
+    <w:p>
+      <w:pPr>
+        <w:numPr>
+          <w:ilvl w:val="0"/>
+          <w:numId w:val="1002"/>
+        </w:numPr>
+        <w:pStyle w:val="Compact"/>
+      </w:pPr>
+      <w:r>
+        <w:rPr>
+          <w:rStyle w:val="VerbatimChar"/>
+        </w:rPr>
+        <w:t xml:space="preserve">Map&lt;Integer, Usuario&gt;</w:t>
+      </w:r>
+      <w:r>
+        <w:t xml:space="preserve"> </w:t>
+      </w:r>
+      <w:r>
+        <w:t xml:space="preserve">y</w:t>
+      </w:r>
+      <w:r>
+        <w:t xml:space="preserve"> </w:t>
+      </w:r>
+      <w:r>
+        <w:rPr>
+          <w:rStyle w:val="VerbatimChar"/>
+        </w:rPr>
+        <w:t xml:space="preserve">Map&lt;Integer, Cliente&gt;</w:t>
+      </w:r>
+      <w:r>
+        <w:t xml:space="preserve"> </w:t>
+      </w:r>
+      <w:r>
+        <w:t xml:space="preserve">(</w:t>
+      </w:r>
+      <w:r>
+        <w:rPr>
+          <w:rStyle w:val="VerbatimChar"/>
+        </w:rPr>
+        <w:t xml:space="preserve">HashMap</w:t>
+      </w:r>
+      <w:r>
+        <w:t xml:space="preserve">) en los registros: el CRUD por id llega directo sin recorrer la colección.</w:t>
+      </w:r>
+    </w:p>
+    <w:p>
+      <w:pPr>
+        <w:numPr>
+          <w:ilvl w:val="0"/>
+          <w:numId w:val="1002"/>
+        </w:numPr>
+        <w:pStyle w:val="Compact"/>
+      </w:pPr>
+      <w:r>
+        <w:rPr>
+          <w:rStyle w:val="VerbatimChar"/>
+        </w:rPr>
+        <w:t xml:space="preserve">TreeMap&lt;Integer, Factura&gt;</w:t>
+      </w:r>
+      <w:r>
+        <w:t xml:space="preserve"> </w:t>
+      </w:r>
+      <w:r>
+        <w:t xml:space="preserve">en</w:t>
+      </w:r>
+      <w:r>
+        <w:t xml:space="preserve"> </w:t>
+      </w:r>
+      <w:r>
+        <w:rPr>
+          <w:rStyle w:val="VerbatimChar"/>
+        </w:rPr>
+        <w:t xml:space="preserve">RegistroFacturas</w:t>
+      </w:r>
+      <w:r>
+        <w:t xml:space="preserve">: búsqueda por número y facturas ordenadas por número.</w:t>
+      </w:r>
+    </w:p>
+    <w:p>
+      <w:pPr>
+        <w:numPr>
+          <w:ilvl w:val="0"/>
+          <w:numId w:val="1002"/>
+        </w:numPr>
+        <w:pStyle w:val="Compact"/>
+      </w:pPr>
+      <w:r>
+        <w:rPr>
+          <w:rStyle w:val="VerbatimChar"/>
+        </w:rPr>
+        <w:t xml:space="preserve">CopyOnWriteArrayList</w:t>
+      </w:r>
+      <w:r>
+        <w:t xml:space="preserve"> </w:t>
+      </w:r>
+      <w:r>
+        <w:t xml:space="preserve">para los clientes conectados al servidor (segura para hilos); nota sobre</w:t>
+      </w:r>
+      <w:r>
+        <w:t xml:space="preserve"> </w:t>
+      </w:r>
+      <w:r>
+        <w:rPr>
+          <w:rStyle w:val="VerbatimChar"/>
+        </w:rPr>
+        <w:t xml:space="preserve">ConcurrentHashMap</w:t>
+      </w:r>
+      <w:r>
+        <w:t xml:space="preserve"> </w:t>
+      </w:r>
+      <w:r>
+        <w:t xml:space="preserve">en el servidor.</w:t>
+      </w:r>
+    </w:p>
+    <w:p>
+      <w:pPr>
+        <w:numPr>
+          <w:ilvl w:val="0"/>
+          <w:numId w:val="1002"/>
+        </w:numPr>
+        <w:pStyle w:val="Compact"/>
+      </w:pPr>
+      <w:r>
+        <w:t xml:space="preserve">Nueva tabla «Colecciones: cuál se usa y por qué» al final de la sección 4.2 y fila de colecciones en la tabla de conceptos del curso.</w:t>
+      </w:r>
+    </w:p>
+    <w:bookmarkEnd w:id="20"/>
+    <w:bookmarkStart w:id="21" w:name="documento-v7-2026-10-08-commit-047b31c"/>
+    <w:p>
+      <w:pPr>
+        <w:pStyle w:val="Heading3"/>
+      </w:pPr>
+      <w:r>
         <w:t xml:space="preserve">Documento v7 · 2026-10-08 · commit</w:t>
       </w:r>
       <w:r>
@@ -184,7 +455,7 @@
       <w:pPr>
         <w:numPr>
           <w:ilvl w:val="0"/>
-          <w:numId w:val="1002"/>
+          <w:numId w:val="1003"/>
         </w:numPr>
         <w:pStyle w:val="Compact"/>
       </w:pPr>
@@ -196,7 +467,7 @@
       <w:pPr>
         <w:numPr>
           <w:ilvl w:val="0"/>
-          <w:numId w:val="1002"/>
+          <w:numId w:val="1003"/>
         </w:numPr>
         <w:pStyle w:val="Compact"/>
       </w:pPr>
@@ -208,7 +479,7 @@
       <w:pPr>
         <w:numPr>
           <w:ilvl w:val="0"/>
-          <w:numId w:val="1002"/>
+          <w:numId w:val="1003"/>
         </w:numPr>
         <w:pStyle w:val="Compact"/>
       </w:pPr>
@@ -220,7 +491,7 @@
       <w:pPr>
         <w:numPr>
           <w:ilvl w:val="0"/>
-          <w:numId w:val="1002"/>
+          <w:numId w:val="1003"/>
         </w:numPr>
         <w:pStyle w:val="Compact"/>
       </w:pPr>
@@ -250,7 +521,7 @@
       <w:pPr>
         <w:numPr>
           <w:ilvl w:val="0"/>
-          <w:numId w:val="1002"/>
+          <w:numId w:val="1003"/>
         </w:numPr>
         <w:pStyle w:val="Compact"/>
       </w:pPr>
@@ -258,8 +529,8 @@
         <w:t xml:space="preserve">El nombre del profesor (Mario Alberto Vargas Montes) queda en la portada.</w:t>
       </w:r>
     </w:p>
-    <w:bookmarkEnd w:id="20"/>
-    <w:bookmarkStart w:id="21" w:name="documento-v6-2026-10-08-commit-99f55d4"/>
+    <w:bookmarkEnd w:id="21"/>
+    <w:bookmarkStart w:id="22" w:name="documento-v6-2026-10-08-commit-99f55d4"/>
     <w:p>
       <w:pPr>
         <w:pStyle w:val="Heading3"/>
@@ -281,7 +552,7 @@
       <w:pPr>
         <w:numPr>
           <w:ilvl w:val="0"/>
-          <w:numId w:val="1003"/>
+          <w:numId w:val="1004"/>
         </w:numPr>
         <w:pStyle w:val="Compact"/>
       </w:pPr>
@@ -293,7 +564,7 @@
       <w:pPr>
         <w:numPr>
           <w:ilvl w:val="0"/>
-          <w:numId w:val="1003"/>
+          <w:numId w:val="1004"/>
         </w:numPr>
         <w:pStyle w:val="Compact"/>
       </w:pPr>
@@ -305,7 +576,7 @@
       <w:pPr>
         <w:numPr>
           <w:ilvl w:val="0"/>
-          <w:numId w:val="1003"/>
+          <w:numId w:val="1004"/>
         </w:numPr>
         <w:pStyle w:val="Compact"/>
       </w:pPr>
@@ -362,7 +633,7 @@
       <w:pPr>
         <w:numPr>
           <w:ilvl w:val="0"/>
-          <w:numId w:val="1003"/>
+          <w:numId w:val="1004"/>
         </w:numPr>
         <w:pStyle w:val="Compact"/>
       </w:pPr>
@@ -383,7 +654,7 @@
       <w:pPr>
         <w:numPr>
           <w:ilvl w:val="0"/>
-          <w:numId w:val="1003"/>
+          <w:numId w:val="1004"/>
         </w:numPr>
         <w:pStyle w:val="Compact"/>
       </w:pPr>
@@ -395,7 +666,7 @@
       <w:pPr>
         <w:numPr>
           <w:ilvl w:val="0"/>
-          <w:numId w:val="1003"/>
+          <w:numId w:val="1004"/>
         </w:numPr>
         <w:pStyle w:val="Compact"/>
       </w:pPr>
@@ -407,7 +678,7 @@
       <w:pPr>
         <w:numPr>
           <w:ilvl w:val="0"/>
-          <w:numId w:val="1003"/>
+          <w:numId w:val="1004"/>
         </w:numPr>
         <w:pStyle w:val="Compact"/>
       </w:pPr>
@@ -415,8 +686,8 @@
         <w:t xml:space="preserve">Requerimientos no funcionales de pantallas, sockets, concurrencia y base de datos ajustados.</w:t>
       </w:r>
     </w:p>
-    <w:bookmarkEnd w:id="21"/>
-    <w:bookmarkStart w:id="22" w:name="documento-v5-2026-10-08-commit-9a7a9a7"/>
+    <w:bookmarkEnd w:id="22"/>
+    <w:bookmarkStart w:id="23" w:name="documento-v5-2026-10-08-commit-9a7a9a7"/>
     <w:p>
       <w:pPr>
         <w:pStyle w:val="Heading3"/>
@@ -438,7 +709,7 @@
       <w:pPr>
         <w:numPr>
           <w:ilvl w:val="0"/>
-          <w:numId w:val="1004"/>
+          <w:numId w:val="1005"/>
         </w:numPr>
         <w:pStyle w:val="Compact"/>
       </w:pPr>
@@ -482,7 +753,7 @@
       <w:pPr>
         <w:numPr>
           <w:ilvl w:val="0"/>
-          <w:numId w:val="1004"/>
+          <w:numId w:val="1005"/>
         </w:numPr>
         <w:pStyle w:val="Compact"/>
       </w:pPr>
@@ -494,7 +765,7 @@
       <w:pPr>
         <w:numPr>
           <w:ilvl w:val="0"/>
-          <w:numId w:val="1004"/>
+          <w:numId w:val="1005"/>
         </w:numPr>
         <w:pStyle w:val="Compact"/>
       </w:pPr>
@@ -506,7 +777,7 @@
       <w:pPr>
         <w:numPr>
           <w:ilvl w:val="0"/>
-          <w:numId w:val="1004"/>
+          <w:numId w:val="1005"/>
         </w:numPr>
         <w:pStyle w:val="Compact"/>
       </w:pPr>
@@ -526,8 +797,8 @@
         <w:t xml:space="preserve">.</w:t>
       </w:r>
     </w:p>
-    <w:bookmarkEnd w:id="22"/>
-    <w:bookmarkStart w:id="23" w:name="documento-v4-2026-10-08-commit-b3e7477"/>
+    <w:bookmarkEnd w:id="23"/>
+    <w:bookmarkStart w:id="24" w:name="documento-v4-2026-10-08-commit-b3e7477"/>
     <w:p>
       <w:pPr>
         <w:pStyle w:val="Heading3"/>
@@ -549,7 +820,7 @@
       <w:pPr>
         <w:numPr>
           <w:ilvl w:val="0"/>
-          <w:numId w:val="1005"/>
+          <w:numId w:val="1006"/>
         </w:numPr>
         <w:pStyle w:val="Compact"/>
       </w:pPr>
@@ -561,7 +832,7 @@
       <w:pPr>
         <w:numPr>
           <w:ilvl w:val="0"/>
-          <w:numId w:val="1005"/>
+          <w:numId w:val="1006"/>
         </w:numPr>
         <w:pStyle w:val="Compact"/>
       </w:pPr>
@@ -573,7 +844,7 @@
       <w:pPr>
         <w:numPr>
           <w:ilvl w:val="0"/>
-          <w:numId w:val="1005"/>
+          <w:numId w:val="1006"/>
         </w:numPr>
         <w:pStyle w:val="Compact"/>
       </w:pPr>
@@ -585,7 +856,7 @@
       <w:pPr>
         <w:numPr>
           <w:ilvl w:val="0"/>
-          <w:numId w:val="1005"/>
+          <w:numId w:val="1006"/>
         </w:numPr>
         <w:pStyle w:val="Compact"/>
       </w:pPr>
@@ -620,8 +891,8 @@
         <w:t xml:space="preserve">.</w:t>
       </w:r>
     </w:p>
-    <w:bookmarkEnd w:id="23"/>
-    <w:bookmarkStart w:id="24" w:name="documento-v3-2026-10-08-commit-bf66b07"/>
+    <w:bookmarkEnd w:id="24"/>
+    <w:bookmarkStart w:id="25" w:name="documento-v3-2026-10-08-commit-bf66b07"/>
     <w:p>
       <w:pPr>
         <w:pStyle w:val="Heading3"/>
@@ -643,7 +914,7 @@
       <w:pPr>
         <w:numPr>
           <w:ilvl w:val="0"/>
-          <w:numId w:val="1006"/>
+          <w:numId w:val="1007"/>
         </w:numPr>
         <w:pStyle w:val="Compact"/>
       </w:pPr>
@@ -655,7 +926,7 @@
       <w:pPr>
         <w:numPr>
           <w:ilvl w:val="0"/>
-          <w:numId w:val="1006"/>
+          <w:numId w:val="1007"/>
         </w:numPr>
         <w:pStyle w:val="Compact"/>
       </w:pPr>
@@ -663,8 +934,8 @@
         <w:t xml:space="preserve">La versión va en el nombre del archivo y la numeración pasa a v1, v2, v3…</w:t>
       </w:r>
     </w:p>
-    <w:bookmarkEnd w:id="24"/>
-    <w:bookmarkStart w:id="25" w:name="documento-v2-2026-10-08-commit-07de778"/>
+    <w:bookmarkEnd w:id="25"/>
+    <w:bookmarkStart w:id="26" w:name="documento-v2-2026-10-08-commit-07de778"/>
     <w:p>
       <w:pPr>
         <w:pStyle w:val="Heading3"/>
@@ -686,7 +957,7 @@
       <w:pPr>
         <w:numPr>
           <w:ilvl w:val="0"/>
-          <w:numId w:val="1007"/>
+          <w:numId w:val="1008"/>
         </w:numPr>
         <w:pStyle w:val="Compact"/>
       </w:pPr>
@@ -899,7 +1170,7 @@
       <w:pPr>
         <w:numPr>
           <w:ilvl w:val="0"/>
-          <w:numId w:val="1007"/>
+          <w:numId w:val="1008"/>
         </w:numPr>
         <w:pStyle w:val="Compact"/>
       </w:pPr>
@@ -911,7 +1182,7 @@
       <w:pPr>
         <w:numPr>
           <w:ilvl w:val="0"/>
-          <w:numId w:val="1007"/>
+          <w:numId w:val="1008"/>
         </w:numPr>
         <w:pStyle w:val="Compact"/>
       </w:pPr>
@@ -923,7 +1194,7 @@
       <w:pPr>
         <w:numPr>
           <w:ilvl w:val="0"/>
-          <w:numId w:val="1007"/>
+          <w:numId w:val="1008"/>
         </w:numPr>
         <w:pStyle w:val="Compact"/>
       </w:pPr>
@@ -950,7 +1221,7 @@
       <w:pPr>
         <w:numPr>
           <w:ilvl w:val="0"/>
-          <w:numId w:val="1007"/>
+          <w:numId w:val="1008"/>
         </w:numPr>
         <w:pStyle w:val="Compact"/>
       </w:pPr>
@@ -962,7 +1233,7 @@
       <w:pPr>
         <w:numPr>
           <w:ilvl w:val="0"/>
-          <w:numId w:val="1007"/>
+          <w:numId w:val="1008"/>
         </w:numPr>
         <w:pStyle w:val="Compact"/>
       </w:pPr>
@@ -1000,8 +1271,8 @@
         <w:t xml:space="preserve">(el impuesto lo define cada tipo de producto).</w:t>
       </w:r>
     </w:p>
-    <w:bookmarkEnd w:id="25"/>
-    <w:bookmarkStart w:id="26" w:name="documento-v1-2026-10-06-commit-9be1af4"/>
+    <w:bookmarkEnd w:id="26"/>
+    <w:bookmarkStart w:id="27" w:name="documento-v1-2026-10-06-commit-9be1af4"/>
     <w:p>
       <w:pPr>
         <w:pStyle w:val="Heading3"/>
@@ -1023,7 +1294,7 @@
       <w:pPr>
         <w:numPr>
           <w:ilvl w:val="0"/>
-          <w:numId w:val="1008"/>
+          <w:numId w:val="1009"/>
         </w:numPr>
         <w:pStyle w:val="Compact"/>
       </w:pPr>
@@ -1031,9 +1302,9 @@
         <w:t xml:space="preserve">Primera versión del documento de diseño del Avance 1 (Proyecto 1, Fidecompro): clases con atributos, métodos y relaciones; 15 historias de usuario; 8 prototipos de pantalla; diagramas de arquitectura, secuencia y navegación.</w:t>
       </w:r>
     </w:p>
-    <w:bookmarkEnd w:id="26"/>
     <w:bookmarkEnd w:id="27"/>
-    <w:bookmarkStart w:id="32" w:name="diagrama-de-clases-word-aparte"/>
+    <w:bookmarkEnd w:id="28"/>
+    <w:bookmarkStart w:id="35" w:name="diagrama-de-clases-word-aparte"/>
     <w:p>
       <w:pPr>
         <w:pStyle w:val="Heading2"/>
@@ -1042,12 +1313,145 @@
         <w:t xml:space="preserve">Diagrama de clases (Word aparte)</w:t>
       </w:r>
     </w:p>
-    <w:bookmarkStart w:id="28" w:name="Xd9ab462069bc781e05750197a0b9dcc21416b9b"/>
+    <w:bookmarkStart w:id="29" w:name="X66fc17acf23d8016d6af910173fecc388667a68"/>
     <w:p>
       <w:pPr>
         <w:pStyle w:val="Heading3"/>
       </w:pPr>
       <w:r>
+        <w:t xml:space="preserve">Diagrama de clases v2 · 2026-10-08 · commit</w:t>
+      </w:r>
+      <w:r>
+        <w:t xml:space="preserve"> </w:t>
+      </w:r>
+      <w:r>
+        <w:rPr>
+          <w:rStyle w:val="VerbatimChar"/>
+        </w:rPr>
+        <w:t xml:space="preserve">626c373</w:t>
+      </w:r>
+    </w:p>
+    <w:p>
+      <w:pPr>
+        <w:numPr>
+          <w:ilvl w:val="0"/>
+          <w:numId w:val="1010"/>
+        </w:numPr>
+        <w:pStyle w:val="Compact"/>
+      </w:pPr>
+      <w:r>
+        <w:t xml:space="preserve">Mismos cambios de colecciones del documento v8:</w:t>
+      </w:r>
+      <w:r>
+        <w:t xml:space="preserve"> </w:t>
+      </w:r>
+      <w:r>
+        <w:rPr>
+          <w:rStyle w:val="VerbatimChar"/>
+        </w:rPr>
+        <w:t xml:space="preserve">List</w:t>
+      </w:r>
+      <w:r>
+        <w:t xml:space="preserve">,</w:t>
+      </w:r>
+      <w:r>
+        <w:t xml:space="preserve"> </w:t>
+      </w:r>
+      <w:r>
+        <w:rPr>
+          <w:rStyle w:val="VerbatimChar"/>
+        </w:rPr>
+        <w:t xml:space="preserve">Set</w:t>
+      </w:r>
+      <w:r>
+        <w:t xml:space="preserve">,</w:t>
+      </w:r>
+      <w:r>
+        <w:t xml:space="preserve"> </w:t>
+      </w:r>
+      <w:r>
+        <w:rPr>
+          <w:rStyle w:val="VerbatimChar"/>
+        </w:rPr>
+        <w:t xml:space="preserve">Map</w:t>
+      </w:r>
+      <w:r>
+        <w:t xml:space="preserve">,</w:t>
+      </w:r>
+      <w:r>
+        <w:t xml:space="preserve"> </w:t>
+      </w:r>
+      <w:r>
+        <w:rPr>
+          <w:rStyle w:val="VerbatimChar"/>
+        </w:rPr>
+        <w:t xml:space="preserve">TreeMap</w:t>
+      </w:r>
+      <w:r>
+        <w:t xml:space="preserve"> </w:t>
+      </w:r>
+      <w:r>
+        <w:t xml:space="preserve">y</w:t>
+      </w:r>
+      <w:r>
+        <w:t xml:space="preserve"> </w:t>
+      </w:r>
+      <w:r>
+        <w:rPr>
+          <w:rStyle w:val="VerbatimChar"/>
+        </w:rPr>
+        <w:t xml:space="preserve">CopyOnWriteArrayList</w:t>
+      </w:r>
+      <w:r>
+        <w:t xml:space="preserve"> </w:t>
+      </w:r>
+      <w:r>
+        <w:t xml:space="preserve">en los diagramas y en las tablas de clases, más la tabla «Colecciones: cuál se usa y por qué».</w:t>
+      </w:r>
+    </w:p>
+    <w:p>
+      <w:pPr>
+        <w:numPr>
+          <w:ilvl w:val="0"/>
+          <w:numId w:val="1010"/>
+        </w:numPr>
+        <w:pStyle w:val="Compact"/>
+      </w:pPr>
+      <w:r>
+        <w:rPr>
+          <w:rStyle w:val="VerbatimChar"/>
+        </w:rPr>
+        <w:t xml:space="preserve">Avance1_Diagrama_de_Clases_v2.docx</w:t>
+      </w:r>
+      <w:r>
+        <w:t xml:space="preserve"> </w:t>
+      </w:r>
+      <w:r>
+        <w:t xml:space="preserve">y</w:t>
+      </w:r>
+      <w:r>
+        <w:t xml:space="preserve"> </w:t>
+      </w:r>
+      <w:r>
+        <w:rPr>
+          <w:rStyle w:val="VerbatimChar"/>
+        </w:rPr>
+        <w:t xml:space="preserve">Avance1_Diagrama_de_Clases_v2.drawio</w:t>
+      </w:r>
+      <w:r>
+        <w:t xml:space="preserve"> </w:t>
+      </w:r>
+      <w:r>
+        <w:t xml:space="preserve">(tres páginas, igual que v1).</w:t>
+      </w:r>
+    </w:p>
+    <w:bookmarkEnd w:id="29"/>
+    <w:bookmarkStart w:id="30" w:name="Xd9ab462069bc781e05750197a0b9dcc21416b9b"/>
+    <w:p>
+      <w:pPr>
+        <w:pStyle w:val="Heading3"/>
+      </w:pPr>
+      <w:r>
         <w:t xml:space="preserve">Diagrama de clases v1 · 2026-10-08 · commit</w:t>
       </w:r>
       <w:r>
@@ -1064,7 +1468,7 @@
       <w:pPr>
         <w:numPr>
           <w:ilvl w:val="0"/>
-          <w:numId w:val="1009"/>
+          <w:numId w:val="1011"/>
         </w:numPr>
         <w:pStyle w:val="Compact"/>
       </w:pPr>
@@ -1076,7 +1480,7 @@
       <w:pPr>
         <w:numPr>
           <w:ilvl w:val="0"/>
-          <w:numId w:val="1009"/>
+          <w:numId w:val="1011"/>
         </w:numPr>
         <w:pStyle w:val="Compact"/>
       </w:pPr>
@@ -1121,7 +1525,7 @@
       <w:pPr>
         <w:numPr>
           <w:ilvl w:val="0"/>
-          <w:numId w:val="1009"/>
+          <w:numId w:val="1011"/>
         </w:numPr>
         <w:pStyle w:val="Compact"/>
       </w:pPr>
@@ -1165,90 +1569,101 @@
         <w:t xml:space="preserve">desde los diagramas de Mermaid.</w:t>
       </w:r>
     </w:p>
-    <w:bookmarkEnd w:id="28"/>
-    <w:bookmarkStart w:id="29" w:name="X391512b3d0076f68eba38bfbe03fbe6da9ec0d0"/>
+    <w:bookmarkEnd w:id="30"/>
+    <w:bookmarkStart w:id="31" w:name="X8bff2cc937d55517ed7504f8d852e738002eded"/>
     <w:p>
       <w:pPr>
         <w:pStyle w:val="Heading3"/>
       </w:pPr>
       <w:r>
-        <w:t xml:space="preserve">Diagrama de clases simplificado v3 · 2026-10-08 · commit</w:t>
-      </w:r>
-      <w:r>
-        <w:t xml:space="preserve"> </w:t>
-      </w:r>
-      <w:r>
-        <w:rPr>
-          <w:rStyle w:val="VerbatimChar"/>
-        </w:rPr>
-        <w:t xml:space="preserve">4438bd1</w:t>
-      </w:r>
-    </w:p>
-    <w:p>
-      <w:pPr>
-        <w:numPr>
-          <w:ilvl w:val="0"/>
-          <w:numId w:val="1010"/>
-        </w:numPr>
-        <w:pStyle w:val="Compact"/>
-      </w:pPr>
-      <w:r>
-        <w:t xml:space="preserve">Formato vertical para poner la imagen en una página completa de Word: la simbología pasa debajo del diagrama, en dos columnas, y la imagen queda con la proporción de una página carta con márgenes de 2 cm (ancho/alto = 0,8).</w:t>
-      </w:r>
-    </w:p>
-    <w:p>
-      <w:pPr>
-        <w:numPr>
-          <w:ilvl w:val="0"/>
-          <w:numId w:val="1010"/>
-        </w:numPr>
-        <w:pStyle w:val="Compact"/>
-      </w:pPr>
-      <w:r>
-        <w:t xml:space="preserve">Los métodos muestran solo los tipos de sus parámetros, por ejemplo</w:t>
-      </w:r>
-      <w:r>
-        <w:t xml:space="preserve"> </w:t>
-      </w:r>
-      <w:r>
-        <w:rPr>
-          <w:rStyle w:val="VerbatimChar"/>
-        </w:rPr>
-        <w:t xml:space="preserve">agregarDetalle(Producto, int)</w:t>
-      </w:r>
-      <w:r>
-        <w:t xml:space="preserve">, para que las clases sean más angostas.</w:t>
-      </w:r>
-    </w:p>
-    <w:bookmarkEnd w:id="29"/>
-    <w:bookmarkStart w:id="30" w:name="Xc4a290eef64159bbb850880299580525a5d9206"/>
-    <w:p>
-      <w:pPr>
-        <w:pStyle w:val="Heading3"/>
-      </w:pPr>
-      <w:r>
-        <w:t xml:space="preserve">Diagrama de clases simplificado v2 · 2026-10-08 · commit</w:t>
-      </w:r>
-      <w:r>
-        <w:t xml:space="preserve"> </w:t>
-      </w:r>
-      <w:r>
-        <w:rPr>
-          <w:rStyle w:val="VerbatimChar"/>
-        </w:rPr>
-        <w:t xml:space="preserve">75f343e</w:t>
-      </w:r>
-    </w:p>
-    <w:p>
-      <w:pPr>
-        <w:numPr>
-          <w:ilvl w:val="0"/>
-          <w:numId w:val="1011"/>
-        </w:numPr>
-        <w:pStyle w:val="Compact"/>
-      </w:pPr>
-      <w:r>
-        <w:t xml:space="preserve">Se agrega al lado del diagrama un cuadro de</w:t>
+        <w:t xml:space="preserve">Diagrama de clases simplificado v4 · 2026-10-08 · commit</w:t>
+      </w:r>
+      <w:r>
+        <w:t xml:space="preserve"> </w:t>
+      </w:r>
+      <w:r>
+        <w:rPr>
+          <w:rStyle w:val="VerbatimChar"/>
+        </w:rPr>
+        <w:t xml:space="preserve">626c373</w:t>
+      </w:r>
+    </w:p>
+    <w:p>
+      <w:pPr>
+        <w:numPr>
+          <w:ilvl w:val="0"/>
+          <w:numId w:val="1012"/>
+        </w:numPr>
+        <w:pStyle w:val="Compact"/>
+      </w:pPr>
+      <w:r>
+        <w:t xml:space="preserve">Colecciones declaradas por su interface:</w:t>
+      </w:r>
+      <w:r>
+        <w:t xml:space="preserve"> </w:t>
+      </w:r>
+      <w:r>
+        <w:rPr>
+          <w:rStyle w:val="VerbatimChar"/>
+        </w:rPr>
+        <w:t xml:space="preserve">List&lt;Producto&gt;</w:t>
+      </w:r>
+      <w:r>
+        <w:t xml:space="preserve">,</w:t>
+      </w:r>
+      <w:r>
+        <w:t xml:space="preserve"> </w:t>
+      </w:r>
+      <w:r>
+        <w:rPr>
+          <w:rStyle w:val="VerbatimChar"/>
+        </w:rPr>
+        <w:t xml:space="preserve">List&lt;Categoria&gt;</w:t>
+      </w:r>
+      <w:r>
+        <w:t xml:space="preserve"> </w:t>
+      </w:r>
+      <w:r>
+        <w:t xml:space="preserve">y el atributo</w:t>
+      </w:r>
+      <w:r>
+        <w:t xml:space="preserve"> </w:t>
+      </w:r>
+      <w:r>
+        <w:rPr>
+          <w:rStyle w:val="VerbatimChar"/>
+        </w:rPr>
+        <w:t xml:space="preserve">detalles: List&lt;DetalleFactura&gt;</w:t>
+      </w:r>
+      <w:r>
+        <w:t xml:space="preserve"> </w:t>
+      </w:r>
+      <w:r>
+        <w:t xml:space="preserve">en</w:t>
+      </w:r>
+      <w:r>
+        <w:t xml:space="preserve"> </w:t>
+      </w:r>
+      <w:r>
+        <w:rPr>
+          <w:rStyle w:val="VerbatimChar"/>
+        </w:rPr>
+        <w:t xml:space="preserve">Factura</w:t>
+      </w:r>
+      <w:r>
+        <w:t xml:space="preserve">.</w:t>
+      </w:r>
+    </w:p>
+    <w:p>
+      <w:pPr>
+        <w:numPr>
+          <w:ilvl w:val="0"/>
+          <w:numId w:val="1012"/>
+        </w:numPr>
+        <w:pStyle w:val="Compact"/>
+      </w:pPr>
+      <w:r>
+        <w:t xml:space="preserve">La simbología agrega el apartado</w:t>
       </w:r>
       <w:r>
         <w:t xml:space="preserve"> </w:t>
@@ -1258,6 +1673,156 @@
           <w:bCs/>
           <w:b/>
         </w:rPr>
+        <w:t xml:space="preserve">Colecciones</w:t>
+      </w:r>
+      <w:r>
+        <w:t xml:space="preserve">: qué es</w:t>
+      </w:r>
+      <w:r>
+        <w:t xml:space="preserve"> </w:t>
+      </w:r>
+      <w:r>
+        <w:rPr>
+          <w:rStyle w:val="VerbatimChar"/>
+        </w:rPr>
+        <w:t xml:space="preserve">List&lt;Tipo&gt;</w:t>
+      </w:r>
+      <w:r>
+        <w:t xml:space="preserve"> </w:t>
+      </w:r>
+      <w:r>
+        <w:t xml:space="preserve">y que el diagrama completo también usa</w:t>
+      </w:r>
+      <w:r>
+        <w:t xml:space="preserve"> </w:t>
+      </w:r>
+      <w:r>
+        <w:rPr>
+          <w:rStyle w:val="VerbatimChar"/>
+        </w:rPr>
+        <w:t xml:space="preserve">Set</w:t>
+      </w:r>
+      <w:r>
+        <w:t xml:space="preserve"> </w:t>
+      </w:r>
+      <w:r>
+        <w:t xml:space="preserve">y</w:t>
+      </w:r>
+      <w:r>
+        <w:t xml:space="preserve"> </w:t>
+      </w:r>
+      <w:r>
+        <w:rPr>
+          <w:rStyle w:val="VerbatimChar"/>
+        </w:rPr>
+        <w:t xml:space="preserve">Map</w:t>
+      </w:r>
+      <w:r>
+        <w:t xml:space="preserve">/</w:t>
+      </w:r>
+      <w:r>
+        <w:rPr>
+          <w:rStyle w:val="VerbatimChar"/>
+        </w:rPr>
+        <w:t xml:space="preserve">TreeMap</w:t>
+      </w:r>
+      <w:r>
+        <w:t xml:space="preserve">.</w:t>
+      </w:r>
+    </w:p>
+    <w:bookmarkEnd w:id="31"/>
+    <w:bookmarkStart w:id="32" w:name="X391512b3d0076f68eba38bfbe03fbe6da9ec0d0"/>
+    <w:p>
+      <w:pPr>
+        <w:pStyle w:val="Heading3"/>
+      </w:pPr>
+      <w:r>
+        <w:t xml:space="preserve">Diagrama de clases simplificado v3 · 2026-10-08 · commit</w:t>
+      </w:r>
+      <w:r>
+        <w:t xml:space="preserve"> </w:t>
+      </w:r>
+      <w:r>
+        <w:rPr>
+          <w:rStyle w:val="VerbatimChar"/>
+        </w:rPr>
+        <w:t xml:space="preserve">4438bd1</w:t>
+      </w:r>
+    </w:p>
+    <w:p>
+      <w:pPr>
+        <w:numPr>
+          <w:ilvl w:val="0"/>
+          <w:numId w:val="1013"/>
+        </w:numPr>
+        <w:pStyle w:val="Compact"/>
+      </w:pPr>
+      <w:r>
+        <w:t xml:space="preserve">Formato vertical para poner la imagen en una página completa de Word: la simbología pasa debajo del diagrama, en dos columnas, y la imagen queda con la proporción de una página carta con márgenes de 2 cm (ancho/alto = 0,8).</w:t>
+      </w:r>
+    </w:p>
+    <w:p>
+      <w:pPr>
+        <w:numPr>
+          <w:ilvl w:val="0"/>
+          <w:numId w:val="1013"/>
+        </w:numPr>
+        <w:pStyle w:val="Compact"/>
+      </w:pPr>
+      <w:r>
+        <w:t xml:space="preserve">Los métodos muestran solo los tipos de sus parámetros, por ejemplo</w:t>
+      </w:r>
+      <w:r>
+        <w:t xml:space="preserve"> </w:t>
+      </w:r>
+      <w:r>
+        <w:rPr>
+          <w:rStyle w:val="VerbatimChar"/>
+        </w:rPr>
+        <w:t xml:space="preserve">agregarDetalle(Producto, int)</w:t>
+      </w:r>
+      <w:r>
+        <w:t xml:space="preserve">, para que las clases sean más angostas.</w:t>
+      </w:r>
+    </w:p>
+    <w:bookmarkEnd w:id="32"/>
+    <w:bookmarkStart w:id="33" w:name="Xc4a290eef64159bbb850880299580525a5d9206"/>
+    <w:p>
+      <w:pPr>
+        <w:pStyle w:val="Heading3"/>
+      </w:pPr>
+      <w:r>
+        <w:t xml:space="preserve">Diagrama de clases simplificado v2 · 2026-10-08 · commit</w:t>
+      </w:r>
+      <w:r>
+        <w:t xml:space="preserve"> </w:t>
+      </w:r>
+      <w:r>
+        <w:rPr>
+          <w:rStyle w:val="VerbatimChar"/>
+        </w:rPr>
+        <w:t xml:space="preserve">75f343e</w:t>
+      </w:r>
+    </w:p>
+    <w:p>
+      <w:pPr>
+        <w:numPr>
+          <w:ilvl w:val="0"/>
+          <w:numId w:val="1014"/>
+        </w:numPr>
+        <w:pStyle w:val="Compact"/>
+      </w:pPr>
+      <w:r>
+        <w:t xml:space="preserve">Se agrega al lado del diagrama un cuadro de</w:t>
+      </w:r>
+      <w:r>
+        <w:t xml:space="preserve"> </w:t>
+      </w:r>
+      <w:r>
+        <w:rPr>
+          <w:bCs/>
+          <w:b/>
+        </w:rPr>
         <w:t xml:space="preserve">simbología</w:t>
       </w:r>
       <w:r>
@@ -1280,8 +1845,8 @@
         <w:t xml:space="preserve">) con un ejemplo, y cada tipo de flecha (herencia, implementación, composición, agregación y asociación).</w:t>
       </w:r>
     </w:p>
-    <w:bookmarkEnd w:id="30"/>
-    <w:bookmarkStart w:id="31" w:name="X861f067dae0e8a264748fdbddc6a638f1e0d1d0"/>
+    <w:bookmarkEnd w:id="33"/>
+    <w:bookmarkStart w:id="34" w:name="X861f067dae0e8a264748fdbddc6a638f1e0d1d0"/>
     <w:p>
       <w:pPr>
         <w:pStyle w:val="Heading3"/>
@@ -1303,7 +1868,7 @@
       <w:pPr>
         <w:numPr>
           <w:ilvl w:val="0"/>
-          <w:numId w:val="1012"/>
+          <w:numId w:val="1015"/>
         </w:numPr>
         <w:pStyle w:val="Compact"/>
       </w:pPr>
@@ -1315,7 +1880,7 @@
       <w:pPr>
         <w:numPr>
           <w:ilvl w:val="0"/>
-          <w:numId w:val="1012"/>
+          <w:numId w:val="1015"/>
         </w:numPr>
         <w:pStyle w:val="Compact"/>
       </w:pPr>
@@ -1360,224 +1925,426 @@
       </w:r>
       <w:r>
         <w:t xml:space="preserve">.</w:t>
-      </w:r>
-    </w:p>
-    <w:bookmarkEnd w:id="31"/>
-    <w:bookmarkEnd w:id="32"/>
-    <w:bookmarkStart w:id="35" w:name="código"/>
-    <w:p>
-      <w:pPr>
-        <w:pStyle w:val="Heading2"/>
-      </w:pPr>
-      <w:r>
-        <w:t xml:space="preserve">Código</w:t>
-      </w:r>
-    </w:p>
-    <w:bookmarkStart w:id="33" w:name="código-v2-2026-10-08-commit-99f55d4"/>
-    <w:p>
-      <w:pPr>
-        <w:pStyle w:val="Heading3"/>
-      </w:pPr>
-      <w:r>
-        <w:t xml:space="preserve">Código v2 · 2026-10-08 · commit</w:t>
-      </w:r>
-      <w:r>
-        <w:t xml:space="preserve"> </w:t>
-      </w:r>
-      <w:r>
-        <w:rPr>
-          <w:rStyle w:val="VerbatimChar"/>
-        </w:rPr>
-        <w:t xml:space="preserve">99f55d4</w:t>
-      </w:r>
-    </w:p>
-    <w:p>
-      <w:pPr>
-        <w:numPr>
-          <w:ilvl w:val="0"/>
-          <w:numId w:val="1013"/>
-        </w:numPr>
-        <w:pStyle w:val="Compact"/>
-      </w:pPr>
-      <w:r>
-        <w:rPr>
-          <w:rStyle w:val="VerbatimChar"/>
-        </w:rPr>
-        <w:t xml:space="preserve">eliminarCliente</w:t>
-      </w:r>
-      <w:r>
-        <w:t xml:space="preserve"> </w:t>
-      </w:r>
-      <w:r>
-        <w:t xml:space="preserve">y</w:t>
-      </w:r>
-      <w:r>
-        <w:t xml:space="preserve"> </w:t>
-      </w:r>
-      <w:r>
-        <w:rPr>
-          <w:rStyle w:val="VerbatimChar"/>
-        </w:rPr>
-        <w:t xml:space="preserve">eliminarUsuario</w:t>
-      </w:r>
-      <w:r>
-        <w:t xml:space="preserve"> </w:t>
-      </w:r>
-      <w:r>
-        <w:t xml:space="preserve">en los registros;</w:t>
-      </w:r>
-      <w:r>
-        <w:t xml:space="preserve"> </w:t>
-      </w:r>
-      <w:r>
-        <w:rPr>
-          <w:rStyle w:val="VerbatimChar"/>
-        </w:rPr>
-        <w:t xml:space="preserve">tieneFacturasCliente</w:t>
-      </w:r>
-      <w:r>
-        <w:t xml:space="preserve"> </w:t>
-      </w:r>
-      <w:r>
-        <w:t xml:space="preserve">y</w:t>
-      </w:r>
-      <w:r>
-        <w:t xml:space="preserve"> </w:t>
-      </w:r>
-      <w:r>
-        <w:rPr>
-          <w:rStyle w:val="VerbatimChar"/>
-        </w:rPr>
-        <w:t xml:space="preserve">tieneFacturasUsuario</w:t>
-      </w:r>
-      <w:r>
-        <w:t xml:space="preserve"> </w:t>
-      </w:r>
-      <w:r>
-        <w:t xml:space="preserve">en</w:t>
-      </w:r>
-      <w:r>
-        <w:t xml:space="preserve"> </w:t>
-      </w:r>
-      <w:r>
-        <w:rPr>
-          <w:rStyle w:val="VerbatimChar"/>
-        </w:rPr>
-        <w:t xml:space="preserve">RegistroFacturas</w:t>
-      </w:r>
-      <w:r>
-        <w:t xml:space="preserve">.</w:t>
-      </w:r>
-    </w:p>
-    <w:p>
-      <w:pPr>
-        <w:numPr>
-          <w:ilvl w:val="0"/>
-          <w:numId w:val="1013"/>
-        </w:numPr>
-        <w:pStyle w:val="Compact"/>
-      </w:pPr>
-      <w:r>
-        <w:t xml:space="preserve">El</w:t>
-      </w:r>
-      <w:r>
-        <w:t xml:space="preserve"> </w:t>
-      </w:r>
-      <w:r>
-        <w:rPr>
-          <w:rStyle w:val="VerbatimChar"/>
-        </w:rPr>
-        <w:t xml:space="preserve">main</w:t>
-      </w:r>
-      <w:r>
-        <w:t xml:space="preserve"> </w:t>
-      </w:r>
-      <w:r>
-        <w:t xml:space="preserve">muestra la regla: un cliente con facturas se desactiva y uno sin facturas se elimina.</w:t>
-      </w:r>
-    </w:p>
-    <w:bookmarkEnd w:id="33"/>
-    <w:bookmarkStart w:id="34" w:name="código-v1-2026-10-08-commit-442187a"/>
-    <w:p>
-      <w:pPr>
-        <w:pStyle w:val="Heading3"/>
-      </w:pPr>
-      <w:r>
-        <w:t xml:space="preserve">Código v1 · 2026-10-08 · commit</w:t>
-      </w:r>
-      <w:r>
-        <w:t xml:space="preserve"> </w:t>
-      </w:r>
-      <w:r>
-        <w:rPr>
-          <w:rStyle w:val="VerbatimChar"/>
-        </w:rPr>
-        <w:t xml:space="preserve">442187a</w:t>
-      </w:r>
-    </w:p>
-    <w:p>
-      <w:pPr>
-        <w:numPr>
-          <w:ilvl w:val="0"/>
-          <w:numId w:val="1014"/>
-        </w:numPr>
-        <w:pStyle w:val="Compact"/>
-      </w:pPr>
-      <w:r>
-        <w:t xml:space="preserve">Proyecto Maven</w:t>
-      </w:r>
-      <w:r>
-        <w:t xml:space="preserve"> </w:t>
-      </w:r>
-      <w:r>
-        <w:rPr>
-          <w:rStyle w:val="VerbatimChar"/>
-        </w:rPr>
-        <w:t xml:space="preserve">Fidecompro</w:t>
-      </w:r>
-      <w:r>
-        <w:t xml:space="preserve"> </w:t>
-      </w:r>
-      <w:r>
-        <w:t xml:space="preserve">(Java 17) con las clases del modelo de dominio del documento v2.</w:t>
-      </w:r>
-    </w:p>
-    <w:p>
-      <w:pPr>
-        <w:numPr>
-          <w:ilvl w:val="0"/>
-          <w:numId w:val="1014"/>
-        </w:numPr>
-        <w:pStyle w:val="Compact"/>
-      </w:pPr>
-      <w:r>
-        <w:rPr>
-          <w:rStyle w:val="VerbatimChar"/>
-        </w:rPr>
-        <w:t xml:space="preserve">main</w:t>
-      </w:r>
-      <w:r>
-        <w:t xml:space="preserve"> </w:t>
-      </w:r>
-      <w:r>
-        <w:t xml:space="preserve">de consola que recorre las historias de usuario principales, incluida la venta simultánea desde dos cajas con hilos.</w:t>
-      </w:r>
-    </w:p>
-    <w:p>
-      <w:pPr>
-        <w:numPr>
-          <w:ilvl w:val="0"/>
-          <w:numId w:val="1014"/>
-        </w:numPr>
-        <w:pStyle w:val="Compact"/>
-      </w:pPr>
-      <w:r>
-        <w:t xml:space="preserve">Código de referencia para entender el diseño; no es un entregable.</w:t>
       </w:r>
     </w:p>
     <w:bookmarkEnd w:id="34"/>
     <w:bookmarkEnd w:id="35"/>
+    <w:bookmarkStart w:id="39" w:name="código"/>
+    <w:p>
+      <w:pPr>
+        <w:pStyle w:val="Heading2"/>
+      </w:pPr>
+      <w:r>
+        <w:t xml:space="preserve">Código</w:t>
+      </w:r>
+    </w:p>
+    <w:bookmarkStart w:id="36" w:name="código-v3-2026-10-08-commit-626c373"/>
+    <w:p>
+      <w:pPr>
+        <w:pStyle w:val="Heading3"/>
+      </w:pPr>
+      <w:r>
+        <w:t xml:space="preserve">Código v3 · 2026-10-08 · commit</w:t>
+      </w:r>
+      <w:r>
+        <w:t xml:space="preserve"> </w:t>
+      </w:r>
+      <w:r>
+        <w:rPr>
+          <w:rStyle w:val="VerbatimChar"/>
+        </w:rPr>
+        <w:t xml:space="preserve">626c373</w:t>
+      </w:r>
+    </w:p>
+    <w:p>
+      <w:pPr>
+        <w:numPr>
+          <w:ilvl w:val="0"/>
+          <w:numId w:val="1016"/>
+        </w:numPr>
+        <w:pStyle w:val="Compact"/>
+      </w:pPr>
+      <w:r>
+        <w:rPr>
+          <w:rStyle w:val="VerbatimChar"/>
+        </w:rPr>
+        <w:t xml:space="preserve">RegistroUsuarios</w:t>
+      </w:r>
+      <w:r>
+        <w:t xml:space="preserve"> </w:t>
+      </w:r>
+      <w:r>
+        <w:t xml:space="preserve">y</w:t>
+      </w:r>
+      <w:r>
+        <w:t xml:space="preserve"> </w:t>
+      </w:r>
+      <w:r>
+        <w:rPr>
+          <w:rStyle w:val="VerbatimChar"/>
+        </w:rPr>
+        <w:t xml:space="preserve">RegistroClientes</w:t>
+      </w:r>
+      <w:r>
+        <w:t xml:space="preserve"> </w:t>
+      </w:r>
+      <w:r>
+        <w:t xml:space="preserve">usan</w:t>
+      </w:r>
+      <w:r>
+        <w:t xml:space="preserve"> </w:t>
+      </w:r>
+      <w:r>
+        <w:rPr>
+          <w:rStyle w:val="VerbatimChar"/>
+        </w:rPr>
+        <w:t xml:space="preserve">Map&lt;Integer, …&gt; = new HashMap&lt;&gt;()</w:t>
+      </w:r>
+      <w:r>
+        <w:t xml:space="preserve"> </w:t>
+      </w:r>
+      <w:r>
+        <w:t xml:space="preserve">con el id como clave;</w:t>
+      </w:r>
+      <w:r>
+        <w:t xml:space="preserve"> </w:t>
+      </w:r>
+      <w:r>
+        <w:rPr>
+          <w:rStyle w:val="VerbatimChar"/>
+        </w:rPr>
+        <w:t xml:space="preserve">RegistroFacturas</w:t>
+      </w:r>
+      <w:r>
+        <w:t xml:space="preserve"> </w:t>
+      </w:r>
+      <w:r>
+        <w:t xml:space="preserve">usa</w:t>
+      </w:r>
+      <w:r>
+        <w:t xml:space="preserve"> </w:t>
+      </w:r>
+      <w:r>
+        <w:rPr>
+          <w:rStyle w:val="VerbatimChar"/>
+        </w:rPr>
+        <w:t xml:space="preserve">TreeMap&lt;Integer, Factura&gt;</w:t>
+      </w:r>
+      <w:r>
+        <w:t xml:space="preserve"> </w:t>
+      </w:r>
+      <w:r>
+        <w:t xml:space="preserve">con el número como clave.</w:t>
+      </w:r>
+    </w:p>
+    <w:p>
+      <w:pPr>
+        <w:numPr>
+          <w:ilvl w:val="0"/>
+          <w:numId w:val="1016"/>
+        </w:numPr>
+        <w:pStyle w:val="Compact"/>
+      </w:pPr>
+      <w:r>
+        <w:rPr>
+          <w:rStyle w:val="VerbatimChar"/>
+        </w:rPr>
+        <w:t xml:space="preserve">ArticuloHogar.advertencias</w:t>
+      </w:r>
+      <w:r>
+        <w:t xml:space="preserve"> </w:t>
+      </w:r>
+      <w:r>
+        <w:t xml:space="preserve">es un</w:t>
+      </w:r>
+      <w:r>
+        <w:t xml:space="preserve"> </w:t>
+      </w:r>
+      <w:r>
+        <w:rPr>
+          <w:rStyle w:val="VerbatimChar"/>
+        </w:rPr>
+        <w:t xml:space="preserve">Set&lt;String&gt; = new HashSet&lt;&gt;()</w:t>
+      </w:r>
+      <w:r>
+        <w:t xml:space="preserve">; las demás colecciones se declaran como</w:t>
+      </w:r>
+      <w:r>
+        <w:t xml:space="preserve"> </w:t>
+      </w:r>
+      <w:r>
+        <w:rPr>
+          <w:rStyle w:val="VerbatimChar"/>
+        </w:rPr>
+        <w:t xml:space="preserve">List&lt;T&gt;</w:t>
+      </w:r>
+      <w:r>
+        <w:t xml:space="preserve">.</w:t>
+      </w:r>
+    </w:p>
+    <w:p>
+      <w:pPr>
+        <w:numPr>
+          <w:ilvl w:val="0"/>
+          <w:numId w:val="1016"/>
+        </w:numPr>
+        <w:pStyle w:val="Compact"/>
+      </w:pPr>
+      <w:r>
+        <w:t xml:space="preserve">El</w:t>
+      </w:r>
+      <w:r>
+        <w:t xml:space="preserve"> </w:t>
+      </w:r>
+      <w:r>
+        <w:rPr>
+          <w:rStyle w:val="VerbatimChar"/>
+        </w:rPr>
+        <w:t xml:space="preserve">main</w:t>
+      </w:r>
+      <w:r>
+        <w:t xml:space="preserve"> </w:t>
+      </w:r>
+      <w:r>
+        <w:t xml:space="preserve">muestra que el</w:t>
+      </w:r>
+      <w:r>
+        <w:t xml:space="preserve"> </w:t>
+      </w:r>
+      <w:r>
+        <w:rPr>
+          <w:rStyle w:val="VerbatimChar"/>
+        </w:rPr>
+        <w:t xml:space="preserve">Set</w:t>
+      </w:r>
+      <w:r>
+        <w:t xml:space="preserve"> </w:t>
+      </w:r>
+      <w:r>
+        <w:t xml:space="preserve">no repite una advertencia y que el</w:t>
+      </w:r>
+      <w:r>
+        <w:t xml:space="preserve"> </w:t>
+      </w:r>
+      <w:r>
+        <w:rPr>
+          <w:rStyle w:val="VerbatimChar"/>
+        </w:rPr>
+        <w:t xml:space="preserve">TreeMap</w:t>
+      </w:r>
+      <w:r>
+        <w:t xml:space="preserve"> </w:t>
+      </w:r>
+      <w:r>
+        <w:t xml:space="preserve">da la primera y la última factura.</w:t>
+      </w:r>
+    </w:p>
     <w:bookmarkEnd w:id="36"/>
+    <w:bookmarkStart w:id="37" w:name="código-v2-2026-10-08-commit-99f55d4"/>
+    <w:p>
+      <w:pPr>
+        <w:pStyle w:val="Heading3"/>
+      </w:pPr>
+      <w:r>
+        <w:t xml:space="preserve">Código v2 · 2026-10-08 · commit</w:t>
+      </w:r>
+      <w:r>
+        <w:t xml:space="preserve"> </w:t>
+      </w:r>
+      <w:r>
+        <w:rPr>
+          <w:rStyle w:val="VerbatimChar"/>
+        </w:rPr>
+        <w:t xml:space="preserve">99f55d4</w:t>
+      </w:r>
+    </w:p>
+    <w:p>
+      <w:pPr>
+        <w:numPr>
+          <w:ilvl w:val="0"/>
+          <w:numId w:val="1017"/>
+        </w:numPr>
+        <w:pStyle w:val="Compact"/>
+      </w:pPr>
+      <w:r>
+        <w:rPr>
+          <w:rStyle w:val="VerbatimChar"/>
+        </w:rPr>
+        <w:t xml:space="preserve">eliminarCliente</w:t>
+      </w:r>
+      <w:r>
+        <w:t xml:space="preserve"> </w:t>
+      </w:r>
+      <w:r>
+        <w:t xml:space="preserve">y</w:t>
+      </w:r>
+      <w:r>
+        <w:t xml:space="preserve"> </w:t>
+      </w:r>
+      <w:r>
+        <w:rPr>
+          <w:rStyle w:val="VerbatimChar"/>
+        </w:rPr>
+        <w:t xml:space="preserve">eliminarUsuario</w:t>
+      </w:r>
+      <w:r>
+        <w:t xml:space="preserve"> </w:t>
+      </w:r>
+      <w:r>
+        <w:t xml:space="preserve">en los registros;</w:t>
+      </w:r>
+      <w:r>
+        <w:t xml:space="preserve"> </w:t>
+      </w:r>
+      <w:r>
+        <w:rPr>
+          <w:rStyle w:val="VerbatimChar"/>
+        </w:rPr>
+        <w:t xml:space="preserve">tieneFacturasCliente</w:t>
+      </w:r>
+      <w:r>
+        <w:t xml:space="preserve"> </w:t>
+      </w:r>
+      <w:r>
+        <w:t xml:space="preserve">y</w:t>
+      </w:r>
+      <w:r>
+        <w:t xml:space="preserve"> </w:t>
+      </w:r>
+      <w:r>
+        <w:rPr>
+          <w:rStyle w:val="VerbatimChar"/>
+        </w:rPr>
+        <w:t xml:space="preserve">tieneFacturasUsuario</w:t>
+      </w:r>
+      <w:r>
+        <w:t xml:space="preserve"> </w:t>
+      </w:r>
+      <w:r>
+        <w:t xml:space="preserve">en</w:t>
+      </w:r>
+      <w:r>
+        <w:t xml:space="preserve"> </w:t>
+      </w:r>
+      <w:r>
+        <w:rPr>
+          <w:rStyle w:val="VerbatimChar"/>
+        </w:rPr>
+        <w:t xml:space="preserve">RegistroFacturas</w:t>
+      </w:r>
+      <w:r>
+        <w:t xml:space="preserve">.</w:t>
+      </w:r>
+    </w:p>
+    <w:p>
+      <w:pPr>
+        <w:numPr>
+          <w:ilvl w:val="0"/>
+          <w:numId w:val="1017"/>
+        </w:numPr>
+        <w:pStyle w:val="Compact"/>
+      </w:pPr>
+      <w:r>
+        <w:t xml:space="preserve">El</w:t>
+      </w:r>
+      <w:r>
+        <w:t xml:space="preserve"> </w:t>
+      </w:r>
+      <w:r>
+        <w:rPr>
+          <w:rStyle w:val="VerbatimChar"/>
+        </w:rPr>
+        <w:t xml:space="preserve">main</w:t>
+      </w:r>
+      <w:r>
+        <w:t xml:space="preserve"> </w:t>
+      </w:r>
+      <w:r>
+        <w:t xml:space="preserve">muestra la regla: un cliente con facturas se desactiva y uno sin facturas se elimina.</w:t>
+      </w:r>
+    </w:p>
+    <w:bookmarkEnd w:id="37"/>
+    <w:bookmarkStart w:id="38" w:name="código-v1-2026-10-08-commit-442187a"/>
+    <w:p>
+      <w:pPr>
+        <w:pStyle w:val="Heading3"/>
+      </w:pPr>
+      <w:r>
+        <w:t xml:space="preserve">Código v1 · 2026-10-08 · commit</w:t>
+      </w:r>
+      <w:r>
+        <w:t xml:space="preserve"> </w:t>
+      </w:r>
+      <w:r>
+        <w:rPr>
+          <w:rStyle w:val="VerbatimChar"/>
+        </w:rPr>
+        <w:t xml:space="preserve">442187a</w:t>
+      </w:r>
+    </w:p>
+    <w:p>
+      <w:pPr>
+        <w:numPr>
+          <w:ilvl w:val="0"/>
+          <w:numId w:val="1018"/>
+        </w:numPr>
+        <w:pStyle w:val="Compact"/>
+      </w:pPr>
+      <w:r>
+        <w:t xml:space="preserve">Proyecto Maven</w:t>
+      </w:r>
+      <w:r>
+        <w:t xml:space="preserve"> </w:t>
+      </w:r>
+      <w:r>
+        <w:rPr>
+          <w:rStyle w:val="VerbatimChar"/>
+        </w:rPr>
+        <w:t xml:space="preserve">Fidecompro</w:t>
+      </w:r>
+      <w:r>
+        <w:t xml:space="preserve"> </w:t>
+      </w:r>
+      <w:r>
+        <w:t xml:space="preserve">(Java 17) con las clases del modelo de dominio del documento v2.</w:t>
+      </w:r>
+    </w:p>
+    <w:p>
+      <w:pPr>
+        <w:numPr>
+          <w:ilvl w:val="0"/>
+          <w:numId w:val="1018"/>
+        </w:numPr>
+        <w:pStyle w:val="Compact"/>
+      </w:pPr>
+      <w:r>
+        <w:rPr>
+          <w:rStyle w:val="VerbatimChar"/>
+        </w:rPr>
+        <w:t xml:space="preserve">main</w:t>
+      </w:r>
+      <w:r>
+        <w:t xml:space="preserve"> </w:t>
+      </w:r>
+      <w:r>
+        <w:t xml:space="preserve">de consola que recorre las historias de usuario principales, incluida la venta simultánea desde dos cajas con hilos.</w:t>
+      </w:r>
+    </w:p>
+    <w:p>
+      <w:pPr>
+        <w:numPr>
+          <w:ilvl w:val="0"/>
+          <w:numId w:val="1018"/>
+        </w:numPr>
+        <w:pStyle w:val="Compact"/>
+      </w:pPr>
+      <w:r>
+        <w:t xml:space="preserve">Código de referencia para entender el diseño; no es un entregable.</w:t>
+      </w:r>
+    </w:p>
+    <w:bookmarkEnd w:id="38"/>
+    <w:bookmarkEnd w:id="39"/>
+    <w:bookmarkEnd w:id="40"/>
     <w:sectPr>
       <w:pgSz w:w="12240" w:h="15840"/>
       <w:pgMar w:left="1134" w:right="1134"/>
@@ -1806,6 +2573,18 @@
     <w:abstractNumId w:val="991"/>
   </w:num>
   <w:num w:numId="1014">
+    <w:abstractNumId w:val="991"/>
+  </w:num>
+  <w:num w:numId="1015">
+    <w:abstractNumId w:val="991"/>
+  </w:num>
+  <w:num w:numId="1016">
+    <w:abstractNumId w:val="991"/>
+  </w:num>
+  <w:num w:numId="1017">
+    <w:abstractNumId w:val="991"/>
+  </w:num>
+  <w:num w:numId="1018">
     <w:abstractNumId w:val="991"/>
   </w:num>
 </w:numbering>

</xml_diff>

<commit_message>
CHANGELOG y README: documento v9 y diagrama de clases v3
Co-Authored-By: Claude Opus 5.5 (1M context) <noreply@anthropic.com>
Claude-Session: https://claude.ai/code/session_01VkQm5RLcZiQMKLCS3EK3og
</commit_message>
<xml_diff>
--- a/docs/Historial_de_versiones.docx
+++ b/docs/Historial_de_versiones.docx
@@ -2,7 +2,7 @@
 <file path=word/document.xml><?xml version="1.0" encoding="utf-8"?>
 <w:document xmlns:w="http://schemas.openxmlformats.org/wordprocessingml/2006/main" xmlns:m="http://schemas.openxmlformats.org/officeDocument/2006/math" xmlns:r="http://schemas.openxmlformats.org/officeDocument/2006/relationships" xmlns:o="urn:schemas-microsoft-com:office:office" xmlns:v="urn:schemas-microsoft-com:vml" xmlns:w10="urn:schemas-microsoft-com:office:word" xmlns:a="http://schemas.openxmlformats.org/drawingml/2006/main" xmlns:pic="http://schemas.openxmlformats.org/drawingml/2006/picture" xmlns:wp="http://schemas.openxmlformats.org/drawingml/2006/wordprocessingDrawing">
   <w:body>
-    <w:bookmarkStart w:id="40" w:name="historial-de-versiones"/>
+    <w:bookmarkStart w:id="42" w:name="historial-de-versiones"/>
     <w:p>
       <w:pPr>
         <w:pStyle w:val="Heading1"/>
@@ -153,7 +153,7 @@
         <w:t xml:space="preserve">.</w:t>
       </w:r>
     </w:p>
-    <w:bookmarkStart w:id="28" w:name="documento-de-diseño"/>
+    <w:bookmarkStart w:id="29" w:name="documento-de-diseño"/>
     <w:p>
       <w:pPr>
         <w:pStyle w:val="Heading2"/>
@@ -162,12 +162,145 @@
         <w:t xml:space="preserve">Documento de diseño</w:t>
       </w:r>
     </w:p>
-    <w:bookmarkStart w:id="20" w:name="documento-v8-2026-10-08-commit-626c373"/>
+    <w:bookmarkStart w:id="20" w:name="documento-v9-2026-10-08-commit-5400cea"/>
     <w:p>
       <w:pPr>
         <w:pStyle w:val="Heading3"/>
       </w:pPr>
       <w:r>
+        <w:t xml:space="preserve">Documento v9 · 2026-10-08 · commit</w:t>
+      </w:r>
+      <w:r>
+        <w:t xml:space="preserve"> </w:t>
+      </w:r>
+      <w:r>
+        <w:rPr>
+          <w:rStyle w:val="VerbatimChar"/>
+        </w:rPr>
+        <w:t xml:space="preserve">5400cea</w:t>
+      </w:r>
+    </w:p>
+    <w:p>
+      <w:pPr>
+        <w:numPr>
+          <w:ilvl w:val="0"/>
+          <w:numId w:val="1002"/>
+        </w:numPr>
+        <w:pStyle w:val="Compact"/>
+      </w:pPr>
+      <w:r>
+        <w:t xml:space="preserve">La tabla «Colecciones: cuál se usa y por qué» tiene una columna nueva con el ejemplo del profesor que respalda cada elección:</w:t>
+      </w:r>
+      <w:r>
+        <w:t xml:space="preserve"> </w:t>
+      </w:r>
+      <w:r>
+        <w:rPr>
+          <w:rStyle w:val="VerbatimChar"/>
+        </w:rPr>
+        <w:t xml:space="preserve">EjemploList</w:t>
+      </w:r>
+      <w:r>
+        <w:t xml:space="preserve">,</w:t>
+      </w:r>
+      <w:r>
+        <w:t xml:space="preserve"> </w:t>
+      </w:r>
+      <w:r>
+        <w:rPr>
+          <w:rStyle w:val="VerbatimChar"/>
+        </w:rPr>
+        <w:t xml:space="preserve">EjemploCollection</w:t>
+      </w:r>
+      <w:r>
+        <w:t xml:space="preserve">,</w:t>
+      </w:r>
+      <w:r>
+        <w:t xml:space="preserve"> </w:t>
+      </w:r>
+      <w:r>
+        <w:rPr>
+          <w:rStyle w:val="VerbatimChar"/>
+        </w:rPr>
+        <w:t xml:space="preserve">EjemploSet</w:t>
+      </w:r>
+      <w:r>
+        <w:t xml:space="preserve">,</w:t>
+      </w:r>
+      <w:r>
+        <w:t xml:space="preserve"> </w:t>
+      </w:r>
+      <w:r>
+        <w:rPr>
+          <w:rStyle w:val="VerbatimChar"/>
+        </w:rPr>
+        <w:t xml:space="preserve">EjemploMap</w:t>
+      </w:r>
+      <w:r>
+        <w:t xml:space="preserve"> </w:t>
+      </w:r>
+      <w:r>
+        <w:t xml:space="preserve">y</w:t>
+      </w:r>
+      <w:r>
+        <w:t xml:space="preserve"> </w:t>
+      </w:r>
+      <w:r>
+        <w:rPr>
+          <w:rStyle w:val="VerbatimChar"/>
+        </w:rPr>
+        <w:t xml:space="preserve">EjemploTreeMap</w:t>
+      </w:r>
+      <w:r>
+        <w:t xml:space="preserve">.</w:t>
+      </w:r>
+    </w:p>
+    <w:p>
+      <w:pPr>
+        <w:numPr>
+          <w:ilvl w:val="0"/>
+          <w:numId w:val="1002"/>
+        </w:numPr>
+        <w:pStyle w:val="Compact"/>
+      </w:pPr>
+      <w:r>
+        <w:t xml:space="preserve">El texto explica, con</w:t>
+      </w:r>
+      <w:r>
+        <w:t xml:space="preserve"> </w:t>
+      </w:r>
+      <w:r>
+        <w:rPr>
+          <w:rStyle w:val="VerbatimChar"/>
+        </w:rPr>
+        <w:t xml:space="preserve">EjemploColeccionGenerica</w:t>
+      </w:r>
+      <w:r>
+        <w:t xml:space="preserve"> </w:t>
+      </w:r>
+      <w:r>
+        <w:t xml:space="preserve">y</w:t>
+      </w:r>
+      <w:r>
+        <w:t xml:space="preserve"> </w:t>
+      </w:r>
+      <w:r>
+        <w:rPr>
+          <w:rStyle w:val="VerbatimChar"/>
+        </w:rPr>
+        <w:t xml:space="preserve">EjemploColeccionNoGenerica</w:t>
+      </w:r>
+      <w:r>
+        <w:t xml:space="preserve">, por qué todas las colecciones son genéricas (no hace falta cast).</w:t>
+      </w:r>
+    </w:p>
+    <w:bookmarkEnd w:id="20"/>
+    <w:bookmarkStart w:id="21" w:name="documento-v8-2026-10-08-commit-626c373"/>
+    <w:p>
+      <w:pPr>
+        <w:pStyle w:val="Heading3"/>
+      </w:pPr>
+      <w:r>
         <w:t xml:space="preserve">Documento v8 · 2026-10-08 · commit</w:t>
       </w:r>
       <w:r>
@@ -184,7 +317,7 @@
       <w:pPr>
         <w:numPr>
           <w:ilvl w:val="0"/>
-          <w:numId w:val="1002"/>
+          <w:numId w:val="1003"/>
         </w:numPr>
         <w:pStyle w:val="Compact"/>
       </w:pPr>
@@ -253,7 +386,7 @@
       <w:pPr>
         <w:numPr>
           <w:ilvl w:val="0"/>
-          <w:numId w:val="1002"/>
+          <w:numId w:val="1003"/>
         </w:numPr>
         <w:pStyle w:val="Compact"/>
       </w:pPr>
@@ -274,7 +407,7 @@
       <w:pPr>
         <w:numPr>
           <w:ilvl w:val="0"/>
-          <w:numId w:val="1002"/>
+          <w:numId w:val="1003"/>
         </w:numPr>
         <w:pStyle w:val="Compact"/>
       </w:pPr>
@@ -310,7 +443,7 @@
       <w:pPr>
         <w:numPr>
           <w:ilvl w:val="0"/>
-          <w:numId w:val="1002"/>
+          <w:numId w:val="1003"/>
         </w:numPr>
         <w:pStyle w:val="Compact"/>
       </w:pPr>
@@ -355,7 +488,7 @@
       <w:pPr>
         <w:numPr>
           <w:ilvl w:val="0"/>
-          <w:numId w:val="1002"/>
+          <w:numId w:val="1003"/>
         </w:numPr>
         <w:pStyle w:val="Compact"/>
       </w:pPr>
@@ -388,7 +521,7 @@
       <w:pPr>
         <w:numPr>
           <w:ilvl w:val="0"/>
-          <w:numId w:val="1002"/>
+          <w:numId w:val="1003"/>
         </w:numPr>
         <w:pStyle w:val="Compact"/>
       </w:pPr>
@@ -424,7 +557,7 @@
       <w:pPr>
         <w:numPr>
           <w:ilvl w:val="0"/>
-          <w:numId w:val="1002"/>
+          <w:numId w:val="1003"/>
         </w:numPr>
         <w:pStyle w:val="Compact"/>
       </w:pPr>
@@ -432,8 +565,8 @@
         <w:t xml:space="preserve">Nueva tabla «Colecciones: cuál se usa y por qué» al final de la sección 4.2 y fila de colecciones en la tabla de conceptos del curso.</w:t>
       </w:r>
     </w:p>
-    <w:bookmarkEnd w:id="20"/>
-    <w:bookmarkStart w:id="21" w:name="documento-v7-2026-10-08-commit-047b31c"/>
+    <w:bookmarkEnd w:id="21"/>
+    <w:bookmarkStart w:id="22" w:name="documento-v7-2026-10-08-commit-047b31c"/>
     <w:p>
       <w:pPr>
         <w:pStyle w:val="Heading3"/>
@@ -455,7 +588,7 @@
       <w:pPr>
         <w:numPr>
           <w:ilvl w:val="0"/>
-          <w:numId w:val="1003"/>
+          <w:numId w:val="1004"/>
         </w:numPr>
         <w:pStyle w:val="Compact"/>
       </w:pPr>
@@ -467,7 +600,7 @@
       <w:pPr>
         <w:numPr>
           <w:ilvl w:val="0"/>
-          <w:numId w:val="1003"/>
+          <w:numId w:val="1004"/>
         </w:numPr>
         <w:pStyle w:val="Compact"/>
       </w:pPr>
@@ -479,7 +612,7 @@
       <w:pPr>
         <w:numPr>
           <w:ilvl w:val="0"/>
-          <w:numId w:val="1003"/>
+          <w:numId w:val="1004"/>
         </w:numPr>
         <w:pStyle w:val="Compact"/>
       </w:pPr>
@@ -491,7 +624,7 @@
       <w:pPr>
         <w:numPr>
           <w:ilvl w:val="0"/>
-          <w:numId w:val="1003"/>
+          <w:numId w:val="1004"/>
         </w:numPr>
         <w:pStyle w:val="Compact"/>
       </w:pPr>
@@ -521,7 +654,7 @@
       <w:pPr>
         <w:numPr>
           <w:ilvl w:val="0"/>
-          <w:numId w:val="1003"/>
+          <w:numId w:val="1004"/>
         </w:numPr>
         <w:pStyle w:val="Compact"/>
       </w:pPr>
@@ -529,8 +662,8 @@
         <w:t xml:space="preserve">El nombre del profesor (Mario Alberto Vargas Montes) queda en la portada.</w:t>
       </w:r>
     </w:p>
-    <w:bookmarkEnd w:id="21"/>
-    <w:bookmarkStart w:id="22" w:name="documento-v6-2026-10-08-commit-99f55d4"/>
+    <w:bookmarkEnd w:id="22"/>
+    <w:bookmarkStart w:id="23" w:name="documento-v6-2026-10-08-commit-99f55d4"/>
     <w:p>
       <w:pPr>
         <w:pStyle w:val="Heading3"/>
@@ -552,7 +685,7 @@
       <w:pPr>
         <w:numPr>
           <w:ilvl w:val="0"/>
-          <w:numId w:val="1004"/>
+          <w:numId w:val="1005"/>
         </w:numPr>
         <w:pStyle w:val="Compact"/>
       </w:pPr>
@@ -564,7 +697,7 @@
       <w:pPr>
         <w:numPr>
           <w:ilvl w:val="0"/>
-          <w:numId w:val="1004"/>
+          <w:numId w:val="1005"/>
         </w:numPr>
         <w:pStyle w:val="Compact"/>
       </w:pPr>
@@ -576,7 +709,7 @@
       <w:pPr>
         <w:numPr>
           <w:ilvl w:val="0"/>
-          <w:numId w:val="1004"/>
+          <w:numId w:val="1005"/>
         </w:numPr>
         <w:pStyle w:val="Compact"/>
       </w:pPr>
@@ -633,7 +766,7 @@
       <w:pPr>
         <w:numPr>
           <w:ilvl w:val="0"/>
-          <w:numId w:val="1004"/>
+          <w:numId w:val="1005"/>
         </w:numPr>
         <w:pStyle w:val="Compact"/>
       </w:pPr>
@@ -654,7 +787,7 @@
       <w:pPr>
         <w:numPr>
           <w:ilvl w:val="0"/>
-          <w:numId w:val="1004"/>
+          <w:numId w:val="1005"/>
         </w:numPr>
         <w:pStyle w:val="Compact"/>
       </w:pPr>
@@ -666,7 +799,7 @@
       <w:pPr>
         <w:numPr>
           <w:ilvl w:val="0"/>
-          <w:numId w:val="1004"/>
+          <w:numId w:val="1005"/>
         </w:numPr>
         <w:pStyle w:val="Compact"/>
       </w:pPr>
@@ -678,7 +811,7 @@
       <w:pPr>
         <w:numPr>
           <w:ilvl w:val="0"/>
-          <w:numId w:val="1004"/>
+          <w:numId w:val="1005"/>
         </w:numPr>
         <w:pStyle w:val="Compact"/>
       </w:pPr>
@@ -686,8 +819,8 @@
         <w:t xml:space="preserve">Requerimientos no funcionales de pantallas, sockets, concurrencia y base de datos ajustados.</w:t>
       </w:r>
     </w:p>
-    <w:bookmarkEnd w:id="22"/>
-    <w:bookmarkStart w:id="23" w:name="documento-v5-2026-10-08-commit-9a7a9a7"/>
+    <w:bookmarkEnd w:id="23"/>
+    <w:bookmarkStart w:id="24" w:name="documento-v5-2026-10-08-commit-9a7a9a7"/>
     <w:p>
       <w:pPr>
         <w:pStyle w:val="Heading3"/>
@@ -709,7 +842,7 @@
       <w:pPr>
         <w:numPr>
           <w:ilvl w:val="0"/>
-          <w:numId w:val="1005"/>
+          <w:numId w:val="1006"/>
         </w:numPr>
         <w:pStyle w:val="Compact"/>
       </w:pPr>
@@ -753,7 +886,7 @@
       <w:pPr>
         <w:numPr>
           <w:ilvl w:val="0"/>
-          <w:numId w:val="1005"/>
+          <w:numId w:val="1006"/>
         </w:numPr>
         <w:pStyle w:val="Compact"/>
       </w:pPr>
@@ -765,7 +898,7 @@
       <w:pPr>
         <w:numPr>
           <w:ilvl w:val="0"/>
-          <w:numId w:val="1005"/>
+          <w:numId w:val="1006"/>
         </w:numPr>
         <w:pStyle w:val="Compact"/>
       </w:pPr>
@@ -777,7 +910,7 @@
       <w:pPr>
         <w:numPr>
           <w:ilvl w:val="0"/>
-          <w:numId w:val="1005"/>
+          <w:numId w:val="1006"/>
         </w:numPr>
         <w:pStyle w:val="Compact"/>
       </w:pPr>
@@ -797,8 +930,8 @@
         <w:t xml:space="preserve">.</w:t>
       </w:r>
     </w:p>
-    <w:bookmarkEnd w:id="23"/>
-    <w:bookmarkStart w:id="24" w:name="documento-v4-2026-10-08-commit-b3e7477"/>
+    <w:bookmarkEnd w:id="24"/>
+    <w:bookmarkStart w:id="25" w:name="documento-v4-2026-10-08-commit-b3e7477"/>
     <w:p>
       <w:pPr>
         <w:pStyle w:val="Heading3"/>
@@ -820,7 +953,7 @@
       <w:pPr>
         <w:numPr>
           <w:ilvl w:val="0"/>
-          <w:numId w:val="1006"/>
+          <w:numId w:val="1007"/>
         </w:numPr>
         <w:pStyle w:val="Compact"/>
       </w:pPr>
@@ -832,7 +965,7 @@
       <w:pPr>
         <w:numPr>
           <w:ilvl w:val="0"/>
-          <w:numId w:val="1006"/>
+          <w:numId w:val="1007"/>
         </w:numPr>
         <w:pStyle w:val="Compact"/>
       </w:pPr>
@@ -844,7 +977,7 @@
       <w:pPr>
         <w:numPr>
           <w:ilvl w:val="0"/>
-          <w:numId w:val="1006"/>
+          <w:numId w:val="1007"/>
         </w:numPr>
         <w:pStyle w:val="Compact"/>
       </w:pPr>
@@ -856,7 +989,7 @@
       <w:pPr>
         <w:numPr>
           <w:ilvl w:val="0"/>
-          <w:numId w:val="1006"/>
+          <w:numId w:val="1007"/>
         </w:numPr>
         <w:pStyle w:val="Compact"/>
       </w:pPr>
@@ -891,8 +1024,8 @@
         <w:t xml:space="preserve">.</w:t>
       </w:r>
     </w:p>
-    <w:bookmarkEnd w:id="24"/>
-    <w:bookmarkStart w:id="25" w:name="documento-v3-2026-10-08-commit-bf66b07"/>
+    <w:bookmarkEnd w:id="25"/>
+    <w:bookmarkStart w:id="26" w:name="documento-v3-2026-10-08-commit-bf66b07"/>
     <w:p>
       <w:pPr>
         <w:pStyle w:val="Heading3"/>
@@ -914,7 +1047,7 @@
       <w:pPr>
         <w:numPr>
           <w:ilvl w:val="0"/>
-          <w:numId w:val="1007"/>
+          <w:numId w:val="1008"/>
         </w:numPr>
         <w:pStyle w:val="Compact"/>
       </w:pPr>
@@ -926,7 +1059,7 @@
       <w:pPr>
         <w:numPr>
           <w:ilvl w:val="0"/>
-          <w:numId w:val="1007"/>
+          <w:numId w:val="1008"/>
         </w:numPr>
         <w:pStyle w:val="Compact"/>
       </w:pPr>
@@ -934,8 +1067,8 @@
         <w:t xml:space="preserve">La versión va en el nombre del archivo y la numeración pasa a v1, v2, v3…</w:t>
       </w:r>
     </w:p>
-    <w:bookmarkEnd w:id="25"/>
-    <w:bookmarkStart w:id="26" w:name="documento-v2-2026-10-08-commit-07de778"/>
+    <w:bookmarkEnd w:id="26"/>
+    <w:bookmarkStart w:id="27" w:name="documento-v2-2026-10-08-commit-07de778"/>
     <w:p>
       <w:pPr>
         <w:pStyle w:val="Heading3"/>
@@ -957,7 +1090,7 @@
       <w:pPr>
         <w:numPr>
           <w:ilvl w:val="0"/>
-          <w:numId w:val="1008"/>
+          <w:numId w:val="1009"/>
         </w:numPr>
         <w:pStyle w:val="Compact"/>
       </w:pPr>
@@ -1170,7 +1303,7 @@
       <w:pPr>
         <w:numPr>
           <w:ilvl w:val="0"/>
-          <w:numId w:val="1008"/>
+          <w:numId w:val="1009"/>
         </w:numPr>
         <w:pStyle w:val="Compact"/>
       </w:pPr>
@@ -1182,7 +1315,7 @@
       <w:pPr>
         <w:numPr>
           <w:ilvl w:val="0"/>
-          <w:numId w:val="1008"/>
+          <w:numId w:val="1009"/>
         </w:numPr>
         <w:pStyle w:val="Compact"/>
       </w:pPr>
@@ -1194,7 +1327,7 @@
       <w:pPr>
         <w:numPr>
           <w:ilvl w:val="0"/>
-          <w:numId w:val="1008"/>
+          <w:numId w:val="1009"/>
         </w:numPr>
         <w:pStyle w:val="Compact"/>
       </w:pPr>
@@ -1221,7 +1354,7 @@
       <w:pPr>
         <w:numPr>
           <w:ilvl w:val="0"/>
-          <w:numId w:val="1008"/>
+          <w:numId w:val="1009"/>
         </w:numPr>
         <w:pStyle w:val="Compact"/>
       </w:pPr>
@@ -1233,7 +1366,7 @@
       <w:pPr>
         <w:numPr>
           <w:ilvl w:val="0"/>
-          <w:numId w:val="1008"/>
+          <w:numId w:val="1009"/>
         </w:numPr>
         <w:pStyle w:val="Compact"/>
       </w:pPr>
@@ -1271,8 +1404,8 @@
         <w:t xml:space="preserve">(el impuesto lo define cada tipo de producto).</w:t>
       </w:r>
     </w:p>
-    <w:bookmarkEnd w:id="26"/>
-    <w:bookmarkStart w:id="27" w:name="documento-v1-2026-10-06-commit-9be1af4"/>
+    <w:bookmarkEnd w:id="27"/>
+    <w:bookmarkStart w:id="28" w:name="documento-v1-2026-10-06-commit-9be1af4"/>
     <w:p>
       <w:pPr>
         <w:pStyle w:val="Heading3"/>
@@ -1294,7 +1427,7 @@
       <w:pPr>
         <w:numPr>
           <w:ilvl w:val="0"/>
-          <w:numId w:val="1009"/>
+          <w:numId w:val="1010"/>
         </w:numPr>
         <w:pStyle w:val="Compact"/>
       </w:pPr>
@@ -1302,9 +1435,9 @@
         <w:t xml:space="preserve">Primera versión del documento de diseño del Avance 1 (Proyecto 1, Fidecompro): clases con atributos, métodos y relaciones; 15 historias de usuario; 8 prototipos de pantalla; diagramas de arquitectura, secuencia y navegación.</w:t>
       </w:r>
     </w:p>
-    <w:bookmarkEnd w:id="27"/>
     <w:bookmarkEnd w:id="28"/>
-    <w:bookmarkStart w:id="35" w:name="diagrama-de-clases-word-aparte"/>
+    <w:bookmarkEnd w:id="29"/>
+    <w:bookmarkStart w:id="37" w:name="diagrama-de-clases-word-aparte"/>
     <w:p>
       <w:pPr>
         <w:pStyle w:val="Heading2"/>
@@ -1313,12 +1446,58 @@
         <w:t xml:space="preserve">Diagrama de clases (Word aparte)</w:t>
       </w:r>
     </w:p>
-    <w:bookmarkStart w:id="29" w:name="X66fc17acf23d8016d6af910173fecc388667a68"/>
+    <w:bookmarkStart w:id="30" w:name="X863504495f0c283560039533b96e35d8a8aec92"/>
     <w:p>
       <w:pPr>
         <w:pStyle w:val="Heading3"/>
       </w:pPr>
       <w:r>
+        <w:t xml:space="preserve">Diagrama de clases v3 · 2026-10-08 · commit</w:t>
+      </w:r>
+      <w:r>
+        <w:t xml:space="preserve"> </w:t>
+      </w:r>
+      <w:r>
+        <w:rPr>
+          <w:rStyle w:val="VerbatimChar"/>
+        </w:rPr>
+        <w:t xml:space="preserve">5400cea</w:t>
+      </w:r>
+    </w:p>
+    <w:p>
+      <w:pPr>
+        <w:numPr>
+          <w:ilvl w:val="0"/>
+          <w:numId w:val="1011"/>
+        </w:numPr>
+        <w:pStyle w:val="Compact"/>
+      </w:pPr>
+      <w:r>
+        <w:t xml:space="preserve">Word aparte con la tabla de colecciones del documento v9 (cita los ejemplos del profesor). El</w:t>
+      </w:r>
+      <w:r>
+        <w:t xml:space="preserve"> </w:t>
+      </w:r>
+      <w:r>
+        <w:rPr>
+          <w:rStyle w:val="VerbatimChar"/>
+        </w:rPr>
+        <w:t xml:space="preserve">.drawio</w:t>
+      </w:r>
+      <w:r>
+        <w:t xml:space="preserve"> </w:t>
+      </w:r>
+      <w:r>
+        <w:t xml:space="preserve">sigue en v2 porque los diagramas no cambiaron.</w:t>
+      </w:r>
+    </w:p>
+    <w:bookmarkEnd w:id="30"/>
+    <w:bookmarkStart w:id="31" w:name="X66fc17acf23d8016d6af910173fecc388667a68"/>
+    <w:p>
+      <w:pPr>
+        <w:pStyle w:val="Heading3"/>
+      </w:pPr>
+      <w:r>
         <w:t xml:space="preserve">Diagrama de clases v2 · 2026-10-08 · commit</w:t>
       </w:r>
       <w:r>
@@ -1335,7 +1514,7 @@
       <w:pPr>
         <w:numPr>
           <w:ilvl w:val="0"/>
-          <w:numId w:val="1010"/>
+          <w:numId w:val="1012"/>
         </w:numPr>
         <w:pStyle w:val="Compact"/>
       </w:pPr>
@@ -1413,7 +1592,7 @@
       <w:pPr>
         <w:numPr>
           <w:ilvl w:val="0"/>
-          <w:numId w:val="1010"/>
+          <w:numId w:val="1012"/>
         </w:numPr>
         <w:pStyle w:val="Compact"/>
       </w:pPr>
@@ -1445,8 +1624,8 @@
         <w:t xml:space="preserve">(tres páginas, igual que v1).</w:t>
       </w:r>
     </w:p>
-    <w:bookmarkEnd w:id="29"/>
-    <w:bookmarkStart w:id="30" w:name="Xd9ab462069bc781e05750197a0b9dcc21416b9b"/>
+    <w:bookmarkEnd w:id="31"/>
+    <w:bookmarkStart w:id="32" w:name="Xd9ab462069bc781e05750197a0b9dcc21416b9b"/>
     <w:p>
       <w:pPr>
         <w:pStyle w:val="Heading3"/>
@@ -1468,7 +1647,7 @@
       <w:pPr>
         <w:numPr>
           <w:ilvl w:val="0"/>
-          <w:numId w:val="1011"/>
+          <w:numId w:val="1013"/>
         </w:numPr>
         <w:pStyle w:val="Compact"/>
       </w:pPr>
@@ -1480,7 +1659,7 @@
       <w:pPr>
         <w:numPr>
           <w:ilvl w:val="0"/>
-          <w:numId w:val="1011"/>
+          <w:numId w:val="1013"/>
         </w:numPr>
         <w:pStyle w:val="Compact"/>
       </w:pPr>
@@ -1525,7 +1704,7 @@
       <w:pPr>
         <w:numPr>
           <w:ilvl w:val="0"/>
-          <w:numId w:val="1011"/>
+          <w:numId w:val="1013"/>
         </w:numPr>
         <w:pStyle w:val="Compact"/>
       </w:pPr>
@@ -1569,8 +1748,8 @@
         <w:t xml:space="preserve">desde los diagramas de Mermaid.</w:t>
       </w:r>
     </w:p>
-    <w:bookmarkEnd w:id="30"/>
-    <w:bookmarkStart w:id="31" w:name="X8bff2cc937d55517ed7504f8d852e738002eded"/>
+    <w:bookmarkEnd w:id="32"/>
+    <w:bookmarkStart w:id="33" w:name="X8bff2cc937d55517ed7504f8d852e738002eded"/>
     <w:p>
       <w:pPr>
         <w:pStyle w:val="Heading3"/>
@@ -1592,7 +1771,7 @@
       <w:pPr>
         <w:numPr>
           <w:ilvl w:val="0"/>
-          <w:numId w:val="1012"/>
+          <w:numId w:val="1014"/>
         </w:numPr>
         <w:pStyle w:val="Compact"/>
       </w:pPr>
@@ -1658,7 +1837,7 @@
       <w:pPr>
         <w:numPr>
           <w:ilvl w:val="0"/>
-          <w:numId w:val="1012"/>
+          <w:numId w:val="1014"/>
         </w:numPr>
         <w:pStyle w:val="Compact"/>
       </w:pPr>
@@ -1730,8 +1909,8 @@
         <w:t xml:space="preserve">.</w:t>
       </w:r>
     </w:p>
-    <w:bookmarkEnd w:id="31"/>
-    <w:bookmarkStart w:id="32" w:name="X391512b3d0076f68eba38bfbe03fbe6da9ec0d0"/>
+    <w:bookmarkEnd w:id="33"/>
+    <w:bookmarkStart w:id="34" w:name="X391512b3d0076f68eba38bfbe03fbe6da9ec0d0"/>
     <w:p>
       <w:pPr>
         <w:pStyle w:val="Heading3"/>
@@ -1753,7 +1932,7 @@
       <w:pPr>
         <w:numPr>
           <w:ilvl w:val="0"/>
-          <w:numId w:val="1013"/>
+          <w:numId w:val="1015"/>
         </w:numPr>
         <w:pStyle w:val="Compact"/>
       </w:pPr>
@@ -1765,7 +1944,7 @@
       <w:pPr>
         <w:numPr>
           <w:ilvl w:val="0"/>
-          <w:numId w:val="1013"/>
+          <w:numId w:val="1015"/>
         </w:numPr>
         <w:pStyle w:val="Compact"/>
       </w:pPr>
@@ -1785,8 +1964,8 @@
         <w:t xml:space="preserve">, para que las clases sean más angostas.</w:t>
       </w:r>
     </w:p>
-    <w:bookmarkEnd w:id="32"/>
-    <w:bookmarkStart w:id="33" w:name="Xc4a290eef64159bbb850880299580525a5d9206"/>
+    <w:bookmarkEnd w:id="34"/>
+    <w:bookmarkStart w:id="35" w:name="Xc4a290eef64159bbb850880299580525a5d9206"/>
     <w:p>
       <w:pPr>
         <w:pStyle w:val="Heading3"/>
@@ -1808,7 +1987,7 @@
       <w:pPr>
         <w:numPr>
           <w:ilvl w:val="0"/>
-          <w:numId w:val="1014"/>
+          <w:numId w:val="1016"/>
         </w:numPr>
         <w:pStyle w:val="Compact"/>
       </w:pPr>
@@ -1845,8 +2024,8 @@
         <w:t xml:space="preserve">) con un ejemplo, y cada tipo de flecha (herencia, implementación, composición, agregación y asociación).</w:t>
       </w:r>
     </w:p>
-    <w:bookmarkEnd w:id="33"/>
-    <w:bookmarkStart w:id="34" w:name="X861f067dae0e8a264748fdbddc6a638f1e0d1d0"/>
+    <w:bookmarkEnd w:id="35"/>
+    <w:bookmarkStart w:id="36" w:name="X861f067dae0e8a264748fdbddc6a638f1e0d1d0"/>
     <w:p>
       <w:pPr>
         <w:pStyle w:val="Heading3"/>
@@ -1868,7 +2047,7 @@
       <w:pPr>
         <w:numPr>
           <w:ilvl w:val="0"/>
-          <w:numId w:val="1015"/>
+          <w:numId w:val="1017"/>
         </w:numPr>
         <w:pStyle w:val="Compact"/>
       </w:pPr>
@@ -1880,7 +2059,7 @@
       <w:pPr>
         <w:numPr>
           <w:ilvl w:val="0"/>
-          <w:numId w:val="1015"/>
+          <w:numId w:val="1017"/>
         </w:numPr>
         <w:pStyle w:val="Compact"/>
       </w:pPr>
@@ -1927,9 +2106,9 @@
         <w:t xml:space="preserve">.</w:t>
       </w:r>
     </w:p>
-    <w:bookmarkEnd w:id="34"/>
-    <w:bookmarkEnd w:id="35"/>
-    <w:bookmarkStart w:id="39" w:name="código"/>
+    <w:bookmarkEnd w:id="36"/>
+    <w:bookmarkEnd w:id="37"/>
+    <w:bookmarkStart w:id="41" w:name="código"/>
     <w:p>
       <w:pPr>
         <w:pStyle w:val="Heading2"/>
@@ -1938,7 +2117,7 @@
         <w:t xml:space="preserve">Código</w:t>
       </w:r>
     </w:p>
-    <w:bookmarkStart w:id="36" w:name="código-v3-2026-10-08-commit-626c373"/>
+    <w:bookmarkStart w:id="38" w:name="código-v3-2026-10-08-commit-626c373"/>
     <w:p>
       <w:pPr>
         <w:pStyle w:val="Heading3"/>
@@ -1960,7 +2139,7 @@
       <w:pPr>
         <w:numPr>
           <w:ilvl w:val="0"/>
-          <w:numId w:val="1016"/>
+          <w:numId w:val="1018"/>
         </w:numPr>
         <w:pStyle w:val="Compact"/>
       </w:pPr>
@@ -2041,7 +2220,7 @@
       <w:pPr>
         <w:numPr>
           <w:ilvl w:val="0"/>
-          <w:numId w:val="1016"/>
+          <w:numId w:val="1018"/>
         </w:numPr>
         <w:pStyle w:val="Compact"/>
       </w:pPr>
@@ -2086,7 +2265,7 @@
       <w:pPr>
         <w:numPr>
           <w:ilvl w:val="0"/>
-          <w:numId w:val="1016"/>
+          <w:numId w:val="1018"/>
         </w:numPr>
         <w:pStyle w:val="Compact"/>
       </w:pPr>
@@ -2139,8 +2318,8 @@
         <w:t xml:space="preserve">da la primera y la última factura.</w:t>
       </w:r>
     </w:p>
-    <w:bookmarkEnd w:id="36"/>
-    <w:bookmarkStart w:id="37" w:name="código-v2-2026-10-08-commit-99f55d4"/>
+    <w:bookmarkEnd w:id="38"/>
+    <w:bookmarkStart w:id="39" w:name="código-v2-2026-10-08-commit-99f55d4"/>
     <w:p>
       <w:pPr>
         <w:pStyle w:val="Heading3"/>
@@ -2162,7 +2341,7 @@
       <w:pPr>
         <w:numPr>
           <w:ilvl w:val="0"/>
-          <w:numId w:val="1017"/>
+          <w:numId w:val="1019"/>
         </w:numPr>
         <w:pStyle w:val="Compact"/>
       </w:pPr>
@@ -2240,7 +2419,7 @@
       <w:pPr>
         <w:numPr>
           <w:ilvl w:val="0"/>
-          <w:numId w:val="1017"/>
+          <w:numId w:val="1019"/>
         </w:numPr>
         <w:pStyle w:val="Compact"/>
       </w:pPr>
@@ -2263,8 +2442,8 @@
         <w:t xml:space="preserve">muestra la regla: un cliente con facturas se desactiva y uno sin facturas se elimina.</w:t>
       </w:r>
     </w:p>
-    <w:bookmarkEnd w:id="37"/>
-    <w:bookmarkStart w:id="38" w:name="código-v1-2026-10-08-commit-442187a"/>
+    <w:bookmarkEnd w:id="39"/>
+    <w:bookmarkStart w:id="40" w:name="código-v1-2026-10-08-commit-442187a"/>
     <w:p>
       <w:pPr>
         <w:pStyle w:val="Heading3"/>
@@ -2286,7 +2465,7 @@
       <w:pPr>
         <w:numPr>
           <w:ilvl w:val="0"/>
-          <w:numId w:val="1018"/>
+          <w:numId w:val="1020"/>
         </w:numPr>
         <w:pStyle w:val="Compact"/>
       </w:pPr>
@@ -2313,7 +2492,7 @@
       <w:pPr>
         <w:numPr>
           <w:ilvl w:val="0"/>
-          <w:numId w:val="1018"/>
+          <w:numId w:val="1020"/>
         </w:numPr>
         <w:pStyle w:val="Compact"/>
       </w:pPr>
@@ -2334,7 +2513,7 @@
       <w:pPr>
         <w:numPr>
           <w:ilvl w:val="0"/>
-          <w:numId w:val="1018"/>
+          <w:numId w:val="1020"/>
         </w:numPr>
         <w:pStyle w:val="Compact"/>
       </w:pPr>
@@ -2342,9 +2521,9 @@
         <w:t xml:space="preserve">Código de referencia para entender el diseño; no es un entregable.</w:t>
       </w:r>
     </w:p>
-    <w:bookmarkEnd w:id="38"/>
-    <w:bookmarkEnd w:id="39"/>
     <w:bookmarkEnd w:id="40"/>
+    <w:bookmarkEnd w:id="41"/>
+    <w:bookmarkEnd w:id="42"/>
     <w:sectPr>
       <w:pgSz w:w="12240" w:h="15840"/>
       <w:pgMar w:left="1134" w:right="1134"/>
@@ -2585,6 +2764,12 @@
     <w:abstractNumId w:val="991"/>
   </w:num>
   <w:num w:numId="1018">
+    <w:abstractNumId w:val="991"/>
+  </w:num>
+  <w:num w:numId="1019">
+    <w:abstractNumId w:val="991"/>
+  </w:num>
+  <w:num w:numId="1020">
     <w:abstractNumId w:val="991"/>
   </w:num>
 </w:numbering>

</xml_diff>

<commit_message>
CHANGELOG: commit del diagrama de clases v4
Co-Authored-By: Claude Opus 5.5 (1M context) <noreply@anthropic.com>
Claude-Session: https://claude.ai/code/session_01VkQm5RLcZiQMKLCS3EK3og
</commit_message>
<xml_diff>
--- a/docs/Historial_de_versiones.docx
+++ b/docs/Historial_de_versiones.docx
@@ -1446,13 +1446,22 @@
         <w:t xml:space="preserve">Diagrama de clases (Word aparte)</w:t>
       </w:r>
     </w:p>
-    <w:bookmarkStart w:id="30" w:name="diagrama-de-clases-v4-2026-10-08"/>
+    <w:bookmarkStart w:id="30" w:name="X8b6f1de3ef83515f9063b0f71c4f739b3d8e2c1"/>
     <w:p>
       <w:pPr>
         <w:pStyle w:val="Heading3"/>
       </w:pPr>
       <w:r>
-        <w:t xml:space="preserve">Diagrama de clases v4 · 2026-10-08</w:t>
+        <w:t xml:space="preserve">Diagrama de clases v4 · 2026-10-08 · commit</w:t>
+      </w:r>
+      <w:r>
+        <w:t xml:space="preserve"> </w:t>
+      </w:r>
+      <w:r>
+        <w:rPr>
+          <w:rStyle w:val="VerbatimChar"/>
+        </w:rPr>
+        <w:t xml:space="preserve">7d53a0e</w:t>
       </w:r>
     </w:p>
     <w:p>

</xml_diff>

<commit_message>
Diagrama de clases v4: numeración alineada con la carpeta de entregas
Co-Authored-By: Claude Opus 5.5 (1M context) <noreply@anthropic.com>
Claude-Session: https://claude.ai/code/session_01VkQm5RLcZiQMKLCS3EK3og
</commit_message>
<xml_diff>
--- a/docs/Historial_de_versiones.docx
+++ b/docs/Historial_de_versiones.docx
@@ -2,7 +2,7 @@
 <file path=word/document.xml><?xml version="1.0" encoding="utf-8"?>
 <w:document xmlns:w="http://schemas.openxmlformats.org/wordprocessingml/2006/main" xmlns:m="http://schemas.openxmlformats.org/officeDocument/2006/math" xmlns:r="http://schemas.openxmlformats.org/officeDocument/2006/relationships" xmlns:o="urn:schemas-microsoft-com:office:office" xmlns:v="urn:schemas-microsoft-com:vml" xmlns:w10="urn:schemas-microsoft-com:office:word" xmlns:a="http://schemas.openxmlformats.org/drawingml/2006/main" xmlns:pic="http://schemas.openxmlformats.org/drawingml/2006/picture" xmlns:wp="http://schemas.openxmlformats.org/drawingml/2006/wordprocessingDrawing">
   <w:body>
-    <w:bookmarkStart w:id="42" w:name="historial-de-versiones"/>
+    <w:bookmarkStart w:id="43" w:name="historial-de-versiones"/>
     <w:p>
       <w:pPr>
         <w:pStyle w:val="Heading1"/>
@@ -1437,7 +1437,7 @@
     </w:p>
     <w:bookmarkEnd w:id="28"/>
     <w:bookmarkEnd w:id="29"/>
-    <w:bookmarkStart w:id="37" w:name="diagrama-de-clases-word-aparte"/>
+    <w:bookmarkStart w:id="38" w:name="diagrama-de-clases-word-aparte"/>
     <w:p>
       <w:pPr>
         <w:pStyle w:val="Heading2"/>
@@ -1446,12 +1446,70 @@
         <w:t xml:space="preserve">Diagrama de clases (Word aparte)</w:t>
       </w:r>
     </w:p>
-    <w:bookmarkStart w:id="30" w:name="X863504495f0c283560039533b96e35d8a8aec92"/>
+    <w:bookmarkStart w:id="30" w:name="diagrama-de-clases-v4-2026-10-08"/>
     <w:p>
       <w:pPr>
         <w:pStyle w:val="Heading3"/>
       </w:pPr>
       <w:r>
+        <w:t xml:space="preserve">Diagrama de clases v4 · 2026-10-08</w:t>
+      </w:r>
+    </w:p>
+    <w:p>
+      <w:pPr>
+        <w:numPr>
+          <w:ilvl w:val="0"/>
+          <w:numId w:val="1011"/>
+        </w:numPr>
+        <w:pStyle w:val="Compact"/>
+      </w:pPr>
+      <w:r>
+        <w:t xml:space="preserve">Numeración alineada con la carpeta de Nando (</w:t>
+      </w:r>
+      <w:r>
+        <w:rPr>
+          <w:rStyle w:val="VerbatimChar"/>
+        </w:rPr>
+        <w:t xml:space="preserve">Sem5\Avance1</w:t>
+      </w:r>
+      <w:r>
+        <w:t xml:space="preserve">), donde el diagrama con las colecciones ya se guardó como v4. Word y</w:t>
+      </w:r>
+      <w:r>
+        <w:t xml:space="preserve"> </w:t>
+      </w:r>
+      <w:r>
+        <w:rPr>
+          <w:rStyle w:val="VerbatimChar"/>
+        </w:rPr>
+        <w:t xml:space="preserve">.drawio</w:t>
+      </w:r>
+      <w:r>
+        <w:t xml:space="preserve"> </w:t>
+      </w:r>
+      <w:r>
+        <w:t xml:space="preserve">quedan ambos en v4.</w:t>
+      </w:r>
+    </w:p>
+    <w:p>
+      <w:pPr>
+        <w:numPr>
+          <w:ilvl w:val="0"/>
+          <w:numId w:val="1011"/>
+        </w:numPr>
+        <w:pStyle w:val="Compact"/>
+      </w:pPr>
+      <w:r>
+        <w:t xml:space="preserve">Contenido: el de las entradas v2 y v3 de abajo (colecciones según su uso y la tabla que cita los ejemplos del profesor). Esos números solo existieron en el repositorio.</w:t>
+      </w:r>
+    </w:p>
+    <w:bookmarkEnd w:id="30"/>
+    <w:bookmarkStart w:id="31" w:name="X863504495f0c283560039533b96e35d8a8aec92"/>
+    <w:p>
+      <w:pPr>
+        <w:pStyle w:val="Heading3"/>
+      </w:pPr>
+      <w:r>
         <w:t xml:space="preserve">Diagrama de clases v3 · 2026-10-08 · commit</w:t>
       </w:r>
       <w:r>
@@ -1468,7 +1526,7 @@
       <w:pPr>
         <w:numPr>
           <w:ilvl w:val="0"/>
-          <w:numId w:val="1011"/>
+          <w:numId w:val="1012"/>
         </w:numPr>
         <w:pStyle w:val="Compact"/>
       </w:pPr>
@@ -1491,8 +1549,8 @@
         <w:t xml:space="preserve">sigue en v2 porque los diagramas no cambiaron.</w:t>
       </w:r>
     </w:p>
-    <w:bookmarkEnd w:id="30"/>
-    <w:bookmarkStart w:id="31" w:name="X66fc17acf23d8016d6af910173fecc388667a68"/>
+    <w:bookmarkEnd w:id="31"/>
+    <w:bookmarkStart w:id="32" w:name="X66fc17acf23d8016d6af910173fecc388667a68"/>
     <w:p>
       <w:pPr>
         <w:pStyle w:val="Heading3"/>
@@ -1514,7 +1572,7 @@
       <w:pPr>
         <w:numPr>
           <w:ilvl w:val="0"/>
-          <w:numId w:val="1012"/>
+          <w:numId w:val="1013"/>
         </w:numPr>
         <w:pStyle w:val="Compact"/>
       </w:pPr>
@@ -1592,7 +1650,7 @@
       <w:pPr>
         <w:numPr>
           <w:ilvl w:val="0"/>
-          <w:numId w:val="1012"/>
+          <w:numId w:val="1013"/>
         </w:numPr>
         <w:pStyle w:val="Compact"/>
       </w:pPr>
@@ -1624,8 +1682,8 @@
         <w:t xml:space="preserve">(tres páginas, igual que v1).</w:t>
       </w:r>
     </w:p>
-    <w:bookmarkEnd w:id="31"/>
-    <w:bookmarkStart w:id="32" w:name="Xd9ab462069bc781e05750197a0b9dcc21416b9b"/>
+    <w:bookmarkEnd w:id="32"/>
+    <w:bookmarkStart w:id="33" w:name="Xd9ab462069bc781e05750197a0b9dcc21416b9b"/>
     <w:p>
       <w:pPr>
         <w:pStyle w:val="Heading3"/>
@@ -1647,7 +1705,7 @@
       <w:pPr>
         <w:numPr>
           <w:ilvl w:val="0"/>
-          <w:numId w:val="1013"/>
+          <w:numId w:val="1014"/>
         </w:numPr>
         <w:pStyle w:val="Compact"/>
       </w:pPr>
@@ -1659,7 +1717,7 @@
       <w:pPr>
         <w:numPr>
           <w:ilvl w:val="0"/>
-          <w:numId w:val="1013"/>
+          <w:numId w:val="1014"/>
         </w:numPr>
         <w:pStyle w:val="Compact"/>
       </w:pPr>
@@ -1704,7 +1762,7 @@
       <w:pPr>
         <w:numPr>
           <w:ilvl w:val="0"/>
-          <w:numId w:val="1013"/>
+          <w:numId w:val="1014"/>
         </w:numPr>
         <w:pStyle w:val="Compact"/>
       </w:pPr>
@@ -1748,8 +1806,8 @@
         <w:t xml:space="preserve">desde los diagramas de Mermaid.</w:t>
       </w:r>
     </w:p>
-    <w:bookmarkEnd w:id="32"/>
-    <w:bookmarkStart w:id="33" w:name="X8bff2cc937d55517ed7504f8d852e738002eded"/>
+    <w:bookmarkEnd w:id="33"/>
+    <w:bookmarkStart w:id="34" w:name="X8bff2cc937d55517ed7504f8d852e738002eded"/>
     <w:p>
       <w:pPr>
         <w:pStyle w:val="Heading3"/>
@@ -1771,7 +1829,7 @@
       <w:pPr>
         <w:numPr>
           <w:ilvl w:val="0"/>
-          <w:numId w:val="1014"/>
+          <w:numId w:val="1015"/>
         </w:numPr>
         <w:pStyle w:val="Compact"/>
       </w:pPr>
@@ -1837,7 +1895,7 @@
       <w:pPr>
         <w:numPr>
           <w:ilvl w:val="0"/>
-          <w:numId w:val="1014"/>
+          <w:numId w:val="1015"/>
         </w:numPr>
         <w:pStyle w:val="Compact"/>
       </w:pPr>
@@ -1909,8 +1967,8 @@
         <w:t xml:space="preserve">.</w:t>
       </w:r>
     </w:p>
-    <w:bookmarkEnd w:id="33"/>
-    <w:bookmarkStart w:id="34" w:name="X391512b3d0076f68eba38bfbe03fbe6da9ec0d0"/>
+    <w:bookmarkEnd w:id="34"/>
+    <w:bookmarkStart w:id="35" w:name="X391512b3d0076f68eba38bfbe03fbe6da9ec0d0"/>
     <w:p>
       <w:pPr>
         <w:pStyle w:val="Heading3"/>
@@ -1932,7 +1990,7 @@
       <w:pPr>
         <w:numPr>
           <w:ilvl w:val="0"/>
-          <w:numId w:val="1015"/>
+          <w:numId w:val="1016"/>
         </w:numPr>
         <w:pStyle w:val="Compact"/>
       </w:pPr>
@@ -1944,7 +2002,7 @@
       <w:pPr>
         <w:numPr>
           <w:ilvl w:val="0"/>
-          <w:numId w:val="1015"/>
+          <w:numId w:val="1016"/>
         </w:numPr>
         <w:pStyle w:val="Compact"/>
       </w:pPr>
@@ -1964,8 +2022,8 @@
         <w:t xml:space="preserve">, para que las clases sean más angostas.</w:t>
       </w:r>
     </w:p>
-    <w:bookmarkEnd w:id="34"/>
-    <w:bookmarkStart w:id="35" w:name="Xc4a290eef64159bbb850880299580525a5d9206"/>
+    <w:bookmarkEnd w:id="35"/>
+    <w:bookmarkStart w:id="36" w:name="Xc4a290eef64159bbb850880299580525a5d9206"/>
     <w:p>
       <w:pPr>
         <w:pStyle w:val="Heading3"/>
@@ -1987,7 +2045,7 @@
       <w:pPr>
         <w:numPr>
           <w:ilvl w:val="0"/>
-          <w:numId w:val="1016"/>
+          <w:numId w:val="1017"/>
         </w:numPr>
         <w:pStyle w:val="Compact"/>
       </w:pPr>
@@ -2024,8 +2082,8 @@
         <w:t xml:space="preserve">) con un ejemplo, y cada tipo de flecha (herencia, implementación, composición, agregación y asociación).</w:t>
       </w:r>
     </w:p>
-    <w:bookmarkEnd w:id="35"/>
-    <w:bookmarkStart w:id="36" w:name="X861f067dae0e8a264748fdbddc6a638f1e0d1d0"/>
+    <w:bookmarkEnd w:id="36"/>
+    <w:bookmarkStart w:id="37" w:name="X861f067dae0e8a264748fdbddc6a638f1e0d1d0"/>
     <w:p>
       <w:pPr>
         <w:pStyle w:val="Heading3"/>
@@ -2047,7 +2105,7 @@
       <w:pPr>
         <w:numPr>
           <w:ilvl w:val="0"/>
-          <w:numId w:val="1017"/>
+          <w:numId w:val="1018"/>
         </w:numPr>
         <w:pStyle w:val="Compact"/>
       </w:pPr>
@@ -2059,7 +2117,7 @@
       <w:pPr>
         <w:numPr>
           <w:ilvl w:val="0"/>
-          <w:numId w:val="1017"/>
+          <w:numId w:val="1018"/>
         </w:numPr>
         <w:pStyle w:val="Compact"/>
       </w:pPr>
@@ -2106,9 +2164,9 @@
         <w:t xml:space="preserve">.</w:t>
       </w:r>
     </w:p>
-    <w:bookmarkEnd w:id="36"/>
     <w:bookmarkEnd w:id="37"/>
-    <w:bookmarkStart w:id="41" w:name="código"/>
+    <w:bookmarkEnd w:id="38"/>
+    <w:bookmarkStart w:id="42" w:name="código"/>
     <w:p>
       <w:pPr>
         <w:pStyle w:val="Heading2"/>
@@ -2117,7 +2175,7 @@
         <w:t xml:space="preserve">Código</w:t>
       </w:r>
     </w:p>
-    <w:bookmarkStart w:id="38" w:name="código-v3-2026-10-08-commit-626c373"/>
+    <w:bookmarkStart w:id="39" w:name="código-v3-2026-10-08-commit-626c373"/>
     <w:p>
       <w:pPr>
         <w:pStyle w:val="Heading3"/>
@@ -2139,7 +2197,7 @@
       <w:pPr>
         <w:numPr>
           <w:ilvl w:val="0"/>
-          <w:numId w:val="1018"/>
+          <w:numId w:val="1019"/>
         </w:numPr>
         <w:pStyle w:val="Compact"/>
       </w:pPr>
@@ -2220,7 +2278,7 @@
       <w:pPr>
         <w:numPr>
           <w:ilvl w:val="0"/>
-          <w:numId w:val="1018"/>
+          <w:numId w:val="1019"/>
         </w:numPr>
         <w:pStyle w:val="Compact"/>
       </w:pPr>
@@ -2265,7 +2323,7 @@
       <w:pPr>
         <w:numPr>
           <w:ilvl w:val="0"/>
-          <w:numId w:val="1018"/>
+          <w:numId w:val="1019"/>
         </w:numPr>
         <w:pStyle w:val="Compact"/>
       </w:pPr>
@@ -2318,8 +2376,8 @@
         <w:t xml:space="preserve">da la primera y la última factura.</w:t>
       </w:r>
     </w:p>
-    <w:bookmarkEnd w:id="38"/>
-    <w:bookmarkStart w:id="39" w:name="código-v2-2026-10-08-commit-99f55d4"/>
+    <w:bookmarkEnd w:id="39"/>
+    <w:bookmarkStart w:id="40" w:name="código-v2-2026-10-08-commit-99f55d4"/>
     <w:p>
       <w:pPr>
         <w:pStyle w:val="Heading3"/>
@@ -2341,7 +2399,7 @@
       <w:pPr>
         <w:numPr>
           <w:ilvl w:val="0"/>
-          <w:numId w:val="1019"/>
+          <w:numId w:val="1020"/>
         </w:numPr>
         <w:pStyle w:val="Compact"/>
       </w:pPr>
@@ -2419,7 +2477,7 @@
       <w:pPr>
         <w:numPr>
           <w:ilvl w:val="0"/>
-          <w:numId w:val="1019"/>
+          <w:numId w:val="1020"/>
         </w:numPr>
         <w:pStyle w:val="Compact"/>
       </w:pPr>
@@ -2442,8 +2500,8 @@
         <w:t xml:space="preserve">muestra la regla: un cliente con facturas se desactiva y uno sin facturas se elimina.</w:t>
       </w:r>
     </w:p>
-    <w:bookmarkEnd w:id="39"/>
-    <w:bookmarkStart w:id="40" w:name="código-v1-2026-10-08-commit-442187a"/>
+    <w:bookmarkEnd w:id="40"/>
+    <w:bookmarkStart w:id="41" w:name="código-v1-2026-10-08-commit-442187a"/>
     <w:p>
       <w:pPr>
         <w:pStyle w:val="Heading3"/>
@@ -2465,7 +2523,7 @@
       <w:pPr>
         <w:numPr>
           <w:ilvl w:val="0"/>
-          <w:numId w:val="1020"/>
+          <w:numId w:val="1021"/>
         </w:numPr>
         <w:pStyle w:val="Compact"/>
       </w:pPr>
@@ -2492,7 +2550,7 @@
       <w:pPr>
         <w:numPr>
           <w:ilvl w:val="0"/>
-          <w:numId w:val="1020"/>
+          <w:numId w:val="1021"/>
         </w:numPr>
         <w:pStyle w:val="Compact"/>
       </w:pPr>
@@ -2513,7 +2571,7 @@
       <w:pPr>
         <w:numPr>
           <w:ilvl w:val="0"/>
-          <w:numId w:val="1020"/>
+          <w:numId w:val="1021"/>
         </w:numPr>
         <w:pStyle w:val="Compact"/>
       </w:pPr>
@@ -2521,9 +2579,9 @@
         <w:t xml:space="preserve">Código de referencia para entender el diseño; no es un entregable.</w:t>
       </w:r>
     </w:p>
-    <w:bookmarkEnd w:id="40"/>
     <w:bookmarkEnd w:id="41"/>
     <w:bookmarkEnd w:id="42"/>
+    <w:bookmarkEnd w:id="43"/>
     <w:sectPr>
       <w:pgSz w:w="12240" w:h="15840"/>
       <w:pgMar w:left="1134" w:right="1134"/>
@@ -2770,6 +2828,9 @@
     <w:abstractNumId w:val="991"/>
   </w:num>
   <w:num w:numId="1020">
+    <w:abstractNumId w:val="991"/>
+  </w:num>
+  <w:num w:numId="1021">
     <w:abstractNumId w:val="991"/>
   </w:num>
 </w:numbering>

</xml_diff>

<commit_message>
CHANGELOG y README: documento v10 y diagrama de clases v5
Co-Authored-By: Claude Opus 5.5 (1M context) <noreply@anthropic.com>
Claude-Session: https://claude.ai/code/session_01VkQm5RLcZiQMKLCS3EK3og
</commit_message>
<xml_diff>
--- a/docs/Historial_de_versiones.docx
+++ b/docs/Historial_de_versiones.docx
@@ -2,7 +2,7 @@
 <file path=word/document.xml><?xml version="1.0" encoding="utf-8"?>
 <w:document xmlns:w="http://schemas.openxmlformats.org/wordprocessingml/2006/main" xmlns:m="http://schemas.openxmlformats.org/officeDocument/2006/math" xmlns:r="http://schemas.openxmlformats.org/officeDocument/2006/relationships" xmlns:o="urn:schemas-microsoft-com:office:office" xmlns:v="urn:schemas-microsoft-com:vml" xmlns:w10="urn:schemas-microsoft-com:office:word" xmlns:a="http://schemas.openxmlformats.org/drawingml/2006/main" xmlns:pic="http://schemas.openxmlformats.org/drawingml/2006/picture" xmlns:wp="http://schemas.openxmlformats.org/drawingml/2006/wordprocessingDrawing">
   <w:body>
-    <w:bookmarkStart w:id="43" w:name="historial-de-versiones"/>
+    <w:bookmarkStart w:id="45" w:name="historial-de-versiones"/>
     <w:p>
       <w:pPr>
         <w:pStyle w:val="Heading1"/>
@@ -153,7 +153,7 @@
         <w:t xml:space="preserve">.</w:t>
       </w:r>
     </w:p>
-    <w:bookmarkStart w:id="29" w:name="documento-de-diseño"/>
+    <w:bookmarkStart w:id="30" w:name="documento-de-diseño"/>
     <w:p>
       <w:pPr>
         <w:pStyle w:val="Heading2"/>
@@ -162,22 +162,22 @@
         <w:t xml:space="preserve">Documento de diseño</w:t>
       </w:r>
     </w:p>
-    <w:bookmarkStart w:id="20" w:name="documento-v9-2026-10-08-commit-5400cea"/>
+    <w:bookmarkStart w:id="20" w:name="documento-v10-2026-10-08-commit-fee9361"/>
     <w:p>
       <w:pPr>
         <w:pStyle w:val="Heading3"/>
       </w:pPr>
       <w:r>
-        <w:t xml:space="preserve">Documento v9 · 2026-10-08 · commit</w:t>
-      </w:r>
-      <w:r>
-        <w:t xml:space="preserve"> </w:t>
-      </w:r>
-      <w:r>
-        <w:rPr>
-          <w:rStyle w:val="VerbatimChar"/>
-        </w:rPr>
-        <w:t xml:space="preserve">5400cea</w:t>
+        <w:t xml:space="preserve">Documento v10 · 2026-10-08 · commit</w:t>
+      </w:r>
+      <w:r>
+        <w:t xml:space="preserve"> </w:t>
+      </w:r>
+      <w:r>
+        <w:rPr>
+          <w:rStyle w:val="VerbatimChar"/>
+        </w:rPr>
+        <w:t xml:space="preserve">fee9361</w:t>
       </w:r>
     </w:p>
     <w:p>
@@ -189,532 +189,7 @@
         <w:pStyle w:val="Compact"/>
       </w:pPr>
       <w:r>
-        <w:t xml:space="preserve">La tabla «Colecciones: cuál se usa y por qué» tiene una columna nueva con el ejemplo del profesor que respalda cada elección:</w:t>
-      </w:r>
-      <w:r>
-        <w:t xml:space="preserve"> </w:t>
-      </w:r>
-      <w:r>
-        <w:rPr>
-          <w:rStyle w:val="VerbatimChar"/>
-        </w:rPr>
-        <w:t xml:space="preserve">EjemploList</w:t>
-      </w:r>
-      <w:r>
-        <w:t xml:space="preserve">,</w:t>
-      </w:r>
-      <w:r>
-        <w:t xml:space="preserve"> </w:t>
-      </w:r>
-      <w:r>
-        <w:rPr>
-          <w:rStyle w:val="VerbatimChar"/>
-        </w:rPr>
-        <w:t xml:space="preserve">EjemploCollection</w:t>
-      </w:r>
-      <w:r>
-        <w:t xml:space="preserve">,</w:t>
-      </w:r>
-      <w:r>
-        <w:t xml:space="preserve"> </w:t>
-      </w:r>
-      <w:r>
-        <w:rPr>
-          <w:rStyle w:val="VerbatimChar"/>
-        </w:rPr>
-        <w:t xml:space="preserve">EjemploSet</w:t>
-      </w:r>
-      <w:r>
-        <w:t xml:space="preserve">,</w:t>
-      </w:r>
-      <w:r>
-        <w:t xml:space="preserve"> </w:t>
-      </w:r>
-      <w:r>
-        <w:rPr>
-          <w:rStyle w:val="VerbatimChar"/>
-        </w:rPr>
-        <w:t xml:space="preserve">EjemploMap</w:t>
-      </w:r>
-      <w:r>
-        <w:t xml:space="preserve"> </w:t>
-      </w:r>
-      <w:r>
-        <w:t xml:space="preserve">y</w:t>
-      </w:r>
-      <w:r>
-        <w:t xml:space="preserve"> </w:t>
-      </w:r>
-      <w:r>
-        <w:rPr>
-          <w:rStyle w:val="VerbatimChar"/>
-        </w:rPr>
-        <w:t xml:space="preserve">EjemploTreeMap</w:t>
-      </w:r>
-      <w:r>
-        <w:t xml:space="preserve">.</w:t>
-      </w:r>
-    </w:p>
-    <w:p>
-      <w:pPr>
-        <w:numPr>
-          <w:ilvl w:val="0"/>
-          <w:numId w:val="1002"/>
-        </w:numPr>
-        <w:pStyle w:val="Compact"/>
-      </w:pPr>
-      <w:r>
-        <w:t xml:space="preserve">El texto explica, con</w:t>
-      </w:r>
-      <w:r>
-        <w:t xml:space="preserve"> </w:t>
-      </w:r>
-      <w:r>
-        <w:rPr>
-          <w:rStyle w:val="VerbatimChar"/>
-        </w:rPr>
-        <w:t xml:space="preserve">EjemploColeccionGenerica</w:t>
-      </w:r>
-      <w:r>
-        <w:t xml:space="preserve"> </w:t>
-      </w:r>
-      <w:r>
-        <w:t xml:space="preserve">y</w:t>
-      </w:r>
-      <w:r>
-        <w:t xml:space="preserve"> </w:t>
-      </w:r>
-      <w:r>
-        <w:rPr>
-          <w:rStyle w:val="VerbatimChar"/>
-        </w:rPr>
-        <w:t xml:space="preserve">EjemploColeccionNoGenerica</w:t>
-      </w:r>
-      <w:r>
-        <w:t xml:space="preserve">, por qué todas las colecciones son genéricas (no hace falta cast).</w:t>
-      </w:r>
-    </w:p>
-    <w:bookmarkEnd w:id="20"/>
-    <w:bookmarkStart w:id="21" w:name="documento-v8-2026-10-08-commit-626c373"/>
-    <w:p>
-      <w:pPr>
-        <w:pStyle w:val="Heading3"/>
-      </w:pPr>
-      <w:r>
-        <w:t xml:space="preserve">Documento v8 · 2026-10-08 · commit</w:t>
-      </w:r>
-      <w:r>
-        <w:t xml:space="preserve"> </w:t>
-      </w:r>
-      <w:r>
-        <w:rPr>
-          <w:rStyle w:val="VerbatimChar"/>
-        </w:rPr>
-        <w:t xml:space="preserve">626c373</w:t>
-      </w:r>
-    </w:p>
-    <w:p>
-      <w:pPr>
-        <w:numPr>
-          <w:ilvl w:val="0"/>
-          <w:numId w:val="1003"/>
-        </w:numPr>
-        <w:pStyle w:val="Compact"/>
-      </w:pPr>
-      <w:r>
-        <w:t xml:space="preserve">El profesor explicó que un error común es usar listas para todo. Ahora cada colección se elige según su uso, como en sus ejemplos (</w:t>
-      </w:r>
-      <w:r>
-        <w:rPr>
-          <w:rStyle w:val="VerbatimChar"/>
-        </w:rPr>
-        <w:t xml:space="preserve">EjemploList</w:t>
-      </w:r>
-      <w:r>
-        <w:t xml:space="preserve">,</w:t>
-      </w:r>
-      <w:r>
-        <w:t xml:space="preserve"> </w:t>
-      </w:r>
-      <w:r>
-        <w:rPr>
-          <w:rStyle w:val="VerbatimChar"/>
-        </w:rPr>
-        <w:t xml:space="preserve">EjemploSet</w:t>
-      </w:r>
-      <w:r>
-        <w:t xml:space="preserve">,</w:t>
-      </w:r>
-      <w:r>
-        <w:t xml:space="preserve"> </w:t>
-      </w:r>
-      <w:r>
-        <w:rPr>
-          <w:rStyle w:val="VerbatimChar"/>
-        </w:rPr>
-        <w:t xml:space="preserve">EjemploMap</w:t>
-      </w:r>
-      <w:r>
-        <w:t xml:space="preserve">,</w:t>
-      </w:r>
-      <w:r>
-        <w:t xml:space="preserve"> </w:t>
-      </w:r>
-      <w:r>
-        <w:rPr>
-          <w:rStyle w:val="VerbatimChar"/>
-        </w:rPr>
-        <w:t xml:space="preserve">EjemploTreeMap</w:t>
-      </w:r>
-      <w:r>
-        <w:t xml:space="preserve">), y se declaran por su interface:</w:t>
-      </w:r>
-      <w:r>
-        <w:t xml:space="preserve"> </w:t>
-      </w:r>
-      <w:r>
-        <w:rPr>
-          <w:rStyle w:val="VerbatimChar"/>
-        </w:rPr>
-        <w:t xml:space="preserve">List&lt;T&gt; lista = new ArrayList&lt;&gt;()</w:t>
-      </w:r>
-      <w:r>
-        <w:t xml:space="preserve">.</w:t>
-      </w:r>
-    </w:p>
-    <w:p>
-      <w:pPr>
-        <w:numPr>
-          <w:ilvl w:val="0"/>
-          <w:numId w:val="1003"/>
-        </w:numPr>
-        <w:pStyle w:val="Compact"/>
-      </w:pPr>
-      <w:r>
-        <w:rPr>
-          <w:rStyle w:val="VerbatimChar"/>
-        </w:rPr>
-        <w:t xml:space="preserve">List</w:t>
-      </w:r>
-      <w:r>
-        <w:t xml:space="preserve"> </w:t>
-      </w:r>
-      <w:r>
-        <w:t xml:space="preserve">donde importa el orden: detalles de la factura, productos de la categoría, categorías del inventario y los resultados de las consultas.</w:t>
-      </w:r>
-    </w:p>
-    <w:p>
-      <w:pPr>
-        <w:numPr>
-          <w:ilvl w:val="0"/>
-          <w:numId w:val="1003"/>
-        </w:numPr>
-        <w:pStyle w:val="Compact"/>
-      </w:pPr>
-      <w:r>
-        <w:rPr>
-          <w:rStyle w:val="VerbatimChar"/>
-        </w:rPr>
-        <w:t xml:space="preserve">Set&lt;String&gt;</w:t>
-      </w:r>
-      <w:r>
-        <w:t xml:space="preserve"> </w:t>
-      </w:r>
-      <w:r>
-        <w:t xml:space="preserve">para las advertencias de</w:t>
-      </w:r>
-      <w:r>
-        <w:t xml:space="preserve"> </w:t>
-      </w:r>
-      <w:r>
-        <w:rPr>
-          <w:rStyle w:val="VerbatimChar"/>
-        </w:rPr>
-        <w:t xml:space="preserve">ArticuloHogar</w:t>
-      </w:r>
-      <w:r>
-        <w:t xml:space="preserve"> </w:t>
-      </w:r>
-      <w:r>
-        <w:t xml:space="preserve">(no se repiten).</w:t>
-      </w:r>
-    </w:p>
-    <w:p>
-      <w:pPr>
-        <w:numPr>
-          <w:ilvl w:val="0"/>
-          <w:numId w:val="1003"/>
-        </w:numPr>
-        <w:pStyle w:val="Compact"/>
-      </w:pPr>
-      <w:r>
-        <w:rPr>
-          <w:rStyle w:val="VerbatimChar"/>
-        </w:rPr>
-        <w:t xml:space="preserve">Map&lt;Integer, Usuario&gt;</w:t>
-      </w:r>
-      <w:r>
-        <w:t xml:space="preserve"> </w:t>
-      </w:r>
-      <w:r>
-        <w:t xml:space="preserve">y</w:t>
-      </w:r>
-      <w:r>
-        <w:t xml:space="preserve"> </w:t>
-      </w:r>
-      <w:r>
-        <w:rPr>
-          <w:rStyle w:val="VerbatimChar"/>
-        </w:rPr>
-        <w:t xml:space="preserve">Map&lt;Integer, Cliente&gt;</w:t>
-      </w:r>
-      <w:r>
-        <w:t xml:space="preserve"> </w:t>
-      </w:r>
-      <w:r>
-        <w:t xml:space="preserve">(</w:t>
-      </w:r>
-      <w:r>
-        <w:rPr>
-          <w:rStyle w:val="VerbatimChar"/>
-        </w:rPr>
-        <w:t xml:space="preserve">HashMap</w:t>
-      </w:r>
-      <w:r>
-        <w:t xml:space="preserve">) en los registros: el CRUD por id llega directo sin recorrer la colección.</w:t>
-      </w:r>
-    </w:p>
-    <w:p>
-      <w:pPr>
-        <w:numPr>
-          <w:ilvl w:val="0"/>
-          <w:numId w:val="1003"/>
-        </w:numPr>
-        <w:pStyle w:val="Compact"/>
-      </w:pPr>
-      <w:r>
-        <w:rPr>
-          <w:rStyle w:val="VerbatimChar"/>
-        </w:rPr>
-        <w:t xml:space="preserve">TreeMap&lt;Integer, Factura&gt;</w:t>
-      </w:r>
-      <w:r>
-        <w:t xml:space="preserve"> </w:t>
-      </w:r>
-      <w:r>
-        <w:t xml:space="preserve">en</w:t>
-      </w:r>
-      <w:r>
-        <w:t xml:space="preserve"> </w:t>
-      </w:r>
-      <w:r>
-        <w:rPr>
-          <w:rStyle w:val="VerbatimChar"/>
-        </w:rPr>
-        <w:t xml:space="preserve">RegistroFacturas</w:t>
-      </w:r>
-      <w:r>
-        <w:t xml:space="preserve">: búsqueda por número y facturas ordenadas por número.</w:t>
-      </w:r>
-    </w:p>
-    <w:p>
-      <w:pPr>
-        <w:numPr>
-          <w:ilvl w:val="0"/>
-          <w:numId w:val="1003"/>
-        </w:numPr>
-        <w:pStyle w:val="Compact"/>
-      </w:pPr>
-      <w:r>
-        <w:rPr>
-          <w:rStyle w:val="VerbatimChar"/>
-        </w:rPr>
-        <w:t xml:space="preserve">CopyOnWriteArrayList</w:t>
-      </w:r>
-      <w:r>
-        <w:t xml:space="preserve"> </w:t>
-      </w:r>
-      <w:r>
-        <w:t xml:space="preserve">para los clientes conectados al servidor (segura para hilos); nota sobre</w:t>
-      </w:r>
-      <w:r>
-        <w:t xml:space="preserve"> </w:t>
-      </w:r>
-      <w:r>
-        <w:rPr>
-          <w:rStyle w:val="VerbatimChar"/>
-        </w:rPr>
-        <w:t xml:space="preserve">ConcurrentHashMap</w:t>
-      </w:r>
-      <w:r>
-        <w:t xml:space="preserve"> </w:t>
-      </w:r>
-      <w:r>
-        <w:t xml:space="preserve">en el servidor.</w:t>
-      </w:r>
-    </w:p>
-    <w:p>
-      <w:pPr>
-        <w:numPr>
-          <w:ilvl w:val="0"/>
-          <w:numId w:val="1003"/>
-        </w:numPr>
-        <w:pStyle w:val="Compact"/>
-      </w:pPr>
-      <w:r>
-        <w:t xml:space="preserve">Nueva tabla «Colecciones: cuál se usa y por qué» al final de la sección 4.2 y fila de colecciones en la tabla de conceptos del curso.</w:t>
-      </w:r>
-    </w:p>
-    <w:bookmarkEnd w:id="21"/>
-    <w:bookmarkStart w:id="22" w:name="documento-v7-2026-10-08-commit-047b31c"/>
-    <w:p>
-      <w:pPr>
-        <w:pStyle w:val="Heading3"/>
-      </w:pPr>
-      <w:r>
-        <w:t xml:space="preserve">Documento v7 · 2026-10-08 · commit</w:t>
-      </w:r>
-      <w:r>
-        <w:t xml:space="preserve"> </w:t>
-      </w:r>
-      <w:r>
-        <w:rPr>
-          <w:rStyle w:val="VerbatimChar"/>
-        </w:rPr>
-        <w:t xml:space="preserve">047b31c</w:t>
-      </w:r>
-    </w:p>
-    <w:p>
-      <w:pPr>
-        <w:numPr>
-          <w:ilvl w:val="0"/>
-          <w:numId w:val="1004"/>
-        </w:numPr>
-        <w:pStyle w:val="Compact"/>
-      </w:pPr>
-      <w:r>
-        <w:t xml:space="preserve">El profesor indicó que el Avance 1 es conceptual y pide tres partes: historias de usuario, diagrama de clases y bocetos (login, menú y pantallas CRUD de las clases). Se agrega al inicio una tabla que indica dónde está cada una.</w:t>
-      </w:r>
-    </w:p>
-    <w:p>
-      <w:pPr>
-        <w:numPr>
-          <w:ilvl w:val="0"/>
-          <w:numId w:val="1004"/>
-        </w:numPr>
-        <w:pStyle w:val="Compact"/>
-      </w:pPr>
-      <w:r>
-        <w:t xml:space="preserve">La sección 6 abre con una tabla que relaciona cada pantalla con la clase que administra y sus operaciones CRUD.</w:t>
-      </w:r>
-    </w:p>
-    <w:p>
-      <w:pPr>
-        <w:numPr>
-          <w:ilvl w:val="0"/>
-          <w:numId w:val="1004"/>
-        </w:numPr>
-        <w:pStyle w:val="Compact"/>
-      </w:pPr>
-      <w:r>
-        <w:t xml:space="preserve">Nuevo boceto P10 de gestión de categorías (antes solo se mencionaba como diálogo).</w:t>
-      </w:r>
-    </w:p>
-    <w:p>
-      <w:pPr>
-        <w:numPr>
-          <w:ilvl w:val="0"/>
-          <w:numId w:val="1004"/>
-        </w:numPr>
-        <w:pStyle w:val="Compact"/>
-      </w:pPr>
-      <w:r>
-        <w:t xml:space="preserve">La HU 7 se llama ahora</w:t>
-      </w:r>
-      <w:r>
-        <w:t xml:space="preserve"> </w:t>
-      </w:r>
-      <w:r>
-        <w:t xml:space="preserve">“</w:t>
-      </w:r>
-      <w:r>
-        <w:t xml:space="preserve">Administrar categorías</w:t>
-      </w:r>
-      <w:r>
-        <w:t xml:space="preserve">”</w:t>
-      </w:r>
-      <w:r>
-        <w:t xml:space="preserve"> </w:t>
-      </w:r>
-      <w:r>
-        <w:t xml:space="preserve">en el resumen.</w:t>
-      </w:r>
-    </w:p>
-    <w:p>
-      <w:pPr>
-        <w:numPr>
-          <w:ilvl w:val="0"/>
-          <w:numId w:val="1004"/>
-        </w:numPr>
-        <w:pStyle w:val="Compact"/>
-      </w:pPr>
-      <w:r>
-        <w:t xml:space="preserve">El nombre del profesor (Mario Alberto Vargas Montes) queda en la portada.</w:t>
-      </w:r>
-    </w:p>
-    <w:bookmarkEnd w:id="22"/>
-    <w:bookmarkStart w:id="23" w:name="documento-v6-2026-10-08-commit-99f55d4"/>
-    <w:p>
-      <w:pPr>
-        <w:pStyle w:val="Heading3"/>
-      </w:pPr>
-      <w:r>
-        <w:t xml:space="preserve">Documento v6 · 2026-10-08 · commit</w:t>
-      </w:r>
-      <w:r>
-        <w:t xml:space="preserve"> </w:t>
-      </w:r>
-      <w:r>
-        <w:rPr>
-          <w:rStyle w:val="VerbatimChar"/>
-        </w:rPr>
-        <w:t xml:space="preserve">99f55d4</w:t>
-      </w:r>
-    </w:p>
-    <w:p>
-      <w:pPr>
-        <w:numPr>
-          <w:ilvl w:val="0"/>
-          <w:numId w:val="1005"/>
-        </w:numPr>
-        <w:pStyle w:val="Compact"/>
-      </w:pPr>
-      <w:r>
-        <w:t xml:space="preserve">Diseño alineado con lo que el profesor pidió para el proyecto final: sockets, hilos, pantallas JFrame, base de datos MySQL o Derby, CRUD completo desde pantallas, varios clientes a la vez y un video final.</w:t>
-      </w:r>
-    </w:p>
-    <w:p>
-      <w:pPr>
-        <w:numPr>
-          <w:ilvl w:val="0"/>
-          <w:numId w:val="1005"/>
-        </w:numPr>
-        <w:pStyle w:val="Compact"/>
-      </w:pPr>
-      <w:r>
-        <w:t xml:space="preserve">Nueva sección 1.2 con esos requisitos y dónde los cumple el diseño.</w:t>
-      </w:r>
-    </w:p>
-    <w:p>
-      <w:pPr>
-        <w:numPr>
-          <w:ilvl w:val="0"/>
-          <w:numId w:val="1005"/>
-        </w:numPr>
-        <w:pStyle w:val="Compact"/>
-      </w:pPr>
-      <w:r>
-        <w:t xml:space="preserve">CRUD completo: usuarios, clientes, categorías y productos ahora se pueden</w:t>
+        <w:t xml:space="preserve">La sección 4.1 abre con la</w:t>
       </w:r>
       <w:r>
         <w:t xml:space="preserve"> </w:t>
@@ -724,6 +199,602 @@
           <w:bCs/>
           <w:b/>
         </w:rPr>
+        <w:t xml:space="preserve">vista general</w:t>
+      </w:r>
+      <w:r>
+        <w:t xml:space="preserve"> </w:t>
+      </w:r>
+      <w:r>
+        <w:t xml:space="preserve">del diagrama de clases en una página completa, con su simbología: es la imagen del diagrama simplificado v4 de draw.io, ya con las colecciones. Después sigue el detalle en dos diagramas.</w:t>
+      </w:r>
+    </w:p>
+    <w:p>
+      <w:pPr>
+        <w:numPr>
+          <w:ilvl w:val="0"/>
+          <w:numId w:val="1002"/>
+        </w:numPr>
+        <w:pStyle w:val="Compact"/>
+      </w:pPr>
+      <w:r>
+        <w:t xml:space="preserve">Se mencionan los archivos editables de draw.io y la tabla del inicio indica dónde está la vista general.</w:t>
+      </w:r>
+    </w:p>
+    <w:p>
+      <w:pPr>
+        <w:numPr>
+          <w:ilvl w:val="0"/>
+          <w:numId w:val="1002"/>
+        </w:numPr>
+        <w:pStyle w:val="Compact"/>
+      </w:pPr>
+      <w:r>
+        <w:t xml:space="preserve">Las imágenes grandes se limitan a 20,5 cm de alto para que el título y el pie de figura queden en la misma página.</w:t>
+      </w:r>
+    </w:p>
+    <w:bookmarkEnd w:id="20"/>
+    <w:bookmarkStart w:id="21" w:name="documento-v9-2026-10-08-commit-5400cea"/>
+    <w:p>
+      <w:pPr>
+        <w:pStyle w:val="Heading3"/>
+      </w:pPr>
+      <w:r>
+        <w:t xml:space="preserve">Documento v9 · 2026-10-08 · commit</w:t>
+      </w:r>
+      <w:r>
+        <w:t xml:space="preserve"> </w:t>
+      </w:r>
+      <w:r>
+        <w:rPr>
+          <w:rStyle w:val="VerbatimChar"/>
+        </w:rPr>
+        <w:t xml:space="preserve">5400cea</w:t>
+      </w:r>
+    </w:p>
+    <w:p>
+      <w:pPr>
+        <w:numPr>
+          <w:ilvl w:val="0"/>
+          <w:numId w:val="1003"/>
+        </w:numPr>
+        <w:pStyle w:val="Compact"/>
+      </w:pPr>
+      <w:r>
+        <w:t xml:space="preserve">La tabla «Colecciones: cuál se usa y por qué» tiene una columna nueva con el ejemplo del profesor que respalda cada elección:</w:t>
+      </w:r>
+      <w:r>
+        <w:t xml:space="preserve"> </w:t>
+      </w:r>
+      <w:r>
+        <w:rPr>
+          <w:rStyle w:val="VerbatimChar"/>
+        </w:rPr>
+        <w:t xml:space="preserve">EjemploList</w:t>
+      </w:r>
+      <w:r>
+        <w:t xml:space="preserve">,</w:t>
+      </w:r>
+      <w:r>
+        <w:t xml:space="preserve"> </w:t>
+      </w:r>
+      <w:r>
+        <w:rPr>
+          <w:rStyle w:val="VerbatimChar"/>
+        </w:rPr>
+        <w:t xml:space="preserve">EjemploCollection</w:t>
+      </w:r>
+      <w:r>
+        <w:t xml:space="preserve">,</w:t>
+      </w:r>
+      <w:r>
+        <w:t xml:space="preserve"> </w:t>
+      </w:r>
+      <w:r>
+        <w:rPr>
+          <w:rStyle w:val="VerbatimChar"/>
+        </w:rPr>
+        <w:t xml:space="preserve">EjemploSet</w:t>
+      </w:r>
+      <w:r>
+        <w:t xml:space="preserve">,</w:t>
+      </w:r>
+      <w:r>
+        <w:t xml:space="preserve"> </w:t>
+      </w:r>
+      <w:r>
+        <w:rPr>
+          <w:rStyle w:val="VerbatimChar"/>
+        </w:rPr>
+        <w:t xml:space="preserve">EjemploMap</w:t>
+      </w:r>
+      <w:r>
+        <w:t xml:space="preserve"> </w:t>
+      </w:r>
+      <w:r>
+        <w:t xml:space="preserve">y</w:t>
+      </w:r>
+      <w:r>
+        <w:t xml:space="preserve"> </w:t>
+      </w:r>
+      <w:r>
+        <w:rPr>
+          <w:rStyle w:val="VerbatimChar"/>
+        </w:rPr>
+        <w:t xml:space="preserve">EjemploTreeMap</w:t>
+      </w:r>
+      <w:r>
+        <w:t xml:space="preserve">.</w:t>
+      </w:r>
+    </w:p>
+    <w:p>
+      <w:pPr>
+        <w:numPr>
+          <w:ilvl w:val="0"/>
+          <w:numId w:val="1003"/>
+        </w:numPr>
+        <w:pStyle w:val="Compact"/>
+      </w:pPr>
+      <w:r>
+        <w:t xml:space="preserve">El texto explica, con</w:t>
+      </w:r>
+      <w:r>
+        <w:t xml:space="preserve"> </w:t>
+      </w:r>
+      <w:r>
+        <w:rPr>
+          <w:rStyle w:val="VerbatimChar"/>
+        </w:rPr>
+        <w:t xml:space="preserve">EjemploColeccionGenerica</w:t>
+      </w:r>
+      <w:r>
+        <w:t xml:space="preserve"> </w:t>
+      </w:r>
+      <w:r>
+        <w:t xml:space="preserve">y</w:t>
+      </w:r>
+      <w:r>
+        <w:t xml:space="preserve"> </w:t>
+      </w:r>
+      <w:r>
+        <w:rPr>
+          <w:rStyle w:val="VerbatimChar"/>
+        </w:rPr>
+        <w:t xml:space="preserve">EjemploColeccionNoGenerica</w:t>
+      </w:r>
+      <w:r>
+        <w:t xml:space="preserve">, por qué todas las colecciones son genéricas (no hace falta cast).</w:t>
+      </w:r>
+    </w:p>
+    <w:bookmarkEnd w:id="21"/>
+    <w:bookmarkStart w:id="22" w:name="documento-v8-2026-10-08-commit-626c373"/>
+    <w:p>
+      <w:pPr>
+        <w:pStyle w:val="Heading3"/>
+      </w:pPr>
+      <w:r>
+        <w:t xml:space="preserve">Documento v8 · 2026-10-08 · commit</w:t>
+      </w:r>
+      <w:r>
+        <w:t xml:space="preserve"> </w:t>
+      </w:r>
+      <w:r>
+        <w:rPr>
+          <w:rStyle w:val="VerbatimChar"/>
+        </w:rPr>
+        <w:t xml:space="preserve">626c373</w:t>
+      </w:r>
+    </w:p>
+    <w:p>
+      <w:pPr>
+        <w:numPr>
+          <w:ilvl w:val="0"/>
+          <w:numId w:val="1004"/>
+        </w:numPr>
+        <w:pStyle w:val="Compact"/>
+      </w:pPr>
+      <w:r>
+        <w:t xml:space="preserve">El profesor explicó que un error común es usar listas para todo. Ahora cada colección se elige según su uso, como en sus ejemplos (</w:t>
+      </w:r>
+      <w:r>
+        <w:rPr>
+          <w:rStyle w:val="VerbatimChar"/>
+        </w:rPr>
+        <w:t xml:space="preserve">EjemploList</w:t>
+      </w:r>
+      <w:r>
+        <w:t xml:space="preserve">,</w:t>
+      </w:r>
+      <w:r>
+        <w:t xml:space="preserve"> </w:t>
+      </w:r>
+      <w:r>
+        <w:rPr>
+          <w:rStyle w:val="VerbatimChar"/>
+        </w:rPr>
+        <w:t xml:space="preserve">EjemploSet</w:t>
+      </w:r>
+      <w:r>
+        <w:t xml:space="preserve">,</w:t>
+      </w:r>
+      <w:r>
+        <w:t xml:space="preserve"> </w:t>
+      </w:r>
+      <w:r>
+        <w:rPr>
+          <w:rStyle w:val="VerbatimChar"/>
+        </w:rPr>
+        <w:t xml:space="preserve">EjemploMap</w:t>
+      </w:r>
+      <w:r>
+        <w:t xml:space="preserve">,</w:t>
+      </w:r>
+      <w:r>
+        <w:t xml:space="preserve"> </w:t>
+      </w:r>
+      <w:r>
+        <w:rPr>
+          <w:rStyle w:val="VerbatimChar"/>
+        </w:rPr>
+        <w:t xml:space="preserve">EjemploTreeMap</w:t>
+      </w:r>
+      <w:r>
+        <w:t xml:space="preserve">), y se declaran por su interface:</w:t>
+      </w:r>
+      <w:r>
+        <w:t xml:space="preserve"> </w:t>
+      </w:r>
+      <w:r>
+        <w:rPr>
+          <w:rStyle w:val="VerbatimChar"/>
+        </w:rPr>
+        <w:t xml:space="preserve">List&lt;T&gt; lista = new ArrayList&lt;&gt;()</w:t>
+      </w:r>
+      <w:r>
+        <w:t xml:space="preserve">.</w:t>
+      </w:r>
+    </w:p>
+    <w:p>
+      <w:pPr>
+        <w:numPr>
+          <w:ilvl w:val="0"/>
+          <w:numId w:val="1004"/>
+        </w:numPr>
+        <w:pStyle w:val="Compact"/>
+      </w:pPr>
+      <w:r>
+        <w:rPr>
+          <w:rStyle w:val="VerbatimChar"/>
+        </w:rPr>
+        <w:t xml:space="preserve">List</w:t>
+      </w:r>
+      <w:r>
+        <w:t xml:space="preserve"> </w:t>
+      </w:r>
+      <w:r>
+        <w:t xml:space="preserve">donde importa el orden: detalles de la factura, productos de la categoría, categorías del inventario y los resultados de las consultas.</w:t>
+      </w:r>
+    </w:p>
+    <w:p>
+      <w:pPr>
+        <w:numPr>
+          <w:ilvl w:val="0"/>
+          <w:numId w:val="1004"/>
+        </w:numPr>
+        <w:pStyle w:val="Compact"/>
+      </w:pPr>
+      <w:r>
+        <w:rPr>
+          <w:rStyle w:val="VerbatimChar"/>
+        </w:rPr>
+        <w:t xml:space="preserve">Set&lt;String&gt;</w:t>
+      </w:r>
+      <w:r>
+        <w:t xml:space="preserve"> </w:t>
+      </w:r>
+      <w:r>
+        <w:t xml:space="preserve">para las advertencias de</w:t>
+      </w:r>
+      <w:r>
+        <w:t xml:space="preserve"> </w:t>
+      </w:r>
+      <w:r>
+        <w:rPr>
+          <w:rStyle w:val="VerbatimChar"/>
+        </w:rPr>
+        <w:t xml:space="preserve">ArticuloHogar</w:t>
+      </w:r>
+      <w:r>
+        <w:t xml:space="preserve"> </w:t>
+      </w:r>
+      <w:r>
+        <w:t xml:space="preserve">(no se repiten).</w:t>
+      </w:r>
+    </w:p>
+    <w:p>
+      <w:pPr>
+        <w:numPr>
+          <w:ilvl w:val="0"/>
+          <w:numId w:val="1004"/>
+        </w:numPr>
+        <w:pStyle w:val="Compact"/>
+      </w:pPr>
+      <w:r>
+        <w:rPr>
+          <w:rStyle w:val="VerbatimChar"/>
+        </w:rPr>
+        <w:t xml:space="preserve">Map&lt;Integer, Usuario&gt;</w:t>
+      </w:r>
+      <w:r>
+        <w:t xml:space="preserve"> </w:t>
+      </w:r>
+      <w:r>
+        <w:t xml:space="preserve">y</w:t>
+      </w:r>
+      <w:r>
+        <w:t xml:space="preserve"> </w:t>
+      </w:r>
+      <w:r>
+        <w:rPr>
+          <w:rStyle w:val="VerbatimChar"/>
+        </w:rPr>
+        <w:t xml:space="preserve">Map&lt;Integer, Cliente&gt;</w:t>
+      </w:r>
+      <w:r>
+        <w:t xml:space="preserve"> </w:t>
+      </w:r>
+      <w:r>
+        <w:t xml:space="preserve">(</w:t>
+      </w:r>
+      <w:r>
+        <w:rPr>
+          <w:rStyle w:val="VerbatimChar"/>
+        </w:rPr>
+        <w:t xml:space="preserve">HashMap</w:t>
+      </w:r>
+      <w:r>
+        <w:t xml:space="preserve">) en los registros: el CRUD por id llega directo sin recorrer la colección.</w:t>
+      </w:r>
+    </w:p>
+    <w:p>
+      <w:pPr>
+        <w:numPr>
+          <w:ilvl w:val="0"/>
+          <w:numId w:val="1004"/>
+        </w:numPr>
+        <w:pStyle w:val="Compact"/>
+      </w:pPr>
+      <w:r>
+        <w:rPr>
+          <w:rStyle w:val="VerbatimChar"/>
+        </w:rPr>
+        <w:t xml:space="preserve">TreeMap&lt;Integer, Factura&gt;</w:t>
+      </w:r>
+      <w:r>
+        <w:t xml:space="preserve"> </w:t>
+      </w:r>
+      <w:r>
+        <w:t xml:space="preserve">en</w:t>
+      </w:r>
+      <w:r>
+        <w:t xml:space="preserve"> </w:t>
+      </w:r>
+      <w:r>
+        <w:rPr>
+          <w:rStyle w:val="VerbatimChar"/>
+        </w:rPr>
+        <w:t xml:space="preserve">RegistroFacturas</w:t>
+      </w:r>
+      <w:r>
+        <w:t xml:space="preserve">: búsqueda por número y facturas ordenadas por número.</w:t>
+      </w:r>
+    </w:p>
+    <w:p>
+      <w:pPr>
+        <w:numPr>
+          <w:ilvl w:val="0"/>
+          <w:numId w:val="1004"/>
+        </w:numPr>
+        <w:pStyle w:val="Compact"/>
+      </w:pPr>
+      <w:r>
+        <w:rPr>
+          <w:rStyle w:val="VerbatimChar"/>
+        </w:rPr>
+        <w:t xml:space="preserve">CopyOnWriteArrayList</w:t>
+      </w:r>
+      <w:r>
+        <w:t xml:space="preserve"> </w:t>
+      </w:r>
+      <w:r>
+        <w:t xml:space="preserve">para los clientes conectados al servidor (segura para hilos); nota sobre</w:t>
+      </w:r>
+      <w:r>
+        <w:t xml:space="preserve"> </w:t>
+      </w:r>
+      <w:r>
+        <w:rPr>
+          <w:rStyle w:val="VerbatimChar"/>
+        </w:rPr>
+        <w:t xml:space="preserve">ConcurrentHashMap</w:t>
+      </w:r>
+      <w:r>
+        <w:t xml:space="preserve"> </w:t>
+      </w:r>
+      <w:r>
+        <w:t xml:space="preserve">en el servidor.</w:t>
+      </w:r>
+    </w:p>
+    <w:p>
+      <w:pPr>
+        <w:numPr>
+          <w:ilvl w:val="0"/>
+          <w:numId w:val="1004"/>
+        </w:numPr>
+        <w:pStyle w:val="Compact"/>
+      </w:pPr>
+      <w:r>
+        <w:t xml:space="preserve">Nueva tabla «Colecciones: cuál se usa y por qué» al final de la sección 4.2 y fila de colecciones en la tabla de conceptos del curso.</w:t>
+      </w:r>
+    </w:p>
+    <w:bookmarkEnd w:id="22"/>
+    <w:bookmarkStart w:id="23" w:name="documento-v7-2026-10-08-commit-047b31c"/>
+    <w:p>
+      <w:pPr>
+        <w:pStyle w:val="Heading3"/>
+      </w:pPr>
+      <w:r>
+        <w:t xml:space="preserve">Documento v7 · 2026-10-08 · commit</w:t>
+      </w:r>
+      <w:r>
+        <w:t xml:space="preserve"> </w:t>
+      </w:r>
+      <w:r>
+        <w:rPr>
+          <w:rStyle w:val="VerbatimChar"/>
+        </w:rPr>
+        <w:t xml:space="preserve">047b31c</w:t>
+      </w:r>
+    </w:p>
+    <w:p>
+      <w:pPr>
+        <w:numPr>
+          <w:ilvl w:val="0"/>
+          <w:numId w:val="1005"/>
+        </w:numPr>
+        <w:pStyle w:val="Compact"/>
+      </w:pPr>
+      <w:r>
+        <w:t xml:space="preserve">El profesor indicó que el Avance 1 es conceptual y pide tres partes: historias de usuario, diagrama de clases y bocetos (login, menú y pantallas CRUD de las clases). Se agrega al inicio una tabla que indica dónde está cada una.</w:t>
+      </w:r>
+    </w:p>
+    <w:p>
+      <w:pPr>
+        <w:numPr>
+          <w:ilvl w:val="0"/>
+          <w:numId w:val="1005"/>
+        </w:numPr>
+        <w:pStyle w:val="Compact"/>
+      </w:pPr>
+      <w:r>
+        <w:t xml:space="preserve">La sección 6 abre con una tabla que relaciona cada pantalla con la clase que administra y sus operaciones CRUD.</w:t>
+      </w:r>
+    </w:p>
+    <w:p>
+      <w:pPr>
+        <w:numPr>
+          <w:ilvl w:val="0"/>
+          <w:numId w:val="1005"/>
+        </w:numPr>
+        <w:pStyle w:val="Compact"/>
+      </w:pPr>
+      <w:r>
+        <w:t xml:space="preserve">Nuevo boceto P10 de gestión de categorías (antes solo se mencionaba como diálogo).</w:t>
+      </w:r>
+    </w:p>
+    <w:p>
+      <w:pPr>
+        <w:numPr>
+          <w:ilvl w:val="0"/>
+          <w:numId w:val="1005"/>
+        </w:numPr>
+        <w:pStyle w:val="Compact"/>
+      </w:pPr>
+      <w:r>
+        <w:t xml:space="preserve">La HU 7 se llama ahora</w:t>
+      </w:r>
+      <w:r>
+        <w:t xml:space="preserve"> </w:t>
+      </w:r>
+      <w:r>
+        <w:t xml:space="preserve">“</w:t>
+      </w:r>
+      <w:r>
+        <w:t xml:space="preserve">Administrar categorías</w:t>
+      </w:r>
+      <w:r>
+        <w:t xml:space="preserve">”</w:t>
+      </w:r>
+      <w:r>
+        <w:t xml:space="preserve"> </w:t>
+      </w:r>
+      <w:r>
+        <w:t xml:space="preserve">en el resumen.</w:t>
+      </w:r>
+    </w:p>
+    <w:p>
+      <w:pPr>
+        <w:numPr>
+          <w:ilvl w:val="0"/>
+          <w:numId w:val="1005"/>
+        </w:numPr>
+        <w:pStyle w:val="Compact"/>
+      </w:pPr>
+      <w:r>
+        <w:t xml:space="preserve">El nombre del profesor (Mario Alberto Vargas Montes) queda en la portada.</w:t>
+      </w:r>
+    </w:p>
+    <w:bookmarkEnd w:id="23"/>
+    <w:bookmarkStart w:id="24" w:name="documento-v6-2026-10-08-commit-99f55d4"/>
+    <w:p>
+      <w:pPr>
+        <w:pStyle w:val="Heading3"/>
+      </w:pPr>
+      <w:r>
+        <w:t xml:space="preserve">Documento v6 · 2026-10-08 · commit</w:t>
+      </w:r>
+      <w:r>
+        <w:t xml:space="preserve"> </w:t>
+      </w:r>
+      <w:r>
+        <w:rPr>
+          <w:rStyle w:val="VerbatimChar"/>
+        </w:rPr>
+        <w:t xml:space="preserve">99f55d4</w:t>
+      </w:r>
+    </w:p>
+    <w:p>
+      <w:pPr>
+        <w:numPr>
+          <w:ilvl w:val="0"/>
+          <w:numId w:val="1006"/>
+        </w:numPr>
+        <w:pStyle w:val="Compact"/>
+      </w:pPr>
+      <w:r>
+        <w:t xml:space="preserve">Diseño alineado con lo que el profesor pidió para el proyecto final: sockets, hilos, pantallas JFrame, base de datos MySQL o Derby, CRUD completo desde pantallas, varios clientes a la vez y un video final.</w:t>
+      </w:r>
+    </w:p>
+    <w:p>
+      <w:pPr>
+        <w:numPr>
+          <w:ilvl w:val="0"/>
+          <w:numId w:val="1006"/>
+        </w:numPr>
+        <w:pStyle w:val="Compact"/>
+      </w:pPr>
+      <w:r>
+        <w:t xml:space="preserve">Nueva sección 1.2 con esos requisitos y dónde los cumple el diseño.</w:t>
+      </w:r>
+    </w:p>
+    <w:p>
+      <w:pPr>
+        <w:numPr>
+          <w:ilvl w:val="0"/>
+          <w:numId w:val="1006"/>
+        </w:numPr>
+        <w:pStyle w:val="Compact"/>
+      </w:pPr>
+      <w:r>
+        <w:t xml:space="preserve">CRUD completo: usuarios, clientes, categorías y productos ahora se pueden</w:t>
+      </w:r>
+      <w:r>
+        <w:t xml:space="preserve"> </w:t>
+      </w:r>
+      <w:r>
+        <w:rPr>
+          <w:bCs/>
+          <w:b/>
+        </w:rPr>
         <w:t xml:space="preserve">eliminar</w:t>
       </w:r>
       <w:r>
@@ -766,7 +837,7 @@
       <w:pPr>
         <w:numPr>
           <w:ilvl w:val="0"/>
-          <w:numId w:val="1005"/>
+          <w:numId w:val="1006"/>
         </w:numPr>
         <w:pStyle w:val="Compact"/>
       </w:pPr>
@@ -787,7 +858,7 @@
       <w:pPr>
         <w:numPr>
           <w:ilvl w:val="0"/>
-          <w:numId w:val="1005"/>
+          <w:numId w:val="1006"/>
         </w:numPr>
         <w:pStyle w:val="Compact"/>
       </w:pPr>
@@ -799,7 +870,7 @@
       <w:pPr>
         <w:numPr>
           <w:ilvl w:val="0"/>
-          <w:numId w:val="1005"/>
+          <w:numId w:val="1006"/>
         </w:numPr>
         <w:pStyle w:val="Compact"/>
       </w:pPr>
@@ -811,7 +882,7 @@
       <w:pPr>
         <w:numPr>
           <w:ilvl w:val="0"/>
-          <w:numId w:val="1005"/>
+          <w:numId w:val="1006"/>
         </w:numPr>
         <w:pStyle w:val="Compact"/>
       </w:pPr>
@@ -819,8 +890,8 @@
         <w:t xml:space="preserve">Requerimientos no funcionales de pantallas, sockets, concurrencia y base de datos ajustados.</w:t>
       </w:r>
     </w:p>
-    <w:bookmarkEnd w:id="23"/>
-    <w:bookmarkStart w:id="24" w:name="documento-v5-2026-10-08-commit-9a7a9a7"/>
+    <w:bookmarkEnd w:id="24"/>
+    <w:bookmarkStart w:id="25" w:name="documento-v5-2026-10-08-commit-9a7a9a7"/>
     <w:p>
       <w:pPr>
         <w:pStyle w:val="Heading3"/>
@@ -842,7 +913,7 @@
       <w:pPr>
         <w:numPr>
           <w:ilvl w:val="0"/>
-          <w:numId w:val="1006"/>
+          <w:numId w:val="1007"/>
         </w:numPr>
         <w:pStyle w:val="Compact"/>
       </w:pPr>
@@ -886,7 +957,7 @@
       <w:pPr>
         <w:numPr>
           <w:ilvl w:val="0"/>
-          <w:numId w:val="1006"/>
+          <w:numId w:val="1007"/>
         </w:numPr>
         <w:pStyle w:val="Compact"/>
       </w:pPr>
@@ -898,7 +969,7 @@
       <w:pPr>
         <w:numPr>
           <w:ilvl w:val="0"/>
-          <w:numId w:val="1006"/>
+          <w:numId w:val="1007"/>
         </w:numPr>
         <w:pStyle w:val="Compact"/>
       </w:pPr>
@@ -910,7 +981,7 @@
       <w:pPr>
         <w:numPr>
           <w:ilvl w:val="0"/>
-          <w:numId w:val="1006"/>
+          <w:numId w:val="1007"/>
         </w:numPr>
         <w:pStyle w:val="Compact"/>
       </w:pPr>
@@ -930,8 +1001,8 @@
         <w:t xml:space="preserve">.</w:t>
       </w:r>
     </w:p>
-    <w:bookmarkEnd w:id="24"/>
-    <w:bookmarkStart w:id="25" w:name="documento-v4-2026-10-08-commit-b3e7477"/>
+    <w:bookmarkEnd w:id="25"/>
+    <w:bookmarkStart w:id="26" w:name="documento-v4-2026-10-08-commit-b3e7477"/>
     <w:p>
       <w:pPr>
         <w:pStyle w:val="Heading3"/>
@@ -953,7 +1024,7 @@
       <w:pPr>
         <w:numPr>
           <w:ilvl w:val="0"/>
-          <w:numId w:val="1007"/>
+          <w:numId w:val="1008"/>
         </w:numPr>
         <w:pStyle w:val="Compact"/>
       </w:pPr>
@@ -965,7 +1036,7 @@
       <w:pPr>
         <w:numPr>
           <w:ilvl w:val="0"/>
-          <w:numId w:val="1007"/>
+          <w:numId w:val="1008"/>
         </w:numPr>
         <w:pStyle w:val="Compact"/>
       </w:pPr>
@@ -977,7 +1048,7 @@
       <w:pPr>
         <w:numPr>
           <w:ilvl w:val="0"/>
-          <w:numId w:val="1007"/>
+          <w:numId w:val="1008"/>
         </w:numPr>
         <w:pStyle w:val="Compact"/>
       </w:pPr>
@@ -989,7 +1060,7 @@
       <w:pPr>
         <w:numPr>
           <w:ilvl w:val="0"/>
-          <w:numId w:val="1007"/>
+          <w:numId w:val="1008"/>
         </w:numPr>
         <w:pStyle w:val="Compact"/>
       </w:pPr>
@@ -1024,8 +1095,8 @@
         <w:t xml:space="preserve">.</w:t>
       </w:r>
     </w:p>
-    <w:bookmarkEnd w:id="25"/>
-    <w:bookmarkStart w:id="26" w:name="documento-v3-2026-10-08-commit-bf66b07"/>
+    <w:bookmarkEnd w:id="26"/>
+    <w:bookmarkStart w:id="27" w:name="documento-v3-2026-10-08-commit-bf66b07"/>
     <w:p>
       <w:pPr>
         <w:pStyle w:val="Heading3"/>
@@ -1047,7 +1118,7 @@
       <w:pPr>
         <w:numPr>
           <w:ilvl w:val="0"/>
-          <w:numId w:val="1008"/>
+          <w:numId w:val="1009"/>
         </w:numPr>
         <w:pStyle w:val="Compact"/>
       </w:pPr>
@@ -1059,7 +1130,7 @@
       <w:pPr>
         <w:numPr>
           <w:ilvl w:val="0"/>
-          <w:numId w:val="1008"/>
+          <w:numId w:val="1009"/>
         </w:numPr>
         <w:pStyle w:val="Compact"/>
       </w:pPr>
@@ -1067,8 +1138,8 @@
         <w:t xml:space="preserve">La versión va en el nombre del archivo y la numeración pasa a v1, v2, v3…</w:t>
       </w:r>
     </w:p>
-    <w:bookmarkEnd w:id="26"/>
-    <w:bookmarkStart w:id="27" w:name="documento-v2-2026-10-08-commit-07de778"/>
+    <w:bookmarkEnd w:id="27"/>
+    <w:bookmarkStart w:id="28" w:name="documento-v2-2026-10-08-commit-07de778"/>
     <w:p>
       <w:pPr>
         <w:pStyle w:val="Heading3"/>
@@ -1090,7 +1161,7 @@
       <w:pPr>
         <w:numPr>
           <w:ilvl w:val="0"/>
-          <w:numId w:val="1009"/>
+          <w:numId w:val="1010"/>
         </w:numPr>
         <w:pStyle w:val="Compact"/>
       </w:pPr>
@@ -1303,7 +1374,7 @@
       <w:pPr>
         <w:numPr>
           <w:ilvl w:val="0"/>
-          <w:numId w:val="1009"/>
+          <w:numId w:val="1010"/>
         </w:numPr>
         <w:pStyle w:val="Compact"/>
       </w:pPr>
@@ -1315,7 +1386,7 @@
       <w:pPr>
         <w:numPr>
           <w:ilvl w:val="0"/>
-          <w:numId w:val="1009"/>
+          <w:numId w:val="1010"/>
         </w:numPr>
         <w:pStyle w:val="Compact"/>
       </w:pPr>
@@ -1327,7 +1398,7 @@
       <w:pPr>
         <w:numPr>
           <w:ilvl w:val="0"/>
-          <w:numId w:val="1009"/>
+          <w:numId w:val="1010"/>
         </w:numPr>
         <w:pStyle w:val="Compact"/>
       </w:pPr>
@@ -1354,7 +1425,7 @@
       <w:pPr>
         <w:numPr>
           <w:ilvl w:val="0"/>
-          <w:numId w:val="1009"/>
+          <w:numId w:val="1010"/>
         </w:numPr>
         <w:pStyle w:val="Compact"/>
       </w:pPr>
@@ -1366,7 +1437,7 @@
       <w:pPr>
         <w:numPr>
           <w:ilvl w:val="0"/>
-          <w:numId w:val="1009"/>
+          <w:numId w:val="1010"/>
         </w:numPr>
         <w:pStyle w:val="Compact"/>
       </w:pPr>
@@ -1404,8 +1475,8 @@
         <w:t xml:space="preserve">(el impuesto lo define cada tipo de producto).</w:t>
       </w:r>
     </w:p>
-    <w:bookmarkEnd w:id="27"/>
-    <w:bookmarkStart w:id="28" w:name="documento-v1-2026-10-06-commit-9be1af4"/>
+    <w:bookmarkEnd w:id="28"/>
+    <w:bookmarkStart w:id="29" w:name="documento-v1-2026-10-06-commit-9be1af4"/>
     <w:p>
       <w:pPr>
         <w:pStyle w:val="Heading3"/>
@@ -1427,7 +1498,7 @@
       <w:pPr>
         <w:numPr>
           <w:ilvl w:val="0"/>
-          <w:numId w:val="1010"/>
+          <w:numId w:val="1011"/>
         </w:numPr>
         <w:pStyle w:val="Compact"/>
       </w:pPr>
@@ -1435,9 +1506,9 @@
         <w:t xml:space="preserve">Primera versión del documento de diseño del Avance 1 (Proyecto 1, Fidecompro): clases con atributos, métodos y relaciones; 15 historias de usuario; 8 prototipos de pantalla; diagramas de arquitectura, secuencia y navegación.</w:t>
       </w:r>
     </w:p>
-    <w:bookmarkEnd w:id="28"/>
     <w:bookmarkEnd w:id="29"/>
-    <w:bookmarkStart w:id="38" w:name="diagrama-de-clases-word-aparte"/>
+    <w:bookmarkEnd w:id="30"/>
+    <w:bookmarkStart w:id="40" w:name="diagrama-de-clases-word-aparte"/>
     <w:p>
       <w:pPr>
         <w:pStyle w:val="Heading2"/>
@@ -1446,12 +1517,58 @@
         <w:t xml:space="preserve">Diagrama de clases (Word aparte)</w:t>
       </w:r>
     </w:p>
-    <w:bookmarkStart w:id="30" w:name="X8b6f1de3ef83515f9063b0f71c4f739b3d8e2c1"/>
+    <w:bookmarkStart w:id="31" w:name="X10045a7158086462e70fd3a0d9f926166a3c4ea"/>
     <w:p>
       <w:pPr>
         <w:pStyle w:val="Heading3"/>
       </w:pPr>
       <w:r>
+        <w:t xml:space="preserve">Diagrama de clases v5 · 2026-10-08 · commit</w:t>
+      </w:r>
+      <w:r>
+        <w:t xml:space="preserve"> </w:t>
+      </w:r>
+      <w:r>
+        <w:rPr>
+          <w:rStyle w:val="VerbatimChar"/>
+        </w:rPr>
+        <w:t xml:space="preserve">fee9361</w:t>
+      </w:r>
+    </w:p>
+    <w:p>
+      <w:pPr>
+        <w:numPr>
+          <w:ilvl w:val="0"/>
+          <w:numId w:val="1012"/>
+        </w:numPr>
+        <w:pStyle w:val="Compact"/>
+      </w:pPr>
+      <w:r>
+        <w:t xml:space="preserve">Incluye la vista general en una página con simbología, igual que el documento v10. El</w:t>
+      </w:r>
+      <w:r>
+        <w:t xml:space="preserve"> </w:t>
+      </w:r>
+      <w:r>
+        <w:rPr>
+          <w:rStyle w:val="VerbatimChar"/>
+        </w:rPr>
+        <w:t xml:space="preserve">.drawio</w:t>
+      </w:r>
+      <w:r>
+        <w:t xml:space="preserve"> </w:t>
+      </w:r>
+      <w:r>
+        <w:t xml:space="preserve">sigue en v4 porque no cambió.</w:t>
+      </w:r>
+    </w:p>
+    <w:bookmarkEnd w:id="31"/>
+    <w:bookmarkStart w:id="32" w:name="X8b6f1de3ef83515f9063b0f71c4f739b3d8e2c1"/>
+    <w:p>
+      <w:pPr>
+        <w:pStyle w:val="Heading3"/>
+      </w:pPr>
+      <w:r>
         <w:t xml:space="preserve">Diagrama de clases v4 · 2026-10-08 · commit</w:t>
       </w:r>
       <w:r>
@@ -1468,7 +1585,7 @@
       <w:pPr>
         <w:numPr>
           <w:ilvl w:val="0"/>
-          <w:numId w:val="1011"/>
+          <w:numId w:val="1013"/>
         </w:numPr>
         <w:pStyle w:val="Compact"/>
       </w:pPr>
@@ -1504,7 +1621,7 @@
       <w:pPr>
         <w:numPr>
           <w:ilvl w:val="0"/>
-          <w:numId w:val="1011"/>
+          <w:numId w:val="1013"/>
         </w:numPr>
         <w:pStyle w:val="Compact"/>
       </w:pPr>
@@ -1512,8 +1629,8 @@
         <w:t xml:space="preserve">Contenido: el de las entradas v2 y v3 de abajo (colecciones según su uso y la tabla que cita los ejemplos del profesor). Esos números solo existieron en el repositorio.</w:t>
       </w:r>
     </w:p>
-    <w:bookmarkEnd w:id="30"/>
-    <w:bookmarkStart w:id="31" w:name="X863504495f0c283560039533b96e35d8a8aec92"/>
+    <w:bookmarkEnd w:id="32"/>
+    <w:bookmarkStart w:id="33" w:name="X863504495f0c283560039533b96e35d8a8aec92"/>
     <w:p>
       <w:pPr>
         <w:pStyle w:val="Heading3"/>
@@ -1535,7 +1652,7 @@
       <w:pPr>
         <w:numPr>
           <w:ilvl w:val="0"/>
-          <w:numId w:val="1012"/>
+          <w:numId w:val="1014"/>
         </w:numPr>
         <w:pStyle w:val="Compact"/>
       </w:pPr>
@@ -1558,8 +1675,8 @@
         <w:t xml:space="preserve">sigue en v2 porque los diagramas no cambiaron.</w:t>
       </w:r>
     </w:p>
-    <w:bookmarkEnd w:id="31"/>
-    <w:bookmarkStart w:id="32" w:name="X66fc17acf23d8016d6af910173fecc388667a68"/>
+    <w:bookmarkEnd w:id="33"/>
+    <w:bookmarkStart w:id="34" w:name="X66fc17acf23d8016d6af910173fecc388667a68"/>
     <w:p>
       <w:pPr>
         <w:pStyle w:val="Heading3"/>
@@ -1581,7 +1698,7 @@
       <w:pPr>
         <w:numPr>
           <w:ilvl w:val="0"/>
-          <w:numId w:val="1013"/>
+          <w:numId w:val="1015"/>
         </w:numPr>
         <w:pStyle w:val="Compact"/>
       </w:pPr>
@@ -1659,7 +1776,7 @@
       <w:pPr>
         <w:numPr>
           <w:ilvl w:val="0"/>
-          <w:numId w:val="1013"/>
+          <w:numId w:val="1015"/>
         </w:numPr>
         <w:pStyle w:val="Compact"/>
       </w:pPr>
@@ -1691,8 +1808,8 @@
         <w:t xml:space="preserve">(tres páginas, igual que v1).</w:t>
       </w:r>
     </w:p>
-    <w:bookmarkEnd w:id="32"/>
-    <w:bookmarkStart w:id="33" w:name="Xd9ab462069bc781e05750197a0b9dcc21416b9b"/>
+    <w:bookmarkEnd w:id="34"/>
+    <w:bookmarkStart w:id="35" w:name="Xd9ab462069bc781e05750197a0b9dcc21416b9b"/>
     <w:p>
       <w:pPr>
         <w:pStyle w:val="Heading3"/>
@@ -1714,7 +1831,7 @@
       <w:pPr>
         <w:numPr>
           <w:ilvl w:val="0"/>
-          <w:numId w:val="1014"/>
+          <w:numId w:val="1016"/>
         </w:numPr>
         <w:pStyle w:val="Compact"/>
       </w:pPr>
@@ -1726,7 +1843,7 @@
       <w:pPr>
         <w:numPr>
           <w:ilvl w:val="0"/>
-          <w:numId w:val="1014"/>
+          <w:numId w:val="1016"/>
         </w:numPr>
         <w:pStyle w:val="Compact"/>
       </w:pPr>
@@ -1771,7 +1888,7 @@
       <w:pPr>
         <w:numPr>
           <w:ilvl w:val="0"/>
-          <w:numId w:val="1014"/>
+          <w:numId w:val="1016"/>
         </w:numPr>
         <w:pStyle w:val="Compact"/>
       </w:pPr>
@@ -1815,8 +1932,8 @@
         <w:t xml:space="preserve">desde los diagramas de Mermaid.</w:t>
       </w:r>
     </w:p>
-    <w:bookmarkEnd w:id="33"/>
-    <w:bookmarkStart w:id="34" w:name="X8bff2cc937d55517ed7504f8d852e738002eded"/>
+    <w:bookmarkEnd w:id="35"/>
+    <w:bookmarkStart w:id="36" w:name="X8bff2cc937d55517ed7504f8d852e738002eded"/>
     <w:p>
       <w:pPr>
         <w:pStyle w:val="Heading3"/>
@@ -1838,7 +1955,7 @@
       <w:pPr>
         <w:numPr>
           <w:ilvl w:val="0"/>
-          <w:numId w:val="1015"/>
+          <w:numId w:val="1017"/>
         </w:numPr>
         <w:pStyle w:val="Compact"/>
       </w:pPr>
@@ -1904,7 +2021,7 @@
       <w:pPr>
         <w:numPr>
           <w:ilvl w:val="0"/>
-          <w:numId w:val="1015"/>
+          <w:numId w:val="1017"/>
         </w:numPr>
         <w:pStyle w:val="Compact"/>
       </w:pPr>
@@ -1976,8 +2093,8 @@
         <w:t xml:space="preserve">.</w:t>
       </w:r>
     </w:p>
-    <w:bookmarkEnd w:id="34"/>
-    <w:bookmarkStart w:id="35" w:name="X391512b3d0076f68eba38bfbe03fbe6da9ec0d0"/>
+    <w:bookmarkEnd w:id="36"/>
+    <w:bookmarkStart w:id="37" w:name="X391512b3d0076f68eba38bfbe03fbe6da9ec0d0"/>
     <w:p>
       <w:pPr>
         <w:pStyle w:val="Heading3"/>
@@ -1999,7 +2116,7 @@
       <w:pPr>
         <w:numPr>
           <w:ilvl w:val="0"/>
-          <w:numId w:val="1016"/>
+          <w:numId w:val="1018"/>
         </w:numPr>
         <w:pStyle w:val="Compact"/>
       </w:pPr>
@@ -2011,7 +2128,7 @@
       <w:pPr>
         <w:numPr>
           <w:ilvl w:val="0"/>
-          <w:numId w:val="1016"/>
+          <w:numId w:val="1018"/>
         </w:numPr>
         <w:pStyle w:val="Compact"/>
       </w:pPr>
@@ -2031,8 +2148,8 @@
         <w:t xml:space="preserve">, para que las clases sean más angostas.</w:t>
       </w:r>
     </w:p>
-    <w:bookmarkEnd w:id="35"/>
-    <w:bookmarkStart w:id="36" w:name="Xc4a290eef64159bbb850880299580525a5d9206"/>
+    <w:bookmarkEnd w:id="37"/>
+    <w:bookmarkStart w:id="38" w:name="Xc4a290eef64159bbb850880299580525a5d9206"/>
     <w:p>
       <w:pPr>
         <w:pStyle w:val="Heading3"/>
@@ -2054,7 +2171,7 @@
       <w:pPr>
         <w:numPr>
           <w:ilvl w:val="0"/>
-          <w:numId w:val="1017"/>
+          <w:numId w:val="1019"/>
         </w:numPr>
         <w:pStyle w:val="Compact"/>
       </w:pPr>
@@ -2091,8 +2208,8 @@
         <w:t xml:space="preserve">) con un ejemplo, y cada tipo de flecha (herencia, implementación, composición, agregación y asociación).</w:t>
       </w:r>
     </w:p>
-    <w:bookmarkEnd w:id="36"/>
-    <w:bookmarkStart w:id="37" w:name="X861f067dae0e8a264748fdbddc6a638f1e0d1d0"/>
+    <w:bookmarkEnd w:id="38"/>
+    <w:bookmarkStart w:id="39" w:name="X861f067dae0e8a264748fdbddc6a638f1e0d1d0"/>
     <w:p>
       <w:pPr>
         <w:pStyle w:val="Heading3"/>
@@ -2114,7 +2231,7 @@
       <w:pPr>
         <w:numPr>
           <w:ilvl w:val="0"/>
-          <w:numId w:val="1018"/>
+          <w:numId w:val="1020"/>
         </w:numPr>
         <w:pStyle w:val="Compact"/>
       </w:pPr>
@@ -2126,7 +2243,7 @@
       <w:pPr>
         <w:numPr>
           <w:ilvl w:val="0"/>
-          <w:numId w:val="1018"/>
+          <w:numId w:val="1020"/>
         </w:numPr>
         <w:pStyle w:val="Compact"/>
       </w:pPr>
@@ -2173,9 +2290,9 @@
         <w:t xml:space="preserve">.</w:t>
       </w:r>
     </w:p>
-    <w:bookmarkEnd w:id="37"/>
-    <w:bookmarkEnd w:id="38"/>
-    <w:bookmarkStart w:id="42" w:name="código"/>
+    <w:bookmarkEnd w:id="39"/>
+    <w:bookmarkEnd w:id="40"/>
+    <w:bookmarkStart w:id="44" w:name="código"/>
     <w:p>
       <w:pPr>
         <w:pStyle w:val="Heading2"/>
@@ -2184,7 +2301,7 @@
         <w:t xml:space="preserve">Código</w:t>
       </w:r>
     </w:p>
-    <w:bookmarkStart w:id="39" w:name="código-v3-2026-10-08-commit-626c373"/>
+    <w:bookmarkStart w:id="41" w:name="código-v3-2026-10-08-commit-626c373"/>
     <w:p>
       <w:pPr>
         <w:pStyle w:val="Heading3"/>
@@ -2206,7 +2323,7 @@
       <w:pPr>
         <w:numPr>
           <w:ilvl w:val="0"/>
-          <w:numId w:val="1019"/>
+          <w:numId w:val="1021"/>
         </w:numPr>
         <w:pStyle w:val="Compact"/>
       </w:pPr>
@@ -2287,7 +2404,7 @@
       <w:pPr>
         <w:numPr>
           <w:ilvl w:val="0"/>
-          <w:numId w:val="1019"/>
+          <w:numId w:val="1021"/>
         </w:numPr>
         <w:pStyle w:val="Compact"/>
       </w:pPr>
@@ -2332,7 +2449,7 @@
       <w:pPr>
         <w:numPr>
           <w:ilvl w:val="0"/>
-          <w:numId w:val="1019"/>
+          <w:numId w:val="1021"/>
         </w:numPr>
         <w:pStyle w:val="Compact"/>
       </w:pPr>
@@ -2385,8 +2502,8 @@
         <w:t xml:space="preserve">da la primera y la última factura.</w:t>
       </w:r>
     </w:p>
-    <w:bookmarkEnd w:id="39"/>
-    <w:bookmarkStart w:id="40" w:name="código-v2-2026-10-08-commit-99f55d4"/>
+    <w:bookmarkEnd w:id="41"/>
+    <w:bookmarkStart w:id="42" w:name="código-v2-2026-10-08-commit-99f55d4"/>
     <w:p>
       <w:pPr>
         <w:pStyle w:val="Heading3"/>
@@ -2408,7 +2525,7 @@
       <w:pPr>
         <w:numPr>
           <w:ilvl w:val="0"/>
-          <w:numId w:val="1020"/>
+          <w:numId w:val="1022"/>
         </w:numPr>
         <w:pStyle w:val="Compact"/>
       </w:pPr>
@@ -2486,7 +2603,7 @@
       <w:pPr>
         <w:numPr>
           <w:ilvl w:val="0"/>
-          <w:numId w:val="1020"/>
+          <w:numId w:val="1022"/>
         </w:numPr>
         <w:pStyle w:val="Compact"/>
       </w:pPr>
@@ -2509,8 +2626,8 @@
         <w:t xml:space="preserve">muestra la regla: un cliente con facturas se desactiva y uno sin facturas se elimina.</w:t>
       </w:r>
     </w:p>
-    <w:bookmarkEnd w:id="40"/>
-    <w:bookmarkStart w:id="41" w:name="código-v1-2026-10-08-commit-442187a"/>
+    <w:bookmarkEnd w:id="42"/>
+    <w:bookmarkStart w:id="43" w:name="código-v1-2026-10-08-commit-442187a"/>
     <w:p>
       <w:pPr>
         <w:pStyle w:val="Heading3"/>
@@ -2532,7 +2649,7 @@
       <w:pPr>
         <w:numPr>
           <w:ilvl w:val="0"/>
-          <w:numId w:val="1021"/>
+          <w:numId w:val="1023"/>
         </w:numPr>
         <w:pStyle w:val="Compact"/>
       </w:pPr>
@@ -2559,7 +2676,7 @@
       <w:pPr>
         <w:numPr>
           <w:ilvl w:val="0"/>
-          <w:numId w:val="1021"/>
+          <w:numId w:val="1023"/>
         </w:numPr>
         <w:pStyle w:val="Compact"/>
       </w:pPr>
@@ -2580,7 +2697,7 @@
       <w:pPr>
         <w:numPr>
           <w:ilvl w:val="0"/>
-          <w:numId w:val="1021"/>
+          <w:numId w:val="1023"/>
         </w:numPr>
         <w:pStyle w:val="Compact"/>
       </w:pPr>
@@ -2588,9 +2705,9 @@
         <w:t xml:space="preserve">Código de referencia para entender el diseño; no es un entregable.</w:t>
       </w:r>
     </w:p>
-    <w:bookmarkEnd w:id="41"/>
-    <w:bookmarkEnd w:id="42"/>
     <w:bookmarkEnd w:id="43"/>
+    <w:bookmarkEnd w:id="44"/>
+    <w:bookmarkEnd w:id="45"/>
     <w:sectPr>
       <w:pgSz w:w="12240" w:h="15840"/>
       <w:pgMar w:left="1134" w:right="1134"/>
@@ -2840,6 +2957,12 @@
     <w:abstractNumId w:val="991"/>
   </w:num>
   <w:num w:numId="1021">
+    <w:abstractNumId w:val="991"/>
+  </w:num>
+  <w:num w:numId="1022">
+    <w:abstractNumId w:val="991"/>
+  </w:num>
+  <w:num w:numId="1023">
     <w:abstractNumId w:val="991"/>
   </w:num>
 </w:numbering>

</xml_diff>

<commit_message>
CHANGELOG y README: documento v11 y diagrama de clases v6
Co-Authored-By: Claude Opus 5.5 (1M context) <noreply@anthropic.com>
Claude-Session: https://claude.ai/code/session_01VkQm5RLcZiQMKLCS3EK3og
</commit_message>
<xml_diff>
--- a/docs/Historial_de_versiones.docx
+++ b/docs/Historial_de_versiones.docx
@@ -2,7 +2,7 @@
 <file path=word/document.xml><?xml version="1.0" encoding="utf-8"?>
 <w:document xmlns:w="http://schemas.openxmlformats.org/wordprocessingml/2006/main" xmlns:m="http://schemas.openxmlformats.org/officeDocument/2006/math" xmlns:r="http://schemas.openxmlformats.org/officeDocument/2006/relationships" xmlns:o="urn:schemas-microsoft-com:office:office" xmlns:v="urn:schemas-microsoft-com:vml" xmlns:w10="urn:schemas-microsoft-com:office:word" xmlns:a="http://schemas.openxmlformats.org/drawingml/2006/main" xmlns:pic="http://schemas.openxmlformats.org/drawingml/2006/picture" xmlns:wp="http://schemas.openxmlformats.org/drawingml/2006/wordprocessingDrawing">
   <w:body>
-    <w:bookmarkStart w:id="45" w:name="historial-de-versiones"/>
+    <w:bookmarkStart w:id="47" w:name="historial-de-versiones"/>
     <w:p>
       <w:pPr>
         <w:pStyle w:val="Heading1"/>
@@ -153,7 +153,7 @@
         <w:t xml:space="preserve">.</w:t>
       </w:r>
     </w:p>
-    <w:bookmarkStart w:id="30" w:name="documento-de-diseño"/>
+    <w:bookmarkStart w:id="31" w:name="documento-de-diseño"/>
     <w:p>
       <w:pPr>
         <w:pStyle w:val="Heading2"/>
@@ -162,12 +162,127 @@
         <w:t xml:space="preserve">Documento de diseño</w:t>
       </w:r>
     </w:p>
-    <w:bookmarkStart w:id="20" w:name="documento-v10-2026-10-08-commit-fee9361"/>
+    <w:bookmarkStart w:id="20" w:name="documento-v11-2026-10-08-commit-156cbdf"/>
     <w:p>
       <w:pPr>
         <w:pStyle w:val="Heading3"/>
       </w:pPr>
       <w:r>
+        <w:t xml:space="preserve">Documento v11 · 2026-10-08 · commit</w:t>
+      </w:r>
+      <w:r>
+        <w:t xml:space="preserve"> </w:t>
+      </w:r>
+      <w:r>
+        <w:rPr>
+          <w:rStyle w:val="VerbatimChar"/>
+        </w:rPr>
+        <w:t xml:space="preserve">156cbdf</w:t>
+      </w:r>
+    </w:p>
+    <w:p>
+      <w:pPr>
+        <w:numPr>
+          <w:ilvl w:val="0"/>
+          <w:numId w:val="1002"/>
+        </w:numPr>
+        <w:pStyle w:val="Compact"/>
+      </w:pPr>
+      <w:r>
+        <w:t xml:space="preserve">Formato APA 7 (</w:t>
+      </w:r>
+      <w:r>
+        <w:rPr>
+          <w:rStyle w:val="VerbatimChar"/>
+        </w:rPr>
+        <w:t xml:space="preserve">docs/formato_apa.py</w:t>
+      </w:r>
+      <w:r>
+        <w:t xml:space="preserve">): márgenes de 2,54 cm en todas las páginas, también en las horizontales de las historias de usuario; Times New Roman 12; interlineado doble y sangría de 1,27 cm en el texto; número de página arriba a la derecha.</w:t>
+      </w:r>
+    </w:p>
+    <w:p>
+      <w:pPr>
+        <w:numPr>
+          <w:ilvl w:val="0"/>
+          <w:numId w:val="1002"/>
+        </w:numPr>
+        <w:pStyle w:val="Compact"/>
+      </w:pPr>
+      <w:r>
+        <w:t xml:space="preserve">Portada de estudiante: título en negrita y centrado; nombre, universidad, curso, profesor y fecha debajo. El documento empieza en la página 2.</w:t>
+      </w:r>
+    </w:p>
+    <w:p>
+      <w:pPr>
+        <w:numPr>
+          <w:ilvl w:val="0"/>
+          <w:numId w:val="1002"/>
+        </w:numPr>
+        <w:pStyle w:val="Compact"/>
+      </w:pPr>
+      <w:r>
+        <w:t xml:space="preserve">Títulos de nivel 1 centrados en negrita, nivel 2 a la izquierda en negrita y nivel 3 en negrita y cursiva.</w:t>
+      </w:r>
+    </w:p>
+    <w:p>
+      <w:pPr>
+        <w:numPr>
+          <w:ilvl w:val="0"/>
+          <w:numId w:val="1002"/>
+        </w:numPr>
+        <w:pStyle w:val="Compact"/>
+      </w:pPr>
+      <w:r>
+        <w:t xml:space="preserve">Las 35 tablas y las 18 figuras van numeradas (</w:t>
+      </w:r>
+      <w:r>
+        <w:t xml:space="preserve">“</w:t>
+      </w:r>
+      <w:r>
+        <w:t xml:space="preserve">Tabla N</w:t>
+      </w:r>
+      <w:r>
+        <w:t xml:space="preserve">”</w:t>
+      </w:r>
+      <w:r>
+        <w:t xml:space="preserve">,</w:t>
+      </w:r>
+      <w:r>
+        <w:t xml:space="preserve"> </w:t>
+      </w:r>
+      <w:r>
+        <w:t xml:space="preserve">“</w:t>
+      </w:r>
+      <w:r>
+        <w:t xml:space="preserve">Figura N</w:t>
+      </w:r>
+      <w:r>
+        <w:t xml:space="preserve">”</w:t>
+      </w:r>
+      <w:r>
+        <w:t xml:space="preserve">) con su título en cursiva arriba. Las tablas usan solo líneas horizontales; la de historias de usuario y las de requerimientos conservan su formato con colores.</w:t>
+      </w:r>
+    </w:p>
+    <w:p>
+      <w:pPr>
+        <w:numPr>
+          <w:ilvl w:val="0"/>
+          <w:numId w:val="1002"/>
+        </w:numPr>
+        <w:pStyle w:val="Compact"/>
+      </w:pPr>
+      <w:r>
+        <w:t xml:space="preserve">Columnas de la tabla de historias ajustadas al nuevo ancho para que no se corten palabras.</w:t>
+      </w:r>
+    </w:p>
+    <w:bookmarkEnd w:id="20"/>
+    <w:bookmarkStart w:id="21" w:name="documento-v10-2026-10-08-commit-fee9361"/>
+    <w:p>
+      <w:pPr>
+        <w:pStyle w:val="Heading3"/>
+      </w:pPr>
+      <w:r>
         <w:t xml:space="preserve">Documento v10 · 2026-10-08 · commit</w:t>
       </w:r>
       <w:r>
@@ -184,7 +299,7 @@
       <w:pPr>
         <w:numPr>
           <w:ilvl w:val="0"/>
-          <w:numId w:val="1002"/>
+          <w:numId w:val="1003"/>
         </w:numPr>
         <w:pStyle w:val="Compact"/>
       </w:pPr>
@@ -212,7 +327,7 @@
       <w:pPr>
         <w:numPr>
           <w:ilvl w:val="0"/>
-          <w:numId w:val="1002"/>
+          <w:numId w:val="1003"/>
         </w:numPr>
         <w:pStyle w:val="Compact"/>
       </w:pPr>
@@ -224,7 +339,7 @@
       <w:pPr>
         <w:numPr>
           <w:ilvl w:val="0"/>
-          <w:numId w:val="1002"/>
+          <w:numId w:val="1003"/>
         </w:numPr>
         <w:pStyle w:val="Compact"/>
       </w:pPr>
@@ -232,8 +347,8 @@
         <w:t xml:space="preserve">Las imágenes grandes se limitan a 20,5 cm de alto para que el título y el pie de figura queden en la misma página.</w:t>
       </w:r>
     </w:p>
-    <w:bookmarkEnd w:id="20"/>
-    <w:bookmarkStart w:id="21" w:name="documento-v9-2026-10-08-commit-5400cea"/>
+    <w:bookmarkEnd w:id="21"/>
+    <w:bookmarkStart w:id="22" w:name="documento-v9-2026-10-08-commit-5400cea"/>
     <w:p>
       <w:pPr>
         <w:pStyle w:val="Heading3"/>
@@ -255,7 +370,7 @@
       <w:pPr>
         <w:numPr>
           <w:ilvl w:val="0"/>
-          <w:numId w:val="1003"/>
+          <w:numId w:val="1004"/>
         </w:numPr>
         <w:pStyle w:val="Compact"/>
       </w:pPr>
@@ -330,7 +445,7 @@
       <w:pPr>
         <w:numPr>
           <w:ilvl w:val="0"/>
-          <w:numId w:val="1003"/>
+          <w:numId w:val="1004"/>
         </w:numPr>
         <w:pStyle w:val="Compact"/>
       </w:pPr>
@@ -365,8 +480,8 @@
         <w:t xml:space="preserve">, por qué todas las colecciones son genéricas (no hace falta cast).</w:t>
       </w:r>
     </w:p>
-    <w:bookmarkEnd w:id="21"/>
-    <w:bookmarkStart w:id="22" w:name="documento-v8-2026-10-08-commit-626c373"/>
+    <w:bookmarkEnd w:id="22"/>
+    <w:bookmarkStart w:id="23" w:name="documento-v8-2026-10-08-commit-626c373"/>
     <w:p>
       <w:pPr>
         <w:pStyle w:val="Heading3"/>
@@ -388,7 +503,7 @@
       <w:pPr>
         <w:numPr>
           <w:ilvl w:val="0"/>
-          <w:numId w:val="1004"/>
+          <w:numId w:val="1005"/>
         </w:numPr>
         <w:pStyle w:val="Compact"/>
       </w:pPr>
@@ -457,7 +572,7 @@
       <w:pPr>
         <w:numPr>
           <w:ilvl w:val="0"/>
-          <w:numId w:val="1004"/>
+          <w:numId w:val="1005"/>
         </w:numPr>
         <w:pStyle w:val="Compact"/>
       </w:pPr>
@@ -478,7 +593,7 @@
       <w:pPr>
         <w:numPr>
           <w:ilvl w:val="0"/>
-          <w:numId w:val="1004"/>
+          <w:numId w:val="1005"/>
         </w:numPr>
         <w:pStyle w:val="Compact"/>
       </w:pPr>
@@ -514,7 +629,7 @@
       <w:pPr>
         <w:numPr>
           <w:ilvl w:val="0"/>
-          <w:numId w:val="1004"/>
+          <w:numId w:val="1005"/>
         </w:numPr>
         <w:pStyle w:val="Compact"/>
       </w:pPr>
@@ -559,7 +674,7 @@
       <w:pPr>
         <w:numPr>
           <w:ilvl w:val="0"/>
-          <w:numId w:val="1004"/>
+          <w:numId w:val="1005"/>
         </w:numPr>
         <w:pStyle w:val="Compact"/>
       </w:pPr>
@@ -592,7 +707,7 @@
       <w:pPr>
         <w:numPr>
           <w:ilvl w:val="0"/>
-          <w:numId w:val="1004"/>
+          <w:numId w:val="1005"/>
         </w:numPr>
         <w:pStyle w:val="Compact"/>
       </w:pPr>
@@ -628,7 +743,7 @@
       <w:pPr>
         <w:numPr>
           <w:ilvl w:val="0"/>
-          <w:numId w:val="1004"/>
+          <w:numId w:val="1005"/>
         </w:numPr>
         <w:pStyle w:val="Compact"/>
       </w:pPr>
@@ -636,8 +751,8 @@
         <w:t xml:space="preserve">Nueva tabla «Colecciones: cuál se usa y por qué» al final de la sección 4.2 y fila de colecciones en la tabla de conceptos del curso.</w:t>
       </w:r>
     </w:p>
-    <w:bookmarkEnd w:id="22"/>
-    <w:bookmarkStart w:id="23" w:name="documento-v7-2026-10-08-commit-047b31c"/>
+    <w:bookmarkEnd w:id="23"/>
+    <w:bookmarkStart w:id="24" w:name="documento-v7-2026-10-08-commit-047b31c"/>
     <w:p>
       <w:pPr>
         <w:pStyle w:val="Heading3"/>
@@ -659,7 +774,7 @@
       <w:pPr>
         <w:numPr>
           <w:ilvl w:val="0"/>
-          <w:numId w:val="1005"/>
+          <w:numId w:val="1006"/>
         </w:numPr>
         <w:pStyle w:val="Compact"/>
       </w:pPr>
@@ -671,7 +786,7 @@
       <w:pPr>
         <w:numPr>
           <w:ilvl w:val="0"/>
-          <w:numId w:val="1005"/>
+          <w:numId w:val="1006"/>
         </w:numPr>
         <w:pStyle w:val="Compact"/>
       </w:pPr>
@@ -683,7 +798,7 @@
       <w:pPr>
         <w:numPr>
           <w:ilvl w:val="0"/>
-          <w:numId w:val="1005"/>
+          <w:numId w:val="1006"/>
         </w:numPr>
         <w:pStyle w:val="Compact"/>
       </w:pPr>
@@ -695,7 +810,7 @@
       <w:pPr>
         <w:numPr>
           <w:ilvl w:val="0"/>
-          <w:numId w:val="1005"/>
+          <w:numId w:val="1006"/>
         </w:numPr>
         <w:pStyle w:val="Compact"/>
       </w:pPr>
@@ -725,7 +840,7 @@
       <w:pPr>
         <w:numPr>
           <w:ilvl w:val="0"/>
-          <w:numId w:val="1005"/>
+          <w:numId w:val="1006"/>
         </w:numPr>
         <w:pStyle w:val="Compact"/>
       </w:pPr>
@@ -733,8 +848,8 @@
         <w:t xml:space="preserve">El nombre del profesor (Mario Alberto Vargas Montes) queda en la portada.</w:t>
       </w:r>
     </w:p>
-    <w:bookmarkEnd w:id="23"/>
-    <w:bookmarkStart w:id="24" w:name="documento-v6-2026-10-08-commit-99f55d4"/>
+    <w:bookmarkEnd w:id="24"/>
+    <w:bookmarkStart w:id="25" w:name="documento-v6-2026-10-08-commit-99f55d4"/>
     <w:p>
       <w:pPr>
         <w:pStyle w:val="Heading3"/>
@@ -756,7 +871,7 @@
       <w:pPr>
         <w:numPr>
           <w:ilvl w:val="0"/>
-          <w:numId w:val="1006"/>
+          <w:numId w:val="1007"/>
         </w:numPr>
         <w:pStyle w:val="Compact"/>
       </w:pPr>
@@ -768,7 +883,7 @@
       <w:pPr>
         <w:numPr>
           <w:ilvl w:val="0"/>
-          <w:numId w:val="1006"/>
+          <w:numId w:val="1007"/>
         </w:numPr>
         <w:pStyle w:val="Compact"/>
       </w:pPr>
@@ -780,7 +895,7 @@
       <w:pPr>
         <w:numPr>
           <w:ilvl w:val="0"/>
-          <w:numId w:val="1006"/>
+          <w:numId w:val="1007"/>
         </w:numPr>
         <w:pStyle w:val="Compact"/>
       </w:pPr>
@@ -837,7 +952,7 @@
       <w:pPr>
         <w:numPr>
           <w:ilvl w:val="0"/>
-          <w:numId w:val="1006"/>
+          <w:numId w:val="1007"/>
         </w:numPr>
         <w:pStyle w:val="Compact"/>
       </w:pPr>
@@ -858,7 +973,7 @@
       <w:pPr>
         <w:numPr>
           <w:ilvl w:val="0"/>
-          <w:numId w:val="1006"/>
+          <w:numId w:val="1007"/>
         </w:numPr>
         <w:pStyle w:val="Compact"/>
       </w:pPr>
@@ -870,7 +985,7 @@
       <w:pPr>
         <w:numPr>
           <w:ilvl w:val="0"/>
-          <w:numId w:val="1006"/>
+          <w:numId w:val="1007"/>
         </w:numPr>
         <w:pStyle w:val="Compact"/>
       </w:pPr>
@@ -882,7 +997,7 @@
       <w:pPr>
         <w:numPr>
           <w:ilvl w:val="0"/>
-          <w:numId w:val="1006"/>
+          <w:numId w:val="1007"/>
         </w:numPr>
         <w:pStyle w:val="Compact"/>
       </w:pPr>
@@ -890,8 +1005,8 @@
         <w:t xml:space="preserve">Requerimientos no funcionales de pantallas, sockets, concurrencia y base de datos ajustados.</w:t>
       </w:r>
     </w:p>
-    <w:bookmarkEnd w:id="24"/>
-    <w:bookmarkStart w:id="25" w:name="documento-v5-2026-10-08-commit-9a7a9a7"/>
+    <w:bookmarkEnd w:id="25"/>
+    <w:bookmarkStart w:id="26" w:name="documento-v5-2026-10-08-commit-9a7a9a7"/>
     <w:p>
       <w:pPr>
         <w:pStyle w:val="Heading3"/>
@@ -913,7 +1028,7 @@
       <w:pPr>
         <w:numPr>
           <w:ilvl w:val="0"/>
-          <w:numId w:val="1007"/>
+          <w:numId w:val="1008"/>
         </w:numPr>
         <w:pStyle w:val="Compact"/>
       </w:pPr>
@@ -957,7 +1072,7 @@
       <w:pPr>
         <w:numPr>
           <w:ilvl w:val="0"/>
-          <w:numId w:val="1007"/>
+          <w:numId w:val="1008"/>
         </w:numPr>
         <w:pStyle w:val="Compact"/>
       </w:pPr>
@@ -969,7 +1084,7 @@
       <w:pPr>
         <w:numPr>
           <w:ilvl w:val="0"/>
-          <w:numId w:val="1007"/>
+          <w:numId w:val="1008"/>
         </w:numPr>
         <w:pStyle w:val="Compact"/>
       </w:pPr>
@@ -981,7 +1096,7 @@
       <w:pPr>
         <w:numPr>
           <w:ilvl w:val="0"/>
-          <w:numId w:val="1007"/>
+          <w:numId w:val="1008"/>
         </w:numPr>
         <w:pStyle w:val="Compact"/>
       </w:pPr>
@@ -1001,8 +1116,8 @@
         <w:t xml:space="preserve">.</w:t>
       </w:r>
     </w:p>
-    <w:bookmarkEnd w:id="25"/>
-    <w:bookmarkStart w:id="26" w:name="documento-v4-2026-10-08-commit-b3e7477"/>
+    <w:bookmarkEnd w:id="26"/>
+    <w:bookmarkStart w:id="27" w:name="documento-v4-2026-10-08-commit-b3e7477"/>
     <w:p>
       <w:pPr>
         <w:pStyle w:val="Heading3"/>
@@ -1024,7 +1139,7 @@
       <w:pPr>
         <w:numPr>
           <w:ilvl w:val="0"/>
-          <w:numId w:val="1008"/>
+          <w:numId w:val="1009"/>
         </w:numPr>
         <w:pStyle w:val="Compact"/>
       </w:pPr>
@@ -1036,7 +1151,7 @@
       <w:pPr>
         <w:numPr>
           <w:ilvl w:val="0"/>
-          <w:numId w:val="1008"/>
+          <w:numId w:val="1009"/>
         </w:numPr>
         <w:pStyle w:val="Compact"/>
       </w:pPr>
@@ -1048,7 +1163,7 @@
       <w:pPr>
         <w:numPr>
           <w:ilvl w:val="0"/>
-          <w:numId w:val="1008"/>
+          <w:numId w:val="1009"/>
         </w:numPr>
         <w:pStyle w:val="Compact"/>
       </w:pPr>
@@ -1060,7 +1175,7 @@
       <w:pPr>
         <w:numPr>
           <w:ilvl w:val="0"/>
-          <w:numId w:val="1008"/>
+          <w:numId w:val="1009"/>
         </w:numPr>
         <w:pStyle w:val="Compact"/>
       </w:pPr>
@@ -1095,8 +1210,8 @@
         <w:t xml:space="preserve">.</w:t>
       </w:r>
     </w:p>
-    <w:bookmarkEnd w:id="26"/>
-    <w:bookmarkStart w:id="27" w:name="documento-v3-2026-10-08-commit-bf66b07"/>
+    <w:bookmarkEnd w:id="27"/>
+    <w:bookmarkStart w:id="28" w:name="documento-v3-2026-10-08-commit-bf66b07"/>
     <w:p>
       <w:pPr>
         <w:pStyle w:val="Heading3"/>
@@ -1118,7 +1233,7 @@
       <w:pPr>
         <w:numPr>
           <w:ilvl w:val="0"/>
-          <w:numId w:val="1009"/>
+          <w:numId w:val="1010"/>
         </w:numPr>
         <w:pStyle w:val="Compact"/>
       </w:pPr>
@@ -1130,7 +1245,7 @@
       <w:pPr>
         <w:numPr>
           <w:ilvl w:val="0"/>
-          <w:numId w:val="1009"/>
+          <w:numId w:val="1010"/>
         </w:numPr>
         <w:pStyle w:val="Compact"/>
       </w:pPr>
@@ -1138,8 +1253,8 @@
         <w:t xml:space="preserve">La versión va en el nombre del archivo y la numeración pasa a v1, v2, v3…</w:t>
       </w:r>
     </w:p>
-    <w:bookmarkEnd w:id="27"/>
-    <w:bookmarkStart w:id="28" w:name="documento-v2-2026-10-08-commit-07de778"/>
+    <w:bookmarkEnd w:id="28"/>
+    <w:bookmarkStart w:id="29" w:name="documento-v2-2026-10-08-commit-07de778"/>
     <w:p>
       <w:pPr>
         <w:pStyle w:val="Heading3"/>
@@ -1161,7 +1276,7 @@
       <w:pPr>
         <w:numPr>
           <w:ilvl w:val="0"/>
-          <w:numId w:val="1010"/>
+          <w:numId w:val="1011"/>
         </w:numPr>
         <w:pStyle w:val="Compact"/>
       </w:pPr>
@@ -1374,7 +1489,7 @@
       <w:pPr>
         <w:numPr>
           <w:ilvl w:val="0"/>
-          <w:numId w:val="1010"/>
+          <w:numId w:val="1011"/>
         </w:numPr>
         <w:pStyle w:val="Compact"/>
       </w:pPr>
@@ -1386,7 +1501,7 @@
       <w:pPr>
         <w:numPr>
           <w:ilvl w:val="0"/>
-          <w:numId w:val="1010"/>
+          <w:numId w:val="1011"/>
         </w:numPr>
         <w:pStyle w:val="Compact"/>
       </w:pPr>
@@ -1398,7 +1513,7 @@
       <w:pPr>
         <w:numPr>
           <w:ilvl w:val="0"/>
-          <w:numId w:val="1010"/>
+          <w:numId w:val="1011"/>
         </w:numPr>
         <w:pStyle w:val="Compact"/>
       </w:pPr>
@@ -1425,7 +1540,7 @@
       <w:pPr>
         <w:numPr>
           <w:ilvl w:val="0"/>
-          <w:numId w:val="1010"/>
+          <w:numId w:val="1011"/>
         </w:numPr>
         <w:pStyle w:val="Compact"/>
       </w:pPr>
@@ -1437,7 +1552,7 @@
       <w:pPr>
         <w:numPr>
           <w:ilvl w:val="0"/>
-          <w:numId w:val="1010"/>
+          <w:numId w:val="1011"/>
         </w:numPr>
         <w:pStyle w:val="Compact"/>
       </w:pPr>
@@ -1475,8 +1590,8 @@
         <w:t xml:space="preserve">(el impuesto lo define cada tipo de producto).</w:t>
       </w:r>
     </w:p>
-    <w:bookmarkEnd w:id="28"/>
-    <w:bookmarkStart w:id="29" w:name="documento-v1-2026-10-06-commit-9be1af4"/>
+    <w:bookmarkEnd w:id="29"/>
+    <w:bookmarkStart w:id="30" w:name="documento-v1-2026-10-06-commit-9be1af4"/>
     <w:p>
       <w:pPr>
         <w:pStyle w:val="Heading3"/>
@@ -1498,7 +1613,7 @@
       <w:pPr>
         <w:numPr>
           <w:ilvl w:val="0"/>
-          <w:numId w:val="1011"/>
+          <w:numId w:val="1012"/>
         </w:numPr>
         <w:pStyle w:val="Compact"/>
       </w:pPr>
@@ -1506,9 +1621,9 @@
         <w:t xml:space="preserve">Primera versión del documento de diseño del Avance 1 (Proyecto 1, Fidecompro): clases con atributos, métodos y relaciones; 15 historias de usuario; 8 prototipos de pantalla; diagramas de arquitectura, secuencia y navegación.</w:t>
       </w:r>
     </w:p>
-    <w:bookmarkEnd w:id="29"/>
     <w:bookmarkEnd w:id="30"/>
-    <w:bookmarkStart w:id="40" w:name="diagrama-de-clases-word-aparte"/>
+    <w:bookmarkEnd w:id="31"/>
+    <w:bookmarkStart w:id="42" w:name="diagrama-de-clases-word-aparte"/>
     <w:p>
       <w:pPr>
         <w:pStyle w:val="Heading2"/>
@@ -1517,12 +1632,43 @@
         <w:t xml:space="preserve">Diagrama de clases (Word aparte)</w:t>
       </w:r>
     </w:p>
-    <w:bookmarkStart w:id="31" w:name="X10045a7158086462e70fd3a0d9f926166a3c4ea"/>
+    <w:bookmarkStart w:id="32" w:name="X5f51fc4b5ffbe090736f81a3b1012c253b30052"/>
     <w:p>
       <w:pPr>
         <w:pStyle w:val="Heading3"/>
       </w:pPr>
       <w:r>
+        <w:t xml:space="preserve">Diagrama de clases v6 · 2026-10-08 · commit</w:t>
+      </w:r>
+      <w:r>
+        <w:t xml:space="preserve"> </w:t>
+      </w:r>
+      <w:r>
+        <w:rPr>
+          <w:rStyle w:val="VerbatimChar"/>
+        </w:rPr>
+        <w:t xml:space="preserve">156cbdf</w:t>
+      </w:r>
+    </w:p>
+    <w:p>
+      <w:pPr>
+        <w:numPr>
+          <w:ilvl w:val="0"/>
+          <w:numId w:val="1013"/>
+        </w:numPr>
+        <w:pStyle w:val="Compact"/>
+      </w:pPr>
+      <w:r>
+        <w:t xml:space="preserve">Mismo formato APA 7 que el documento v11.</w:t>
+      </w:r>
+    </w:p>
+    <w:bookmarkEnd w:id="32"/>
+    <w:bookmarkStart w:id="33" w:name="X10045a7158086462e70fd3a0d9f926166a3c4ea"/>
+    <w:p>
+      <w:pPr>
+        <w:pStyle w:val="Heading3"/>
+      </w:pPr>
+      <w:r>
         <w:t xml:space="preserve">Diagrama de clases v5 · 2026-10-08 · commit</w:t>
       </w:r>
       <w:r>
@@ -1539,7 +1685,7 @@
       <w:pPr>
         <w:numPr>
           <w:ilvl w:val="0"/>
-          <w:numId w:val="1012"/>
+          <w:numId w:val="1014"/>
         </w:numPr>
         <w:pStyle w:val="Compact"/>
       </w:pPr>
@@ -1562,8 +1708,8 @@
         <w:t xml:space="preserve">sigue en v4 porque no cambió.</w:t>
       </w:r>
     </w:p>
-    <w:bookmarkEnd w:id="31"/>
-    <w:bookmarkStart w:id="32" w:name="X8b6f1de3ef83515f9063b0f71c4f739b3d8e2c1"/>
+    <w:bookmarkEnd w:id="33"/>
+    <w:bookmarkStart w:id="34" w:name="X8b6f1de3ef83515f9063b0f71c4f739b3d8e2c1"/>
     <w:p>
       <w:pPr>
         <w:pStyle w:val="Heading3"/>
@@ -1585,7 +1731,7 @@
       <w:pPr>
         <w:numPr>
           <w:ilvl w:val="0"/>
-          <w:numId w:val="1013"/>
+          <w:numId w:val="1015"/>
         </w:numPr>
         <w:pStyle w:val="Compact"/>
       </w:pPr>
@@ -1621,7 +1767,7 @@
       <w:pPr>
         <w:numPr>
           <w:ilvl w:val="0"/>
-          <w:numId w:val="1013"/>
+          <w:numId w:val="1015"/>
         </w:numPr>
         <w:pStyle w:val="Compact"/>
       </w:pPr>
@@ -1629,8 +1775,8 @@
         <w:t xml:space="preserve">Contenido: el de las entradas v2 y v3 de abajo (colecciones según su uso y la tabla que cita los ejemplos del profesor). Esos números solo existieron en el repositorio.</w:t>
       </w:r>
     </w:p>
-    <w:bookmarkEnd w:id="32"/>
-    <w:bookmarkStart w:id="33" w:name="X863504495f0c283560039533b96e35d8a8aec92"/>
+    <w:bookmarkEnd w:id="34"/>
+    <w:bookmarkStart w:id="35" w:name="X863504495f0c283560039533b96e35d8a8aec92"/>
     <w:p>
       <w:pPr>
         <w:pStyle w:val="Heading3"/>
@@ -1652,7 +1798,7 @@
       <w:pPr>
         <w:numPr>
           <w:ilvl w:val="0"/>
-          <w:numId w:val="1014"/>
+          <w:numId w:val="1016"/>
         </w:numPr>
         <w:pStyle w:val="Compact"/>
       </w:pPr>
@@ -1675,8 +1821,8 @@
         <w:t xml:space="preserve">sigue en v2 porque los diagramas no cambiaron.</w:t>
       </w:r>
     </w:p>
-    <w:bookmarkEnd w:id="33"/>
-    <w:bookmarkStart w:id="34" w:name="X66fc17acf23d8016d6af910173fecc388667a68"/>
+    <w:bookmarkEnd w:id="35"/>
+    <w:bookmarkStart w:id="36" w:name="X66fc17acf23d8016d6af910173fecc388667a68"/>
     <w:p>
       <w:pPr>
         <w:pStyle w:val="Heading3"/>
@@ -1698,7 +1844,7 @@
       <w:pPr>
         <w:numPr>
           <w:ilvl w:val="0"/>
-          <w:numId w:val="1015"/>
+          <w:numId w:val="1017"/>
         </w:numPr>
         <w:pStyle w:val="Compact"/>
       </w:pPr>
@@ -1776,7 +1922,7 @@
       <w:pPr>
         <w:numPr>
           <w:ilvl w:val="0"/>
-          <w:numId w:val="1015"/>
+          <w:numId w:val="1017"/>
         </w:numPr>
         <w:pStyle w:val="Compact"/>
       </w:pPr>
@@ -1808,8 +1954,8 @@
         <w:t xml:space="preserve">(tres páginas, igual que v1).</w:t>
       </w:r>
     </w:p>
-    <w:bookmarkEnd w:id="34"/>
-    <w:bookmarkStart w:id="35" w:name="Xd9ab462069bc781e05750197a0b9dcc21416b9b"/>
+    <w:bookmarkEnd w:id="36"/>
+    <w:bookmarkStart w:id="37" w:name="Xd9ab462069bc781e05750197a0b9dcc21416b9b"/>
     <w:p>
       <w:pPr>
         <w:pStyle w:val="Heading3"/>
@@ -1831,7 +1977,7 @@
       <w:pPr>
         <w:numPr>
           <w:ilvl w:val="0"/>
-          <w:numId w:val="1016"/>
+          <w:numId w:val="1018"/>
         </w:numPr>
         <w:pStyle w:val="Compact"/>
       </w:pPr>
@@ -1843,7 +1989,7 @@
       <w:pPr>
         <w:numPr>
           <w:ilvl w:val="0"/>
-          <w:numId w:val="1016"/>
+          <w:numId w:val="1018"/>
         </w:numPr>
         <w:pStyle w:val="Compact"/>
       </w:pPr>
@@ -1888,7 +2034,7 @@
       <w:pPr>
         <w:numPr>
           <w:ilvl w:val="0"/>
-          <w:numId w:val="1016"/>
+          <w:numId w:val="1018"/>
         </w:numPr>
         <w:pStyle w:val="Compact"/>
       </w:pPr>
@@ -1932,8 +2078,8 @@
         <w:t xml:space="preserve">desde los diagramas de Mermaid.</w:t>
       </w:r>
     </w:p>
-    <w:bookmarkEnd w:id="35"/>
-    <w:bookmarkStart w:id="36" w:name="X8bff2cc937d55517ed7504f8d852e738002eded"/>
+    <w:bookmarkEnd w:id="37"/>
+    <w:bookmarkStart w:id="38" w:name="X8bff2cc937d55517ed7504f8d852e738002eded"/>
     <w:p>
       <w:pPr>
         <w:pStyle w:val="Heading3"/>
@@ -1955,7 +2101,7 @@
       <w:pPr>
         <w:numPr>
           <w:ilvl w:val="0"/>
-          <w:numId w:val="1017"/>
+          <w:numId w:val="1019"/>
         </w:numPr>
         <w:pStyle w:val="Compact"/>
       </w:pPr>
@@ -2021,7 +2167,7 @@
       <w:pPr>
         <w:numPr>
           <w:ilvl w:val="0"/>
-          <w:numId w:val="1017"/>
+          <w:numId w:val="1019"/>
         </w:numPr>
         <w:pStyle w:val="Compact"/>
       </w:pPr>
@@ -2093,8 +2239,8 @@
         <w:t xml:space="preserve">.</w:t>
       </w:r>
     </w:p>
-    <w:bookmarkEnd w:id="36"/>
-    <w:bookmarkStart w:id="37" w:name="X391512b3d0076f68eba38bfbe03fbe6da9ec0d0"/>
+    <w:bookmarkEnd w:id="38"/>
+    <w:bookmarkStart w:id="39" w:name="X391512b3d0076f68eba38bfbe03fbe6da9ec0d0"/>
     <w:p>
       <w:pPr>
         <w:pStyle w:val="Heading3"/>
@@ -2116,7 +2262,7 @@
       <w:pPr>
         <w:numPr>
           <w:ilvl w:val="0"/>
-          <w:numId w:val="1018"/>
+          <w:numId w:val="1020"/>
         </w:numPr>
         <w:pStyle w:val="Compact"/>
       </w:pPr>
@@ -2128,7 +2274,7 @@
       <w:pPr>
         <w:numPr>
           <w:ilvl w:val="0"/>
-          <w:numId w:val="1018"/>
+          <w:numId w:val="1020"/>
         </w:numPr>
         <w:pStyle w:val="Compact"/>
       </w:pPr>
@@ -2148,8 +2294,8 @@
         <w:t xml:space="preserve">, para que las clases sean más angostas.</w:t>
       </w:r>
     </w:p>
-    <w:bookmarkEnd w:id="37"/>
-    <w:bookmarkStart w:id="38" w:name="Xc4a290eef64159bbb850880299580525a5d9206"/>
+    <w:bookmarkEnd w:id="39"/>
+    <w:bookmarkStart w:id="40" w:name="Xc4a290eef64159bbb850880299580525a5d9206"/>
     <w:p>
       <w:pPr>
         <w:pStyle w:val="Heading3"/>
@@ -2171,7 +2317,7 @@
       <w:pPr>
         <w:numPr>
           <w:ilvl w:val="0"/>
-          <w:numId w:val="1019"/>
+          <w:numId w:val="1021"/>
         </w:numPr>
         <w:pStyle w:val="Compact"/>
       </w:pPr>
@@ -2208,8 +2354,8 @@
         <w:t xml:space="preserve">) con un ejemplo, y cada tipo de flecha (herencia, implementación, composición, agregación y asociación).</w:t>
       </w:r>
     </w:p>
-    <w:bookmarkEnd w:id="38"/>
-    <w:bookmarkStart w:id="39" w:name="X861f067dae0e8a264748fdbddc6a638f1e0d1d0"/>
+    <w:bookmarkEnd w:id="40"/>
+    <w:bookmarkStart w:id="41" w:name="X861f067dae0e8a264748fdbddc6a638f1e0d1d0"/>
     <w:p>
       <w:pPr>
         <w:pStyle w:val="Heading3"/>
@@ -2231,7 +2377,7 @@
       <w:pPr>
         <w:numPr>
           <w:ilvl w:val="0"/>
-          <w:numId w:val="1020"/>
+          <w:numId w:val="1022"/>
         </w:numPr>
         <w:pStyle w:val="Compact"/>
       </w:pPr>
@@ -2243,7 +2389,7 @@
       <w:pPr>
         <w:numPr>
           <w:ilvl w:val="0"/>
-          <w:numId w:val="1020"/>
+          <w:numId w:val="1022"/>
         </w:numPr>
         <w:pStyle w:val="Compact"/>
       </w:pPr>
@@ -2290,9 +2436,9 @@
         <w:t xml:space="preserve">.</w:t>
       </w:r>
     </w:p>
-    <w:bookmarkEnd w:id="39"/>
-    <w:bookmarkEnd w:id="40"/>
-    <w:bookmarkStart w:id="44" w:name="código"/>
+    <w:bookmarkEnd w:id="41"/>
+    <w:bookmarkEnd w:id="42"/>
+    <w:bookmarkStart w:id="46" w:name="código"/>
     <w:p>
       <w:pPr>
         <w:pStyle w:val="Heading2"/>
@@ -2301,7 +2447,7 @@
         <w:t xml:space="preserve">Código</w:t>
       </w:r>
     </w:p>
-    <w:bookmarkStart w:id="41" w:name="código-v3-2026-10-08-commit-626c373"/>
+    <w:bookmarkStart w:id="43" w:name="código-v3-2026-10-08-commit-626c373"/>
     <w:p>
       <w:pPr>
         <w:pStyle w:val="Heading3"/>
@@ -2323,7 +2469,7 @@
       <w:pPr>
         <w:numPr>
           <w:ilvl w:val="0"/>
-          <w:numId w:val="1021"/>
+          <w:numId w:val="1023"/>
         </w:numPr>
         <w:pStyle w:val="Compact"/>
       </w:pPr>
@@ -2404,7 +2550,7 @@
       <w:pPr>
         <w:numPr>
           <w:ilvl w:val="0"/>
-          <w:numId w:val="1021"/>
+          <w:numId w:val="1023"/>
         </w:numPr>
         <w:pStyle w:val="Compact"/>
       </w:pPr>
@@ -2449,7 +2595,7 @@
       <w:pPr>
         <w:numPr>
           <w:ilvl w:val="0"/>
-          <w:numId w:val="1021"/>
+          <w:numId w:val="1023"/>
         </w:numPr>
         <w:pStyle w:val="Compact"/>
       </w:pPr>
@@ -2502,8 +2648,8 @@
         <w:t xml:space="preserve">da la primera y la última factura.</w:t>
       </w:r>
     </w:p>
-    <w:bookmarkEnd w:id="41"/>
-    <w:bookmarkStart w:id="42" w:name="código-v2-2026-10-08-commit-99f55d4"/>
+    <w:bookmarkEnd w:id="43"/>
+    <w:bookmarkStart w:id="44" w:name="código-v2-2026-10-08-commit-99f55d4"/>
     <w:p>
       <w:pPr>
         <w:pStyle w:val="Heading3"/>
@@ -2525,7 +2671,7 @@
       <w:pPr>
         <w:numPr>
           <w:ilvl w:val="0"/>
-          <w:numId w:val="1022"/>
+          <w:numId w:val="1024"/>
         </w:numPr>
         <w:pStyle w:val="Compact"/>
       </w:pPr>
@@ -2603,7 +2749,7 @@
       <w:pPr>
         <w:numPr>
           <w:ilvl w:val="0"/>
-          <w:numId w:val="1022"/>
+          <w:numId w:val="1024"/>
         </w:numPr>
         <w:pStyle w:val="Compact"/>
       </w:pPr>
@@ -2626,8 +2772,8 @@
         <w:t xml:space="preserve">muestra la regla: un cliente con facturas se desactiva y uno sin facturas se elimina.</w:t>
       </w:r>
     </w:p>
-    <w:bookmarkEnd w:id="42"/>
-    <w:bookmarkStart w:id="43" w:name="código-v1-2026-10-08-commit-442187a"/>
+    <w:bookmarkEnd w:id="44"/>
+    <w:bookmarkStart w:id="45" w:name="código-v1-2026-10-08-commit-442187a"/>
     <w:p>
       <w:pPr>
         <w:pStyle w:val="Heading3"/>
@@ -2649,7 +2795,7 @@
       <w:pPr>
         <w:numPr>
           <w:ilvl w:val="0"/>
-          <w:numId w:val="1023"/>
+          <w:numId w:val="1025"/>
         </w:numPr>
         <w:pStyle w:val="Compact"/>
       </w:pPr>
@@ -2676,7 +2822,7 @@
       <w:pPr>
         <w:numPr>
           <w:ilvl w:val="0"/>
-          <w:numId w:val="1023"/>
+          <w:numId w:val="1025"/>
         </w:numPr>
         <w:pStyle w:val="Compact"/>
       </w:pPr>
@@ -2697,7 +2843,7 @@
       <w:pPr>
         <w:numPr>
           <w:ilvl w:val="0"/>
-          <w:numId w:val="1023"/>
+          <w:numId w:val="1025"/>
         </w:numPr>
         <w:pStyle w:val="Compact"/>
       </w:pPr>
@@ -2705,9 +2851,9 @@
         <w:t xml:space="preserve">Código de referencia para entender el diseño; no es un entregable.</w:t>
       </w:r>
     </w:p>
-    <w:bookmarkEnd w:id="43"/>
-    <w:bookmarkEnd w:id="44"/>
     <w:bookmarkEnd w:id="45"/>
+    <w:bookmarkEnd w:id="46"/>
+    <w:bookmarkEnd w:id="47"/>
     <w:sectPr>
       <w:pgSz w:w="12240" w:h="15840"/>
       <w:pgMar w:left="1134" w:right="1134"/>
@@ -2963,6 +3109,12 @@
     <w:abstractNumId w:val="991"/>
   </w:num>
   <w:num w:numId="1023">
+    <w:abstractNumId w:val="991"/>
+  </w:num>
+  <w:num w:numId="1024">
+    <w:abstractNumId w:val="991"/>
+  </w:num>
+  <w:num w:numId="1025">
     <w:abstractNumId w:val="991"/>
   </w:num>
 </w:numbering>

</xml_diff>

<commit_message>
CHANGELOG y README: documento v12 y código v4
Co-Authored-By: Claude Opus 5.5 (1M context) <noreply@anthropic.com>
Claude-Session: https://claude.ai/code/session_01VkQm5RLcZiQMKLCS3EK3og
</commit_message>
<xml_diff>
--- a/docs/Historial_de_versiones.docx
+++ b/docs/Historial_de_versiones.docx
@@ -2,7 +2,7 @@
 <file path=word/document.xml><?xml version="1.0" encoding="utf-8"?>
 <w:document xmlns:w="http://schemas.openxmlformats.org/wordprocessingml/2006/main" xmlns:m="http://schemas.openxmlformats.org/officeDocument/2006/math" xmlns:r="http://schemas.openxmlformats.org/officeDocument/2006/relationships" xmlns:o="urn:schemas-microsoft-com:office:office" xmlns:v="urn:schemas-microsoft-com:vml" xmlns:w10="urn:schemas-microsoft-com:office:word" xmlns:a="http://schemas.openxmlformats.org/drawingml/2006/main" xmlns:pic="http://schemas.openxmlformats.org/drawingml/2006/picture" xmlns:wp="http://schemas.openxmlformats.org/drawingml/2006/wordprocessingDrawing">
   <w:body>
-    <w:bookmarkStart w:id="47" w:name="historial-de-versiones"/>
+    <w:bookmarkStart w:id="49" w:name="historial-de-versiones"/>
     <w:p>
       <w:pPr>
         <w:pStyle w:val="Heading1"/>
@@ -153,7 +153,7 @@
         <w:t xml:space="preserve">.</w:t>
       </w:r>
     </w:p>
-    <w:bookmarkStart w:id="31" w:name="documento-de-diseño"/>
+    <w:bookmarkStart w:id="32" w:name="documento-de-diseño"/>
     <w:p>
       <w:pPr>
         <w:pStyle w:val="Heading2"/>
@@ -162,12 +162,67 @@
         <w:t xml:space="preserve">Documento de diseño</w:t>
       </w:r>
     </w:p>
-    <w:bookmarkStart w:id="20" w:name="documento-v11-2026-10-08-commit-156cbdf"/>
+    <w:bookmarkStart w:id="20" w:name="documento-v12-2026-10-08-commit-34bfcec"/>
     <w:p>
       <w:pPr>
         <w:pStyle w:val="Heading3"/>
       </w:pPr>
       <w:r>
+        <w:t xml:space="preserve">Documento v12 · 2026-10-08 · commit</w:t>
+      </w:r>
+      <w:r>
+        <w:t xml:space="preserve"> </w:t>
+      </w:r>
+      <w:r>
+        <w:rPr>
+          <w:rStyle w:val="VerbatimChar"/>
+        </w:rPr>
+        <w:t xml:space="preserve">34bfcec</w:t>
+      </w:r>
+    </w:p>
+    <w:p>
+      <w:pPr>
+        <w:numPr>
+          <w:ilvl w:val="0"/>
+          <w:numId w:val="1002"/>
+        </w:numPr>
+        <w:pStyle w:val="Compact"/>
+      </w:pPr>
+      <w:r>
+        <w:t xml:space="preserve">Historias de usuario de 16 a 12, una por pantalla CRUD como pidió el profesor: HU 1 une iniciar y cerrar sesión; HU 3 une registrar, buscar y modificar y eliminar clientes; HU 11 une consultar y anular facturas. Se conservan los 65 escenarios de aceptación.</w:t>
+      </w:r>
+    </w:p>
+    <w:p>
+      <w:pPr>
+        <w:numPr>
+          <w:ilvl w:val="0"/>
+          <w:numId w:val="1002"/>
+        </w:numPr>
+        <w:pStyle w:val="Compact"/>
+      </w:pPr>
+      <w:r>
+        <w:t xml:space="preserve">Equivalencia con la numeración anterior: 1+2→1, 3→2, 4+5+6→3, 7→4, 8→5, 9→6, 10→7, 11→8, 12→9, 13→10, 14+15→11, 16→12.</w:t>
+      </w:r>
+    </w:p>
+    <w:p>
+      <w:pPr>
+        <w:numPr>
+          <w:ilvl w:val="0"/>
+          <w:numId w:val="1002"/>
+        </w:numPr>
+        <w:pStyle w:val="Compact"/>
+      </w:pPr>
+      <w:r>
+        <w:t xml:space="preserve">Se renumeran las referencias en la guía del inicio, los requerimientos, los bocetos, la trazabilidad y el resumen de historias.</w:t>
+      </w:r>
+    </w:p>
+    <w:bookmarkEnd w:id="20"/>
+    <w:bookmarkStart w:id="21" w:name="documento-v11-2026-10-08-commit-156cbdf"/>
+    <w:p>
+      <w:pPr>
+        <w:pStyle w:val="Heading3"/>
+      </w:pPr>
+      <w:r>
         <w:t xml:space="preserve">Documento v11 · 2026-10-08 · commit</w:t>
       </w:r>
       <w:r>
@@ -184,7 +239,7 @@
       <w:pPr>
         <w:numPr>
           <w:ilvl w:val="0"/>
-          <w:numId w:val="1002"/>
+          <w:numId w:val="1003"/>
         </w:numPr>
         <w:pStyle w:val="Compact"/>
       </w:pPr>
@@ -205,7 +260,7 @@
       <w:pPr>
         <w:numPr>
           <w:ilvl w:val="0"/>
-          <w:numId w:val="1002"/>
+          <w:numId w:val="1003"/>
         </w:numPr>
         <w:pStyle w:val="Compact"/>
       </w:pPr>
@@ -217,7 +272,7 @@
       <w:pPr>
         <w:numPr>
           <w:ilvl w:val="0"/>
-          <w:numId w:val="1002"/>
+          <w:numId w:val="1003"/>
         </w:numPr>
         <w:pStyle w:val="Compact"/>
       </w:pPr>
@@ -229,7 +284,7 @@
       <w:pPr>
         <w:numPr>
           <w:ilvl w:val="0"/>
-          <w:numId w:val="1002"/>
+          <w:numId w:val="1003"/>
         </w:numPr>
         <w:pStyle w:val="Compact"/>
       </w:pPr>
@@ -268,7 +323,7 @@
       <w:pPr>
         <w:numPr>
           <w:ilvl w:val="0"/>
-          <w:numId w:val="1002"/>
+          <w:numId w:val="1003"/>
         </w:numPr>
         <w:pStyle w:val="Compact"/>
       </w:pPr>
@@ -276,8 +331,8 @@
         <w:t xml:space="preserve">Columnas de la tabla de historias ajustadas al nuevo ancho para que no se corten palabras.</w:t>
       </w:r>
     </w:p>
-    <w:bookmarkEnd w:id="20"/>
-    <w:bookmarkStart w:id="21" w:name="documento-v10-2026-10-08-commit-fee9361"/>
+    <w:bookmarkEnd w:id="21"/>
+    <w:bookmarkStart w:id="22" w:name="documento-v10-2026-10-08-commit-fee9361"/>
     <w:p>
       <w:pPr>
         <w:pStyle w:val="Heading3"/>
@@ -299,7 +354,7 @@
       <w:pPr>
         <w:numPr>
           <w:ilvl w:val="0"/>
-          <w:numId w:val="1003"/>
+          <w:numId w:val="1004"/>
         </w:numPr>
         <w:pStyle w:val="Compact"/>
       </w:pPr>
@@ -327,7 +382,7 @@
       <w:pPr>
         <w:numPr>
           <w:ilvl w:val="0"/>
-          <w:numId w:val="1003"/>
+          <w:numId w:val="1004"/>
         </w:numPr>
         <w:pStyle w:val="Compact"/>
       </w:pPr>
@@ -339,7 +394,7 @@
       <w:pPr>
         <w:numPr>
           <w:ilvl w:val="0"/>
-          <w:numId w:val="1003"/>
+          <w:numId w:val="1004"/>
         </w:numPr>
         <w:pStyle w:val="Compact"/>
       </w:pPr>
@@ -347,8 +402,8 @@
         <w:t xml:space="preserve">Las imágenes grandes se limitan a 20,5 cm de alto para que el título y el pie de figura queden en la misma página.</w:t>
       </w:r>
     </w:p>
-    <w:bookmarkEnd w:id="21"/>
-    <w:bookmarkStart w:id="22" w:name="documento-v9-2026-10-08-commit-5400cea"/>
+    <w:bookmarkEnd w:id="22"/>
+    <w:bookmarkStart w:id="23" w:name="documento-v9-2026-10-08-commit-5400cea"/>
     <w:p>
       <w:pPr>
         <w:pStyle w:val="Heading3"/>
@@ -370,7 +425,7 @@
       <w:pPr>
         <w:numPr>
           <w:ilvl w:val="0"/>
-          <w:numId w:val="1004"/>
+          <w:numId w:val="1005"/>
         </w:numPr>
         <w:pStyle w:val="Compact"/>
       </w:pPr>
@@ -445,7 +500,7 @@
       <w:pPr>
         <w:numPr>
           <w:ilvl w:val="0"/>
-          <w:numId w:val="1004"/>
+          <w:numId w:val="1005"/>
         </w:numPr>
         <w:pStyle w:val="Compact"/>
       </w:pPr>
@@ -480,8 +535,8 @@
         <w:t xml:space="preserve">, por qué todas las colecciones son genéricas (no hace falta cast).</w:t>
       </w:r>
     </w:p>
-    <w:bookmarkEnd w:id="22"/>
-    <w:bookmarkStart w:id="23" w:name="documento-v8-2026-10-08-commit-626c373"/>
+    <w:bookmarkEnd w:id="23"/>
+    <w:bookmarkStart w:id="24" w:name="documento-v8-2026-10-08-commit-626c373"/>
     <w:p>
       <w:pPr>
         <w:pStyle w:val="Heading3"/>
@@ -503,7 +558,7 @@
       <w:pPr>
         <w:numPr>
           <w:ilvl w:val="0"/>
-          <w:numId w:val="1005"/>
+          <w:numId w:val="1006"/>
         </w:numPr>
         <w:pStyle w:val="Compact"/>
       </w:pPr>
@@ -572,7 +627,7 @@
       <w:pPr>
         <w:numPr>
           <w:ilvl w:val="0"/>
-          <w:numId w:val="1005"/>
+          <w:numId w:val="1006"/>
         </w:numPr>
         <w:pStyle w:val="Compact"/>
       </w:pPr>
@@ -593,7 +648,7 @@
       <w:pPr>
         <w:numPr>
           <w:ilvl w:val="0"/>
-          <w:numId w:val="1005"/>
+          <w:numId w:val="1006"/>
         </w:numPr>
         <w:pStyle w:val="Compact"/>
       </w:pPr>
@@ -629,7 +684,7 @@
       <w:pPr>
         <w:numPr>
           <w:ilvl w:val="0"/>
-          <w:numId w:val="1005"/>
+          <w:numId w:val="1006"/>
         </w:numPr>
         <w:pStyle w:val="Compact"/>
       </w:pPr>
@@ -674,7 +729,7 @@
       <w:pPr>
         <w:numPr>
           <w:ilvl w:val="0"/>
-          <w:numId w:val="1005"/>
+          <w:numId w:val="1006"/>
         </w:numPr>
         <w:pStyle w:val="Compact"/>
       </w:pPr>
@@ -707,7 +762,7 @@
       <w:pPr>
         <w:numPr>
           <w:ilvl w:val="0"/>
-          <w:numId w:val="1005"/>
+          <w:numId w:val="1006"/>
         </w:numPr>
         <w:pStyle w:val="Compact"/>
       </w:pPr>
@@ -743,7 +798,7 @@
       <w:pPr>
         <w:numPr>
           <w:ilvl w:val="0"/>
-          <w:numId w:val="1005"/>
+          <w:numId w:val="1006"/>
         </w:numPr>
         <w:pStyle w:val="Compact"/>
       </w:pPr>
@@ -751,8 +806,8 @@
         <w:t xml:space="preserve">Nueva tabla «Colecciones: cuál se usa y por qué» al final de la sección 4.2 y fila de colecciones en la tabla de conceptos del curso.</w:t>
       </w:r>
     </w:p>
-    <w:bookmarkEnd w:id="23"/>
-    <w:bookmarkStart w:id="24" w:name="documento-v7-2026-10-08-commit-047b31c"/>
+    <w:bookmarkEnd w:id="24"/>
+    <w:bookmarkStart w:id="25" w:name="documento-v7-2026-10-08-commit-047b31c"/>
     <w:p>
       <w:pPr>
         <w:pStyle w:val="Heading3"/>
@@ -774,7 +829,7 @@
       <w:pPr>
         <w:numPr>
           <w:ilvl w:val="0"/>
-          <w:numId w:val="1006"/>
+          <w:numId w:val="1007"/>
         </w:numPr>
         <w:pStyle w:val="Compact"/>
       </w:pPr>
@@ -786,7 +841,7 @@
       <w:pPr>
         <w:numPr>
           <w:ilvl w:val="0"/>
-          <w:numId w:val="1006"/>
+          <w:numId w:val="1007"/>
         </w:numPr>
         <w:pStyle w:val="Compact"/>
       </w:pPr>
@@ -798,7 +853,7 @@
       <w:pPr>
         <w:numPr>
           <w:ilvl w:val="0"/>
-          <w:numId w:val="1006"/>
+          <w:numId w:val="1007"/>
         </w:numPr>
         <w:pStyle w:val="Compact"/>
       </w:pPr>
@@ -810,7 +865,7 @@
       <w:pPr>
         <w:numPr>
           <w:ilvl w:val="0"/>
-          <w:numId w:val="1006"/>
+          <w:numId w:val="1007"/>
         </w:numPr>
         <w:pStyle w:val="Compact"/>
       </w:pPr>
@@ -840,7 +895,7 @@
       <w:pPr>
         <w:numPr>
           <w:ilvl w:val="0"/>
-          <w:numId w:val="1006"/>
+          <w:numId w:val="1007"/>
         </w:numPr>
         <w:pStyle w:val="Compact"/>
       </w:pPr>
@@ -848,8 +903,8 @@
         <w:t xml:space="preserve">El nombre del profesor (Mario Alberto Vargas Montes) queda en la portada.</w:t>
       </w:r>
     </w:p>
-    <w:bookmarkEnd w:id="24"/>
-    <w:bookmarkStart w:id="25" w:name="documento-v6-2026-10-08-commit-99f55d4"/>
+    <w:bookmarkEnd w:id="25"/>
+    <w:bookmarkStart w:id="26" w:name="documento-v6-2026-10-08-commit-99f55d4"/>
     <w:p>
       <w:pPr>
         <w:pStyle w:val="Heading3"/>
@@ -871,7 +926,7 @@
       <w:pPr>
         <w:numPr>
           <w:ilvl w:val="0"/>
-          <w:numId w:val="1007"/>
+          <w:numId w:val="1008"/>
         </w:numPr>
         <w:pStyle w:val="Compact"/>
       </w:pPr>
@@ -883,7 +938,7 @@
       <w:pPr>
         <w:numPr>
           <w:ilvl w:val="0"/>
-          <w:numId w:val="1007"/>
+          <w:numId w:val="1008"/>
         </w:numPr>
         <w:pStyle w:val="Compact"/>
       </w:pPr>
@@ -895,7 +950,7 @@
       <w:pPr>
         <w:numPr>
           <w:ilvl w:val="0"/>
-          <w:numId w:val="1007"/>
+          <w:numId w:val="1008"/>
         </w:numPr>
         <w:pStyle w:val="Compact"/>
       </w:pPr>
@@ -952,7 +1007,7 @@
       <w:pPr>
         <w:numPr>
           <w:ilvl w:val="0"/>
-          <w:numId w:val="1007"/>
+          <w:numId w:val="1008"/>
         </w:numPr>
         <w:pStyle w:val="Compact"/>
       </w:pPr>
@@ -973,7 +1028,7 @@
       <w:pPr>
         <w:numPr>
           <w:ilvl w:val="0"/>
-          <w:numId w:val="1007"/>
+          <w:numId w:val="1008"/>
         </w:numPr>
         <w:pStyle w:val="Compact"/>
       </w:pPr>
@@ -985,7 +1040,7 @@
       <w:pPr>
         <w:numPr>
           <w:ilvl w:val="0"/>
-          <w:numId w:val="1007"/>
+          <w:numId w:val="1008"/>
         </w:numPr>
         <w:pStyle w:val="Compact"/>
       </w:pPr>
@@ -997,7 +1052,7 @@
       <w:pPr>
         <w:numPr>
           <w:ilvl w:val="0"/>
-          <w:numId w:val="1007"/>
+          <w:numId w:val="1008"/>
         </w:numPr>
         <w:pStyle w:val="Compact"/>
       </w:pPr>
@@ -1005,8 +1060,8 @@
         <w:t xml:space="preserve">Requerimientos no funcionales de pantallas, sockets, concurrencia y base de datos ajustados.</w:t>
       </w:r>
     </w:p>
-    <w:bookmarkEnd w:id="25"/>
-    <w:bookmarkStart w:id="26" w:name="documento-v5-2026-10-08-commit-9a7a9a7"/>
+    <w:bookmarkEnd w:id="26"/>
+    <w:bookmarkStart w:id="27" w:name="documento-v5-2026-10-08-commit-9a7a9a7"/>
     <w:p>
       <w:pPr>
         <w:pStyle w:val="Heading3"/>
@@ -1028,7 +1083,7 @@
       <w:pPr>
         <w:numPr>
           <w:ilvl w:val="0"/>
-          <w:numId w:val="1008"/>
+          <w:numId w:val="1009"/>
         </w:numPr>
         <w:pStyle w:val="Compact"/>
       </w:pPr>
@@ -1072,7 +1127,7 @@
       <w:pPr>
         <w:numPr>
           <w:ilvl w:val="0"/>
-          <w:numId w:val="1008"/>
+          <w:numId w:val="1009"/>
         </w:numPr>
         <w:pStyle w:val="Compact"/>
       </w:pPr>
@@ -1084,7 +1139,7 @@
       <w:pPr>
         <w:numPr>
           <w:ilvl w:val="0"/>
-          <w:numId w:val="1008"/>
+          <w:numId w:val="1009"/>
         </w:numPr>
         <w:pStyle w:val="Compact"/>
       </w:pPr>
@@ -1096,7 +1151,7 @@
       <w:pPr>
         <w:numPr>
           <w:ilvl w:val="0"/>
-          <w:numId w:val="1008"/>
+          <w:numId w:val="1009"/>
         </w:numPr>
         <w:pStyle w:val="Compact"/>
       </w:pPr>
@@ -1116,8 +1171,8 @@
         <w:t xml:space="preserve">.</w:t>
       </w:r>
     </w:p>
-    <w:bookmarkEnd w:id="26"/>
-    <w:bookmarkStart w:id="27" w:name="documento-v4-2026-10-08-commit-b3e7477"/>
+    <w:bookmarkEnd w:id="27"/>
+    <w:bookmarkStart w:id="28" w:name="documento-v4-2026-10-08-commit-b3e7477"/>
     <w:p>
       <w:pPr>
         <w:pStyle w:val="Heading3"/>
@@ -1139,7 +1194,7 @@
       <w:pPr>
         <w:numPr>
           <w:ilvl w:val="0"/>
-          <w:numId w:val="1009"/>
+          <w:numId w:val="1010"/>
         </w:numPr>
         <w:pStyle w:val="Compact"/>
       </w:pPr>
@@ -1151,7 +1206,7 @@
       <w:pPr>
         <w:numPr>
           <w:ilvl w:val="0"/>
-          <w:numId w:val="1009"/>
+          <w:numId w:val="1010"/>
         </w:numPr>
         <w:pStyle w:val="Compact"/>
       </w:pPr>
@@ -1163,7 +1218,7 @@
       <w:pPr>
         <w:numPr>
           <w:ilvl w:val="0"/>
-          <w:numId w:val="1009"/>
+          <w:numId w:val="1010"/>
         </w:numPr>
         <w:pStyle w:val="Compact"/>
       </w:pPr>
@@ -1175,7 +1230,7 @@
       <w:pPr>
         <w:numPr>
           <w:ilvl w:val="0"/>
-          <w:numId w:val="1009"/>
+          <w:numId w:val="1010"/>
         </w:numPr>
         <w:pStyle w:val="Compact"/>
       </w:pPr>
@@ -1210,8 +1265,8 @@
         <w:t xml:space="preserve">.</w:t>
       </w:r>
     </w:p>
-    <w:bookmarkEnd w:id="27"/>
-    <w:bookmarkStart w:id="28" w:name="documento-v3-2026-10-08-commit-bf66b07"/>
+    <w:bookmarkEnd w:id="28"/>
+    <w:bookmarkStart w:id="29" w:name="documento-v3-2026-10-08-commit-bf66b07"/>
     <w:p>
       <w:pPr>
         <w:pStyle w:val="Heading3"/>
@@ -1233,7 +1288,7 @@
       <w:pPr>
         <w:numPr>
           <w:ilvl w:val="0"/>
-          <w:numId w:val="1010"/>
+          <w:numId w:val="1011"/>
         </w:numPr>
         <w:pStyle w:val="Compact"/>
       </w:pPr>
@@ -1245,7 +1300,7 @@
       <w:pPr>
         <w:numPr>
           <w:ilvl w:val="0"/>
-          <w:numId w:val="1010"/>
+          <w:numId w:val="1011"/>
         </w:numPr>
         <w:pStyle w:val="Compact"/>
       </w:pPr>
@@ -1253,8 +1308,8 @@
         <w:t xml:space="preserve">La versión va en el nombre del archivo y la numeración pasa a v1, v2, v3…</w:t>
       </w:r>
     </w:p>
-    <w:bookmarkEnd w:id="28"/>
-    <w:bookmarkStart w:id="29" w:name="documento-v2-2026-10-08-commit-07de778"/>
+    <w:bookmarkEnd w:id="29"/>
+    <w:bookmarkStart w:id="30" w:name="documento-v2-2026-10-08-commit-07de778"/>
     <w:p>
       <w:pPr>
         <w:pStyle w:val="Heading3"/>
@@ -1276,7 +1331,7 @@
       <w:pPr>
         <w:numPr>
           <w:ilvl w:val="0"/>
-          <w:numId w:val="1011"/>
+          <w:numId w:val="1012"/>
         </w:numPr>
         <w:pStyle w:val="Compact"/>
       </w:pPr>
@@ -1489,7 +1544,7 @@
       <w:pPr>
         <w:numPr>
           <w:ilvl w:val="0"/>
-          <w:numId w:val="1011"/>
+          <w:numId w:val="1012"/>
         </w:numPr>
         <w:pStyle w:val="Compact"/>
       </w:pPr>
@@ -1501,7 +1556,7 @@
       <w:pPr>
         <w:numPr>
           <w:ilvl w:val="0"/>
-          <w:numId w:val="1011"/>
+          <w:numId w:val="1012"/>
         </w:numPr>
         <w:pStyle w:val="Compact"/>
       </w:pPr>
@@ -1513,7 +1568,7 @@
       <w:pPr>
         <w:numPr>
           <w:ilvl w:val="0"/>
-          <w:numId w:val="1011"/>
+          <w:numId w:val="1012"/>
         </w:numPr>
         <w:pStyle w:val="Compact"/>
       </w:pPr>
@@ -1540,7 +1595,7 @@
       <w:pPr>
         <w:numPr>
           <w:ilvl w:val="0"/>
-          <w:numId w:val="1011"/>
+          <w:numId w:val="1012"/>
         </w:numPr>
         <w:pStyle w:val="Compact"/>
       </w:pPr>
@@ -1552,7 +1607,7 @@
       <w:pPr>
         <w:numPr>
           <w:ilvl w:val="0"/>
-          <w:numId w:val="1011"/>
+          <w:numId w:val="1012"/>
         </w:numPr>
         <w:pStyle w:val="Compact"/>
       </w:pPr>
@@ -1590,8 +1645,8 @@
         <w:t xml:space="preserve">(el impuesto lo define cada tipo de producto).</w:t>
       </w:r>
     </w:p>
-    <w:bookmarkEnd w:id="29"/>
-    <w:bookmarkStart w:id="30" w:name="documento-v1-2026-10-06-commit-9be1af4"/>
+    <w:bookmarkEnd w:id="30"/>
+    <w:bookmarkStart w:id="31" w:name="documento-v1-2026-10-06-commit-9be1af4"/>
     <w:p>
       <w:pPr>
         <w:pStyle w:val="Heading3"/>
@@ -1613,7 +1668,7 @@
       <w:pPr>
         <w:numPr>
           <w:ilvl w:val="0"/>
-          <w:numId w:val="1012"/>
+          <w:numId w:val="1013"/>
         </w:numPr>
         <w:pStyle w:val="Compact"/>
       </w:pPr>
@@ -1621,9 +1676,9 @@
         <w:t xml:space="preserve">Primera versión del documento de diseño del Avance 1 (Proyecto 1, Fidecompro): clases con atributos, métodos y relaciones; 15 historias de usuario; 8 prototipos de pantalla; diagramas de arquitectura, secuencia y navegación.</w:t>
       </w:r>
     </w:p>
-    <w:bookmarkEnd w:id="30"/>
     <w:bookmarkEnd w:id="31"/>
-    <w:bookmarkStart w:id="42" w:name="diagrama-de-clases-word-aparte"/>
+    <w:bookmarkEnd w:id="32"/>
+    <w:bookmarkStart w:id="43" w:name="diagrama-de-clases-word-aparte"/>
     <w:p>
       <w:pPr>
         <w:pStyle w:val="Heading2"/>
@@ -1632,7 +1687,7 @@
         <w:t xml:space="preserve">Diagrama de clases (Word aparte)</w:t>
       </w:r>
     </w:p>
-    <w:bookmarkStart w:id="32" w:name="X5f51fc4b5ffbe090736f81a3b1012c253b30052"/>
+    <w:bookmarkStart w:id="33" w:name="X5f51fc4b5ffbe090736f81a3b1012c253b30052"/>
     <w:p>
       <w:pPr>
         <w:pStyle w:val="Heading3"/>
@@ -1654,7 +1709,7 @@
       <w:pPr>
         <w:numPr>
           <w:ilvl w:val="0"/>
-          <w:numId w:val="1013"/>
+          <w:numId w:val="1014"/>
         </w:numPr>
         <w:pStyle w:val="Compact"/>
       </w:pPr>
@@ -1662,8 +1717,8 @@
         <w:t xml:space="preserve">Mismo formato APA 7 que el documento v11.</w:t>
       </w:r>
     </w:p>
-    <w:bookmarkEnd w:id="32"/>
-    <w:bookmarkStart w:id="33" w:name="X10045a7158086462e70fd3a0d9f926166a3c4ea"/>
+    <w:bookmarkEnd w:id="33"/>
+    <w:bookmarkStart w:id="34" w:name="X10045a7158086462e70fd3a0d9f926166a3c4ea"/>
     <w:p>
       <w:pPr>
         <w:pStyle w:val="Heading3"/>
@@ -1685,7 +1740,7 @@
       <w:pPr>
         <w:numPr>
           <w:ilvl w:val="0"/>
-          <w:numId w:val="1014"/>
+          <w:numId w:val="1015"/>
         </w:numPr>
         <w:pStyle w:val="Compact"/>
       </w:pPr>
@@ -1708,8 +1763,8 @@
         <w:t xml:space="preserve">sigue en v4 porque no cambió.</w:t>
       </w:r>
     </w:p>
-    <w:bookmarkEnd w:id="33"/>
-    <w:bookmarkStart w:id="34" w:name="X8b6f1de3ef83515f9063b0f71c4f739b3d8e2c1"/>
+    <w:bookmarkEnd w:id="34"/>
+    <w:bookmarkStart w:id="35" w:name="X8b6f1de3ef83515f9063b0f71c4f739b3d8e2c1"/>
     <w:p>
       <w:pPr>
         <w:pStyle w:val="Heading3"/>
@@ -1731,7 +1786,7 @@
       <w:pPr>
         <w:numPr>
           <w:ilvl w:val="0"/>
-          <w:numId w:val="1015"/>
+          <w:numId w:val="1016"/>
         </w:numPr>
         <w:pStyle w:val="Compact"/>
       </w:pPr>
@@ -1767,7 +1822,7 @@
       <w:pPr>
         <w:numPr>
           <w:ilvl w:val="0"/>
-          <w:numId w:val="1015"/>
+          <w:numId w:val="1016"/>
         </w:numPr>
         <w:pStyle w:val="Compact"/>
       </w:pPr>
@@ -1775,8 +1830,8 @@
         <w:t xml:space="preserve">Contenido: el de las entradas v2 y v3 de abajo (colecciones según su uso y la tabla que cita los ejemplos del profesor). Esos números solo existieron en el repositorio.</w:t>
       </w:r>
     </w:p>
-    <w:bookmarkEnd w:id="34"/>
-    <w:bookmarkStart w:id="35" w:name="X863504495f0c283560039533b96e35d8a8aec92"/>
+    <w:bookmarkEnd w:id="35"/>
+    <w:bookmarkStart w:id="36" w:name="X863504495f0c283560039533b96e35d8a8aec92"/>
     <w:p>
       <w:pPr>
         <w:pStyle w:val="Heading3"/>
@@ -1798,7 +1853,7 @@
       <w:pPr>
         <w:numPr>
           <w:ilvl w:val="0"/>
-          <w:numId w:val="1016"/>
+          <w:numId w:val="1017"/>
         </w:numPr>
         <w:pStyle w:val="Compact"/>
       </w:pPr>
@@ -1821,8 +1876,8 @@
         <w:t xml:space="preserve">sigue en v2 porque los diagramas no cambiaron.</w:t>
       </w:r>
     </w:p>
-    <w:bookmarkEnd w:id="35"/>
-    <w:bookmarkStart w:id="36" w:name="X66fc17acf23d8016d6af910173fecc388667a68"/>
+    <w:bookmarkEnd w:id="36"/>
+    <w:bookmarkStart w:id="37" w:name="X66fc17acf23d8016d6af910173fecc388667a68"/>
     <w:p>
       <w:pPr>
         <w:pStyle w:val="Heading3"/>
@@ -1844,7 +1899,7 @@
       <w:pPr>
         <w:numPr>
           <w:ilvl w:val="0"/>
-          <w:numId w:val="1017"/>
+          <w:numId w:val="1018"/>
         </w:numPr>
         <w:pStyle w:val="Compact"/>
       </w:pPr>
@@ -1922,7 +1977,7 @@
       <w:pPr>
         <w:numPr>
           <w:ilvl w:val="0"/>
-          <w:numId w:val="1017"/>
+          <w:numId w:val="1018"/>
         </w:numPr>
         <w:pStyle w:val="Compact"/>
       </w:pPr>
@@ -1954,8 +2009,8 @@
         <w:t xml:space="preserve">(tres páginas, igual que v1).</w:t>
       </w:r>
     </w:p>
-    <w:bookmarkEnd w:id="36"/>
-    <w:bookmarkStart w:id="37" w:name="Xd9ab462069bc781e05750197a0b9dcc21416b9b"/>
+    <w:bookmarkEnd w:id="37"/>
+    <w:bookmarkStart w:id="38" w:name="Xd9ab462069bc781e05750197a0b9dcc21416b9b"/>
     <w:p>
       <w:pPr>
         <w:pStyle w:val="Heading3"/>
@@ -1977,7 +2032,7 @@
       <w:pPr>
         <w:numPr>
           <w:ilvl w:val="0"/>
-          <w:numId w:val="1018"/>
+          <w:numId w:val="1019"/>
         </w:numPr>
         <w:pStyle w:val="Compact"/>
       </w:pPr>
@@ -1989,7 +2044,7 @@
       <w:pPr>
         <w:numPr>
           <w:ilvl w:val="0"/>
-          <w:numId w:val="1018"/>
+          <w:numId w:val="1019"/>
         </w:numPr>
         <w:pStyle w:val="Compact"/>
       </w:pPr>
@@ -2034,7 +2089,7 @@
       <w:pPr>
         <w:numPr>
           <w:ilvl w:val="0"/>
-          <w:numId w:val="1018"/>
+          <w:numId w:val="1019"/>
         </w:numPr>
         <w:pStyle w:val="Compact"/>
       </w:pPr>
@@ -2078,8 +2133,8 @@
         <w:t xml:space="preserve">desde los diagramas de Mermaid.</w:t>
       </w:r>
     </w:p>
-    <w:bookmarkEnd w:id="37"/>
-    <w:bookmarkStart w:id="38" w:name="X8bff2cc937d55517ed7504f8d852e738002eded"/>
+    <w:bookmarkEnd w:id="38"/>
+    <w:bookmarkStart w:id="39" w:name="X8bff2cc937d55517ed7504f8d852e738002eded"/>
     <w:p>
       <w:pPr>
         <w:pStyle w:val="Heading3"/>
@@ -2101,7 +2156,7 @@
       <w:pPr>
         <w:numPr>
           <w:ilvl w:val="0"/>
-          <w:numId w:val="1019"/>
+          <w:numId w:val="1020"/>
         </w:numPr>
         <w:pStyle w:val="Compact"/>
       </w:pPr>
@@ -2167,7 +2222,7 @@
       <w:pPr>
         <w:numPr>
           <w:ilvl w:val="0"/>
-          <w:numId w:val="1019"/>
+          <w:numId w:val="1020"/>
         </w:numPr>
         <w:pStyle w:val="Compact"/>
       </w:pPr>
@@ -2239,8 +2294,8 @@
         <w:t xml:space="preserve">.</w:t>
       </w:r>
     </w:p>
-    <w:bookmarkEnd w:id="38"/>
-    <w:bookmarkStart w:id="39" w:name="X391512b3d0076f68eba38bfbe03fbe6da9ec0d0"/>
+    <w:bookmarkEnd w:id="39"/>
+    <w:bookmarkStart w:id="40" w:name="X391512b3d0076f68eba38bfbe03fbe6da9ec0d0"/>
     <w:p>
       <w:pPr>
         <w:pStyle w:val="Heading3"/>
@@ -2262,7 +2317,7 @@
       <w:pPr>
         <w:numPr>
           <w:ilvl w:val="0"/>
-          <w:numId w:val="1020"/>
+          <w:numId w:val="1021"/>
         </w:numPr>
         <w:pStyle w:val="Compact"/>
       </w:pPr>
@@ -2274,7 +2329,7 @@
       <w:pPr>
         <w:numPr>
           <w:ilvl w:val="0"/>
-          <w:numId w:val="1020"/>
+          <w:numId w:val="1021"/>
         </w:numPr>
         <w:pStyle w:val="Compact"/>
       </w:pPr>
@@ -2294,8 +2349,8 @@
         <w:t xml:space="preserve">, para que las clases sean más angostas.</w:t>
       </w:r>
     </w:p>
-    <w:bookmarkEnd w:id="39"/>
-    <w:bookmarkStart w:id="40" w:name="Xc4a290eef64159bbb850880299580525a5d9206"/>
+    <w:bookmarkEnd w:id="40"/>
+    <w:bookmarkStart w:id="41" w:name="Xc4a290eef64159bbb850880299580525a5d9206"/>
     <w:p>
       <w:pPr>
         <w:pStyle w:val="Heading3"/>
@@ -2317,7 +2372,7 @@
       <w:pPr>
         <w:numPr>
           <w:ilvl w:val="0"/>
-          <w:numId w:val="1021"/>
+          <w:numId w:val="1022"/>
         </w:numPr>
         <w:pStyle w:val="Compact"/>
       </w:pPr>
@@ -2354,8 +2409,8 @@
         <w:t xml:space="preserve">) con un ejemplo, y cada tipo de flecha (herencia, implementación, composición, agregación y asociación).</w:t>
       </w:r>
     </w:p>
-    <w:bookmarkEnd w:id="40"/>
-    <w:bookmarkStart w:id="41" w:name="X861f067dae0e8a264748fdbddc6a638f1e0d1d0"/>
+    <w:bookmarkEnd w:id="41"/>
+    <w:bookmarkStart w:id="42" w:name="X861f067dae0e8a264748fdbddc6a638f1e0d1d0"/>
     <w:p>
       <w:pPr>
         <w:pStyle w:val="Heading3"/>
@@ -2377,7 +2432,7 @@
       <w:pPr>
         <w:numPr>
           <w:ilvl w:val="0"/>
-          <w:numId w:val="1022"/>
+          <w:numId w:val="1023"/>
         </w:numPr>
         <w:pStyle w:val="Compact"/>
       </w:pPr>
@@ -2389,7 +2444,7 @@
       <w:pPr>
         <w:numPr>
           <w:ilvl w:val="0"/>
-          <w:numId w:val="1022"/>
+          <w:numId w:val="1023"/>
         </w:numPr>
         <w:pStyle w:val="Compact"/>
       </w:pPr>
@@ -2436,9 +2491,9 @@
         <w:t xml:space="preserve">.</w:t>
       </w:r>
     </w:p>
-    <w:bookmarkEnd w:id="41"/>
     <w:bookmarkEnd w:id="42"/>
-    <w:bookmarkStart w:id="46" w:name="código"/>
+    <w:bookmarkEnd w:id="43"/>
+    <w:bookmarkStart w:id="48" w:name="código"/>
     <w:p>
       <w:pPr>
         <w:pStyle w:val="Heading2"/>
@@ -2447,12 +2502,58 @@
         <w:t xml:space="preserve">Código</w:t>
       </w:r>
     </w:p>
-    <w:bookmarkStart w:id="43" w:name="código-v3-2026-10-08-commit-626c373"/>
+    <w:bookmarkStart w:id="44" w:name="código-v4-2026-10-08-commit-34bfcec"/>
     <w:p>
       <w:pPr>
         <w:pStyle w:val="Heading3"/>
       </w:pPr>
       <w:r>
+        <w:t xml:space="preserve">Código v4 · 2026-10-08 · commit</w:t>
+      </w:r>
+      <w:r>
+        <w:t xml:space="preserve"> </w:t>
+      </w:r>
+      <w:r>
+        <w:rPr>
+          <w:rStyle w:val="VerbatimChar"/>
+        </w:rPr>
+        <w:t xml:space="preserve">34bfcec</w:t>
+      </w:r>
+    </w:p>
+    <w:p>
+      <w:pPr>
+        <w:numPr>
+          <w:ilvl w:val="0"/>
+          <w:numId w:val="1024"/>
+        </w:numPr>
+        <w:pStyle w:val="Compact"/>
+      </w:pPr>
+      <w:r>
+        <w:t xml:space="preserve">Solo cambian los títulos y comentarios del</w:t>
+      </w:r>
+      <w:r>
+        <w:t xml:space="preserve"> </w:t>
+      </w:r>
+      <w:r>
+        <w:rPr>
+          <w:rStyle w:val="VerbatimChar"/>
+        </w:rPr>
+        <w:t xml:space="preserve">main</w:t>
+      </w:r>
+      <w:r>
+        <w:t xml:space="preserve"> </w:t>
+      </w:r>
+      <w:r>
+        <w:t xml:space="preserve">a la nueva numeración de historias (documento v12).</w:t>
+      </w:r>
+    </w:p>
+    <w:bookmarkEnd w:id="44"/>
+    <w:bookmarkStart w:id="45" w:name="código-v3-2026-10-08-commit-626c373"/>
+    <w:p>
+      <w:pPr>
+        <w:pStyle w:val="Heading3"/>
+      </w:pPr>
+      <w:r>
         <w:t xml:space="preserve">Código v3 · 2026-10-08 · commit</w:t>
       </w:r>
       <w:r>
@@ -2469,7 +2570,7 @@
       <w:pPr>
         <w:numPr>
           <w:ilvl w:val="0"/>
-          <w:numId w:val="1023"/>
+          <w:numId w:val="1025"/>
         </w:numPr>
         <w:pStyle w:val="Compact"/>
       </w:pPr>
@@ -2550,7 +2651,7 @@
       <w:pPr>
         <w:numPr>
           <w:ilvl w:val="0"/>
-          <w:numId w:val="1023"/>
+          <w:numId w:val="1025"/>
         </w:numPr>
         <w:pStyle w:val="Compact"/>
       </w:pPr>
@@ -2595,7 +2696,7 @@
       <w:pPr>
         <w:numPr>
           <w:ilvl w:val="0"/>
-          <w:numId w:val="1023"/>
+          <w:numId w:val="1025"/>
         </w:numPr>
         <w:pStyle w:val="Compact"/>
       </w:pPr>
@@ -2648,8 +2749,8 @@
         <w:t xml:space="preserve">da la primera y la última factura.</w:t>
       </w:r>
     </w:p>
-    <w:bookmarkEnd w:id="43"/>
-    <w:bookmarkStart w:id="44" w:name="código-v2-2026-10-08-commit-99f55d4"/>
+    <w:bookmarkEnd w:id="45"/>
+    <w:bookmarkStart w:id="46" w:name="código-v2-2026-10-08-commit-99f55d4"/>
     <w:p>
       <w:pPr>
         <w:pStyle w:val="Heading3"/>
@@ -2671,7 +2772,7 @@
       <w:pPr>
         <w:numPr>
           <w:ilvl w:val="0"/>
-          <w:numId w:val="1024"/>
+          <w:numId w:val="1026"/>
         </w:numPr>
         <w:pStyle w:val="Compact"/>
       </w:pPr>
@@ -2749,7 +2850,7 @@
       <w:pPr>
         <w:numPr>
           <w:ilvl w:val="0"/>
-          <w:numId w:val="1024"/>
+          <w:numId w:val="1026"/>
         </w:numPr>
         <w:pStyle w:val="Compact"/>
       </w:pPr>
@@ -2772,8 +2873,8 @@
         <w:t xml:space="preserve">muestra la regla: un cliente con facturas se desactiva y uno sin facturas se elimina.</w:t>
       </w:r>
     </w:p>
-    <w:bookmarkEnd w:id="44"/>
-    <w:bookmarkStart w:id="45" w:name="código-v1-2026-10-08-commit-442187a"/>
+    <w:bookmarkEnd w:id="46"/>
+    <w:bookmarkStart w:id="47" w:name="código-v1-2026-10-08-commit-442187a"/>
     <w:p>
       <w:pPr>
         <w:pStyle w:val="Heading3"/>
@@ -2795,7 +2896,7 @@
       <w:pPr>
         <w:numPr>
           <w:ilvl w:val="0"/>
-          <w:numId w:val="1025"/>
+          <w:numId w:val="1027"/>
         </w:numPr>
         <w:pStyle w:val="Compact"/>
       </w:pPr>
@@ -2822,7 +2923,7 @@
       <w:pPr>
         <w:numPr>
           <w:ilvl w:val="0"/>
-          <w:numId w:val="1025"/>
+          <w:numId w:val="1027"/>
         </w:numPr>
         <w:pStyle w:val="Compact"/>
       </w:pPr>
@@ -2843,7 +2944,7 @@
       <w:pPr>
         <w:numPr>
           <w:ilvl w:val="0"/>
-          <w:numId w:val="1025"/>
+          <w:numId w:val="1027"/>
         </w:numPr>
         <w:pStyle w:val="Compact"/>
       </w:pPr>
@@ -2851,9 +2952,9 @@
         <w:t xml:space="preserve">Código de referencia para entender el diseño; no es un entregable.</w:t>
       </w:r>
     </w:p>
-    <w:bookmarkEnd w:id="45"/>
-    <w:bookmarkEnd w:id="46"/>
     <w:bookmarkEnd w:id="47"/>
+    <w:bookmarkEnd w:id="48"/>
+    <w:bookmarkEnd w:id="49"/>
     <w:sectPr>
       <w:pgSz w:w="12240" w:h="15840"/>
       <w:pgMar w:left="1134" w:right="1134"/>
@@ -3115,6 +3216,12 @@
     <w:abstractNumId w:val="991"/>
   </w:num>
   <w:num w:numId="1025">
+    <w:abstractNumId w:val="991"/>
+  </w:num>
+  <w:num w:numId="1026">
+    <w:abstractNumId w:val="991"/>
+  </w:num>
+  <w:num w:numId="1027">
     <w:abstractNumId w:val="991"/>
   </w:num>
 </w:numbering>

</xml_diff>

<commit_message>
CHANGELOG: historias de usuario v1
Co-Authored-By: Claude Opus 5.5 (1M context) <noreply@anthropic.com>
Claude-Session: https://claude.ai/code/session_01VkQm5RLcZiQMKLCS3EK3og
</commit_message>
<xml_diff>
--- a/docs/Historial_de_versiones.docx
+++ b/docs/Historial_de_versiones.docx
@@ -2,7 +2,7 @@
 <file path=word/document.xml><?xml version="1.0" encoding="utf-8"?>
 <w:document xmlns:w="http://schemas.openxmlformats.org/wordprocessingml/2006/main" xmlns:m="http://schemas.openxmlformats.org/officeDocument/2006/math" xmlns:r="http://schemas.openxmlformats.org/officeDocument/2006/relationships" xmlns:o="urn:schemas-microsoft-com:office:office" xmlns:v="urn:schemas-microsoft-com:vml" xmlns:w10="urn:schemas-microsoft-com:office:word" xmlns:a="http://schemas.openxmlformats.org/drawingml/2006/main" xmlns:pic="http://schemas.openxmlformats.org/drawingml/2006/picture" xmlns:wp="http://schemas.openxmlformats.org/drawingml/2006/wordprocessingDrawing">
   <w:body>
-    <w:bookmarkStart w:id="49" w:name="historial-de-versiones"/>
+    <w:bookmarkStart w:id="51" w:name="historial-de-versiones"/>
     <w:p>
       <w:pPr>
         <w:pStyle w:val="Heading1"/>
@@ -2493,16 +2493,75 @@
     </w:p>
     <w:bookmarkEnd w:id="42"/>
     <w:bookmarkEnd w:id="43"/>
-    <w:bookmarkStart w:id="48" w:name="código"/>
+    <w:bookmarkStart w:id="45" w:name="historias-de-usuario-word-aparte"/>
     <w:p>
       <w:pPr>
         <w:pStyle w:val="Heading2"/>
       </w:pPr>
       <w:r>
+        <w:t xml:space="preserve">Historias de usuario (Word aparte)</w:t>
+      </w:r>
+    </w:p>
+    <w:bookmarkStart w:id="44" w:name="Xe7240de9be5baf05b0d81e6c0c0e2d6d32324b3"/>
+    <w:p>
+      <w:pPr>
+        <w:pStyle w:val="Heading3"/>
+      </w:pPr>
+      <w:r>
+        <w:t xml:space="preserve">Historias de usuario v1 · 2026-10-08 · commit</w:t>
+      </w:r>
+      <w:r>
+        <w:t xml:space="preserve"> </w:t>
+      </w:r>
+      <w:r>
+        <w:rPr>
+          <w:rStyle w:val="VerbatimChar"/>
+        </w:rPr>
+        <w:t xml:space="preserve">9fae723</w:t>
+      </w:r>
+    </w:p>
+    <w:p>
+      <w:pPr>
+        <w:numPr>
+          <w:ilvl w:val="0"/>
+          <w:numId w:val="1024"/>
+        </w:numPr>
+        <w:pStyle w:val="Compact"/>
+      </w:pPr>
+      <w:r>
+        <w:rPr>
+          <w:rStyle w:val="VerbatimChar"/>
+        </w:rPr>
+        <w:t xml:space="preserve">Avance1_Historias_de_Usuario_v1.docx</w:t>
+      </w:r>
+      <w:r>
+        <w:t xml:space="preserve">: solo la tabla de las 12 historias del documento v12 con sus 65 escenarios, en página horizontal con márgenes de 2,54 cm y Times New Roman, para copiarla a otro documento. Se genera con</w:t>
+      </w:r>
+      <w:r>
+        <w:t xml:space="preserve"> </w:t>
+      </w:r>
+      <w:r>
+        <w:rPr>
+          <w:rStyle w:val="VerbatimChar"/>
+        </w:rPr>
+        <w:t xml:space="preserve">docs/construir_historias.py</w:t>
+      </w:r>
+      <w:r>
+        <w:t xml:space="preserve">.</w:t>
+      </w:r>
+    </w:p>
+    <w:bookmarkEnd w:id="44"/>
+    <w:bookmarkEnd w:id="45"/>
+    <w:bookmarkStart w:id="50" w:name="código"/>
+    <w:p>
+      <w:pPr>
+        <w:pStyle w:val="Heading2"/>
+      </w:pPr>
+      <w:r>
         <w:t xml:space="preserve">Código</w:t>
       </w:r>
     </w:p>
-    <w:bookmarkStart w:id="44" w:name="código-v4-2026-10-08-commit-34bfcec"/>
+    <w:bookmarkStart w:id="46" w:name="código-v4-2026-10-08-commit-34bfcec"/>
     <w:p>
       <w:pPr>
         <w:pStyle w:val="Heading3"/>
@@ -2524,7 +2583,7 @@
       <w:pPr>
         <w:numPr>
           <w:ilvl w:val="0"/>
-          <w:numId w:val="1024"/>
+          <w:numId w:val="1025"/>
         </w:numPr>
         <w:pStyle w:val="Compact"/>
       </w:pPr>
@@ -2547,8 +2606,8 @@
         <w:t xml:space="preserve">a la nueva numeración de historias (documento v12).</w:t>
       </w:r>
     </w:p>
-    <w:bookmarkEnd w:id="44"/>
-    <w:bookmarkStart w:id="45" w:name="código-v3-2026-10-08-commit-626c373"/>
+    <w:bookmarkEnd w:id="46"/>
+    <w:bookmarkStart w:id="47" w:name="código-v3-2026-10-08-commit-626c373"/>
     <w:p>
       <w:pPr>
         <w:pStyle w:val="Heading3"/>
@@ -2570,7 +2629,7 @@
       <w:pPr>
         <w:numPr>
           <w:ilvl w:val="0"/>
-          <w:numId w:val="1025"/>
+          <w:numId w:val="1026"/>
         </w:numPr>
         <w:pStyle w:val="Compact"/>
       </w:pPr>
@@ -2651,7 +2710,7 @@
       <w:pPr>
         <w:numPr>
           <w:ilvl w:val="0"/>
-          <w:numId w:val="1025"/>
+          <w:numId w:val="1026"/>
         </w:numPr>
         <w:pStyle w:val="Compact"/>
       </w:pPr>
@@ -2696,7 +2755,7 @@
       <w:pPr>
         <w:numPr>
           <w:ilvl w:val="0"/>
-          <w:numId w:val="1025"/>
+          <w:numId w:val="1026"/>
         </w:numPr>
         <w:pStyle w:val="Compact"/>
       </w:pPr>
@@ -2749,8 +2808,8 @@
         <w:t xml:space="preserve">da la primera y la última factura.</w:t>
       </w:r>
     </w:p>
-    <w:bookmarkEnd w:id="45"/>
-    <w:bookmarkStart w:id="46" w:name="código-v2-2026-10-08-commit-99f55d4"/>
+    <w:bookmarkEnd w:id="47"/>
+    <w:bookmarkStart w:id="48" w:name="código-v2-2026-10-08-commit-99f55d4"/>
     <w:p>
       <w:pPr>
         <w:pStyle w:val="Heading3"/>
@@ -2772,7 +2831,7 @@
       <w:pPr>
         <w:numPr>
           <w:ilvl w:val="0"/>
-          <w:numId w:val="1026"/>
+          <w:numId w:val="1027"/>
         </w:numPr>
         <w:pStyle w:val="Compact"/>
       </w:pPr>
@@ -2850,7 +2909,7 @@
       <w:pPr>
         <w:numPr>
           <w:ilvl w:val="0"/>
-          <w:numId w:val="1026"/>
+          <w:numId w:val="1027"/>
         </w:numPr>
         <w:pStyle w:val="Compact"/>
       </w:pPr>
@@ -2873,8 +2932,8 @@
         <w:t xml:space="preserve">muestra la regla: un cliente con facturas se desactiva y uno sin facturas se elimina.</w:t>
       </w:r>
     </w:p>
-    <w:bookmarkEnd w:id="46"/>
-    <w:bookmarkStart w:id="47" w:name="código-v1-2026-10-08-commit-442187a"/>
+    <w:bookmarkEnd w:id="48"/>
+    <w:bookmarkStart w:id="49" w:name="código-v1-2026-10-08-commit-442187a"/>
     <w:p>
       <w:pPr>
         <w:pStyle w:val="Heading3"/>
@@ -2896,7 +2955,7 @@
       <w:pPr>
         <w:numPr>
           <w:ilvl w:val="0"/>
-          <w:numId w:val="1027"/>
+          <w:numId w:val="1028"/>
         </w:numPr>
         <w:pStyle w:val="Compact"/>
       </w:pPr>
@@ -2923,7 +2982,7 @@
       <w:pPr>
         <w:numPr>
           <w:ilvl w:val="0"/>
-          <w:numId w:val="1027"/>
+          <w:numId w:val="1028"/>
         </w:numPr>
         <w:pStyle w:val="Compact"/>
       </w:pPr>
@@ -2944,7 +3003,7 @@
       <w:pPr>
         <w:numPr>
           <w:ilvl w:val="0"/>
-          <w:numId w:val="1027"/>
+          <w:numId w:val="1028"/>
         </w:numPr>
         <w:pStyle w:val="Compact"/>
       </w:pPr>
@@ -2952,9 +3011,9 @@
         <w:t xml:space="preserve">Código de referencia para entender el diseño; no es un entregable.</w:t>
       </w:r>
     </w:p>
-    <w:bookmarkEnd w:id="47"/>
-    <w:bookmarkEnd w:id="48"/>
     <w:bookmarkEnd w:id="49"/>
+    <w:bookmarkEnd w:id="50"/>
+    <w:bookmarkEnd w:id="51"/>
     <w:sectPr>
       <w:pgSz w:w="12240" w:h="15840"/>
       <w:pgMar w:left="1134" w:right="1134"/>
@@ -3222,6 +3281,9 @@
     <w:abstractNumId w:val="991"/>
   </w:num>
   <w:num w:numId="1027">
+    <w:abstractNumId w:val="991"/>
+  </w:num>
+  <w:num w:numId="1028">
     <w:abstractNumId w:val="991"/>
   </w:num>
 </w:numbering>

</xml_diff>

<commit_message>
CHANGELOG: documento v13 e historias v2
Co-Authored-By: Claude Opus 5.5 (1M context) <noreply@anthropic.com>
Claude-Session: https://claude.ai/code/session_01VkQm5RLcZiQMKLCS3EK3og
</commit_message>
<xml_diff>
--- a/docs/Historial_de_versiones.docx
+++ b/docs/Historial_de_versiones.docx
@@ -2,7 +2,7 @@
 <file path=word/document.xml><?xml version="1.0" encoding="utf-8"?>
 <w:document xmlns:w="http://schemas.openxmlformats.org/wordprocessingml/2006/main" xmlns:m="http://schemas.openxmlformats.org/officeDocument/2006/math" xmlns:r="http://schemas.openxmlformats.org/officeDocument/2006/relationships" xmlns:o="urn:schemas-microsoft-com:office:office" xmlns:v="urn:schemas-microsoft-com:vml" xmlns:w10="urn:schemas-microsoft-com:office:word" xmlns:a="http://schemas.openxmlformats.org/drawingml/2006/main" xmlns:pic="http://schemas.openxmlformats.org/drawingml/2006/picture" xmlns:wp="http://schemas.openxmlformats.org/drawingml/2006/wordprocessingDrawing">
   <w:body>
-    <w:bookmarkStart w:id="51" w:name="historial-de-versiones"/>
+    <w:bookmarkStart w:id="53" w:name="historial-de-versiones"/>
     <w:p>
       <w:pPr>
         <w:pStyle w:val="Heading1"/>
@@ -153,7 +153,7 @@
         <w:t xml:space="preserve">.</w:t>
       </w:r>
     </w:p>
-    <w:bookmarkStart w:id="32" w:name="documento-de-diseño"/>
+    <w:bookmarkStart w:id="33" w:name="documento-de-diseño"/>
     <w:p>
       <w:pPr>
         <w:pStyle w:val="Heading2"/>
@@ -162,12 +162,55 @@
         <w:t xml:space="preserve">Documento de diseño</w:t>
       </w:r>
     </w:p>
-    <w:bookmarkStart w:id="20" w:name="documento-v12-2026-10-08-commit-34bfcec"/>
+    <w:bookmarkStart w:id="20" w:name="documento-v13-2026-10-08-commit-bce4e1c"/>
     <w:p>
       <w:pPr>
         <w:pStyle w:val="Heading3"/>
       </w:pPr>
       <w:r>
+        <w:t xml:space="preserve">Documento v13 · 2026-10-08 · commit</w:t>
+      </w:r>
+      <w:r>
+        <w:t xml:space="preserve"> </w:t>
+      </w:r>
+      <w:r>
+        <w:rPr>
+          <w:rStyle w:val="VerbatimChar"/>
+        </w:rPr>
+        <w:t xml:space="preserve">bce4e1c</w:t>
+      </w:r>
+    </w:p>
+    <w:p>
+      <w:pPr>
+        <w:numPr>
+          <w:ilvl w:val="0"/>
+          <w:numId w:val="1002"/>
+        </w:numPr>
+        <w:pStyle w:val="Compact"/>
+      </w:pPr>
+      <w:r>
+        <w:t xml:space="preserve">Escenarios de aceptación consolidados: como máximo 4 por historia, de 65 a 40. Se unen los casos parecidos sin perder ninguna regla: todos los datos inválidos de un formulario en un escenario, eliminar con o sin facturas en otro, búsqueda y edición de clientes juntas, y anulación no permitida (ya anulada o vendedor).</w:t>
+      </w:r>
+    </w:p>
+    <w:p>
+      <w:pPr>
+        <w:numPr>
+          <w:ilvl w:val="0"/>
+          <w:numId w:val="1002"/>
+        </w:numPr>
+        <w:pStyle w:val="Compact"/>
+      </w:pPr>
+      <w:r>
+        <w:t xml:space="preserve">Escenarios por historia: HU 1 a HU 3, 4 cada una; HU 4, 3; HU 5, 4; HU 6, 3; HU 7, 2; HU 8, 4; HU 9 y HU 10, 2 cada una; HU 11 y HU 12, 4 cada una.</w:t>
+      </w:r>
+    </w:p>
+    <w:bookmarkEnd w:id="20"/>
+    <w:bookmarkStart w:id="21" w:name="documento-v12-2026-10-08-commit-34bfcec"/>
+    <w:p>
+      <w:pPr>
+        <w:pStyle w:val="Heading3"/>
+      </w:pPr>
+      <w:r>
         <w:t xml:space="preserve">Documento v12 · 2026-10-08 · commit</w:t>
       </w:r>
       <w:r>
@@ -184,7 +227,7 @@
       <w:pPr>
         <w:numPr>
           <w:ilvl w:val="0"/>
-          <w:numId w:val="1002"/>
+          <w:numId w:val="1003"/>
         </w:numPr>
         <w:pStyle w:val="Compact"/>
       </w:pPr>
@@ -196,7 +239,7 @@
       <w:pPr>
         <w:numPr>
           <w:ilvl w:val="0"/>
-          <w:numId w:val="1002"/>
+          <w:numId w:val="1003"/>
         </w:numPr>
         <w:pStyle w:val="Compact"/>
       </w:pPr>
@@ -208,7 +251,7 @@
       <w:pPr>
         <w:numPr>
           <w:ilvl w:val="0"/>
-          <w:numId w:val="1002"/>
+          <w:numId w:val="1003"/>
         </w:numPr>
         <w:pStyle w:val="Compact"/>
       </w:pPr>
@@ -216,8 +259,8 @@
         <w:t xml:space="preserve">Se renumeran las referencias en la guía del inicio, los requerimientos, los bocetos, la trazabilidad y el resumen de historias.</w:t>
       </w:r>
     </w:p>
-    <w:bookmarkEnd w:id="20"/>
-    <w:bookmarkStart w:id="21" w:name="documento-v11-2026-10-08-commit-156cbdf"/>
+    <w:bookmarkEnd w:id="21"/>
+    <w:bookmarkStart w:id="22" w:name="documento-v11-2026-10-08-commit-156cbdf"/>
     <w:p>
       <w:pPr>
         <w:pStyle w:val="Heading3"/>
@@ -239,7 +282,7 @@
       <w:pPr>
         <w:numPr>
           <w:ilvl w:val="0"/>
-          <w:numId w:val="1003"/>
+          <w:numId w:val="1004"/>
         </w:numPr>
         <w:pStyle w:val="Compact"/>
       </w:pPr>
@@ -260,7 +303,7 @@
       <w:pPr>
         <w:numPr>
           <w:ilvl w:val="0"/>
-          <w:numId w:val="1003"/>
+          <w:numId w:val="1004"/>
         </w:numPr>
         <w:pStyle w:val="Compact"/>
       </w:pPr>
@@ -272,7 +315,7 @@
       <w:pPr>
         <w:numPr>
           <w:ilvl w:val="0"/>
-          <w:numId w:val="1003"/>
+          <w:numId w:val="1004"/>
         </w:numPr>
         <w:pStyle w:val="Compact"/>
       </w:pPr>
@@ -284,7 +327,7 @@
       <w:pPr>
         <w:numPr>
           <w:ilvl w:val="0"/>
-          <w:numId w:val="1003"/>
+          <w:numId w:val="1004"/>
         </w:numPr>
         <w:pStyle w:val="Compact"/>
       </w:pPr>
@@ -323,7 +366,7 @@
       <w:pPr>
         <w:numPr>
           <w:ilvl w:val="0"/>
-          <w:numId w:val="1003"/>
+          <w:numId w:val="1004"/>
         </w:numPr>
         <w:pStyle w:val="Compact"/>
       </w:pPr>
@@ -331,8 +374,8 @@
         <w:t xml:space="preserve">Columnas de la tabla de historias ajustadas al nuevo ancho para que no se corten palabras.</w:t>
       </w:r>
     </w:p>
-    <w:bookmarkEnd w:id="21"/>
-    <w:bookmarkStart w:id="22" w:name="documento-v10-2026-10-08-commit-fee9361"/>
+    <w:bookmarkEnd w:id="22"/>
+    <w:bookmarkStart w:id="23" w:name="documento-v10-2026-10-08-commit-fee9361"/>
     <w:p>
       <w:pPr>
         <w:pStyle w:val="Heading3"/>
@@ -354,7 +397,7 @@
       <w:pPr>
         <w:numPr>
           <w:ilvl w:val="0"/>
-          <w:numId w:val="1004"/>
+          <w:numId w:val="1005"/>
         </w:numPr>
         <w:pStyle w:val="Compact"/>
       </w:pPr>
@@ -382,7 +425,7 @@
       <w:pPr>
         <w:numPr>
           <w:ilvl w:val="0"/>
-          <w:numId w:val="1004"/>
+          <w:numId w:val="1005"/>
         </w:numPr>
         <w:pStyle w:val="Compact"/>
       </w:pPr>
@@ -394,7 +437,7 @@
       <w:pPr>
         <w:numPr>
           <w:ilvl w:val="0"/>
-          <w:numId w:val="1004"/>
+          <w:numId w:val="1005"/>
         </w:numPr>
         <w:pStyle w:val="Compact"/>
       </w:pPr>
@@ -402,8 +445,8 @@
         <w:t xml:space="preserve">Las imágenes grandes se limitan a 20,5 cm de alto para que el título y el pie de figura queden en la misma página.</w:t>
       </w:r>
     </w:p>
-    <w:bookmarkEnd w:id="22"/>
-    <w:bookmarkStart w:id="23" w:name="documento-v9-2026-10-08-commit-5400cea"/>
+    <w:bookmarkEnd w:id="23"/>
+    <w:bookmarkStart w:id="24" w:name="documento-v9-2026-10-08-commit-5400cea"/>
     <w:p>
       <w:pPr>
         <w:pStyle w:val="Heading3"/>
@@ -425,7 +468,7 @@
       <w:pPr>
         <w:numPr>
           <w:ilvl w:val="0"/>
-          <w:numId w:val="1005"/>
+          <w:numId w:val="1006"/>
         </w:numPr>
         <w:pStyle w:val="Compact"/>
       </w:pPr>
@@ -500,7 +543,7 @@
       <w:pPr>
         <w:numPr>
           <w:ilvl w:val="0"/>
-          <w:numId w:val="1005"/>
+          <w:numId w:val="1006"/>
         </w:numPr>
         <w:pStyle w:val="Compact"/>
       </w:pPr>
@@ -535,8 +578,8 @@
         <w:t xml:space="preserve">, por qué todas las colecciones son genéricas (no hace falta cast).</w:t>
       </w:r>
     </w:p>
-    <w:bookmarkEnd w:id="23"/>
-    <w:bookmarkStart w:id="24" w:name="documento-v8-2026-10-08-commit-626c373"/>
+    <w:bookmarkEnd w:id="24"/>
+    <w:bookmarkStart w:id="25" w:name="documento-v8-2026-10-08-commit-626c373"/>
     <w:p>
       <w:pPr>
         <w:pStyle w:val="Heading3"/>
@@ -558,7 +601,7 @@
       <w:pPr>
         <w:numPr>
           <w:ilvl w:val="0"/>
-          <w:numId w:val="1006"/>
+          <w:numId w:val="1007"/>
         </w:numPr>
         <w:pStyle w:val="Compact"/>
       </w:pPr>
@@ -627,7 +670,7 @@
       <w:pPr>
         <w:numPr>
           <w:ilvl w:val="0"/>
-          <w:numId w:val="1006"/>
+          <w:numId w:val="1007"/>
         </w:numPr>
         <w:pStyle w:val="Compact"/>
       </w:pPr>
@@ -648,7 +691,7 @@
       <w:pPr>
         <w:numPr>
           <w:ilvl w:val="0"/>
-          <w:numId w:val="1006"/>
+          <w:numId w:val="1007"/>
         </w:numPr>
         <w:pStyle w:val="Compact"/>
       </w:pPr>
@@ -684,7 +727,7 @@
       <w:pPr>
         <w:numPr>
           <w:ilvl w:val="0"/>
-          <w:numId w:val="1006"/>
+          <w:numId w:val="1007"/>
         </w:numPr>
         <w:pStyle w:val="Compact"/>
       </w:pPr>
@@ -729,7 +772,7 @@
       <w:pPr>
         <w:numPr>
           <w:ilvl w:val="0"/>
-          <w:numId w:val="1006"/>
+          <w:numId w:val="1007"/>
         </w:numPr>
         <w:pStyle w:val="Compact"/>
       </w:pPr>
@@ -762,7 +805,7 @@
       <w:pPr>
         <w:numPr>
           <w:ilvl w:val="0"/>
-          <w:numId w:val="1006"/>
+          <w:numId w:val="1007"/>
         </w:numPr>
         <w:pStyle w:val="Compact"/>
       </w:pPr>
@@ -798,7 +841,7 @@
       <w:pPr>
         <w:numPr>
           <w:ilvl w:val="0"/>
-          <w:numId w:val="1006"/>
+          <w:numId w:val="1007"/>
         </w:numPr>
         <w:pStyle w:val="Compact"/>
       </w:pPr>
@@ -806,8 +849,8 @@
         <w:t xml:space="preserve">Nueva tabla «Colecciones: cuál se usa y por qué» al final de la sección 4.2 y fila de colecciones en la tabla de conceptos del curso.</w:t>
       </w:r>
     </w:p>
-    <w:bookmarkEnd w:id="24"/>
-    <w:bookmarkStart w:id="25" w:name="documento-v7-2026-10-08-commit-047b31c"/>
+    <w:bookmarkEnd w:id="25"/>
+    <w:bookmarkStart w:id="26" w:name="documento-v7-2026-10-08-commit-047b31c"/>
     <w:p>
       <w:pPr>
         <w:pStyle w:val="Heading3"/>
@@ -829,7 +872,7 @@
       <w:pPr>
         <w:numPr>
           <w:ilvl w:val="0"/>
-          <w:numId w:val="1007"/>
+          <w:numId w:val="1008"/>
         </w:numPr>
         <w:pStyle w:val="Compact"/>
       </w:pPr>
@@ -841,7 +884,7 @@
       <w:pPr>
         <w:numPr>
           <w:ilvl w:val="0"/>
-          <w:numId w:val="1007"/>
+          <w:numId w:val="1008"/>
         </w:numPr>
         <w:pStyle w:val="Compact"/>
       </w:pPr>
@@ -853,7 +896,7 @@
       <w:pPr>
         <w:numPr>
           <w:ilvl w:val="0"/>
-          <w:numId w:val="1007"/>
+          <w:numId w:val="1008"/>
         </w:numPr>
         <w:pStyle w:val="Compact"/>
       </w:pPr>
@@ -865,7 +908,7 @@
       <w:pPr>
         <w:numPr>
           <w:ilvl w:val="0"/>
-          <w:numId w:val="1007"/>
+          <w:numId w:val="1008"/>
         </w:numPr>
         <w:pStyle w:val="Compact"/>
       </w:pPr>
@@ -895,7 +938,7 @@
       <w:pPr>
         <w:numPr>
           <w:ilvl w:val="0"/>
-          <w:numId w:val="1007"/>
+          <w:numId w:val="1008"/>
         </w:numPr>
         <w:pStyle w:val="Compact"/>
       </w:pPr>
@@ -903,8 +946,8 @@
         <w:t xml:space="preserve">El nombre del profesor (Mario Alberto Vargas Montes) queda en la portada.</w:t>
       </w:r>
     </w:p>
-    <w:bookmarkEnd w:id="25"/>
-    <w:bookmarkStart w:id="26" w:name="documento-v6-2026-10-08-commit-99f55d4"/>
+    <w:bookmarkEnd w:id="26"/>
+    <w:bookmarkStart w:id="27" w:name="documento-v6-2026-10-08-commit-99f55d4"/>
     <w:p>
       <w:pPr>
         <w:pStyle w:val="Heading3"/>
@@ -926,7 +969,7 @@
       <w:pPr>
         <w:numPr>
           <w:ilvl w:val="0"/>
-          <w:numId w:val="1008"/>
+          <w:numId w:val="1009"/>
         </w:numPr>
         <w:pStyle w:val="Compact"/>
       </w:pPr>
@@ -938,7 +981,7 @@
       <w:pPr>
         <w:numPr>
           <w:ilvl w:val="0"/>
-          <w:numId w:val="1008"/>
+          <w:numId w:val="1009"/>
         </w:numPr>
         <w:pStyle w:val="Compact"/>
       </w:pPr>
@@ -950,7 +993,7 @@
       <w:pPr>
         <w:numPr>
           <w:ilvl w:val="0"/>
-          <w:numId w:val="1008"/>
+          <w:numId w:val="1009"/>
         </w:numPr>
         <w:pStyle w:val="Compact"/>
       </w:pPr>
@@ -1007,7 +1050,7 @@
       <w:pPr>
         <w:numPr>
           <w:ilvl w:val="0"/>
-          <w:numId w:val="1008"/>
+          <w:numId w:val="1009"/>
         </w:numPr>
         <w:pStyle w:val="Compact"/>
       </w:pPr>
@@ -1028,7 +1071,7 @@
       <w:pPr>
         <w:numPr>
           <w:ilvl w:val="0"/>
-          <w:numId w:val="1008"/>
+          <w:numId w:val="1009"/>
         </w:numPr>
         <w:pStyle w:val="Compact"/>
       </w:pPr>
@@ -1040,7 +1083,7 @@
       <w:pPr>
         <w:numPr>
           <w:ilvl w:val="0"/>
-          <w:numId w:val="1008"/>
+          <w:numId w:val="1009"/>
         </w:numPr>
         <w:pStyle w:val="Compact"/>
       </w:pPr>
@@ -1052,7 +1095,7 @@
       <w:pPr>
         <w:numPr>
           <w:ilvl w:val="0"/>
-          <w:numId w:val="1008"/>
+          <w:numId w:val="1009"/>
         </w:numPr>
         <w:pStyle w:val="Compact"/>
       </w:pPr>
@@ -1060,8 +1103,8 @@
         <w:t xml:space="preserve">Requerimientos no funcionales de pantallas, sockets, concurrencia y base de datos ajustados.</w:t>
       </w:r>
     </w:p>
-    <w:bookmarkEnd w:id="26"/>
-    <w:bookmarkStart w:id="27" w:name="documento-v5-2026-10-08-commit-9a7a9a7"/>
+    <w:bookmarkEnd w:id="27"/>
+    <w:bookmarkStart w:id="28" w:name="documento-v5-2026-10-08-commit-9a7a9a7"/>
     <w:p>
       <w:pPr>
         <w:pStyle w:val="Heading3"/>
@@ -1083,7 +1126,7 @@
       <w:pPr>
         <w:numPr>
           <w:ilvl w:val="0"/>
-          <w:numId w:val="1009"/>
+          <w:numId w:val="1010"/>
         </w:numPr>
         <w:pStyle w:val="Compact"/>
       </w:pPr>
@@ -1127,7 +1170,7 @@
       <w:pPr>
         <w:numPr>
           <w:ilvl w:val="0"/>
-          <w:numId w:val="1009"/>
+          <w:numId w:val="1010"/>
         </w:numPr>
         <w:pStyle w:val="Compact"/>
       </w:pPr>
@@ -1139,7 +1182,7 @@
       <w:pPr>
         <w:numPr>
           <w:ilvl w:val="0"/>
-          <w:numId w:val="1009"/>
+          <w:numId w:val="1010"/>
         </w:numPr>
         <w:pStyle w:val="Compact"/>
       </w:pPr>
@@ -1151,7 +1194,7 @@
       <w:pPr>
         <w:numPr>
           <w:ilvl w:val="0"/>
-          <w:numId w:val="1009"/>
+          <w:numId w:val="1010"/>
         </w:numPr>
         <w:pStyle w:val="Compact"/>
       </w:pPr>
@@ -1171,8 +1214,8 @@
         <w:t xml:space="preserve">.</w:t>
       </w:r>
     </w:p>
-    <w:bookmarkEnd w:id="27"/>
-    <w:bookmarkStart w:id="28" w:name="documento-v4-2026-10-08-commit-b3e7477"/>
+    <w:bookmarkEnd w:id="28"/>
+    <w:bookmarkStart w:id="29" w:name="documento-v4-2026-10-08-commit-b3e7477"/>
     <w:p>
       <w:pPr>
         <w:pStyle w:val="Heading3"/>
@@ -1194,7 +1237,7 @@
       <w:pPr>
         <w:numPr>
           <w:ilvl w:val="0"/>
-          <w:numId w:val="1010"/>
+          <w:numId w:val="1011"/>
         </w:numPr>
         <w:pStyle w:val="Compact"/>
       </w:pPr>
@@ -1206,7 +1249,7 @@
       <w:pPr>
         <w:numPr>
           <w:ilvl w:val="0"/>
-          <w:numId w:val="1010"/>
+          <w:numId w:val="1011"/>
         </w:numPr>
         <w:pStyle w:val="Compact"/>
       </w:pPr>
@@ -1218,7 +1261,7 @@
       <w:pPr>
         <w:numPr>
           <w:ilvl w:val="0"/>
-          <w:numId w:val="1010"/>
+          <w:numId w:val="1011"/>
         </w:numPr>
         <w:pStyle w:val="Compact"/>
       </w:pPr>
@@ -1230,7 +1273,7 @@
       <w:pPr>
         <w:numPr>
           <w:ilvl w:val="0"/>
-          <w:numId w:val="1010"/>
+          <w:numId w:val="1011"/>
         </w:numPr>
         <w:pStyle w:val="Compact"/>
       </w:pPr>
@@ -1265,8 +1308,8 @@
         <w:t xml:space="preserve">.</w:t>
       </w:r>
     </w:p>
-    <w:bookmarkEnd w:id="28"/>
-    <w:bookmarkStart w:id="29" w:name="documento-v3-2026-10-08-commit-bf66b07"/>
+    <w:bookmarkEnd w:id="29"/>
+    <w:bookmarkStart w:id="30" w:name="documento-v3-2026-10-08-commit-bf66b07"/>
     <w:p>
       <w:pPr>
         <w:pStyle w:val="Heading3"/>
@@ -1288,7 +1331,7 @@
       <w:pPr>
         <w:numPr>
           <w:ilvl w:val="0"/>
-          <w:numId w:val="1011"/>
+          <w:numId w:val="1012"/>
         </w:numPr>
         <w:pStyle w:val="Compact"/>
       </w:pPr>
@@ -1300,7 +1343,7 @@
       <w:pPr>
         <w:numPr>
           <w:ilvl w:val="0"/>
-          <w:numId w:val="1011"/>
+          <w:numId w:val="1012"/>
         </w:numPr>
         <w:pStyle w:val="Compact"/>
       </w:pPr>
@@ -1308,8 +1351,8 @@
         <w:t xml:space="preserve">La versión va en el nombre del archivo y la numeración pasa a v1, v2, v3…</w:t>
       </w:r>
     </w:p>
-    <w:bookmarkEnd w:id="29"/>
-    <w:bookmarkStart w:id="30" w:name="documento-v2-2026-10-08-commit-07de778"/>
+    <w:bookmarkEnd w:id="30"/>
+    <w:bookmarkStart w:id="31" w:name="documento-v2-2026-10-08-commit-07de778"/>
     <w:p>
       <w:pPr>
         <w:pStyle w:val="Heading3"/>
@@ -1331,7 +1374,7 @@
       <w:pPr>
         <w:numPr>
           <w:ilvl w:val="0"/>
-          <w:numId w:val="1012"/>
+          <w:numId w:val="1013"/>
         </w:numPr>
         <w:pStyle w:val="Compact"/>
       </w:pPr>
@@ -1544,7 +1587,7 @@
       <w:pPr>
         <w:numPr>
           <w:ilvl w:val="0"/>
-          <w:numId w:val="1012"/>
+          <w:numId w:val="1013"/>
         </w:numPr>
         <w:pStyle w:val="Compact"/>
       </w:pPr>
@@ -1556,7 +1599,7 @@
       <w:pPr>
         <w:numPr>
           <w:ilvl w:val="0"/>
-          <w:numId w:val="1012"/>
+          <w:numId w:val="1013"/>
         </w:numPr>
         <w:pStyle w:val="Compact"/>
       </w:pPr>
@@ -1568,7 +1611,7 @@
       <w:pPr>
         <w:numPr>
           <w:ilvl w:val="0"/>
-          <w:numId w:val="1012"/>
+          <w:numId w:val="1013"/>
         </w:numPr>
         <w:pStyle w:val="Compact"/>
       </w:pPr>
@@ -1595,7 +1638,7 @@
       <w:pPr>
         <w:numPr>
           <w:ilvl w:val="0"/>
-          <w:numId w:val="1012"/>
+          <w:numId w:val="1013"/>
         </w:numPr>
         <w:pStyle w:val="Compact"/>
       </w:pPr>
@@ -1607,7 +1650,7 @@
       <w:pPr>
         <w:numPr>
           <w:ilvl w:val="0"/>
-          <w:numId w:val="1012"/>
+          <w:numId w:val="1013"/>
         </w:numPr>
         <w:pStyle w:val="Compact"/>
       </w:pPr>
@@ -1645,8 +1688,8 @@
         <w:t xml:space="preserve">(el impuesto lo define cada tipo de producto).</w:t>
       </w:r>
     </w:p>
-    <w:bookmarkEnd w:id="30"/>
-    <w:bookmarkStart w:id="31" w:name="documento-v1-2026-10-06-commit-9be1af4"/>
+    <w:bookmarkEnd w:id="31"/>
+    <w:bookmarkStart w:id="32" w:name="documento-v1-2026-10-06-commit-9be1af4"/>
     <w:p>
       <w:pPr>
         <w:pStyle w:val="Heading3"/>
@@ -1668,7 +1711,7 @@
       <w:pPr>
         <w:numPr>
           <w:ilvl w:val="0"/>
-          <w:numId w:val="1013"/>
+          <w:numId w:val="1014"/>
         </w:numPr>
         <w:pStyle w:val="Compact"/>
       </w:pPr>
@@ -1676,9 +1719,9 @@
         <w:t xml:space="preserve">Primera versión del documento de diseño del Avance 1 (Proyecto 1, Fidecompro): clases con atributos, métodos y relaciones; 15 historias de usuario; 8 prototipos de pantalla; diagramas de arquitectura, secuencia y navegación.</w:t>
       </w:r>
     </w:p>
-    <w:bookmarkEnd w:id="31"/>
     <w:bookmarkEnd w:id="32"/>
-    <w:bookmarkStart w:id="43" w:name="diagrama-de-clases-word-aparte"/>
+    <w:bookmarkEnd w:id="33"/>
+    <w:bookmarkStart w:id="44" w:name="diagrama-de-clases-word-aparte"/>
     <w:p>
       <w:pPr>
         <w:pStyle w:val="Heading2"/>
@@ -1687,7 +1730,7 @@
         <w:t xml:space="preserve">Diagrama de clases (Word aparte)</w:t>
       </w:r>
     </w:p>
-    <w:bookmarkStart w:id="33" w:name="X5f51fc4b5ffbe090736f81a3b1012c253b30052"/>
+    <w:bookmarkStart w:id="34" w:name="X5f51fc4b5ffbe090736f81a3b1012c253b30052"/>
     <w:p>
       <w:pPr>
         <w:pStyle w:val="Heading3"/>
@@ -1709,7 +1752,7 @@
       <w:pPr>
         <w:numPr>
           <w:ilvl w:val="0"/>
-          <w:numId w:val="1014"/>
+          <w:numId w:val="1015"/>
         </w:numPr>
         <w:pStyle w:val="Compact"/>
       </w:pPr>
@@ -1717,8 +1760,8 @@
         <w:t xml:space="preserve">Mismo formato APA 7 que el documento v11.</w:t>
       </w:r>
     </w:p>
-    <w:bookmarkEnd w:id="33"/>
-    <w:bookmarkStart w:id="34" w:name="X10045a7158086462e70fd3a0d9f926166a3c4ea"/>
+    <w:bookmarkEnd w:id="34"/>
+    <w:bookmarkStart w:id="35" w:name="X10045a7158086462e70fd3a0d9f926166a3c4ea"/>
     <w:p>
       <w:pPr>
         <w:pStyle w:val="Heading3"/>
@@ -1740,7 +1783,7 @@
       <w:pPr>
         <w:numPr>
           <w:ilvl w:val="0"/>
-          <w:numId w:val="1015"/>
+          <w:numId w:val="1016"/>
         </w:numPr>
         <w:pStyle w:val="Compact"/>
       </w:pPr>
@@ -1763,8 +1806,8 @@
         <w:t xml:space="preserve">sigue en v4 porque no cambió.</w:t>
       </w:r>
     </w:p>
-    <w:bookmarkEnd w:id="34"/>
-    <w:bookmarkStart w:id="35" w:name="X8b6f1de3ef83515f9063b0f71c4f739b3d8e2c1"/>
+    <w:bookmarkEnd w:id="35"/>
+    <w:bookmarkStart w:id="36" w:name="X8b6f1de3ef83515f9063b0f71c4f739b3d8e2c1"/>
     <w:p>
       <w:pPr>
         <w:pStyle w:val="Heading3"/>
@@ -1786,7 +1829,7 @@
       <w:pPr>
         <w:numPr>
           <w:ilvl w:val="0"/>
-          <w:numId w:val="1016"/>
+          <w:numId w:val="1017"/>
         </w:numPr>
         <w:pStyle w:val="Compact"/>
       </w:pPr>
@@ -1822,7 +1865,7 @@
       <w:pPr>
         <w:numPr>
           <w:ilvl w:val="0"/>
-          <w:numId w:val="1016"/>
+          <w:numId w:val="1017"/>
         </w:numPr>
         <w:pStyle w:val="Compact"/>
       </w:pPr>
@@ -1830,8 +1873,8 @@
         <w:t xml:space="preserve">Contenido: el de las entradas v2 y v3 de abajo (colecciones según su uso y la tabla que cita los ejemplos del profesor). Esos números solo existieron en el repositorio.</w:t>
       </w:r>
     </w:p>
-    <w:bookmarkEnd w:id="35"/>
-    <w:bookmarkStart w:id="36" w:name="X863504495f0c283560039533b96e35d8a8aec92"/>
+    <w:bookmarkEnd w:id="36"/>
+    <w:bookmarkStart w:id="37" w:name="X863504495f0c283560039533b96e35d8a8aec92"/>
     <w:p>
       <w:pPr>
         <w:pStyle w:val="Heading3"/>
@@ -1853,7 +1896,7 @@
       <w:pPr>
         <w:numPr>
           <w:ilvl w:val="0"/>
-          <w:numId w:val="1017"/>
+          <w:numId w:val="1018"/>
         </w:numPr>
         <w:pStyle w:val="Compact"/>
       </w:pPr>
@@ -1876,8 +1919,8 @@
         <w:t xml:space="preserve">sigue en v2 porque los diagramas no cambiaron.</w:t>
       </w:r>
     </w:p>
-    <w:bookmarkEnd w:id="36"/>
-    <w:bookmarkStart w:id="37" w:name="X66fc17acf23d8016d6af910173fecc388667a68"/>
+    <w:bookmarkEnd w:id="37"/>
+    <w:bookmarkStart w:id="38" w:name="X66fc17acf23d8016d6af910173fecc388667a68"/>
     <w:p>
       <w:pPr>
         <w:pStyle w:val="Heading3"/>
@@ -1899,7 +1942,7 @@
       <w:pPr>
         <w:numPr>
           <w:ilvl w:val="0"/>
-          <w:numId w:val="1018"/>
+          <w:numId w:val="1019"/>
         </w:numPr>
         <w:pStyle w:val="Compact"/>
       </w:pPr>
@@ -1977,7 +2020,7 @@
       <w:pPr>
         <w:numPr>
           <w:ilvl w:val="0"/>
-          <w:numId w:val="1018"/>
+          <w:numId w:val="1019"/>
         </w:numPr>
         <w:pStyle w:val="Compact"/>
       </w:pPr>
@@ -2009,8 +2052,8 @@
         <w:t xml:space="preserve">(tres páginas, igual que v1).</w:t>
       </w:r>
     </w:p>
-    <w:bookmarkEnd w:id="37"/>
-    <w:bookmarkStart w:id="38" w:name="Xd9ab462069bc781e05750197a0b9dcc21416b9b"/>
+    <w:bookmarkEnd w:id="38"/>
+    <w:bookmarkStart w:id="39" w:name="Xd9ab462069bc781e05750197a0b9dcc21416b9b"/>
     <w:p>
       <w:pPr>
         <w:pStyle w:val="Heading3"/>
@@ -2032,7 +2075,7 @@
       <w:pPr>
         <w:numPr>
           <w:ilvl w:val="0"/>
-          <w:numId w:val="1019"/>
+          <w:numId w:val="1020"/>
         </w:numPr>
         <w:pStyle w:val="Compact"/>
       </w:pPr>
@@ -2044,7 +2087,7 @@
       <w:pPr>
         <w:numPr>
           <w:ilvl w:val="0"/>
-          <w:numId w:val="1019"/>
+          <w:numId w:val="1020"/>
         </w:numPr>
         <w:pStyle w:val="Compact"/>
       </w:pPr>
@@ -2089,7 +2132,7 @@
       <w:pPr>
         <w:numPr>
           <w:ilvl w:val="0"/>
-          <w:numId w:val="1019"/>
+          <w:numId w:val="1020"/>
         </w:numPr>
         <w:pStyle w:val="Compact"/>
       </w:pPr>
@@ -2133,8 +2176,8 @@
         <w:t xml:space="preserve">desde los diagramas de Mermaid.</w:t>
       </w:r>
     </w:p>
-    <w:bookmarkEnd w:id="38"/>
-    <w:bookmarkStart w:id="39" w:name="X8bff2cc937d55517ed7504f8d852e738002eded"/>
+    <w:bookmarkEnd w:id="39"/>
+    <w:bookmarkStart w:id="40" w:name="X8bff2cc937d55517ed7504f8d852e738002eded"/>
     <w:p>
       <w:pPr>
         <w:pStyle w:val="Heading3"/>
@@ -2156,7 +2199,7 @@
       <w:pPr>
         <w:numPr>
           <w:ilvl w:val="0"/>
-          <w:numId w:val="1020"/>
+          <w:numId w:val="1021"/>
         </w:numPr>
         <w:pStyle w:val="Compact"/>
       </w:pPr>
@@ -2222,7 +2265,7 @@
       <w:pPr>
         <w:numPr>
           <w:ilvl w:val="0"/>
-          <w:numId w:val="1020"/>
+          <w:numId w:val="1021"/>
         </w:numPr>
         <w:pStyle w:val="Compact"/>
       </w:pPr>
@@ -2294,8 +2337,8 @@
         <w:t xml:space="preserve">.</w:t>
       </w:r>
     </w:p>
-    <w:bookmarkEnd w:id="39"/>
-    <w:bookmarkStart w:id="40" w:name="X391512b3d0076f68eba38bfbe03fbe6da9ec0d0"/>
+    <w:bookmarkEnd w:id="40"/>
+    <w:bookmarkStart w:id="41" w:name="X391512b3d0076f68eba38bfbe03fbe6da9ec0d0"/>
     <w:p>
       <w:pPr>
         <w:pStyle w:val="Heading3"/>
@@ -2317,7 +2360,7 @@
       <w:pPr>
         <w:numPr>
           <w:ilvl w:val="0"/>
-          <w:numId w:val="1021"/>
+          <w:numId w:val="1022"/>
         </w:numPr>
         <w:pStyle w:val="Compact"/>
       </w:pPr>
@@ -2329,7 +2372,7 @@
       <w:pPr>
         <w:numPr>
           <w:ilvl w:val="0"/>
-          <w:numId w:val="1021"/>
+          <w:numId w:val="1022"/>
         </w:numPr>
         <w:pStyle w:val="Compact"/>
       </w:pPr>
@@ -2349,8 +2392,8 @@
         <w:t xml:space="preserve">, para que las clases sean más angostas.</w:t>
       </w:r>
     </w:p>
-    <w:bookmarkEnd w:id="40"/>
-    <w:bookmarkStart w:id="41" w:name="Xc4a290eef64159bbb850880299580525a5d9206"/>
+    <w:bookmarkEnd w:id="41"/>
+    <w:bookmarkStart w:id="42" w:name="Xc4a290eef64159bbb850880299580525a5d9206"/>
     <w:p>
       <w:pPr>
         <w:pStyle w:val="Heading3"/>
@@ -2372,7 +2415,7 @@
       <w:pPr>
         <w:numPr>
           <w:ilvl w:val="0"/>
-          <w:numId w:val="1022"/>
+          <w:numId w:val="1023"/>
         </w:numPr>
         <w:pStyle w:val="Compact"/>
       </w:pPr>
@@ -2409,8 +2452,8 @@
         <w:t xml:space="preserve">) con un ejemplo, y cada tipo de flecha (herencia, implementación, composición, agregación y asociación).</w:t>
       </w:r>
     </w:p>
-    <w:bookmarkEnd w:id="41"/>
-    <w:bookmarkStart w:id="42" w:name="X861f067dae0e8a264748fdbddc6a638f1e0d1d0"/>
+    <w:bookmarkEnd w:id="42"/>
+    <w:bookmarkStart w:id="43" w:name="X861f067dae0e8a264748fdbddc6a638f1e0d1d0"/>
     <w:p>
       <w:pPr>
         <w:pStyle w:val="Heading3"/>
@@ -2432,7 +2475,7 @@
       <w:pPr>
         <w:numPr>
           <w:ilvl w:val="0"/>
-          <w:numId w:val="1023"/>
+          <w:numId w:val="1024"/>
         </w:numPr>
         <w:pStyle w:val="Compact"/>
       </w:pPr>
@@ -2444,7 +2487,7 @@
       <w:pPr>
         <w:numPr>
           <w:ilvl w:val="0"/>
-          <w:numId w:val="1023"/>
+          <w:numId w:val="1024"/>
         </w:numPr>
         <w:pStyle w:val="Compact"/>
       </w:pPr>
@@ -2491,9 +2534,9 @@
         <w:t xml:space="preserve">.</w:t>
       </w:r>
     </w:p>
-    <w:bookmarkEnd w:id="42"/>
     <w:bookmarkEnd w:id="43"/>
-    <w:bookmarkStart w:id="45" w:name="historias-de-usuario-word-aparte"/>
+    <w:bookmarkEnd w:id="44"/>
+    <w:bookmarkStart w:id="47" w:name="historias-de-usuario-word-aparte"/>
     <w:p>
       <w:pPr>
         <w:pStyle w:val="Heading2"/>
@@ -2502,12 +2545,43 @@
         <w:t xml:space="preserve">Historias de usuario (Word aparte)</w:t>
       </w:r>
     </w:p>
-    <w:bookmarkStart w:id="44" w:name="Xe7240de9be5baf05b0d81e6c0c0e2d6d32324b3"/>
+    <w:bookmarkStart w:id="45" w:name="X1e92d85a3d5cdcebeb4530033ff4bc73fae25a4"/>
     <w:p>
       <w:pPr>
         <w:pStyle w:val="Heading3"/>
       </w:pPr>
       <w:r>
+        <w:t xml:space="preserve">Historias de usuario v2 · 2026-10-08 · commit</w:t>
+      </w:r>
+      <w:r>
+        <w:t xml:space="preserve"> </w:t>
+      </w:r>
+      <w:r>
+        <w:rPr>
+          <w:rStyle w:val="VerbatimChar"/>
+        </w:rPr>
+        <w:t xml:space="preserve">bce4e1c</w:t>
+      </w:r>
+    </w:p>
+    <w:p>
+      <w:pPr>
+        <w:numPr>
+          <w:ilvl w:val="0"/>
+          <w:numId w:val="1025"/>
+        </w:numPr>
+        <w:pStyle w:val="Compact"/>
+      </w:pPr>
+      <w:r>
+        <w:t xml:space="preserve">Mismas 12 historias con los 40 escenarios consolidados del documento v13 (máximo 4 por historia).</w:t>
+      </w:r>
+    </w:p>
+    <w:bookmarkEnd w:id="45"/>
+    <w:bookmarkStart w:id="46" w:name="Xe7240de9be5baf05b0d81e6c0c0e2d6d32324b3"/>
+    <w:p>
+      <w:pPr>
+        <w:pStyle w:val="Heading3"/>
+      </w:pPr>
+      <w:r>
         <w:t xml:space="preserve">Historias de usuario v1 · 2026-10-08 · commit</w:t>
       </w:r>
       <w:r>
@@ -2524,7 +2598,7 @@
       <w:pPr>
         <w:numPr>
           <w:ilvl w:val="0"/>
-          <w:numId w:val="1024"/>
+          <w:numId w:val="1026"/>
         </w:numPr>
         <w:pStyle w:val="Compact"/>
       </w:pPr>
@@ -2550,9 +2624,9 @@
         <w:t xml:space="preserve">.</w:t>
       </w:r>
     </w:p>
-    <w:bookmarkEnd w:id="44"/>
-    <w:bookmarkEnd w:id="45"/>
-    <w:bookmarkStart w:id="50" w:name="código"/>
+    <w:bookmarkEnd w:id="46"/>
+    <w:bookmarkEnd w:id="47"/>
+    <w:bookmarkStart w:id="52" w:name="código"/>
     <w:p>
       <w:pPr>
         <w:pStyle w:val="Heading2"/>
@@ -2561,7 +2635,7 @@
         <w:t xml:space="preserve">Código</w:t>
       </w:r>
     </w:p>
-    <w:bookmarkStart w:id="46" w:name="código-v4-2026-10-08-commit-34bfcec"/>
+    <w:bookmarkStart w:id="48" w:name="código-v4-2026-10-08-commit-34bfcec"/>
     <w:p>
       <w:pPr>
         <w:pStyle w:val="Heading3"/>
@@ -2583,7 +2657,7 @@
       <w:pPr>
         <w:numPr>
           <w:ilvl w:val="0"/>
-          <w:numId w:val="1025"/>
+          <w:numId w:val="1027"/>
         </w:numPr>
         <w:pStyle w:val="Compact"/>
       </w:pPr>
@@ -2606,8 +2680,8 @@
         <w:t xml:space="preserve">a la nueva numeración de historias (documento v12).</w:t>
       </w:r>
     </w:p>
-    <w:bookmarkEnd w:id="46"/>
-    <w:bookmarkStart w:id="47" w:name="código-v3-2026-10-08-commit-626c373"/>
+    <w:bookmarkEnd w:id="48"/>
+    <w:bookmarkStart w:id="49" w:name="código-v3-2026-10-08-commit-626c373"/>
     <w:p>
       <w:pPr>
         <w:pStyle w:val="Heading3"/>
@@ -2629,7 +2703,7 @@
       <w:pPr>
         <w:numPr>
           <w:ilvl w:val="0"/>
-          <w:numId w:val="1026"/>
+          <w:numId w:val="1028"/>
         </w:numPr>
         <w:pStyle w:val="Compact"/>
       </w:pPr>
@@ -2710,7 +2784,7 @@
       <w:pPr>
         <w:numPr>
           <w:ilvl w:val="0"/>
-          <w:numId w:val="1026"/>
+          <w:numId w:val="1028"/>
         </w:numPr>
         <w:pStyle w:val="Compact"/>
       </w:pPr>
@@ -2755,7 +2829,7 @@
       <w:pPr>
         <w:numPr>
           <w:ilvl w:val="0"/>
-          <w:numId w:val="1026"/>
+          <w:numId w:val="1028"/>
         </w:numPr>
         <w:pStyle w:val="Compact"/>
       </w:pPr>
@@ -2808,8 +2882,8 @@
         <w:t xml:space="preserve">da la primera y la última factura.</w:t>
       </w:r>
     </w:p>
-    <w:bookmarkEnd w:id="47"/>
-    <w:bookmarkStart w:id="48" w:name="código-v2-2026-10-08-commit-99f55d4"/>
+    <w:bookmarkEnd w:id="49"/>
+    <w:bookmarkStart w:id="50" w:name="código-v2-2026-10-08-commit-99f55d4"/>
     <w:p>
       <w:pPr>
         <w:pStyle w:val="Heading3"/>
@@ -2831,7 +2905,7 @@
       <w:pPr>
         <w:numPr>
           <w:ilvl w:val="0"/>
-          <w:numId w:val="1027"/>
+          <w:numId w:val="1029"/>
         </w:numPr>
         <w:pStyle w:val="Compact"/>
       </w:pPr>
@@ -2909,7 +2983,7 @@
       <w:pPr>
         <w:numPr>
           <w:ilvl w:val="0"/>
-          <w:numId w:val="1027"/>
+          <w:numId w:val="1029"/>
         </w:numPr>
         <w:pStyle w:val="Compact"/>
       </w:pPr>
@@ -2932,8 +3006,8 @@
         <w:t xml:space="preserve">muestra la regla: un cliente con facturas se desactiva y uno sin facturas se elimina.</w:t>
       </w:r>
     </w:p>
-    <w:bookmarkEnd w:id="48"/>
-    <w:bookmarkStart w:id="49" w:name="código-v1-2026-10-08-commit-442187a"/>
+    <w:bookmarkEnd w:id="50"/>
+    <w:bookmarkStart w:id="51" w:name="código-v1-2026-10-08-commit-442187a"/>
     <w:p>
       <w:pPr>
         <w:pStyle w:val="Heading3"/>
@@ -2955,7 +3029,7 @@
       <w:pPr>
         <w:numPr>
           <w:ilvl w:val="0"/>
-          <w:numId w:val="1028"/>
+          <w:numId w:val="1030"/>
         </w:numPr>
         <w:pStyle w:val="Compact"/>
       </w:pPr>
@@ -2982,7 +3056,7 @@
       <w:pPr>
         <w:numPr>
           <w:ilvl w:val="0"/>
-          <w:numId w:val="1028"/>
+          <w:numId w:val="1030"/>
         </w:numPr>
         <w:pStyle w:val="Compact"/>
       </w:pPr>
@@ -3003,7 +3077,7 @@
       <w:pPr>
         <w:numPr>
           <w:ilvl w:val="0"/>
-          <w:numId w:val="1028"/>
+          <w:numId w:val="1030"/>
         </w:numPr>
         <w:pStyle w:val="Compact"/>
       </w:pPr>
@@ -3011,9 +3085,9 @@
         <w:t xml:space="preserve">Código de referencia para entender el diseño; no es un entregable.</w:t>
       </w:r>
     </w:p>
-    <w:bookmarkEnd w:id="49"/>
-    <w:bookmarkEnd w:id="50"/>
     <w:bookmarkEnd w:id="51"/>
+    <w:bookmarkEnd w:id="52"/>
+    <w:bookmarkEnd w:id="53"/>
     <w:sectPr>
       <w:pgSz w:w="12240" w:h="15840"/>
       <w:pgMar w:left="1134" w:right="1134"/>
@@ -3286,6 +3360,12 @@
   <w:num w:numId="1028">
     <w:abstractNumId w:val="991"/>
   </w:num>
+  <w:num w:numId="1029">
+    <w:abstractNumId w:val="991"/>
+  </w:num>
+  <w:num w:numId="1030">
+    <w:abstractNumId w:val="991"/>
+  </w:num>
 </w:numbering>
 </file>
 
@@ -3297,7 +3377,7 @@
         <w:rFonts w:asciiTheme="minorHAnsi" w:cstheme="minorBidi" w:eastAsiaTheme="minorHAnsi" w:hAnsiTheme="minorHAnsi"/>
         <w:sz w:val="24"/>
         <w:szCs w:val="24"/>
-        <w:lang w:bidi="ar-SA" w:eastAsia="en-US" w:val="es"/>
+        <w:lang w:bidi="ar-SA" w:eastAsia="en-US" w:val="en-US"/>
       </w:rPr>
     </w:rPrDefault>
     <w:pPrDefault>

</xml_diff>

<commit_message>
CHANGELOG: diagrama simplificado v5, documento v14 y clases v7
Co-Authored-By: Claude Opus 5.5 (1M context) <noreply@anthropic.com>
Claude-Session: https://claude.ai/code/session_01VkQm5RLcZiQMKLCS3EK3og
</commit_message>
<xml_diff>
--- a/docs/Historial_de_versiones.docx
+++ b/docs/Historial_de_versiones.docx
@@ -2,7 +2,7 @@
 <file path=word/document.xml><?xml version="1.0" encoding="utf-8"?>
 <w:document xmlns:w="http://schemas.openxmlformats.org/wordprocessingml/2006/main" xmlns:m="http://schemas.openxmlformats.org/officeDocument/2006/math" xmlns:r="http://schemas.openxmlformats.org/officeDocument/2006/relationships" xmlns:o="urn:schemas-microsoft-com:office:office" xmlns:v="urn:schemas-microsoft-com:vml" xmlns:w10="urn:schemas-microsoft-com:office:word" xmlns:a="http://schemas.openxmlformats.org/drawingml/2006/main" xmlns:pic="http://schemas.openxmlformats.org/drawingml/2006/picture" xmlns:wp="http://schemas.openxmlformats.org/drawingml/2006/wordprocessingDrawing">
   <w:body>
-    <w:bookmarkStart w:id="53" w:name="historial-de-versiones"/>
+    <w:bookmarkStart w:id="56" w:name="historial-de-versiones"/>
     <w:p>
       <w:pPr>
         <w:pStyle w:val="Heading1"/>
@@ -153,7 +153,7 @@
         <w:t xml:space="preserve">.</w:t>
       </w:r>
     </w:p>
-    <w:bookmarkStart w:id="33" w:name="documento-de-diseño"/>
+    <w:bookmarkStart w:id="34" w:name="documento-de-diseño"/>
     <w:p>
       <w:pPr>
         <w:pStyle w:val="Heading2"/>
@@ -162,12 +162,43 @@
         <w:t xml:space="preserve">Documento de diseño</w:t>
       </w:r>
     </w:p>
-    <w:bookmarkStart w:id="20" w:name="documento-v13-2026-10-08-commit-bce4e1c"/>
+    <w:bookmarkStart w:id="20" w:name="documento-v14-2026-10-09-commit-360c024"/>
     <w:p>
       <w:pPr>
         <w:pStyle w:val="Heading3"/>
       </w:pPr>
       <w:r>
+        <w:t xml:space="preserve">Documento v14 · 2026-10-09 · commit</w:t>
+      </w:r>
+      <w:r>
+        <w:t xml:space="preserve"> </w:t>
+      </w:r>
+      <w:r>
+        <w:rPr>
+          <w:rStyle w:val="VerbatimChar"/>
+        </w:rPr>
+        <w:t xml:space="preserve">360c024</w:t>
+      </w:r>
+    </w:p>
+    <w:p>
+      <w:pPr>
+        <w:numPr>
+          <w:ilvl w:val="0"/>
+          <w:numId w:val="1002"/>
+        </w:numPr>
+        <w:pStyle w:val="Compact"/>
+      </w:pPr>
+      <w:r>
+        <w:t xml:space="preserve">La vista general del diagrama de clases (sección 4.1) usa el diagrama simplificado v5, más fácil de leer, y el texto explica cómo leerlo.</w:t>
+      </w:r>
+    </w:p>
+    <w:bookmarkEnd w:id="20"/>
+    <w:bookmarkStart w:id="21" w:name="documento-v13-2026-10-08-commit-bce4e1c"/>
+    <w:p>
+      <w:pPr>
+        <w:pStyle w:val="Heading3"/>
+      </w:pPr>
+      <w:r>
         <w:t xml:space="preserve">Documento v13 · 2026-10-08 · commit</w:t>
       </w:r>
       <w:r>
@@ -184,7 +215,7 @@
       <w:pPr>
         <w:numPr>
           <w:ilvl w:val="0"/>
-          <w:numId w:val="1002"/>
+          <w:numId w:val="1003"/>
         </w:numPr>
         <w:pStyle w:val="Compact"/>
       </w:pPr>
@@ -196,7 +227,7 @@
       <w:pPr>
         <w:numPr>
           <w:ilvl w:val="0"/>
-          <w:numId w:val="1002"/>
+          <w:numId w:val="1003"/>
         </w:numPr>
         <w:pStyle w:val="Compact"/>
       </w:pPr>
@@ -204,8 +235,8 @@
         <w:t xml:space="preserve">Escenarios por historia: HU 1 a HU 3, 4 cada una; HU 4, 3; HU 5, 4; HU 6, 3; HU 7, 2; HU 8, 4; HU 9 y HU 10, 2 cada una; HU 11 y HU 12, 4 cada una.</w:t>
       </w:r>
     </w:p>
-    <w:bookmarkEnd w:id="20"/>
-    <w:bookmarkStart w:id="21" w:name="documento-v12-2026-10-08-commit-34bfcec"/>
+    <w:bookmarkEnd w:id="21"/>
+    <w:bookmarkStart w:id="22" w:name="documento-v12-2026-10-08-commit-34bfcec"/>
     <w:p>
       <w:pPr>
         <w:pStyle w:val="Heading3"/>
@@ -227,7 +258,7 @@
       <w:pPr>
         <w:numPr>
           <w:ilvl w:val="0"/>
-          <w:numId w:val="1003"/>
+          <w:numId w:val="1004"/>
         </w:numPr>
         <w:pStyle w:val="Compact"/>
       </w:pPr>
@@ -239,7 +270,7 @@
       <w:pPr>
         <w:numPr>
           <w:ilvl w:val="0"/>
-          <w:numId w:val="1003"/>
+          <w:numId w:val="1004"/>
         </w:numPr>
         <w:pStyle w:val="Compact"/>
       </w:pPr>
@@ -251,7 +282,7 @@
       <w:pPr>
         <w:numPr>
           <w:ilvl w:val="0"/>
-          <w:numId w:val="1003"/>
+          <w:numId w:val="1004"/>
         </w:numPr>
         <w:pStyle w:val="Compact"/>
       </w:pPr>
@@ -259,8 +290,8 @@
         <w:t xml:space="preserve">Se renumeran las referencias en la guía del inicio, los requerimientos, los bocetos, la trazabilidad y el resumen de historias.</w:t>
       </w:r>
     </w:p>
-    <w:bookmarkEnd w:id="21"/>
-    <w:bookmarkStart w:id="22" w:name="documento-v11-2026-10-08-commit-156cbdf"/>
+    <w:bookmarkEnd w:id="22"/>
+    <w:bookmarkStart w:id="23" w:name="documento-v11-2026-10-08-commit-156cbdf"/>
     <w:p>
       <w:pPr>
         <w:pStyle w:val="Heading3"/>
@@ -282,7 +313,7 @@
       <w:pPr>
         <w:numPr>
           <w:ilvl w:val="0"/>
-          <w:numId w:val="1004"/>
+          <w:numId w:val="1005"/>
         </w:numPr>
         <w:pStyle w:val="Compact"/>
       </w:pPr>
@@ -303,7 +334,7 @@
       <w:pPr>
         <w:numPr>
           <w:ilvl w:val="0"/>
-          <w:numId w:val="1004"/>
+          <w:numId w:val="1005"/>
         </w:numPr>
         <w:pStyle w:val="Compact"/>
       </w:pPr>
@@ -315,7 +346,7 @@
       <w:pPr>
         <w:numPr>
           <w:ilvl w:val="0"/>
-          <w:numId w:val="1004"/>
+          <w:numId w:val="1005"/>
         </w:numPr>
         <w:pStyle w:val="Compact"/>
       </w:pPr>
@@ -327,7 +358,7 @@
       <w:pPr>
         <w:numPr>
           <w:ilvl w:val="0"/>
-          <w:numId w:val="1004"/>
+          <w:numId w:val="1005"/>
         </w:numPr>
         <w:pStyle w:val="Compact"/>
       </w:pPr>
@@ -366,7 +397,7 @@
       <w:pPr>
         <w:numPr>
           <w:ilvl w:val="0"/>
-          <w:numId w:val="1004"/>
+          <w:numId w:val="1005"/>
         </w:numPr>
         <w:pStyle w:val="Compact"/>
       </w:pPr>
@@ -374,8 +405,8 @@
         <w:t xml:space="preserve">Columnas de la tabla de historias ajustadas al nuevo ancho para que no se corten palabras.</w:t>
       </w:r>
     </w:p>
-    <w:bookmarkEnd w:id="22"/>
-    <w:bookmarkStart w:id="23" w:name="documento-v10-2026-10-08-commit-fee9361"/>
+    <w:bookmarkEnd w:id="23"/>
+    <w:bookmarkStart w:id="24" w:name="documento-v10-2026-10-08-commit-fee9361"/>
     <w:p>
       <w:pPr>
         <w:pStyle w:val="Heading3"/>
@@ -397,7 +428,7 @@
       <w:pPr>
         <w:numPr>
           <w:ilvl w:val="0"/>
-          <w:numId w:val="1005"/>
+          <w:numId w:val="1006"/>
         </w:numPr>
         <w:pStyle w:val="Compact"/>
       </w:pPr>
@@ -425,7 +456,7 @@
       <w:pPr>
         <w:numPr>
           <w:ilvl w:val="0"/>
-          <w:numId w:val="1005"/>
+          <w:numId w:val="1006"/>
         </w:numPr>
         <w:pStyle w:val="Compact"/>
       </w:pPr>
@@ -437,7 +468,7 @@
       <w:pPr>
         <w:numPr>
           <w:ilvl w:val="0"/>
-          <w:numId w:val="1005"/>
+          <w:numId w:val="1006"/>
         </w:numPr>
         <w:pStyle w:val="Compact"/>
       </w:pPr>
@@ -445,8 +476,8 @@
         <w:t xml:space="preserve">Las imágenes grandes se limitan a 20,5 cm de alto para que el título y el pie de figura queden en la misma página.</w:t>
       </w:r>
     </w:p>
-    <w:bookmarkEnd w:id="23"/>
-    <w:bookmarkStart w:id="24" w:name="documento-v9-2026-10-08-commit-5400cea"/>
+    <w:bookmarkEnd w:id="24"/>
+    <w:bookmarkStart w:id="25" w:name="documento-v9-2026-10-08-commit-5400cea"/>
     <w:p>
       <w:pPr>
         <w:pStyle w:val="Heading3"/>
@@ -468,7 +499,7 @@
       <w:pPr>
         <w:numPr>
           <w:ilvl w:val="0"/>
-          <w:numId w:val="1006"/>
+          <w:numId w:val="1007"/>
         </w:numPr>
         <w:pStyle w:val="Compact"/>
       </w:pPr>
@@ -543,7 +574,7 @@
       <w:pPr>
         <w:numPr>
           <w:ilvl w:val="0"/>
-          <w:numId w:val="1006"/>
+          <w:numId w:val="1007"/>
         </w:numPr>
         <w:pStyle w:val="Compact"/>
       </w:pPr>
@@ -578,8 +609,8 @@
         <w:t xml:space="preserve">, por qué todas las colecciones son genéricas (no hace falta cast).</w:t>
       </w:r>
     </w:p>
-    <w:bookmarkEnd w:id="24"/>
-    <w:bookmarkStart w:id="25" w:name="documento-v8-2026-10-08-commit-626c373"/>
+    <w:bookmarkEnd w:id="25"/>
+    <w:bookmarkStart w:id="26" w:name="documento-v8-2026-10-08-commit-626c373"/>
     <w:p>
       <w:pPr>
         <w:pStyle w:val="Heading3"/>
@@ -601,7 +632,7 @@
       <w:pPr>
         <w:numPr>
           <w:ilvl w:val="0"/>
-          <w:numId w:val="1007"/>
+          <w:numId w:val="1008"/>
         </w:numPr>
         <w:pStyle w:val="Compact"/>
       </w:pPr>
@@ -670,7 +701,7 @@
       <w:pPr>
         <w:numPr>
           <w:ilvl w:val="0"/>
-          <w:numId w:val="1007"/>
+          <w:numId w:val="1008"/>
         </w:numPr>
         <w:pStyle w:val="Compact"/>
       </w:pPr>
@@ -691,7 +722,7 @@
       <w:pPr>
         <w:numPr>
           <w:ilvl w:val="0"/>
-          <w:numId w:val="1007"/>
+          <w:numId w:val="1008"/>
         </w:numPr>
         <w:pStyle w:val="Compact"/>
       </w:pPr>
@@ -727,7 +758,7 @@
       <w:pPr>
         <w:numPr>
           <w:ilvl w:val="0"/>
-          <w:numId w:val="1007"/>
+          <w:numId w:val="1008"/>
         </w:numPr>
         <w:pStyle w:val="Compact"/>
       </w:pPr>
@@ -772,7 +803,7 @@
       <w:pPr>
         <w:numPr>
           <w:ilvl w:val="0"/>
-          <w:numId w:val="1007"/>
+          <w:numId w:val="1008"/>
         </w:numPr>
         <w:pStyle w:val="Compact"/>
       </w:pPr>
@@ -805,7 +836,7 @@
       <w:pPr>
         <w:numPr>
           <w:ilvl w:val="0"/>
-          <w:numId w:val="1007"/>
+          <w:numId w:val="1008"/>
         </w:numPr>
         <w:pStyle w:val="Compact"/>
       </w:pPr>
@@ -841,7 +872,7 @@
       <w:pPr>
         <w:numPr>
           <w:ilvl w:val="0"/>
-          <w:numId w:val="1007"/>
+          <w:numId w:val="1008"/>
         </w:numPr>
         <w:pStyle w:val="Compact"/>
       </w:pPr>
@@ -849,8 +880,8 @@
         <w:t xml:space="preserve">Nueva tabla «Colecciones: cuál se usa y por qué» al final de la sección 4.2 y fila de colecciones en la tabla de conceptos del curso.</w:t>
       </w:r>
     </w:p>
-    <w:bookmarkEnd w:id="25"/>
-    <w:bookmarkStart w:id="26" w:name="documento-v7-2026-10-08-commit-047b31c"/>
+    <w:bookmarkEnd w:id="26"/>
+    <w:bookmarkStart w:id="27" w:name="documento-v7-2026-10-08-commit-047b31c"/>
     <w:p>
       <w:pPr>
         <w:pStyle w:val="Heading3"/>
@@ -872,7 +903,7 @@
       <w:pPr>
         <w:numPr>
           <w:ilvl w:val="0"/>
-          <w:numId w:val="1008"/>
+          <w:numId w:val="1009"/>
         </w:numPr>
         <w:pStyle w:val="Compact"/>
       </w:pPr>
@@ -884,7 +915,7 @@
       <w:pPr>
         <w:numPr>
           <w:ilvl w:val="0"/>
-          <w:numId w:val="1008"/>
+          <w:numId w:val="1009"/>
         </w:numPr>
         <w:pStyle w:val="Compact"/>
       </w:pPr>
@@ -896,7 +927,7 @@
       <w:pPr>
         <w:numPr>
           <w:ilvl w:val="0"/>
-          <w:numId w:val="1008"/>
+          <w:numId w:val="1009"/>
         </w:numPr>
         <w:pStyle w:val="Compact"/>
       </w:pPr>
@@ -908,7 +939,7 @@
       <w:pPr>
         <w:numPr>
           <w:ilvl w:val="0"/>
-          <w:numId w:val="1008"/>
+          <w:numId w:val="1009"/>
         </w:numPr>
         <w:pStyle w:val="Compact"/>
       </w:pPr>
@@ -938,7 +969,7 @@
       <w:pPr>
         <w:numPr>
           <w:ilvl w:val="0"/>
-          <w:numId w:val="1008"/>
+          <w:numId w:val="1009"/>
         </w:numPr>
         <w:pStyle w:val="Compact"/>
       </w:pPr>
@@ -946,8 +977,8 @@
         <w:t xml:space="preserve">El nombre del profesor (Mario Alberto Vargas Montes) queda en la portada.</w:t>
       </w:r>
     </w:p>
-    <w:bookmarkEnd w:id="26"/>
-    <w:bookmarkStart w:id="27" w:name="documento-v6-2026-10-08-commit-99f55d4"/>
+    <w:bookmarkEnd w:id="27"/>
+    <w:bookmarkStart w:id="28" w:name="documento-v6-2026-10-08-commit-99f55d4"/>
     <w:p>
       <w:pPr>
         <w:pStyle w:val="Heading3"/>
@@ -969,7 +1000,7 @@
       <w:pPr>
         <w:numPr>
           <w:ilvl w:val="0"/>
-          <w:numId w:val="1009"/>
+          <w:numId w:val="1010"/>
         </w:numPr>
         <w:pStyle w:val="Compact"/>
       </w:pPr>
@@ -981,7 +1012,7 @@
       <w:pPr>
         <w:numPr>
           <w:ilvl w:val="0"/>
-          <w:numId w:val="1009"/>
+          <w:numId w:val="1010"/>
         </w:numPr>
         <w:pStyle w:val="Compact"/>
       </w:pPr>
@@ -993,7 +1024,7 @@
       <w:pPr>
         <w:numPr>
           <w:ilvl w:val="0"/>
-          <w:numId w:val="1009"/>
+          <w:numId w:val="1010"/>
         </w:numPr>
         <w:pStyle w:val="Compact"/>
       </w:pPr>
@@ -1050,7 +1081,7 @@
       <w:pPr>
         <w:numPr>
           <w:ilvl w:val="0"/>
-          <w:numId w:val="1009"/>
+          <w:numId w:val="1010"/>
         </w:numPr>
         <w:pStyle w:val="Compact"/>
       </w:pPr>
@@ -1071,7 +1102,7 @@
       <w:pPr>
         <w:numPr>
           <w:ilvl w:val="0"/>
-          <w:numId w:val="1009"/>
+          <w:numId w:val="1010"/>
         </w:numPr>
         <w:pStyle w:val="Compact"/>
       </w:pPr>
@@ -1083,7 +1114,7 @@
       <w:pPr>
         <w:numPr>
           <w:ilvl w:val="0"/>
-          <w:numId w:val="1009"/>
+          <w:numId w:val="1010"/>
         </w:numPr>
         <w:pStyle w:val="Compact"/>
       </w:pPr>
@@ -1095,7 +1126,7 @@
       <w:pPr>
         <w:numPr>
           <w:ilvl w:val="0"/>
-          <w:numId w:val="1009"/>
+          <w:numId w:val="1010"/>
         </w:numPr>
         <w:pStyle w:val="Compact"/>
       </w:pPr>
@@ -1103,8 +1134,8 @@
         <w:t xml:space="preserve">Requerimientos no funcionales de pantallas, sockets, concurrencia y base de datos ajustados.</w:t>
       </w:r>
     </w:p>
-    <w:bookmarkEnd w:id="27"/>
-    <w:bookmarkStart w:id="28" w:name="documento-v5-2026-10-08-commit-9a7a9a7"/>
+    <w:bookmarkEnd w:id="28"/>
+    <w:bookmarkStart w:id="29" w:name="documento-v5-2026-10-08-commit-9a7a9a7"/>
     <w:p>
       <w:pPr>
         <w:pStyle w:val="Heading3"/>
@@ -1126,7 +1157,7 @@
       <w:pPr>
         <w:numPr>
           <w:ilvl w:val="0"/>
-          <w:numId w:val="1010"/>
+          <w:numId w:val="1011"/>
         </w:numPr>
         <w:pStyle w:val="Compact"/>
       </w:pPr>
@@ -1170,7 +1201,7 @@
       <w:pPr>
         <w:numPr>
           <w:ilvl w:val="0"/>
-          <w:numId w:val="1010"/>
+          <w:numId w:val="1011"/>
         </w:numPr>
         <w:pStyle w:val="Compact"/>
       </w:pPr>
@@ -1182,7 +1213,7 @@
       <w:pPr>
         <w:numPr>
           <w:ilvl w:val="0"/>
-          <w:numId w:val="1010"/>
+          <w:numId w:val="1011"/>
         </w:numPr>
         <w:pStyle w:val="Compact"/>
       </w:pPr>
@@ -1194,7 +1225,7 @@
       <w:pPr>
         <w:numPr>
           <w:ilvl w:val="0"/>
-          <w:numId w:val="1010"/>
+          <w:numId w:val="1011"/>
         </w:numPr>
         <w:pStyle w:val="Compact"/>
       </w:pPr>
@@ -1214,8 +1245,8 @@
         <w:t xml:space="preserve">.</w:t>
       </w:r>
     </w:p>
-    <w:bookmarkEnd w:id="28"/>
-    <w:bookmarkStart w:id="29" w:name="documento-v4-2026-10-08-commit-b3e7477"/>
+    <w:bookmarkEnd w:id="29"/>
+    <w:bookmarkStart w:id="30" w:name="documento-v4-2026-10-08-commit-b3e7477"/>
     <w:p>
       <w:pPr>
         <w:pStyle w:val="Heading3"/>
@@ -1237,7 +1268,7 @@
       <w:pPr>
         <w:numPr>
           <w:ilvl w:val="0"/>
-          <w:numId w:val="1011"/>
+          <w:numId w:val="1012"/>
         </w:numPr>
         <w:pStyle w:val="Compact"/>
       </w:pPr>
@@ -1249,7 +1280,7 @@
       <w:pPr>
         <w:numPr>
           <w:ilvl w:val="0"/>
-          <w:numId w:val="1011"/>
+          <w:numId w:val="1012"/>
         </w:numPr>
         <w:pStyle w:val="Compact"/>
       </w:pPr>
@@ -1261,7 +1292,7 @@
       <w:pPr>
         <w:numPr>
           <w:ilvl w:val="0"/>
-          <w:numId w:val="1011"/>
+          <w:numId w:val="1012"/>
         </w:numPr>
         <w:pStyle w:val="Compact"/>
       </w:pPr>
@@ -1273,7 +1304,7 @@
       <w:pPr>
         <w:numPr>
           <w:ilvl w:val="0"/>
-          <w:numId w:val="1011"/>
+          <w:numId w:val="1012"/>
         </w:numPr>
         <w:pStyle w:val="Compact"/>
       </w:pPr>
@@ -1308,8 +1339,8 @@
         <w:t xml:space="preserve">.</w:t>
       </w:r>
     </w:p>
-    <w:bookmarkEnd w:id="29"/>
-    <w:bookmarkStart w:id="30" w:name="documento-v3-2026-10-08-commit-bf66b07"/>
+    <w:bookmarkEnd w:id="30"/>
+    <w:bookmarkStart w:id="31" w:name="documento-v3-2026-10-08-commit-bf66b07"/>
     <w:p>
       <w:pPr>
         <w:pStyle w:val="Heading3"/>
@@ -1331,7 +1362,7 @@
       <w:pPr>
         <w:numPr>
           <w:ilvl w:val="0"/>
-          <w:numId w:val="1012"/>
+          <w:numId w:val="1013"/>
         </w:numPr>
         <w:pStyle w:val="Compact"/>
       </w:pPr>
@@ -1343,7 +1374,7 @@
       <w:pPr>
         <w:numPr>
           <w:ilvl w:val="0"/>
-          <w:numId w:val="1012"/>
+          <w:numId w:val="1013"/>
         </w:numPr>
         <w:pStyle w:val="Compact"/>
       </w:pPr>
@@ -1351,8 +1382,8 @@
         <w:t xml:space="preserve">La versión va en el nombre del archivo y la numeración pasa a v1, v2, v3…</w:t>
       </w:r>
     </w:p>
-    <w:bookmarkEnd w:id="30"/>
-    <w:bookmarkStart w:id="31" w:name="documento-v2-2026-10-08-commit-07de778"/>
+    <w:bookmarkEnd w:id="31"/>
+    <w:bookmarkStart w:id="32" w:name="documento-v2-2026-10-08-commit-07de778"/>
     <w:p>
       <w:pPr>
         <w:pStyle w:val="Heading3"/>
@@ -1374,7 +1405,7 @@
       <w:pPr>
         <w:numPr>
           <w:ilvl w:val="0"/>
-          <w:numId w:val="1013"/>
+          <w:numId w:val="1014"/>
         </w:numPr>
         <w:pStyle w:val="Compact"/>
       </w:pPr>
@@ -1587,7 +1618,7 @@
       <w:pPr>
         <w:numPr>
           <w:ilvl w:val="0"/>
-          <w:numId w:val="1013"/>
+          <w:numId w:val="1014"/>
         </w:numPr>
         <w:pStyle w:val="Compact"/>
       </w:pPr>
@@ -1599,7 +1630,7 @@
       <w:pPr>
         <w:numPr>
           <w:ilvl w:val="0"/>
-          <w:numId w:val="1013"/>
+          <w:numId w:val="1014"/>
         </w:numPr>
         <w:pStyle w:val="Compact"/>
       </w:pPr>
@@ -1611,7 +1642,7 @@
       <w:pPr>
         <w:numPr>
           <w:ilvl w:val="0"/>
-          <w:numId w:val="1013"/>
+          <w:numId w:val="1014"/>
         </w:numPr>
         <w:pStyle w:val="Compact"/>
       </w:pPr>
@@ -1638,7 +1669,7 @@
       <w:pPr>
         <w:numPr>
           <w:ilvl w:val="0"/>
-          <w:numId w:val="1013"/>
+          <w:numId w:val="1014"/>
         </w:numPr>
         <w:pStyle w:val="Compact"/>
       </w:pPr>
@@ -1650,7 +1681,7 @@
       <w:pPr>
         <w:numPr>
           <w:ilvl w:val="0"/>
-          <w:numId w:val="1013"/>
+          <w:numId w:val="1014"/>
         </w:numPr>
         <w:pStyle w:val="Compact"/>
       </w:pPr>
@@ -1688,8 +1719,8 @@
         <w:t xml:space="preserve">(el impuesto lo define cada tipo de producto).</w:t>
       </w:r>
     </w:p>
-    <w:bookmarkEnd w:id="31"/>
-    <w:bookmarkStart w:id="32" w:name="documento-v1-2026-10-06-commit-9be1af4"/>
+    <w:bookmarkEnd w:id="32"/>
+    <w:bookmarkStart w:id="33" w:name="documento-v1-2026-10-06-commit-9be1af4"/>
     <w:p>
       <w:pPr>
         <w:pStyle w:val="Heading3"/>
@@ -1711,7 +1742,7 @@
       <w:pPr>
         <w:numPr>
           <w:ilvl w:val="0"/>
-          <w:numId w:val="1014"/>
+          <w:numId w:val="1015"/>
         </w:numPr>
         <w:pStyle w:val="Compact"/>
       </w:pPr>
@@ -1719,9 +1750,9 @@
         <w:t xml:space="preserve">Primera versión del documento de diseño del Avance 1 (Proyecto 1, Fidecompro): clases con atributos, métodos y relaciones; 15 historias de usuario; 8 prototipos de pantalla; diagramas de arquitectura, secuencia y navegación.</w:t>
       </w:r>
     </w:p>
-    <w:bookmarkEnd w:id="32"/>
     <w:bookmarkEnd w:id="33"/>
-    <w:bookmarkStart w:id="44" w:name="diagrama-de-clases-word-aparte"/>
+    <w:bookmarkEnd w:id="34"/>
+    <w:bookmarkStart w:id="47" w:name="diagrama-de-clases-word-aparte"/>
     <w:p>
       <w:pPr>
         <w:pStyle w:val="Heading2"/>
@@ -1730,12 +1761,58 @@
         <w:t xml:space="preserve">Diagrama de clases (Word aparte)</w:t>
       </w:r>
     </w:p>
-    <w:bookmarkStart w:id="34" w:name="X5f51fc4b5ffbe090736f81a3b1012c253b30052"/>
+    <w:bookmarkStart w:id="35" w:name="X69580a323b9b3200da981be68b69b1aaaf35160"/>
     <w:p>
       <w:pPr>
         <w:pStyle w:val="Heading3"/>
       </w:pPr>
       <w:r>
+        <w:t xml:space="preserve">Diagrama de clases v7 · 2026-10-09 · commit</w:t>
+      </w:r>
+      <w:r>
+        <w:t xml:space="preserve"> </w:t>
+      </w:r>
+      <w:r>
+        <w:rPr>
+          <w:rStyle w:val="VerbatimChar"/>
+        </w:rPr>
+        <w:t xml:space="preserve">360c024</w:t>
+      </w:r>
+    </w:p>
+    <w:p>
+      <w:pPr>
+        <w:numPr>
+          <w:ilvl w:val="0"/>
+          <w:numId w:val="1016"/>
+        </w:numPr>
+        <w:pStyle w:val="Compact"/>
+      </w:pPr>
+      <w:r>
+        <w:t xml:space="preserve">Misma vista general nueva del documento v14 (diagrama simplificado v5). El</w:t>
+      </w:r>
+      <w:r>
+        <w:t xml:space="preserve"> </w:t>
+      </w:r>
+      <w:r>
+        <w:rPr>
+          <w:rStyle w:val="VerbatimChar"/>
+        </w:rPr>
+        <w:t xml:space="preserve">.drawio</w:t>
+      </w:r>
+      <w:r>
+        <w:t xml:space="preserve"> </w:t>
+      </w:r>
+      <w:r>
+        <w:t xml:space="preserve">completo sigue en v4.</w:t>
+      </w:r>
+    </w:p>
+    <w:bookmarkEnd w:id="35"/>
+    <w:bookmarkStart w:id="36" w:name="X5f51fc4b5ffbe090736f81a3b1012c253b30052"/>
+    <w:p>
+      <w:pPr>
+        <w:pStyle w:val="Heading3"/>
+      </w:pPr>
+      <w:r>
         <w:t xml:space="preserve">Diagrama de clases v6 · 2026-10-08 · commit</w:t>
       </w:r>
       <w:r>
@@ -1752,7 +1829,7 @@
       <w:pPr>
         <w:numPr>
           <w:ilvl w:val="0"/>
-          <w:numId w:val="1015"/>
+          <w:numId w:val="1017"/>
         </w:numPr>
         <w:pStyle w:val="Compact"/>
       </w:pPr>
@@ -1760,8 +1837,8 @@
         <w:t xml:space="preserve">Mismo formato APA 7 que el documento v11.</w:t>
       </w:r>
     </w:p>
-    <w:bookmarkEnd w:id="34"/>
-    <w:bookmarkStart w:id="35" w:name="X10045a7158086462e70fd3a0d9f926166a3c4ea"/>
+    <w:bookmarkEnd w:id="36"/>
+    <w:bookmarkStart w:id="37" w:name="X10045a7158086462e70fd3a0d9f926166a3c4ea"/>
     <w:p>
       <w:pPr>
         <w:pStyle w:val="Heading3"/>
@@ -1783,7 +1860,7 @@
       <w:pPr>
         <w:numPr>
           <w:ilvl w:val="0"/>
-          <w:numId w:val="1016"/>
+          <w:numId w:val="1018"/>
         </w:numPr>
         <w:pStyle w:val="Compact"/>
       </w:pPr>
@@ -1806,8 +1883,8 @@
         <w:t xml:space="preserve">sigue en v4 porque no cambió.</w:t>
       </w:r>
     </w:p>
-    <w:bookmarkEnd w:id="35"/>
-    <w:bookmarkStart w:id="36" w:name="X8b6f1de3ef83515f9063b0f71c4f739b3d8e2c1"/>
+    <w:bookmarkEnd w:id="37"/>
+    <w:bookmarkStart w:id="38" w:name="X8b6f1de3ef83515f9063b0f71c4f739b3d8e2c1"/>
     <w:p>
       <w:pPr>
         <w:pStyle w:val="Heading3"/>
@@ -1829,7 +1906,7 @@
       <w:pPr>
         <w:numPr>
           <w:ilvl w:val="0"/>
-          <w:numId w:val="1017"/>
+          <w:numId w:val="1019"/>
         </w:numPr>
         <w:pStyle w:val="Compact"/>
       </w:pPr>
@@ -1865,7 +1942,7 @@
       <w:pPr>
         <w:numPr>
           <w:ilvl w:val="0"/>
-          <w:numId w:val="1017"/>
+          <w:numId w:val="1019"/>
         </w:numPr>
         <w:pStyle w:val="Compact"/>
       </w:pPr>
@@ -1873,8 +1950,8 @@
         <w:t xml:space="preserve">Contenido: el de las entradas v2 y v3 de abajo (colecciones según su uso y la tabla que cita los ejemplos del profesor). Esos números solo existieron en el repositorio.</w:t>
       </w:r>
     </w:p>
-    <w:bookmarkEnd w:id="36"/>
-    <w:bookmarkStart w:id="37" w:name="X863504495f0c283560039533b96e35d8a8aec92"/>
+    <w:bookmarkEnd w:id="38"/>
+    <w:bookmarkStart w:id="39" w:name="X863504495f0c283560039533b96e35d8a8aec92"/>
     <w:p>
       <w:pPr>
         <w:pStyle w:val="Heading3"/>
@@ -1896,7 +1973,7 @@
       <w:pPr>
         <w:numPr>
           <w:ilvl w:val="0"/>
-          <w:numId w:val="1018"/>
+          <w:numId w:val="1020"/>
         </w:numPr>
         <w:pStyle w:val="Compact"/>
       </w:pPr>
@@ -1919,8 +1996,8 @@
         <w:t xml:space="preserve">sigue en v2 porque los diagramas no cambiaron.</w:t>
       </w:r>
     </w:p>
-    <w:bookmarkEnd w:id="37"/>
-    <w:bookmarkStart w:id="38" w:name="X66fc17acf23d8016d6af910173fecc388667a68"/>
+    <w:bookmarkEnd w:id="39"/>
+    <w:bookmarkStart w:id="40" w:name="X66fc17acf23d8016d6af910173fecc388667a68"/>
     <w:p>
       <w:pPr>
         <w:pStyle w:val="Heading3"/>
@@ -1942,7 +2019,7 @@
       <w:pPr>
         <w:numPr>
           <w:ilvl w:val="0"/>
-          <w:numId w:val="1019"/>
+          <w:numId w:val="1021"/>
         </w:numPr>
         <w:pStyle w:val="Compact"/>
       </w:pPr>
@@ -2020,7 +2097,7 @@
       <w:pPr>
         <w:numPr>
           <w:ilvl w:val="0"/>
-          <w:numId w:val="1019"/>
+          <w:numId w:val="1021"/>
         </w:numPr>
         <w:pStyle w:val="Compact"/>
       </w:pPr>
@@ -2052,8 +2129,8 @@
         <w:t xml:space="preserve">(tres páginas, igual que v1).</w:t>
       </w:r>
     </w:p>
-    <w:bookmarkEnd w:id="38"/>
-    <w:bookmarkStart w:id="39" w:name="Xd9ab462069bc781e05750197a0b9dcc21416b9b"/>
+    <w:bookmarkEnd w:id="40"/>
+    <w:bookmarkStart w:id="41" w:name="Xd9ab462069bc781e05750197a0b9dcc21416b9b"/>
     <w:p>
       <w:pPr>
         <w:pStyle w:val="Heading3"/>
@@ -2075,7 +2152,7 @@
       <w:pPr>
         <w:numPr>
           <w:ilvl w:val="0"/>
-          <w:numId w:val="1020"/>
+          <w:numId w:val="1022"/>
         </w:numPr>
         <w:pStyle w:val="Compact"/>
       </w:pPr>
@@ -2087,7 +2164,7 @@
       <w:pPr>
         <w:numPr>
           <w:ilvl w:val="0"/>
-          <w:numId w:val="1020"/>
+          <w:numId w:val="1022"/>
         </w:numPr>
         <w:pStyle w:val="Compact"/>
       </w:pPr>
@@ -2132,7 +2209,7 @@
       <w:pPr>
         <w:numPr>
           <w:ilvl w:val="0"/>
-          <w:numId w:val="1020"/>
+          <w:numId w:val="1022"/>
         </w:numPr>
         <w:pStyle w:val="Compact"/>
       </w:pPr>
@@ -2176,101 +2253,35 @@
         <w:t xml:space="preserve">desde los diagramas de Mermaid.</w:t>
       </w:r>
     </w:p>
-    <w:bookmarkEnd w:id="39"/>
-    <w:bookmarkStart w:id="40" w:name="X8bff2cc937d55517ed7504f8d852e738002eded"/>
+    <w:bookmarkEnd w:id="41"/>
+    <w:bookmarkStart w:id="42" w:name="X53a1eacf4306f1baf4d20ed5877265beeafb517"/>
     <w:p>
       <w:pPr>
         <w:pStyle w:val="Heading3"/>
       </w:pPr>
       <w:r>
-        <w:t xml:space="preserve">Diagrama de clases simplificado v4 · 2026-10-08 · commit</w:t>
-      </w:r>
-      <w:r>
-        <w:t xml:space="preserve"> </w:t>
-      </w:r>
-      <w:r>
-        <w:rPr>
-          <w:rStyle w:val="VerbatimChar"/>
-        </w:rPr>
-        <w:t xml:space="preserve">626c373</w:t>
-      </w:r>
-    </w:p>
-    <w:p>
-      <w:pPr>
-        <w:numPr>
-          <w:ilvl w:val="0"/>
-          <w:numId w:val="1021"/>
-        </w:numPr>
-        <w:pStyle w:val="Compact"/>
-      </w:pPr>
-      <w:r>
-        <w:t xml:space="preserve">Colecciones declaradas por su interface:</w:t>
-      </w:r>
-      <w:r>
-        <w:t xml:space="preserve"> </w:t>
-      </w:r>
-      <w:r>
-        <w:rPr>
-          <w:rStyle w:val="VerbatimChar"/>
-        </w:rPr>
-        <w:t xml:space="preserve">List&lt;Producto&gt;</w:t>
-      </w:r>
-      <w:r>
-        <w:t xml:space="preserve">,</w:t>
-      </w:r>
-      <w:r>
-        <w:t xml:space="preserve"> </w:t>
-      </w:r>
-      <w:r>
-        <w:rPr>
-          <w:rStyle w:val="VerbatimChar"/>
-        </w:rPr>
-        <w:t xml:space="preserve">List&lt;Categoria&gt;</w:t>
-      </w:r>
-      <w:r>
-        <w:t xml:space="preserve"> </w:t>
-      </w:r>
-      <w:r>
-        <w:t xml:space="preserve">y el atributo</w:t>
-      </w:r>
-      <w:r>
-        <w:t xml:space="preserve"> </w:t>
-      </w:r>
-      <w:r>
-        <w:rPr>
-          <w:rStyle w:val="VerbatimChar"/>
-        </w:rPr>
-        <w:t xml:space="preserve">detalles: List&lt;DetalleFactura&gt;</w:t>
-      </w:r>
-      <w:r>
-        <w:t xml:space="preserve"> </w:t>
-      </w:r>
-      <w:r>
-        <w:t xml:space="preserve">en</w:t>
-      </w:r>
-      <w:r>
-        <w:t xml:space="preserve"> </w:t>
-      </w:r>
-      <w:r>
-        <w:rPr>
-          <w:rStyle w:val="VerbatimChar"/>
-        </w:rPr>
-        <w:t xml:space="preserve">Factura</w:t>
-      </w:r>
-      <w:r>
-        <w:t xml:space="preserve">.</w:t>
-      </w:r>
-    </w:p>
-    <w:p>
-      <w:pPr>
-        <w:numPr>
-          <w:ilvl w:val="0"/>
-          <w:numId w:val="1021"/>
-        </w:numPr>
-        <w:pStyle w:val="Compact"/>
-      </w:pPr>
-      <w:r>
-        <w:t xml:space="preserve">La simbología agrega el apartado</w:t>
+        <w:t xml:space="preserve">Diagrama de clases simplificado v5 · 2026-10-09 · commit</w:t>
+      </w:r>
+      <w:r>
+        <w:t xml:space="preserve"> </w:t>
+      </w:r>
+      <w:r>
+        <w:rPr>
+          <w:rStyle w:val="VerbatimChar"/>
+        </w:rPr>
+        <w:t xml:space="preserve">360c024</w:t>
+      </w:r>
+    </w:p>
+    <w:p>
+      <w:pPr>
+        <w:numPr>
+          <w:ilvl w:val="0"/>
+          <w:numId w:val="1023"/>
+        </w:numPr>
+        <w:pStyle w:val="Compact"/>
+      </w:pPr>
+      <w:r>
+        <w:t xml:space="preserve">Cada tipo de relación tiene su color y una palabra sobre la línea que dice cómo se lee:</w:t>
       </w:r>
       <w:r>
         <w:t xml:space="preserve"> </w:t>
@@ -2280,147 +2291,13 @@
           <w:bCs/>
           <w:b/>
         </w:rPr>
-        <w:t xml:space="preserve">Colecciones</w:t>
-      </w:r>
-      <w:r>
-        <w:t xml:space="preserve">: qué es</w:t>
-      </w:r>
-      <w:r>
-        <w:t xml:space="preserve"> </w:t>
-      </w:r>
-      <w:r>
-        <w:rPr>
-          <w:rStyle w:val="VerbatimChar"/>
-        </w:rPr>
-        <w:t xml:space="preserve">List&lt;Tipo&gt;</w:t>
-      </w:r>
-      <w:r>
-        <w:t xml:space="preserve"> </w:t>
-      </w:r>
-      <w:r>
-        <w:t xml:space="preserve">y que el diagrama completo también usa</w:t>
-      </w:r>
-      <w:r>
-        <w:t xml:space="preserve"> </w:t>
-      </w:r>
-      <w:r>
-        <w:rPr>
-          <w:rStyle w:val="VerbatimChar"/>
-        </w:rPr>
-        <w:t xml:space="preserve">Set</w:t>
-      </w:r>
-      <w:r>
-        <w:t xml:space="preserve"> </w:t>
-      </w:r>
-      <w:r>
-        <w:t xml:space="preserve">y</w:t>
-      </w:r>
-      <w:r>
-        <w:t xml:space="preserve"> </w:t>
-      </w:r>
-      <w:r>
-        <w:rPr>
-          <w:rStyle w:val="VerbatimChar"/>
-        </w:rPr>
-        <w:t xml:space="preserve">Map</w:t>
-      </w:r>
-      <w:r>
-        <w:t xml:space="preserve">/</w:t>
-      </w:r>
-      <w:r>
-        <w:rPr>
-          <w:rStyle w:val="VerbatimChar"/>
-        </w:rPr>
-        <w:t xml:space="preserve">TreeMap</w:t>
-      </w:r>
-      <w:r>
-        <w:t xml:space="preserve">.</w:t>
-      </w:r>
-    </w:p>
-    <w:bookmarkEnd w:id="40"/>
-    <w:bookmarkStart w:id="41" w:name="X391512b3d0076f68eba38bfbe03fbe6da9ec0d0"/>
-    <w:p>
-      <w:pPr>
-        <w:pStyle w:val="Heading3"/>
-      </w:pPr>
-      <w:r>
-        <w:t xml:space="preserve">Diagrama de clases simplificado v3 · 2026-10-08 · commit</w:t>
-      </w:r>
-      <w:r>
-        <w:t xml:space="preserve"> </w:t>
-      </w:r>
-      <w:r>
-        <w:rPr>
-          <w:rStyle w:val="VerbatimChar"/>
-        </w:rPr>
-        <w:t xml:space="preserve">4438bd1</w:t>
-      </w:r>
-    </w:p>
-    <w:p>
-      <w:pPr>
-        <w:numPr>
-          <w:ilvl w:val="0"/>
-          <w:numId w:val="1022"/>
-        </w:numPr>
-        <w:pStyle w:val="Compact"/>
-      </w:pPr>
-      <w:r>
-        <w:t xml:space="preserve">Formato vertical para poner la imagen en una página completa de Word: la simbología pasa debajo del diagrama, en dos columnas, y la imagen queda con la proporción de una página carta con márgenes de 2 cm (ancho/alto = 0,8).</w:t>
-      </w:r>
-    </w:p>
-    <w:p>
-      <w:pPr>
-        <w:numPr>
-          <w:ilvl w:val="0"/>
-          <w:numId w:val="1022"/>
-        </w:numPr>
-        <w:pStyle w:val="Compact"/>
-      </w:pPr>
-      <w:r>
-        <w:t xml:space="preserve">Los métodos muestran solo los tipos de sus parámetros, por ejemplo</w:t>
-      </w:r>
-      <w:r>
-        <w:t xml:space="preserve"> </w:t>
-      </w:r>
-      <w:r>
-        <w:rPr>
-          <w:rStyle w:val="VerbatimChar"/>
-        </w:rPr>
-        <w:t xml:space="preserve">agregarDetalle(Producto, int)</w:t>
-      </w:r>
-      <w:r>
-        <w:t xml:space="preserve">, para que las clases sean más angostas.</w:t>
-      </w:r>
-    </w:p>
-    <w:bookmarkEnd w:id="41"/>
-    <w:bookmarkStart w:id="42" w:name="Xc4a290eef64159bbb850880299580525a5d9206"/>
-    <w:p>
-      <w:pPr>
-        <w:pStyle w:val="Heading3"/>
-      </w:pPr>
-      <w:r>
-        <w:t xml:space="preserve">Diagrama de clases simplificado v2 · 2026-10-08 · commit</w:t>
-      </w:r>
-      <w:r>
-        <w:t xml:space="preserve"> </w:t>
-      </w:r>
-      <w:r>
-        <w:rPr>
-          <w:rStyle w:val="VerbatimChar"/>
-        </w:rPr>
-        <w:t xml:space="preserve">75f343e</w:t>
-      </w:r>
-    </w:p>
-    <w:p>
-      <w:pPr>
-        <w:numPr>
-          <w:ilvl w:val="0"/>
-          <w:numId w:val="1023"/>
-        </w:numPr>
-        <w:pStyle w:val="Compact"/>
-      </w:pPr>
-      <w:r>
-        <w:t xml:space="preserve">Se agrega al lado del diagrama un cuadro de</w:t>
+        <w:t xml:space="preserve">es un</w:t>
+      </w:r>
+      <w:r>
+        <w:t xml:space="preserve"> </w:t>
+      </w:r>
+      <w:r>
+        <w:t xml:space="preserve">(herencia, azul),</w:t>
       </w:r>
       <w:r>
         <w:t xml:space="preserve"> </w:t>
@@ -2430,13 +2307,61 @@
           <w:bCs/>
           <w:b/>
         </w:rPr>
-        <w:t xml:space="preserve">simbología</w:t>
-      </w:r>
-      <w:r>
-        <w:t xml:space="preserve"> </w:t>
-      </w:r>
-      <w:r>
-        <w:t xml:space="preserve">que explica cada símbolo: partes de la clase, visibilidad (+, -, #), subrayado (static), cursiva (abstracto), «abstract» e «interface», multiplicidad (1,</w:t>
+        <w:t xml:space="preserve">implementa</w:t>
+      </w:r>
+      <w:r>
+        <w:t xml:space="preserve"> </w:t>
+      </w:r>
+      <w:r>
+        <w:t xml:space="preserve">(morado, punteada),</w:t>
+      </w:r>
+      <w:r>
+        <w:t xml:space="preserve"> </w:t>
+      </w:r>
+      <w:r>
+        <w:rPr>
+          <w:bCs/>
+          <w:b/>
+        </w:rPr>
+        <w:t xml:space="preserve">contiene</w:t>
+      </w:r>
+      <w:r>
+        <w:t xml:space="preserve"> </w:t>
+      </w:r>
+      <w:r>
+        <w:t xml:space="preserve">(composición, rojo),</w:t>
+      </w:r>
+      <w:r>
+        <w:t xml:space="preserve"> </w:t>
+      </w:r>
+      <w:r>
+        <w:rPr>
+          <w:bCs/>
+          <w:b/>
+        </w:rPr>
+        <w:t xml:space="preserve">agrupa</w:t>
+      </w:r>
+      <w:r>
+        <w:t xml:space="preserve"> </w:t>
+      </w:r>
+      <w:r>
+        <w:t xml:space="preserve">(agregación, verde) y</w:t>
+      </w:r>
+      <w:r>
+        <w:t xml:space="preserve"> </w:t>
+      </w:r>
+      <w:r>
+        <w:rPr>
+          <w:bCs/>
+          <w:b/>
+        </w:rPr>
+        <w:t xml:space="preserve">usa</w:t>
+      </w:r>
+      <w:r>
+        <w:t xml:space="preserve"> </w:t>
+      </w:r>
+      <w:r>
+        <w:t xml:space="preserve">(asociación, naranja; en la factura dice</w:t>
       </w:r>
       <w:r>
         <w:t xml:space="preserve"> </w:t>
@@ -2446,14 +2371,367 @@
           <w:iCs/>
           <w:i/>
         </w:rPr>
+        <w:t xml:space="preserve">tiene cliente</w:t>
+      </w:r>
+      <w:r>
+        <w:t xml:space="preserve">,</w:t>
+      </w:r>
+      <w:r>
+        <w:t xml:space="preserve"> </w:t>
+      </w:r>
+      <w:r>
+        <w:rPr>
+          <w:iCs/>
+          <w:i/>
+        </w:rPr>
+        <w:t xml:space="preserve">tiene vendedor</w:t>
+      </w:r>
+      <w:r>
+        <w:t xml:space="preserve"> </w:t>
+      </w:r>
+      <w:r>
+        <w:t xml:space="preserve">y</w:t>
+      </w:r>
+      <w:r>
+        <w:t xml:space="preserve"> </w:t>
+      </w:r>
+      <w:r>
+        <w:rPr>
+          <w:iCs/>
+          <w:i/>
+        </w:rPr>
+        <w:t xml:space="preserve">producto vendido</w:t>
+      </w:r>
+      <w:r>
+        <w:t xml:space="preserve">).</w:t>
+      </w:r>
+    </w:p>
+    <w:p>
+      <w:pPr>
+        <w:numPr>
+          <w:ilvl w:val="0"/>
+          <w:numId w:val="1023"/>
+        </w:numPr>
+        <w:pStyle w:val="Compact"/>
+      </w:pPr>
+      <w:r>
+        <w:t xml:space="preserve">La multiplicidad se escribe también en palabras:</w:t>
+      </w:r>
+      <w:r>
+        <w:t xml:space="preserve"> </w:t>
+      </w:r>
+      <w:r>
+        <w:rPr>
+          <w:rStyle w:val="VerbatimChar"/>
+        </w:rPr>
+        <w:t xml:space="preserve">* (muchos)</w:t>
+      </w:r>
+      <w:r>
+        <w:t xml:space="preserve">,</w:t>
+      </w:r>
+      <w:r>
+        <w:t xml:space="preserve"> </w:t>
+      </w:r>
+      <w:r>
+        <w:rPr>
+          <w:rStyle w:val="VerbatimChar"/>
+        </w:rPr>
+        <w:t xml:space="preserve">1..* (uno o más)</w:t>
+      </w:r>
+      <w:r>
+        <w:t xml:space="preserve">.</w:t>
+      </w:r>
+    </w:p>
+    <w:p>
+      <w:pPr>
+        <w:numPr>
+          <w:ilvl w:val="0"/>
+          <w:numId w:val="1023"/>
+        </w:numPr>
+        <w:pStyle w:val="Compact"/>
+      </w:pPr>
+      <w:r>
+        <w:t xml:space="preserve">Simbología reordenada: empieza por cómo leer las líneas, con un ejemplo de cada una, y luego los números, las partes de la clase, la visibilidad, las clases especiales y las colecciones. Se quitan los símbolos que este diagrama no usa (subrayado de static, Set y Map).</w:t>
+      </w:r>
+    </w:p>
+    <w:bookmarkEnd w:id="42"/>
+    <w:bookmarkStart w:id="43" w:name="X8bff2cc937d55517ed7504f8d852e738002eded"/>
+    <w:p>
+      <w:pPr>
+        <w:pStyle w:val="Heading3"/>
+      </w:pPr>
+      <w:r>
+        <w:t xml:space="preserve">Diagrama de clases simplificado v4 · 2026-10-08 · commit</w:t>
+      </w:r>
+      <w:r>
+        <w:t xml:space="preserve"> </w:t>
+      </w:r>
+      <w:r>
+        <w:rPr>
+          <w:rStyle w:val="VerbatimChar"/>
+        </w:rPr>
+        <w:t xml:space="preserve">626c373</w:t>
+      </w:r>
+    </w:p>
+    <w:p>
+      <w:pPr>
+        <w:numPr>
+          <w:ilvl w:val="0"/>
+          <w:numId w:val="1024"/>
+        </w:numPr>
+        <w:pStyle w:val="Compact"/>
+      </w:pPr>
+      <w:r>
+        <w:t xml:space="preserve">Colecciones declaradas por su interface:</w:t>
+      </w:r>
+      <w:r>
+        <w:t xml:space="preserve"> </w:t>
+      </w:r>
+      <w:r>
+        <w:rPr>
+          <w:rStyle w:val="VerbatimChar"/>
+        </w:rPr>
+        <w:t xml:space="preserve">List&lt;Producto&gt;</w:t>
+      </w:r>
+      <w:r>
+        <w:t xml:space="preserve">,</w:t>
+      </w:r>
+      <w:r>
+        <w:t xml:space="preserve"> </w:t>
+      </w:r>
+      <w:r>
+        <w:rPr>
+          <w:rStyle w:val="VerbatimChar"/>
+        </w:rPr>
+        <w:t xml:space="preserve">List&lt;Categoria&gt;</w:t>
+      </w:r>
+      <w:r>
+        <w:t xml:space="preserve"> </w:t>
+      </w:r>
+      <w:r>
+        <w:t xml:space="preserve">y el atributo</w:t>
+      </w:r>
+      <w:r>
+        <w:t xml:space="preserve"> </w:t>
+      </w:r>
+      <w:r>
+        <w:rPr>
+          <w:rStyle w:val="VerbatimChar"/>
+        </w:rPr>
+        <w:t xml:space="preserve">detalles: List&lt;DetalleFactura&gt;</w:t>
+      </w:r>
+      <w:r>
+        <w:t xml:space="preserve"> </w:t>
+      </w:r>
+      <w:r>
+        <w:t xml:space="preserve">en</w:t>
+      </w:r>
+      <w:r>
+        <w:t xml:space="preserve"> </w:t>
+      </w:r>
+      <w:r>
+        <w:rPr>
+          <w:rStyle w:val="VerbatimChar"/>
+        </w:rPr>
+        <w:t xml:space="preserve">Factura</w:t>
+      </w:r>
+      <w:r>
+        <w:t xml:space="preserve">.</w:t>
+      </w:r>
+    </w:p>
+    <w:p>
+      <w:pPr>
+        <w:numPr>
+          <w:ilvl w:val="0"/>
+          <w:numId w:val="1024"/>
+        </w:numPr>
+        <w:pStyle w:val="Compact"/>
+      </w:pPr>
+      <w:r>
+        <w:t xml:space="preserve">La simbología agrega el apartado</w:t>
+      </w:r>
+      <w:r>
+        <w:t xml:space="preserve"> </w:t>
+      </w:r>
+      <w:r>
+        <w:rPr>
+          <w:bCs/>
+          <w:b/>
+        </w:rPr>
+        <w:t xml:space="preserve">Colecciones</w:t>
+      </w:r>
+      <w:r>
+        <w:t xml:space="preserve">: qué es</w:t>
+      </w:r>
+      <w:r>
+        <w:t xml:space="preserve"> </w:t>
+      </w:r>
+      <w:r>
+        <w:rPr>
+          <w:rStyle w:val="VerbatimChar"/>
+        </w:rPr>
+        <w:t xml:space="preserve">List&lt;Tipo&gt;</w:t>
+      </w:r>
+      <w:r>
+        <w:t xml:space="preserve"> </w:t>
+      </w:r>
+      <w:r>
+        <w:t xml:space="preserve">y que el diagrama completo también usa</w:t>
+      </w:r>
+      <w:r>
+        <w:t xml:space="preserve"> </w:t>
+      </w:r>
+      <w:r>
+        <w:rPr>
+          <w:rStyle w:val="VerbatimChar"/>
+        </w:rPr>
+        <w:t xml:space="preserve">Set</w:t>
+      </w:r>
+      <w:r>
+        <w:t xml:space="preserve"> </w:t>
+      </w:r>
+      <w:r>
+        <w:t xml:space="preserve">y</w:t>
+      </w:r>
+      <w:r>
+        <w:t xml:space="preserve"> </w:t>
+      </w:r>
+      <w:r>
+        <w:rPr>
+          <w:rStyle w:val="VerbatimChar"/>
+        </w:rPr>
+        <w:t xml:space="preserve">Map</w:t>
+      </w:r>
+      <w:r>
+        <w:t xml:space="preserve">/</w:t>
+      </w:r>
+      <w:r>
+        <w:rPr>
+          <w:rStyle w:val="VerbatimChar"/>
+        </w:rPr>
+        <w:t xml:space="preserve">TreeMap</w:t>
+      </w:r>
+      <w:r>
+        <w:t xml:space="preserve">.</w:t>
+      </w:r>
+    </w:p>
+    <w:bookmarkEnd w:id="43"/>
+    <w:bookmarkStart w:id="44" w:name="X391512b3d0076f68eba38bfbe03fbe6da9ec0d0"/>
+    <w:p>
+      <w:pPr>
+        <w:pStyle w:val="Heading3"/>
+      </w:pPr>
+      <w:r>
+        <w:t xml:space="preserve">Diagrama de clases simplificado v3 · 2026-10-08 · commit</w:t>
+      </w:r>
+      <w:r>
+        <w:t xml:space="preserve"> </w:t>
+      </w:r>
+      <w:r>
+        <w:rPr>
+          <w:rStyle w:val="VerbatimChar"/>
+        </w:rPr>
+        <w:t xml:space="preserve">4438bd1</w:t>
+      </w:r>
+    </w:p>
+    <w:p>
+      <w:pPr>
+        <w:numPr>
+          <w:ilvl w:val="0"/>
+          <w:numId w:val="1025"/>
+        </w:numPr>
+        <w:pStyle w:val="Compact"/>
+      </w:pPr>
+      <w:r>
+        <w:t xml:space="preserve">Formato vertical para poner la imagen en una página completa de Word: la simbología pasa debajo del diagrama, en dos columnas, y la imagen queda con la proporción de una página carta con márgenes de 2 cm (ancho/alto = 0,8).</w:t>
+      </w:r>
+    </w:p>
+    <w:p>
+      <w:pPr>
+        <w:numPr>
+          <w:ilvl w:val="0"/>
+          <w:numId w:val="1025"/>
+        </w:numPr>
+        <w:pStyle w:val="Compact"/>
+      </w:pPr>
+      <w:r>
+        <w:t xml:space="preserve">Los métodos muestran solo los tipos de sus parámetros, por ejemplo</w:t>
+      </w:r>
+      <w:r>
+        <w:t xml:space="preserve"> </w:t>
+      </w:r>
+      <w:r>
+        <w:rPr>
+          <w:rStyle w:val="VerbatimChar"/>
+        </w:rPr>
+        <w:t xml:space="preserve">agregarDetalle(Producto, int)</w:t>
+      </w:r>
+      <w:r>
+        <w:t xml:space="preserve">, para que las clases sean más angostas.</w:t>
+      </w:r>
+    </w:p>
+    <w:bookmarkEnd w:id="44"/>
+    <w:bookmarkStart w:id="45" w:name="Xc4a290eef64159bbb850880299580525a5d9206"/>
+    <w:p>
+      <w:pPr>
+        <w:pStyle w:val="Heading3"/>
+      </w:pPr>
+      <w:r>
+        <w:t xml:space="preserve">Diagrama de clases simplificado v2 · 2026-10-08 · commit</w:t>
+      </w:r>
+      <w:r>
+        <w:t xml:space="preserve"> </w:t>
+      </w:r>
+      <w:r>
+        <w:rPr>
+          <w:rStyle w:val="VerbatimChar"/>
+        </w:rPr>
+        <w:t xml:space="preserve">75f343e</w:t>
+      </w:r>
+    </w:p>
+    <w:p>
+      <w:pPr>
+        <w:numPr>
+          <w:ilvl w:val="0"/>
+          <w:numId w:val="1026"/>
+        </w:numPr>
+        <w:pStyle w:val="Compact"/>
+      </w:pPr>
+      <w:r>
+        <w:t xml:space="preserve">Se agrega al lado del diagrama un cuadro de</w:t>
+      </w:r>
+      <w:r>
+        <w:t xml:space="preserve"> </w:t>
+      </w:r>
+      <w:r>
+        <w:rPr>
+          <w:bCs/>
+          <w:b/>
+        </w:rPr>
+        <w:t xml:space="preserve">simbología</w:t>
+      </w:r>
+      <w:r>
+        <w:t xml:space="preserve"> </w:t>
+      </w:r>
+      <w:r>
+        <w:t xml:space="preserve">que explica cada símbolo: partes de la clase, visibilidad (+, -, #), subrayado (static), cursiva (abstracto), «abstract» e «interface», multiplicidad (1,</w:t>
+      </w:r>
+      <w:r>
+        <w:t xml:space="preserve"> </w:t>
+      </w:r>
+      <w:r>
+        <w:rPr>
+          <w:iCs/>
+          <w:i/>
+        </w:rPr>
         <w:t xml:space="preserve">, 1..</w:t>
       </w:r>
       <w:r>
         <w:t xml:space="preserve">) con un ejemplo, y cada tipo de flecha (herencia, implementación, composición, agregación y asociación).</w:t>
       </w:r>
     </w:p>
-    <w:bookmarkEnd w:id="42"/>
-    <w:bookmarkStart w:id="43" w:name="X861f067dae0e8a264748fdbddc6a638f1e0d1d0"/>
+    <w:bookmarkEnd w:id="45"/>
+    <w:bookmarkStart w:id="46" w:name="X861f067dae0e8a264748fdbddc6a638f1e0d1d0"/>
     <w:p>
       <w:pPr>
         <w:pStyle w:val="Heading3"/>
@@ -2475,7 +2753,7 @@
       <w:pPr>
         <w:numPr>
           <w:ilvl w:val="0"/>
-          <w:numId w:val="1024"/>
+          <w:numId w:val="1027"/>
         </w:numPr>
         <w:pStyle w:val="Compact"/>
       </w:pPr>
@@ -2487,7 +2765,7 @@
       <w:pPr>
         <w:numPr>
           <w:ilvl w:val="0"/>
-          <w:numId w:val="1024"/>
+          <w:numId w:val="1027"/>
         </w:numPr>
         <w:pStyle w:val="Compact"/>
       </w:pPr>
@@ -2529,96 +2807,6 @@
           <w:rStyle w:val="VerbatimChar"/>
         </w:rPr>
         <w:t xml:space="preserve">docs/diagramas/00_clases_simplificado.mmd</w:t>
-      </w:r>
-      <w:r>
-        <w:t xml:space="preserve">.</w:t>
-      </w:r>
-    </w:p>
-    <w:bookmarkEnd w:id="43"/>
-    <w:bookmarkEnd w:id="44"/>
-    <w:bookmarkStart w:id="47" w:name="historias-de-usuario-word-aparte"/>
-    <w:p>
-      <w:pPr>
-        <w:pStyle w:val="Heading2"/>
-      </w:pPr>
-      <w:r>
-        <w:t xml:space="preserve">Historias de usuario (Word aparte)</w:t>
-      </w:r>
-    </w:p>
-    <w:bookmarkStart w:id="45" w:name="X1e92d85a3d5cdcebeb4530033ff4bc73fae25a4"/>
-    <w:p>
-      <w:pPr>
-        <w:pStyle w:val="Heading3"/>
-      </w:pPr>
-      <w:r>
-        <w:t xml:space="preserve">Historias de usuario v2 · 2026-10-08 · commit</w:t>
-      </w:r>
-      <w:r>
-        <w:t xml:space="preserve"> </w:t>
-      </w:r>
-      <w:r>
-        <w:rPr>
-          <w:rStyle w:val="VerbatimChar"/>
-        </w:rPr>
-        <w:t xml:space="preserve">bce4e1c</w:t>
-      </w:r>
-    </w:p>
-    <w:p>
-      <w:pPr>
-        <w:numPr>
-          <w:ilvl w:val="0"/>
-          <w:numId w:val="1025"/>
-        </w:numPr>
-        <w:pStyle w:val="Compact"/>
-      </w:pPr>
-      <w:r>
-        <w:t xml:space="preserve">Mismas 12 historias con los 40 escenarios consolidados del documento v13 (máximo 4 por historia).</w:t>
-      </w:r>
-    </w:p>
-    <w:bookmarkEnd w:id="45"/>
-    <w:bookmarkStart w:id="46" w:name="Xe7240de9be5baf05b0d81e6c0c0e2d6d32324b3"/>
-    <w:p>
-      <w:pPr>
-        <w:pStyle w:val="Heading3"/>
-      </w:pPr>
-      <w:r>
-        <w:t xml:space="preserve">Historias de usuario v1 · 2026-10-08 · commit</w:t>
-      </w:r>
-      <w:r>
-        <w:t xml:space="preserve"> </w:t>
-      </w:r>
-      <w:r>
-        <w:rPr>
-          <w:rStyle w:val="VerbatimChar"/>
-        </w:rPr>
-        <w:t xml:space="preserve">9fae723</w:t>
-      </w:r>
-    </w:p>
-    <w:p>
-      <w:pPr>
-        <w:numPr>
-          <w:ilvl w:val="0"/>
-          <w:numId w:val="1026"/>
-        </w:numPr>
-        <w:pStyle w:val="Compact"/>
-      </w:pPr>
-      <w:r>
-        <w:rPr>
-          <w:rStyle w:val="VerbatimChar"/>
-        </w:rPr>
-        <w:t xml:space="preserve">Avance1_Historias_de_Usuario_v1.docx</w:t>
-      </w:r>
-      <w:r>
-        <w:t xml:space="preserve">: solo la tabla de las 12 historias del documento v12 con sus 65 escenarios, en página horizontal con márgenes de 2,54 cm y Times New Roman, para copiarla a otro documento. Se genera con</w:t>
-      </w:r>
-      <w:r>
-        <w:t xml:space="preserve"> </w:t>
-      </w:r>
-      <w:r>
-        <w:rPr>
-          <w:rStyle w:val="VerbatimChar"/>
-        </w:rPr>
-        <w:t xml:space="preserve">docs/construir_historias.py</w:t>
       </w:r>
       <w:r>
         <w:t xml:space="preserve">.</w:t>
@@ -2626,16 +2814,106 @@
     </w:p>
     <w:bookmarkEnd w:id="46"/>
     <w:bookmarkEnd w:id="47"/>
-    <w:bookmarkStart w:id="52" w:name="código"/>
+    <w:bookmarkStart w:id="50" w:name="historias-de-usuario-word-aparte"/>
     <w:p>
       <w:pPr>
         <w:pStyle w:val="Heading2"/>
       </w:pPr>
       <w:r>
+        <w:t xml:space="preserve">Historias de usuario (Word aparte)</w:t>
+      </w:r>
+    </w:p>
+    <w:bookmarkStart w:id="48" w:name="X1e92d85a3d5cdcebeb4530033ff4bc73fae25a4"/>
+    <w:p>
+      <w:pPr>
+        <w:pStyle w:val="Heading3"/>
+      </w:pPr>
+      <w:r>
+        <w:t xml:space="preserve">Historias de usuario v2 · 2026-10-08 · commit</w:t>
+      </w:r>
+      <w:r>
+        <w:t xml:space="preserve"> </w:t>
+      </w:r>
+      <w:r>
+        <w:rPr>
+          <w:rStyle w:val="VerbatimChar"/>
+        </w:rPr>
+        <w:t xml:space="preserve">bce4e1c</w:t>
+      </w:r>
+    </w:p>
+    <w:p>
+      <w:pPr>
+        <w:numPr>
+          <w:ilvl w:val="0"/>
+          <w:numId w:val="1028"/>
+        </w:numPr>
+        <w:pStyle w:val="Compact"/>
+      </w:pPr>
+      <w:r>
+        <w:t xml:space="preserve">Mismas 12 historias con los 40 escenarios consolidados del documento v13 (máximo 4 por historia).</w:t>
+      </w:r>
+    </w:p>
+    <w:bookmarkEnd w:id="48"/>
+    <w:bookmarkStart w:id="49" w:name="Xe7240de9be5baf05b0d81e6c0c0e2d6d32324b3"/>
+    <w:p>
+      <w:pPr>
+        <w:pStyle w:val="Heading3"/>
+      </w:pPr>
+      <w:r>
+        <w:t xml:space="preserve">Historias de usuario v1 · 2026-10-08 · commit</w:t>
+      </w:r>
+      <w:r>
+        <w:t xml:space="preserve"> </w:t>
+      </w:r>
+      <w:r>
+        <w:rPr>
+          <w:rStyle w:val="VerbatimChar"/>
+        </w:rPr>
+        <w:t xml:space="preserve">9fae723</w:t>
+      </w:r>
+    </w:p>
+    <w:p>
+      <w:pPr>
+        <w:numPr>
+          <w:ilvl w:val="0"/>
+          <w:numId w:val="1029"/>
+        </w:numPr>
+        <w:pStyle w:val="Compact"/>
+      </w:pPr>
+      <w:r>
+        <w:rPr>
+          <w:rStyle w:val="VerbatimChar"/>
+        </w:rPr>
+        <w:t xml:space="preserve">Avance1_Historias_de_Usuario_v1.docx</w:t>
+      </w:r>
+      <w:r>
+        <w:t xml:space="preserve">: solo la tabla de las 12 historias del documento v12 con sus 65 escenarios, en página horizontal con márgenes de 2,54 cm y Times New Roman, para copiarla a otro documento. Se genera con</w:t>
+      </w:r>
+      <w:r>
+        <w:t xml:space="preserve"> </w:t>
+      </w:r>
+      <w:r>
+        <w:rPr>
+          <w:rStyle w:val="VerbatimChar"/>
+        </w:rPr>
+        <w:t xml:space="preserve">docs/construir_historias.py</w:t>
+      </w:r>
+      <w:r>
+        <w:t xml:space="preserve">.</w:t>
+      </w:r>
+    </w:p>
+    <w:bookmarkEnd w:id="49"/>
+    <w:bookmarkEnd w:id="50"/>
+    <w:bookmarkStart w:id="55" w:name="código"/>
+    <w:p>
+      <w:pPr>
+        <w:pStyle w:val="Heading2"/>
+      </w:pPr>
+      <w:r>
         <w:t xml:space="preserve">Código</w:t>
       </w:r>
     </w:p>
-    <w:bookmarkStart w:id="48" w:name="código-v4-2026-10-08-commit-34bfcec"/>
+    <w:bookmarkStart w:id="51" w:name="código-v4-2026-10-08-commit-34bfcec"/>
     <w:p>
       <w:pPr>
         <w:pStyle w:val="Heading3"/>
@@ -2657,7 +2935,7 @@
       <w:pPr>
         <w:numPr>
           <w:ilvl w:val="0"/>
-          <w:numId w:val="1027"/>
+          <w:numId w:val="1030"/>
         </w:numPr>
         <w:pStyle w:val="Compact"/>
       </w:pPr>
@@ -2680,8 +2958,8 @@
         <w:t xml:space="preserve">a la nueva numeración de historias (documento v12).</w:t>
       </w:r>
     </w:p>
-    <w:bookmarkEnd w:id="48"/>
-    <w:bookmarkStart w:id="49" w:name="código-v3-2026-10-08-commit-626c373"/>
+    <w:bookmarkEnd w:id="51"/>
+    <w:bookmarkStart w:id="52" w:name="código-v3-2026-10-08-commit-626c373"/>
     <w:p>
       <w:pPr>
         <w:pStyle w:val="Heading3"/>
@@ -2703,7 +2981,7 @@
       <w:pPr>
         <w:numPr>
           <w:ilvl w:val="0"/>
-          <w:numId w:val="1028"/>
+          <w:numId w:val="1031"/>
         </w:numPr>
         <w:pStyle w:val="Compact"/>
       </w:pPr>
@@ -2784,7 +3062,7 @@
       <w:pPr>
         <w:numPr>
           <w:ilvl w:val="0"/>
-          <w:numId w:val="1028"/>
+          <w:numId w:val="1031"/>
         </w:numPr>
         <w:pStyle w:val="Compact"/>
       </w:pPr>
@@ -2829,7 +3107,7 @@
       <w:pPr>
         <w:numPr>
           <w:ilvl w:val="0"/>
-          <w:numId w:val="1028"/>
+          <w:numId w:val="1031"/>
         </w:numPr>
         <w:pStyle w:val="Compact"/>
       </w:pPr>
@@ -2882,8 +3160,8 @@
         <w:t xml:space="preserve">da la primera y la última factura.</w:t>
       </w:r>
     </w:p>
-    <w:bookmarkEnd w:id="49"/>
-    <w:bookmarkStart w:id="50" w:name="código-v2-2026-10-08-commit-99f55d4"/>
+    <w:bookmarkEnd w:id="52"/>
+    <w:bookmarkStart w:id="53" w:name="código-v2-2026-10-08-commit-99f55d4"/>
     <w:p>
       <w:pPr>
         <w:pStyle w:val="Heading3"/>
@@ -2905,7 +3183,7 @@
       <w:pPr>
         <w:numPr>
           <w:ilvl w:val="0"/>
-          <w:numId w:val="1029"/>
+          <w:numId w:val="1032"/>
         </w:numPr>
         <w:pStyle w:val="Compact"/>
       </w:pPr>
@@ -2983,7 +3261,7 @@
       <w:pPr>
         <w:numPr>
           <w:ilvl w:val="0"/>
-          <w:numId w:val="1029"/>
+          <w:numId w:val="1032"/>
         </w:numPr>
         <w:pStyle w:val="Compact"/>
       </w:pPr>
@@ -3006,8 +3284,8 @@
         <w:t xml:space="preserve">muestra la regla: un cliente con facturas se desactiva y uno sin facturas se elimina.</w:t>
       </w:r>
     </w:p>
-    <w:bookmarkEnd w:id="50"/>
-    <w:bookmarkStart w:id="51" w:name="código-v1-2026-10-08-commit-442187a"/>
+    <w:bookmarkEnd w:id="53"/>
+    <w:bookmarkStart w:id="54" w:name="código-v1-2026-10-08-commit-442187a"/>
     <w:p>
       <w:pPr>
         <w:pStyle w:val="Heading3"/>
@@ -3029,7 +3307,7 @@
       <w:pPr>
         <w:numPr>
           <w:ilvl w:val="0"/>
-          <w:numId w:val="1030"/>
+          <w:numId w:val="1033"/>
         </w:numPr>
         <w:pStyle w:val="Compact"/>
       </w:pPr>
@@ -3056,7 +3334,7 @@
       <w:pPr>
         <w:numPr>
           <w:ilvl w:val="0"/>
-          <w:numId w:val="1030"/>
+          <w:numId w:val="1033"/>
         </w:numPr>
         <w:pStyle w:val="Compact"/>
       </w:pPr>
@@ -3077,7 +3355,7 @@
       <w:pPr>
         <w:numPr>
           <w:ilvl w:val="0"/>
-          <w:numId w:val="1030"/>
+          <w:numId w:val="1033"/>
         </w:numPr>
         <w:pStyle w:val="Compact"/>
       </w:pPr>
@@ -3085,9 +3363,9 @@
         <w:t xml:space="preserve">Código de referencia para entender el diseño; no es un entregable.</w:t>
       </w:r>
     </w:p>
-    <w:bookmarkEnd w:id="51"/>
-    <w:bookmarkEnd w:id="52"/>
-    <w:bookmarkEnd w:id="53"/>
+    <w:bookmarkEnd w:id="54"/>
+    <w:bookmarkEnd w:id="55"/>
+    <w:bookmarkEnd w:id="56"/>
     <w:sectPr>
       <w:pgSz w:w="12240" w:h="15840"/>
       <w:pgMar w:left="1134" w:right="1134"/>
@@ -3364,6 +3642,15 @@
     <w:abstractNumId w:val="991"/>
   </w:num>
   <w:num w:numId="1030">
+    <w:abstractNumId w:val="991"/>
+  </w:num>
+  <w:num w:numId="1031">
+    <w:abstractNumId w:val="991"/>
+  </w:num>
+  <w:num w:numId="1032">
+    <w:abstractNumId w:val="991"/>
+  </w:num>
+  <w:num w:numId="1033">
     <w:abstractNumId w:val="991"/>
   </w:num>
 </w:numbering>

</xml_diff>

<commit_message>
CHANGELOG: documento v15, código v5, clases v8, simplificado v6, historias v3
Co-Authored-By: Claude Opus 5.5 (1M context) <noreply@anthropic.com>
Claude-Session: https://claude.ai/code/session_01VkQm5RLcZiQMKLCS3EK3og
</commit_message>
<xml_diff>
--- a/docs/Historial_de_versiones.docx
+++ b/docs/Historial_de_versiones.docx
@@ -2,7 +2,7 @@
 <file path=word/document.xml><?xml version="1.0" encoding="utf-8"?>
 <w:document xmlns:w="http://schemas.openxmlformats.org/wordprocessingml/2006/main" xmlns:m="http://schemas.openxmlformats.org/officeDocument/2006/math" xmlns:r="http://schemas.openxmlformats.org/officeDocument/2006/relationships" xmlns:o="urn:schemas-microsoft-com:office:office" xmlns:v="urn:schemas-microsoft-com:vml" xmlns:w10="urn:schemas-microsoft-com:office:word" xmlns:a="http://schemas.openxmlformats.org/drawingml/2006/main" xmlns:pic="http://schemas.openxmlformats.org/drawingml/2006/picture" xmlns:wp="http://schemas.openxmlformats.org/drawingml/2006/wordprocessingDrawing">
   <w:body>
-    <w:bookmarkStart w:id="56" w:name="historial-de-versiones"/>
+    <w:bookmarkStart w:id="61" w:name="historial-de-versiones"/>
     <w:p>
       <w:pPr>
         <w:pStyle w:val="Heading1"/>
@@ -153,7 +153,7 @@
         <w:t xml:space="preserve">.</w:t>
       </w:r>
     </w:p>
-    <w:bookmarkStart w:id="34" w:name="documento-de-diseño"/>
+    <w:bookmarkStart w:id="35" w:name="documento-de-diseño"/>
     <w:p>
       <w:pPr>
         <w:pStyle w:val="Heading2"/>
@@ -162,12 +162,100 @@
         <w:t xml:space="preserve">Documento de diseño</w:t>
       </w:r>
     </w:p>
-    <w:bookmarkStart w:id="20" w:name="documento-v14-2026-10-09-commit-360c024"/>
+    <w:bookmarkStart w:id="20" w:name="documento-v15-2026-10-09-commit-f16f28f"/>
     <w:p>
       <w:pPr>
         <w:pStyle w:val="Heading3"/>
       </w:pPr>
       <w:r>
+        <w:t xml:space="preserve">Documento v15 · 2026-10-09 · commit</w:t>
+      </w:r>
+      <w:r>
+        <w:t xml:space="preserve"> </w:t>
+      </w:r>
+      <w:r>
+        <w:rPr>
+          <w:rStyle w:val="VerbatimChar"/>
+        </w:rPr>
+        <w:t xml:space="preserve">f16f28f</w:t>
+      </w:r>
+    </w:p>
+    <w:p>
+      <w:pPr>
+        <w:numPr>
+          <w:ilvl w:val="0"/>
+          <w:numId w:val="1002"/>
+        </w:numPr>
+        <w:pStyle w:val="Compact"/>
+      </w:pPr>
+      <w:r>
+        <w:t xml:space="preserve">La identificación (tipo y número de cédula) pasa de</w:t>
+      </w:r>
+      <w:r>
+        <w:t xml:space="preserve"> </w:t>
+      </w:r>
+      <w:r>
+        <w:rPr>
+          <w:rStyle w:val="VerbatimChar"/>
+        </w:rPr>
+        <w:t xml:space="preserve">Cliente</w:t>
+      </w:r>
+      <w:r>
+        <w:t xml:space="preserve"> </w:t>
+      </w:r>
+      <w:r>
+        <w:t xml:space="preserve">a</w:t>
+      </w:r>
+      <w:r>
+        <w:t xml:space="preserve"> </w:t>
+      </w:r>
+      <w:r>
+        <w:rPr>
+          <w:rStyle w:val="VerbatimChar"/>
+        </w:rPr>
+        <w:t xml:space="preserve">Persona</w:t>
+      </w:r>
+      <w:r>
+        <w:t xml:space="preserve">, porque también los usuarios (vendedores y administradores) tienen cédula. Cambian las tablas de atributos de Persona y Cliente, los diagramas de clases, el modelo de base de datos (la tabla USUARIOS agrega</w:t>
+      </w:r>
+      <w:r>
+        <w:t xml:space="preserve"> </w:t>
+      </w:r>
+      <w:r>
+        <w:rPr>
+          <w:rStyle w:val="VerbatimChar"/>
+        </w:rPr>
+        <w:t xml:space="preserve">tipo_identificacion</w:t>
+      </w:r>
+      <w:r>
+        <w:t xml:space="preserve"> </w:t>
+      </w:r>
+      <w:r>
+        <w:t xml:space="preserve">e</w:t>
+      </w:r>
+      <w:r>
+        <w:t xml:space="preserve"> </w:t>
+      </w:r>
+      <w:r>
+        <w:rPr>
+          <w:rStyle w:val="VerbatimChar"/>
+        </w:rPr>
+        <w:t xml:space="preserve">identificacion</w:t>
+      </w:r>
+      <w:r>
+        <w:t xml:space="preserve"> </w:t>
+      </w:r>
+      <w:r>
+        <w:t xml:space="preserve">única), la HU 2 (crear usuario pide la cédula y rechaza una repetida) y el boceto P8 de usuarios.</w:t>
+      </w:r>
+    </w:p>
+    <w:bookmarkEnd w:id="20"/>
+    <w:bookmarkStart w:id="21" w:name="documento-v14-2026-10-09-commit-360c024"/>
+    <w:p>
+      <w:pPr>
+        <w:pStyle w:val="Heading3"/>
+      </w:pPr>
+      <w:r>
         <w:t xml:space="preserve">Documento v14 · 2026-10-09 · commit</w:t>
       </w:r>
       <w:r>
@@ -184,7 +272,7 @@
       <w:pPr>
         <w:numPr>
           <w:ilvl w:val="0"/>
-          <w:numId w:val="1002"/>
+          <w:numId w:val="1003"/>
         </w:numPr>
         <w:pStyle w:val="Compact"/>
       </w:pPr>
@@ -192,8 +280,8 @@
         <w:t xml:space="preserve">La vista general del diagrama de clases (sección 4.1) usa el diagrama simplificado v5, más fácil de leer, y el texto explica cómo leerlo.</w:t>
       </w:r>
     </w:p>
-    <w:bookmarkEnd w:id="20"/>
-    <w:bookmarkStart w:id="21" w:name="documento-v13-2026-10-08-commit-bce4e1c"/>
+    <w:bookmarkEnd w:id="21"/>
+    <w:bookmarkStart w:id="22" w:name="documento-v13-2026-10-08-commit-bce4e1c"/>
     <w:p>
       <w:pPr>
         <w:pStyle w:val="Heading3"/>
@@ -215,7 +303,7 @@
       <w:pPr>
         <w:numPr>
           <w:ilvl w:val="0"/>
-          <w:numId w:val="1003"/>
+          <w:numId w:val="1004"/>
         </w:numPr>
         <w:pStyle w:val="Compact"/>
       </w:pPr>
@@ -227,7 +315,7 @@
       <w:pPr>
         <w:numPr>
           <w:ilvl w:val="0"/>
-          <w:numId w:val="1003"/>
+          <w:numId w:val="1004"/>
         </w:numPr>
         <w:pStyle w:val="Compact"/>
       </w:pPr>
@@ -235,8 +323,8 @@
         <w:t xml:space="preserve">Escenarios por historia: HU 1 a HU 3, 4 cada una; HU 4, 3; HU 5, 4; HU 6, 3; HU 7, 2; HU 8, 4; HU 9 y HU 10, 2 cada una; HU 11 y HU 12, 4 cada una.</w:t>
       </w:r>
     </w:p>
-    <w:bookmarkEnd w:id="21"/>
-    <w:bookmarkStart w:id="22" w:name="documento-v12-2026-10-08-commit-34bfcec"/>
+    <w:bookmarkEnd w:id="22"/>
+    <w:bookmarkStart w:id="23" w:name="documento-v12-2026-10-08-commit-34bfcec"/>
     <w:p>
       <w:pPr>
         <w:pStyle w:val="Heading3"/>
@@ -258,7 +346,7 @@
       <w:pPr>
         <w:numPr>
           <w:ilvl w:val="0"/>
-          <w:numId w:val="1004"/>
+          <w:numId w:val="1005"/>
         </w:numPr>
         <w:pStyle w:val="Compact"/>
       </w:pPr>
@@ -270,7 +358,7 @@
       <w:pPr>
         <w:numPr>
           <w:ilvl w:val="0"/>
-          <w:numId w:val="1004"/>
+          <w:numId w:val="1005"/>
         </w:numPr>
         <w:pStyle w:val="Compact"/>
       </w:pPr>
@@ -282,7 +370,7 @@
       <w:pPr>
         <w:numPr>
           <w:ilvl w:val="0"/>
-          <w:numId w:val="1004"/>
+          <w:numId w:val="1005"/>
         </w:numPr>
         <w:pStyle w:val="Compact"/>
       </w:pPr>
@@ -290,8 +378,8 @@
         <w:t xml:space="preserve">Se renumeran las referencias en la guía del inicio, los requerimientos, los bocetos, la trazabilidad y el resumen de historias.</w:t>
       </w:r>
     </w:p>
-    <w:bookmarkEnd w:id="22"/>
-    <w:bookmarkStart w:id="23" w:name="documento-v11-2026-10-08-commit-156cbdf"/>
+    <w:bookmarkEnd w:id="23"/>
+    <w:bookmarkStart w:id="24" w:name="documento-v11-2026-10-08-commit-156cbdf"/>
     <w:p>
       <w:pPr>
         <w:pStyle w:val="Heading3"/>
@@ -313,7 +401,7 @@
       <w:pPr>
         <w:numPr>
           <w:ilvl w:val="0"/>
-          <w:numId w:val="1005"/>
+          <w:numId w:val="1006"/>
         </w:numPr>
         <w:pStyle w:val="Compact"/>
       </w:pPr>
@@ -334,7 +422,7 @@
       <w:pPr>
         <w:numPr>
           <w:ilvl w:val="0"/>
-          <w:numId w:val="1005"/>
+          <w:numId w:val="1006"/>
         </w:numPr>
         <w:pStyle w:val="Compact"/>
       </w:pPr>
@@ -346,7 +434,7 @@
       <w:pPr>
         <w:numPr>
           <w:ilvl w:val="0"/>
-          <w:numId w:val="1005"/>
+          <w:numId w:val="1006"/>
         </w:numPr>
         <w:pStyle w:val="Compact"/>
       </w:pPr>
@@ -358,7 +446,7 @@
       <w:pPr>
         <w:numPr>
           <w:ilvl w:val="0"/>
-          <w:numId w:val="1005"/>
+          <w:numId w:val="1006"/>
         </w:numPr>
         <w:pStyle w:val="Compact"/>
       </w:pPr>
@@ -397,7 +485,7 @@
       <w:pPr>
         <w:numPr>
           <w:ilvl w:val="0"/>
-          <w:numId w:val="1005"/>
+          <w:numId w:val="1006"/>
         </w:numPr>
         <w:pStyle w:val="Compact"/>
       </w:pPr>
@@ -405,8 +493,8 @@
         <w:t xml:space="preserve">Columnas de la tabla de historias ajustadas al nuevo ancho para que no se corten palabras.</w:t>
       </w:r>
     </w:p>
-    <w:bookmarkEnd w:id="23"/>
-    <w:bookmarkStart w:id="24" w:name="documento-v10-2026-10-08-commit-fee9361"/>
+    <w:bookmarkEnd w:id="24"/>
+    <w:bookmarkStart w:id="25" w:name="documento-v10-2026-10-08-commit-fee9361"/>
     <w:p>
       <w:pPr>
         <w:pStyle w:val="Heading3"/>
@@ -428,7 +516,7 @@
       <w:pPr>
         <w:numPr>
           <w:ilvl w:val="0"/>
-          <w:numId w:val="1006"/>
+          <w:numId w:val="1007"/>
         </w:numPr>
         <w:pStyle w:val="Compact"/>
       </w:pPr>
@@ -456,7 +544,7 @@
       <w:pPr>
         <w:numPr>
           <w:ilvl w:val="0"/>
-          <w:numId w:val="1006"/>
+          <w:numId w:val="1007"/>
         </w:numPr>
         <w:pStyle w:val="Compact"/>
       </w:pPr>
@@ -468,7 +556,7 @@
       <w:pPr>
         <w:numPr>
           <w:ilvl w:val="0"/>
-          <w:numId w:val="1006"/>
+          <w:numId w:val="1007"/>
         </w:numPr>
         <w:pStyle w:val="Compact"/>
       </w:pPr>
@@ -476,8 +564,8 @@
         <w:t xml:space="preserve">Las imágenes grandes se limitan a 20,5 cm de alto para que el título y el pie de figura queden en la misma página.</w:t>
       </w:r>
     </w:p>
-    <w:bookmarkEnd w:id="24"/>
-    <w:bookmarkStart w:id="25" w:name="documento-v9-2026-10-08-commit-5400cea"/>
+    <w:bookmarkEnd w:id="25"/>
+    <w:bookmarkStart w:id="26" w:name="documento-v9-2026-10-08-commit-5400cea"/>
     <w:p>
       <w:pPr>
         <w:pStyle w:val="Heading3"/>
@@ -499,7 +587,7 @@
       <w:pPr>
         <w:numPr>
           <w:ilvl w:val="0"/>
-          <w:numId w:val="1007"/>
+          <w:numId w:val="1008"/>
         </w:numPr>
         <w:pStyle w:val="Compact"/>
       </w:pPr>
@@ -574,7 +662,7 @@
       <w:pPr>
         <w:numPr>
           <w:ilvl w:val="0"/>
-          <w:numId w:val="1007"/>
+          <w:numId w:val="1008"/>
         </w:numPr>
         <w:pStyle w:val="Compact"/>
       </w:pPr>
@@ -609,8 +697,8 @@
         <w:t xml:space="preserve">, por qué todas las colecciones son genéricas (no hace falta cast).</w:t>
       </w:r>
     </w:p>
-    <w:bookmarkEnd w:id="25"/>
-    <w:bookmarkStart w:id="26" w:name="documento-v8-2026-10-08-commit-626c373"/>
+    <w:bookmarkEnd w:id="26"/>
+    <w:bookmarkStart w:id="27" w:name="documento-v8-2026-10-08-commit-626c373"/>
     <w:p>
       <w:pPr>
         <w:pStyle w:val="Heading3"/>
@@ -632,7 +720,7 @@
       <w:pPr>
         <w:numPr>
           <w:ilvl w:val="0"/>
-          <w:numId w:val="1008"/>
+          <w:numId w:val="1009"/>
         </w:numPr>
         <w:pStyle w:val="Compact"/>
       </w:pPr>
@@ -701,7 +789,7 @@
       <w:pPr>
         <w:numPr>
           <w:ilvl w:val="0"/>
-          <w:numId w:val="1008"/>
+          <w:numId w:val="1009"/>
         </w:numPr>
         <w:pStyle w:val="Compact"/>
       </w:pPr>
@@ -722,7 +810,7 @@
       <w:pPr>
         <w:numPr>
           <w:ilvl w:val="0"/>
-          <w:numId w:val="1008"/>
+          <w:numId w:val="1009"/>
         </w:numPr>
         <w:pStyle w:val="Compact"/>
       </w:pPr>
@@ -758,7 +846,7 @@
       <w:pPr>
         <w:numPr>
           <w:ilvl w:val="0"/>
-          <w:numId w:val="1008"/>
+          <w:numId w:val="1009"/>
         </w:numPr>
         <w:pStyle w:val="Compact"/>
       </w:pPr>
@@ -803,7 +891,7 @@
       <w:pPr>
         <w:numPr>
           <w:ilvl w:val="0"/>
-          <w:numId w:val="1008"/>
+          <w:numId w:val="1009"/>
         </w:numPr>
         <w:pStyle w:val="Compact"/>
       </w:pPr>
@@ -836,7 +924,7 @@
       <w:pPr>
         <w:numPr>
           <w:ilvl w:val="0"/>
-          <w:numId w:val="1008"/>
+          <w:numId w:val="1009"/>
         </w:numPr>
         <w:pStyle w:val="Compact"/>
       </w:pPr>
@@ -872,7 +960,7 @@
       <w:pPr>
         <w:numPr>
           <w:ilvl w:val="0"/>
-          <w:numId w:val="1008"/>
+          <w:numId w:val="1009"/>
         </w:numPr>
         <w:pStyle w:val="Compact"/>
       </w:pPr>
@@ -880,8 +968,8 @@
         <w:t xml:space="preserve">Nueva tabla «Colecciones: cuál se usa y por qué» al final de la sección 4.2 y fila de colecciones en la tabla de conceptos del curso.</w:t>
       </w:r>
     </w:p>
-    <w:bookmarkEnd w:id="26"/>
-    <w:bookmarkStart w:id="27" w:name="documento-v7-2026-10-08-commit-047b31c"/>
+    <w:bookmarkEnd w:id="27"/>
+    <w:bookmarkStart w:id="28" w:name="documento-v7-2026-10-08-commit-047b31c"/>
     <w:p>
       <w:pPr>
         <w:pStyle w:val="Heading3"/>
@@ -903,7 +991,7 @@
       <w:pPr>
         <w:numPr>
           <w:ilvl w:val="0"/>
-          <w:numId w:val="1009"/>
+          <w:numId w:val="1010"/>
         </w:numPr>
         <w:pStyle w:val="Compact"/>
       </w:pPr>
@@ -915,7 +1003,7 @@
       <w:pPr>
         <w:numPr>
           <w:ilvl w:val="0"/>
-          <w:numId w:val="1009"/>
+          <w:numId w:val="1010"/>
         </w:numPr>
         <w:pStyle w:val="Compact"/>
       </w:pPr>
@@ -927,7 +1015,7 @@
       <w:pPr>
         <w:numPr>
           <w:ilvl w:val="0"/>
-          <w:numId w:val="1009"/>
+          <w:numId w:val="1010"/>
         </w:numPr>
         <w:pStyle w:val="Compact"/>
       </w:pPr>
@@ -939,7 +1027,7 @@
       <w:pPr>
         <w:numPr>
           <w:ilvl w:val="0"/>
-          <w:numId w:val="1009"/>
+          <w:numId w:val="1010"/>
         </w:numPr>
         <w:pStyle w:val="Compact"/>
       </w:pPr>
@@ -969,7 +1057,7 @@
       <w:pPr>
         <w:numPr>
           <w:ilvl w:val="0"/>
-          <w:numId w:val="1009"/>
+          <w:numId w:val="1010"/>
         </w:numPr>
         <w:pStyle w:val="Compact"/>
       </w:pPr>
@@ -977,8 +1065,8 @@
         <w:t xml:space="preserve">El nombre del profesor (Mario Alberto Vargas Montes) queda en la portada.</w:t>
       </w:r>
     </w:p>
-    <w:bookmarkEnd w:id="27"/>
-    <w:bookmarkStart w:id="28" w:name="documento-v6-2026-10-08-commit-99f55d4"/>
+    <w:bookmarkEnd w:id="28"/>
+    <w:bookmarkStart w:id="29" w:name="documento-v6-2026-10-08-commit-99f55d4"/>
     <w:p>
       <w:pPr>
         <w:pStyle w:val="Heading3"/>
@@ -1000,7 +1088,7 @@
       <w:pPr>
         <w:numPr>
           <w:ilvl w:val="0"/>
-          <w:numId w:val="1010"/>
+          <w:numId w:val="1011"/>
         </w:numPr>
         <w:pStyle w:val="Compact"/>
       </w:pPr>
@@ -1012,7 +1100,7 @@
       <w:pPr>
         <w:numPr>
           <w:ilvl w:val="0"/>
-          <w:numId w:val="1010"/>
+          <w:numId w:val="1011"/>
         </w:numPr>
         <w:pStyle w:val="Compact"/>
       </w:pPr>
@@ -1024,7 +1112,7 @@
       <w:pPr>
         <w:numPr>
           <w:ilvl w:val="0"/>
-          <w:numId w:val="1010"/>
+          <w:numId w:val="1011"/>
         </w:numPr>
         <w:pStyle w:val="Compact"/>
       </w:pPr>
@@ -1081,7 +1169,7 @@
       <w:pPr>
         <w:numPr>
           <w:ilvl w:val="0"/>
-          <w:numId w:val="1010"/>
+          <w:numId w:val="1011"/>
         </w:numPr>
         <w:pStyle w:val="Compact"/>
       </w:pPr>
@@ -1102,7 +1190,7 @@
       <w:pPr>
         <w:numPr>
           <w:ilvl w:val="0"/>
-          <w:numId w:val="1010"/>
+          <w:numId w:val="1011"/>
         </w:numPr>
         <w:pStyle w:val="Compact"/>
       </w:pPr>
@@ -1114,7 +1202,7 @@
       <w:pPr>
         <w:numPr>
           <w:ilvl w:val="0"/>
-          <w:numId w:val="1010"/>
+          <w:numId w:val="1011"/>
         </w:numPr>
         <w:pStyle w:val="Compact"/>
       </w:pPr>
@@ -1126,7 +1214,7 @@
       <w:pPr>
         <w:numPr>
           <w:ilvl w:val="0"/>
-          <w:numId w:val="1010"/>
+          <w:numId w:val="1011"/>
         </w:numPr>
         <w:pStyle w:val="Compact"/>
       </w:pPr>
@@ -1134,8 +1222,8 @@
         <w:t xml:space="preserve">Requerimientos no funcionales de pantallas, sockets, concurrencia y base de datos ajustados.</w:t>
       </w:r>
     </w:p>
-    <w:bookmarkEnd w:id="28"/>
-    <w:bookmarkStart w:id="29" w:name="documento-v5-2026-10-08-commit-9a7a9a7"/>
+    <w:bookmarkEnd w:id="29"/>
+    <w:bookmarkStart w:id="30" w:name="documento-v5-2026-10-08-commit-9a7a9a7"/>
     <w:p>
       <w:pPr>
         <w:pStyle w:val="Heading3"/>
@@ -1157,7 +1245,7 @@
       <w:pPr>
         <w:numPr>
           <w:ilvl w:val="0"/>
-          <w:numId w:val="1011"/>
+          <w:numId w:val="1012"/>
         </w:numPr>
         <w:pStyle w:val="Compact"/>
       </w:pPr>
@@ -1201,7 +1289,7 @@
       <w:pPr>
         <w:numPr>
           <w:ilvl w:val="0"/>
-          <w:numId w:val="1011"/>
+          <w:numId w:val="1012"/>
         </w:numPr>
         <w:pStyle w:val="Compact"/>
       </w:pPr>
@@ -1213,7 +1301,7 @@
       <w:pPr>
         <w:numPr>
           <w:ilvl w:val="0"/>
-          <w:numId w:val="1011"/>
+          <w:numId w:val="1012"/>
         </w:numPr>
         <w:pStyle w:val="Compact"/>
       </w:pPr>
@@ -1225,7 +1313,7 @@
       <w:pPr>
         <w:numPr>
           <w:ilvl w:val="0"/>
-          <w:numId w:val="1011"/>
+          <w:numId w:val="1012"/>
         </w:numPr>
         <w:pStyle w:val="Compact"/>
       </w:pPr>
@@ -1245,8 +1333,8 @@
         <w:t xml:space="preserve">.</w:t>
       </w:r>
     </w:p>
-    <w:bookmarkEnd w:id="29"/>
-    <w:bookmarkStart w:id="30" w:name="documento-v4-2026-10-08-commit-b3e7477"/>
+    <w:bookmarkEnd w:id="30"/>
+    <w:bookmarkStart w:id="31" w:name="documento-v4-2026-10-08-commit-b3e7477"/>
     <w:p>
       <w:pPr>
         <w:pStyle w:val="Heading3"/>
@@ -1268,7 +1356,7 @@
       <w:pPr>
         <w:numPr>
           <w:ilvl w:val="0"/>
-          <w:numId w:val="1012"/>
+          <w:numId w:val="1013"/>
         </w:numPr>
         <w:pStyle w:val="Compact"/>
       </w:pPr>
@@ -1280,7 +1368,7 @@
       <w:pPr>
         <w:numPr>
           <w:ilvl w:val="0"/>
-          <w:numId w:val="1012"/>
+          <w:numId w:val="1013"/>
         </w:numPr>
         <w:pStyle w:val="Compact"/>
       </w:pPr>
@@ -1292,7 +1380,7 @@
       <w:pPr>
         <w:numPr>
           <w:ilvl w:val="0"/>
-          <w:numId w:val="1012"/>
+          <w:numId w:val="1013"/>
         </w:numPr>
         <w:pStyle w:val="Compact"/>
       </w:pPr>
@@ -1304,7 +1392,7 @@
       <w:pPr>
         <w:numPr>
           <w:ilvl w:val="0"/>
-          <w:numId w:val="1012"/>
+          <w:numId w:val="1013"/>
         </w:numPr>
         <w:pStyle w:val="Compact"/>
       </w:pPr>
@@ -1339,8 +1427,8 @@
         <w:t xml:space="preserve">.</w:t>
       </w:r>
     </w:p>
-    <w:bookmarkEnd w:id="30"/>
-    <w:bookmarkStart w:id="31" w:name="documento-v3-2026-10-08-commit-bf66b07"/>
+    <w:bookmarkEnd w:id="31"/>
+    <w:bookmarkStart w:id="32" w:name="documento-v3-2026-10-08-commit-bf66b07"/>
     <w:p>
       <w:pPr>
         <w:pStyle w:val="Heading3"/>
@@ -1362,7 +1450,7 @@
       <w:pPr>
         <w:numPr>
           <w:ilvl w:val="0"/>
-          <w:numId w:val="1013"/>
+          <w:numId w:val="1014"/>
         </w:numPr>
         <w:pStyle w:val="Compact"/>
       </w:pPr>
@@ -1374,7 +1462,7 @@
       <w:pPr>
         <w:numPr>
           <w:ilvl w:val="0"/>
-          <w:numId w:val="1013"/>
+          <w:numId w:val="1014"/>
         </w:numPr>
         <w:pStyle w:val="Compact"/>
       </w:pPr>
@@ -1382,8 +1470,8 @@
         <w:t xml:space="preserve">La versión va en el nombre del archivo y la numeración pasa a v1, v2, v3…</w:t>
       </w:r>
     </w:p>
-    <w:bookmarkEnd w:id="31"/>
-    <w:bookmarkStart w:id="32" w:name="documento-v2-2026-10-08-commit-07de778"/>
+    <w:bookmarkEnd w:id="32"/>
+    <w:bookmarkStart w:id="33" w:name="documento-v2-2026-10-08-commit-07de778"/>
     <w:p>
       <w:pPr>
         <w:pStyle w:val="Heading3"/>
@@ -1405,7 +1493,7 @@
       <w:pPr>
         <w:numPr>
           <w:ilvl w:val="0"/>
-          <w:numId w:val="1014"/>
+          <w:numId w:val="1015"/>
         </w:numPr>
         <w:pStyle w:val="Compact"/>
       </w:pPr>
@@ -1618,7 +1706,7 @@
       <w:pPr>
         <w:numPr>
           <w:ilvl w:val="0"/>
-          <w:numId w:val="1014"/>
+          <w:numId w:val="1015"/>
         </w:numPr>
         <w:pStyle w:val="Compact"/>
       </w:pPr>
@@ -1630,7 +1718,7 @@
       <w:pPr>
         <w:numPr>
           <w:ilvl w:val="0"/>
-          <w:numId w:val="1014"/>
+          <w:numId w:val="1015"/>
         </w:numPr>
         <w:pStyle w:val="Compact"/>
       </w:pPr>
@@ -1642,7 +1730,7 @@
       <w:pPr>
         <w:numPr>
           <w:ilvl w:val="0"/>
-          <w:numId w:val="1014"/>
+          <w:numId w:val="1015"/>
         </w:numPr>
         <w:pStyle w:val="Compact"/>
       </w:pPr>
@@ -1669,7 +1757,7 @@
       <w:pPr>
         <w:numPr>
           <w:ilvl w:val="0"/>
-          <w:numId w:val="1014"/>
+          <w:numId w:val="1015"/>
         </w:numPr>
         <w:pStyle w:val="Compact"/>
       </w:pPr>
@@ -1681,7 +1769,7 @@
       <w:pPr>
         <w:numPr>
           <w:ilvl w:val="0"/>
-          <w:numId w:val="1014"/>
+          <w:numId w:val="1015"/>
         </w:numPr>
         <w:pStyle w:val="Compact"/>
       </w:pPr>
@@ -1719,8 +1807,8 @@
         <w:t xml:space="preserve">(el impuesto lo define cada tipo de producto).</w:t>
       </w:r>
     </w:p>
-    <w:bookmarkEnd w:id="32"/>
-    <w:bookmarkStart w:id="33" w:name="documento-v1-2026-10-06-commit-9be1af4"/>
+    <w:bookmarkEnd w:id="33"/>
+    <w:bookmarkStart w:id="34" w:name="documento-v1-2026-10-06-commit-9be1af4"/>
     <w:p>
       <w:pPr>
         <w:pStyle w:val="Heading3"/>
@@ -1742,7 +1830,7 @@
       <w:pPr>
         <w:numPr>
           <w:ilvl w:val="0"/>
-          <w:numId w:val="1015"/>
+          <w:numId w:val="1016"/>
         </w:numPr>
         <w:pStyle w:val="Compact"/>
       </w:pPr>
@@ -1750,9 +1838,9 @@
         <w:t xml:space="preserve">Primera versión del documento de diseño del Avance 1 (Proyecto 1, Fidecompro): clases con atributos, métodos y relaciones; 15 historias de usuario; 8 prototipos de pantalla; diagramas de arquitectura, secuencia y navegación.</w:t>
       </w:r>
     </w:p>
-    <w:bookmarkEnd w:id="33"/>
     <w:bookmarkEnd w:id="34"/>
-    <w:bookmarkStart w:id="47" w:name="diagrama-de-clases-word-aparte"/>
+    <w:bookmarkEnd w:id="35"/>
+    <w:bookmarkStart w:id="50" w:name="diagrama-de-clases-word-aparte"/>
     <w:p>
       <w:pPr>
         <w:pStyle w:val="Heading2"/>
@@ -1761,12 +1849,133 @@
         <w:t xml:space="preserve">Diagrama de clases (Word aparte)</w:t>
       </w:r>
     </w:p>
-    <w:bookmarkStart w:id="35" w:name="X69580a323b9b3200da981be68b69b1aaaf35160"/>
+    <w:bookmarkStart w:id="36" w:name="X46a963d1117fa41e63f85e6e49e42a8f94c2c7e"/>
     <w:p>
       <w:pPr>
         <w:pStyle w:val="Heading3"/>
       </w:pPr>
       <w:r>
+        <w:t xml:space="preserve">Diagrama de clases v8 · 2026-10-09 · commit</w:t>
+      </w:r>
+      <w:r>
+        <w:t xml:space="preserve"> </w:t>
+      </w:r>
+      <w:r>
+        <w:rPr>
+          <w:rStyle w:val="VerbatimChar"/>
+        </w:rPr>
+        <w:t xml:space="preserve">f16f28f</w:t>
+      </w:r>
+    </w:p>
+    <w:p>
+      <w:pPr>
+        <w:numPr>
+          <w:ilvl w:val="0"/>
+          <w:numId w:val="1017"/>
+        </w:numPr>
+        <w:pStyle w:val="Compact"/>
+      </w:pPr>
+      <w:r>
+        <w:rPr>
+          <w:rStyle w:val="VerbatimChar"/>
+        </w:rPr>
+        <w:t xml:space="preserve">Persona</w:t>
+      </w:r>
+      <w:r>
+        <w:t xml:space="preserve"> </w:t>
+      </w:r>
+      <w:r>
+        <w:t xml:space="preserve">tiene</w:t>
+      </w:r>
+      <w:r>
+        <w:t xml:space="preserve"> </w:t>
+      </w:r>
+      <w:r>
+        <w:rPr>
+          <w:rStyle w:val="VerbatimChar"/>
+        </w:rPr>
+        <w:t xml:space="preserve">tipoIdentificacion</w:t>
+      </w:r>
+      <w:r>
+        <w:t xml:space="preserve"> </w:t>
+      </w:r>
+      <w:r>
+        <w:t xml:space="preserve">e</w:t>
+      </w:r>
+      <w:r>
+        <w:t xml:space="preserve"> </w:t>
+      </w:r>
+      <w:r>
+        <w:rPr>
+          <w:rStyle w:val="VerbatimChar"/>
+        </w:rPr>
+        <w:t xml:space="preserve">identificacion</w:t>
+      </w:r>
+      <w:r>
+        <w:t xml:space="preserve">;</w:t>
+      </w:r>
+      <w:r>
+        <w:t xml:space="preserve"> </w:t>
+      </w:r>
+      <w:r>
+        <w:rPr>
+          <w:rStyle w:val="VerbatimChar"/>
+        </w:rPr>
+        <w:t xml:space="preserve">Cliente</w:t>
+      </w:r>
+      <w:r>
+        <w:t xml:space="preserve"> </w:t>
+      </w:r>
+      <w:r>
+        <w:t xml:space="preserve">ya no los repite y</w:t>
+      </w:r>
+      <w:r>
+        <w:t xml:space="preserve"> </w:t>
+      </w:r>
+      <w:r>
+        <w:rPr>
+          <w:rStyle w:val="VerbatimChar"/>
+        </w:rPr>
+        <w:t xml:space="preserve">Usuario</w:t>
+      </w:r>
+      <w:r>
+        <w:t xml:space="preserve"> </w:t>
+      </w:r>
+      <w:r>
+        <w:t xml:space="preserve">los recibe en su constructor. El</w:t>
+      </w:r>
+      <w:r>
+        <w:t xml:space="preserve"> </w:t>
+      </w:r>
+      <w:r>
+        <w:rPr>
+          <w:rStyle w:val="VerbatimChar"/>
+        </w:rPr>
+        <w:t xml:space="preserve">.drawio</w:t>
+      </w:r>
+      <w:r>
+        <w:t xml:space="preserve"> </w:t>
+      </w:r>
+      <w:r>
+        <w:t xml:space="preserve">completo pasa a v5 (</w:t>
+      </w:r>
+      <w:r>
+        <w:rPr>
+          <w:rStyle w:val="VerbatimChar"/>
+        </w:rPr>
+        <w:t xml:space="preserve">Avance1_Diagrama_de_Clases_v5.drawio</w:t>
+      </w:r>
+      <w:r>
+        <w:t xml:space="preserve">).</w:t>
+      </w:r>
+    </w:p>
+    <w:bookmarkEnd w:id="36"/>
+    <w:bookmarkStart w:id="37" w:name="X69580a323b9b3200da981be68b69b1aaaf35160"/>
+    <w:p>
+      <w:pPr>
+        <w:pStyle w:val="Heading3"/>
+      </w:pPr>
+      <w:r>
         <w:t xml:space="preserve">Diagrama de clases v7 · 2026-10-09 · commit</w:t>
       </w:r>
       <w:r>
@@ -1783,7 +1992,7 @@
       <w:pPr>
         <w:numPr>
           <w:ilvl w:val="0"/>
-          <w:numId w:val="1016"/>
+          <w:numId w:val="1018"/>
         </w:numPr>
         <w:pStyle w:val="Compact"/>
       </w:pPr>
@@ -1806,8 +2015,8 @@
         <w:t xml:space="preserve">completo sigue en v4.</w:t>
       </w:r>
     </w:p>
-    <w:bookmarkEnd w:id="35"/>
-    <w:bookmarkStart w:id="36" w:name="X5f51fc4b5ffbe090736f81a3b1012c253b30052"/>
+    <w:bookmarkEnd w:id="37"/>
+    <w:bookmarkStart w:id="38" w:name="X5f51fc4b5ffbe090736f81a3b1012c253b30052"/>
     <w:p>
       <w:pPr>
         <w:pStyle w:val="Heading3"/>
@@ -1829,7 +2038,7 @@
       <w:pPr>
         <w:numPr>
           <w:ilvl w:val="0"/>
-          <w:numId w:val="1017"/>
+          <w:numId w:val="1019"/>
         </w:numPr>
         <w:pStyle w:val="Compact"/>
       </w:pPr>
@@ -1837,8 +2046,8 @@
         <w:t xml:space="preserve">Mismo formato APA 7 que el documento v11.</w:t>
       </w:r>
     </w:p>
-    <w:bookmarkEnd w:id="36"/>
-    <w:bookmarkStart w:id="37" w:name="X10045a7158086462e70fd3a0d9f926166a3c4ea"/>
+    <w:bookmarkEnd w:id="38"/>
+    <w:bookmarkStart w:id="39" w:name="X10045a7158086462e70fd3a0d9f926166a3c4ea"/>
     <w:p>
       <w:pPr>
         <w:pStyle w:val="Heading3"/>
@@ -1860,7 +2069,7 @@
       <w:pPr>
         <w:numPr>
           <w:ilvl w:val="0"/>
-          <w:numId w:val="1018"/>
+          <w:numId w:val="1020"/>
         </w:numPr>
         <w:pStyle w:val="Compact"/>
       </w:pPr>
@@ -1883,8 +2092,8 @@
         <w:t xml:space="preserve">sigue en v4 porque no cambió.</w:t>
       </w:r>
     </w:p>
-    <w:bookmarkEnd w:id="37"/>
-    <w:bookmarkStart w:id="38" w:name="X8b6f1de3ef83515f9063b0f71c4f739b3d8e2c1"/>
+    <w:bookmarkEnd w:id="39"/>
+    <w:bookmarkStart w:id="40" w:name="X8b6f1de3ef83515f9063b0f71c4f739b3d8e2c1"/>
     <w:p>
       <w:pPr>
         <w:pStyle w:val="Heading3"/>
@@ -1906,7 +2115,7 @@
       <w:pPr>
         <w:numPr>
           <w:ilvl w:val="0"/>
-          <w:numId w:val="1019"/>
+          <w:numId w:val="1021"/>
         </w:numPr>
         <w:pStyle w:val="Compact"/>
       </w:pPr>
@@ -1942,7 +2151,7 @@
       <w:pPr>
         <w:numPr>
           <w:ilvl w:val="0"/>
-          <w:numId w:val="1019"/>
+          <w:numId w:val="1021"/>
         </w:numPr>
         <w:pStyle w:val="Compact"/>
       </w:pPr>
@@ -1950,8 +2159,8 @@
         <w:t xml:space="preserve">Contenido: el de las entradas v2 y v3 de abajo (colecciones según su uso y la tabla que cita los ejemplos del profesor). Esos números solo existieron en el repositorio.</w:t>
       </w:r>
     </w:p>
-    <w:bookmarkEnd w:id="38"/>
-    <w:bookmarkStart w:id="39" w:name="X863504495f0c283560039533b96e35d8a8aec92"/>
+    <w:bookmarkEnd w:id="40"/>
+    <w:bookmarkStart w:id="41" w:name="X863504495f0c283560039533b96e35d8a8aec92"/>
     <w:p>
       <w:pPr>
         <w:pStyle w:val="Heading3"/>
@@ -1973,7 +2182,7 @@
       <w:pPr>
         <w:numPr>
           <w:ilvl w:val="0"/>
-          <w:numId w:val="1020"/>
+          <w:numId w:val="1022"/>
         </w:numPr>
         <w:pStyle w:val="Compact"/>
       </w:pPr>
@@ -1996,8 +2205,8 @@
         <w:t xml:space="preserve">sigue en v2 porque los diagramas no cambiaron.</w:t>
       </w:r>
     </w:p>
-    <w:bookmarkEnd w:id="39"/>
-    <w:bookmarkStart w:id="40" w:name="X66fc17acf23d8016d6af910173fecc388667a68"/>
+    <w:bookmarkEnd w:id="41"/>
+    <w:bookmarkStart w:id="42" w:name="X66fc17acf23d8016d6af910173fecc388667a68"/>
     <w:p>
       <w:pPr>
         <w:pStyle w:val="Heading3"/>
@@ -2019,7 +2228,7 @@
       <w:pPr>
         <w:numPr>
           <w:ilvl w:val="0"/>
-          <w:numId w:val="1021"/>
+          <w:numId w:val="1023"/>
         </w:numPr>
         <w:pStyle w:val="Compact"/>
       </w:pPr>
@@ -2097,7 +2306,7 @@
       <w:pPr>
         <w:numPr>
           <w:ilvl w:val="0"/>
-          <w:numId w:val="1021"/>
+          <w:numId w:val="1023"/>
         </w:numPr>
         <w:pStyle w:val="Compact"/>
       </w:pPr>
@@ -2129,8 +2338,8 @@
         <w:t xml:space="preserve">(tres páginas, igual que v1).</w:t>
       </w:r>
     </w:p>
-    <w:bookmarkEnd w:id="40"/>
-    <w:bookmarkStart w:id="41" w:name="Xd9ab462069bc781e05750197a0b9dcc21416b9b"/>
+    <w:bookmarkEnd w:id="42"/>
+    <w:bookmarkStart w:id="43" w:name="Xd9ab462069bc781e05750197a0b9dcc21416b9b"/>
     <w:p>
       <w:pPr>
         <w:pStyle w:val="Heading3"/>
@@ -2152,7 +2361,7 @@
       <w:pPr>
         <w:numPr>
           <w:ilvl w:val="0"/>
-          <w:numId w:val="1022"/>
+          <w:numId w:val="1024"/>
         </w:numPr>
         <w:pStyle w:val="Compact"/>
       </w:pPr>
@@ -2164,7 +2373,7 @@
       <w:pPr>
         <w:numPr>
           <w:ilvl w:val="0"/>
-          <w:numId w:val="1022"/>
+          <w:numId w:val="1024"/>
         </w:numPr>
         <w:pStyle w:val="Compact"/>
       </w:pPr>
@@ -2209,7 +2418,7 @@
       <w:pPr>
         <w:numPr>
           <w:ilvl w:val="0"/>
-          <w:numId w:val="1022"/>
+          <w:numId w:val="1024"/>
         </w:numPr>
         <w:pStyle w:val="Compact"/>
       </w:pPr>
@@ -2253,13 +2462,122 @@
         <w:t xml:space="preserve">desde los diagramas de Mermaid.</w:t>
       </w:r>
     </w:p>
-    <w:bookmarkEnd w:id="41"/>
-    <w:bookmarkStart w:id="42" w:name="X53a1eacf4306f1baf4d20ed5877265beeafb517"/>
+    <w:bookmarkEnd w:id="43"/>
+    <w:bookmarkStart w:id="44" w:name="Xf244e10a504e7d0e88c7dc09be70936a1b7ad0c"/>
     <w:p>
       <w:pPr>
         <w:pStyle w:val="Heading3"/>
       </w:pPr>
       <w:r>
+        <w:t xml:space="preserve">Diagrama de clases simplificado v6 · 2026-10-09 · commit</w:t>
+      </w:r>
+      <w:r>
+        <w:t xml:space="preserve"> </w:t>
+      </w:r>
+      <w:r>
+        <w:rPr>
+          <w:rStyle w:val="VerbatimChar"/>
+        </w:rPr>
+        <w:t xml:space="preserve">f16f28f</w:t>
+      </w:r>
+    </w:p>
+    <w:p>
+      <w:pPr>
+        <w:numPr>
+          <w:ilvl w:val="0"/>
+          <w:numId w:val="1025"/>
+        </w:numPr>
+        <w:pStyle w:val="Compact"/>
+      </w:pPr>
+      <w:r>
+        <w:rPr>
+          <w:rStyle w:val="VerbatimChar"/>
+        </w:rPr>
+        <w:t xml:space="preserve">Persona</w:t>
+      </w:r>
+      <w:r>
+        <w:t xml:space="preserve"> </w:t>
+      </w:r>
+      <w:r>
+        <w:t xml:space="preserve">muestra</w:t>
+      </w:r>
+      <w:r>
+        <w:t xml:space="preserve"> </w:t>
+      </w:r>
+      <w:r>
+        <w:rPr>
+          <w:rStyle w:val="VerbatimChar"/>
+        </w:rPr>
+        <w:t xml:space="preserve">tipoIdentificacion</w:t>
+      </w:r>
+      <w:r>
+        <w:t xml:space="preserve"> </w:t>
+      </w:r>
+      <w:r>
+        <w:t xml:space="preserve">e</w:t>
+      </w:r>
+      <w:r>
+        <w:t xml:space="preserve"> </w:t>
+      </w:r>
+      <w:r>
+        <w:rPr>
+          <w:rStyle w:val="VerbatimChar"/>
+        </w:rPr>
+        <w:t xml:space="preserve">identificacion</w:t>
+      </w:r>
+      <w:r>
+        <w:t xml:space="preserve">;</w:t>
+      </w:r>
+      <w:r>
+        <w:t xml:space="preserve"> </w:t>
+      </w:r>
+      <w:r>
+        <w:rPr>
+          <w:rStyle w:val="VerbatimChar"/>
+        </w:rPr>
+        <w:t xml:space="preserve">Cliente</w:t>
+      </w:r>
+      <w:r>
+        <w:t xml:space="preserve"> </w:t>
+      </w:r>
+      <w:r>
+        <w:t xml:space="preserve">queda solo con</w:t>
+      </w:r>
+      <w:r>
+        <w:t xml:space="preserve"> </w:t>
+      </w:r>
+      <w:r>
+        <w:rPr>
+          <w:rStyle w:val="VerbatimChar"/>
+        </w:rPr>
+        <w:t xml:space="preserve">direccion</w:t>
+      </w:r>
+      <w:r>
+        <w:t xml:space="preserve"> </w:t>
+      </w:r>
+      <w:r>
+        <w:t xml:space="preserve">y</w:t>
+      </w:r>
+      <w:r>
+        <w:t xml:space="preserve"> </w:t>
+      </w:r>
+      <w:r>
+        <w:rPr>
+          <w:rStyle w:val="VerbatimChar"/>
+        </w:rPr>
+        <w:t xml:space="preserve">activo</w:t>
+      </w:r>
+      <w:r>
+        <w:t xml:space="preserve">.</w:t>
+      </w:r>
+    </w:p>
+    <w:bookmarkEnd w:id="44"/>
+    <w:bookmarkStart w:id="45" w:name="X53a1eacf4306f1baf4d20ed5877265beeafb517"/>
+    <w:p>
+      <w:pPr>
+        <w:pStyle w:val="Heading3"/>
+      </w:pPr>
+      <w:r>
         <w:t xml:space="preserve">Diagrama de clases simplificado v5 · 2026-10-09 · commit</w:t>
       </w:r>
       <w:r>
@@ -2276,7 +2594,7 @@
       <w:pPr>
         <w:numPr>
           <w:ilvl w:val="0"/>
-          <w:numId w:val="1023"/>
+          <w:numId w:val="1026"/>
         </w:numPr>
         <w:pStyle w:val="Compact"/>
       </w:pPr>
@@ -2410,7 +2728,7 @@
       <w:pPr>
         <w:numPr>
           <w:ilvl w:val="0"/>
-          <w:numId w:val="1023"/>
+          <w:numId w:val="1026"/>
         </w:numPr>
         <w:pStyle w:val="Compact"/>
       </w:pPr>
@@ -2446,7 +2764,7 @@
       <w:pPr>
         <w:numPr>
           <w:ilvl w:val="0"/>
-          <w:numId w:val="1023"/>
+          <w:numId w:val="1026"/>
         </w:numPr>
         <w:pStyle w:val="Compact"/>
       </w:pPr>
@@ -2454,8 +2772,8 @@
         <w:t xml:space="preserve">Simbología reordenada: empieza por cómo leer las líneas, con un ejemplo de cada una, y luego los números, las partes de la clase, la visibilidad, las clases especiales y las colecciones. Se quitan los símbolos que este diagrama no usa (subrayado de static, Set y Map).</w:t>
       </w:r>
     </w:p>
-    <w:bookmarkEnd w:id="42"/>
-    <w:bookmarkStart w:id="43" w:name="X8bff2cc937d55517ed7504f8d852e738002eded"/>
+    <w:bookmarkEnd w:id="45"/>
+    <w:bookmarkStart w:id="46" w:name="X8bff2cc937d55517ed7504f8d852e738002eded"/>
     <w:p>
       <w:pPr>
         <w:pStyle w:val="Heading3"/>
@@ -2477,7 +2795,7 @@
       <w:pPr>
         <w:numPr>
           <w:ilvl w:val="0"/>
-          <w:numId w:val="1024"/>
+          <w:numId w:val="1027"/>
         </w:numPr>
         <w:pStyle w:val="Compact"/>
       </w:pPr>
@@ -2543,7 +2861,7 @@
       <w:pPr>
         <w:numPr>
           <w:ilvl w:val="0"/>
-          <w:numId w:val="1024"/>
+          <w:numId w:val="1027"/>
         </w:numPr>
         <w:pStyle w:val="Compact"/>
       </w:pPr>
@@ -2615,8 +2933,8 @@
         <w:t xml:space="preserve">.</w:t>
       </w:r>
     </w:p>
-    <w:bookmarkEnd w:id="43"/>
-    <w:bookmarkStart w:id="44" w:name="X391512b3d0076f68eba38bfbe03fbe6da9ec0d0"/>
+    <w:bookmarkEnd w:id="46"/>
+    <w:bookmarkStart w:id="47" w:name="X391512b3d0076f68eba38bfbe03fbe6da9ec0d0"/>
     <w:p>
       <w:pPr>
         <w:pStyle w:val="Heading3"/>
@@ -2638,7 +2956,7 @@
       <w:pPr>
         <w:numPr>
           <w:ilvl w:val="0"/>
-          <w:numId w:val="1025"/>
+          <w:numId w:val="1028"/>
         </w:numPr>
         <w:pStyle w:val="Compact"/>
       </w:pPr>
@@ -2650,7 +2968,7 @@
       <w:pPr>
         <w:numPr>
           <w:ilvl w:val="0"/>
-          <w:numId w:val="1025"/>
+          <w:numId w:val="1028"/>
         </w:numPr>
         <w:pStyle w:val="Compact"/>
       </w:pPr>
@@ -2670,8 +2988,8 @@
         <w:t xml:space="preserve">, para que las clases sean más angostas.</w:t>
       </w:r>
     </w:p>
-    <w:bookmarkEnd w:id="44"/>
-    <w:bookmarkStart w:id="45" w:name="Xc4a290eef64159bbb850880299580525a5d9206"/>
+    <w:bookmarkEnd w:id="47"/>
+    <w:bookmarkStart w:id="48" w:name="Xc4a290eef64159bbb850880299580525a5d9206"/>
     <w:p>
       <w:pPr>
         <w:pStyle w:val="Heading3"/>
@@ -2693,7 +3011,7 @@
       <w:pPr>
         <w:numPr>
           <w:ilvl w:val="0"/>
-          <w:numId w:val="1026"/>
+          <w:numId w:val="1029"/>
         </w:numPr>
         <w:pStyle w:val="Compact"/>
       </w:pPr>
@@ -2730,8 +3048,8 @@
         <w:t xml:space="preserve">) con un ejemplo, y cada tipo de flecha (herencia, implementación, composición, agregación y asociación).</w:t>
       </w:r>
     </w:p>
-    <w:bookmarkEnd w:id="45"/>
-    <w:bookmarkStart w:id="46" w:name="X861f067dae0e8a264748fdbddc6a638f1e0d1d0"/>
+    <w:bookmarkEnd w:id="48"/>
+    <w:bookmarkStart w:id="49" w:name="X861f067dae0e8a264748fdbddc6a638f1e0d1d0"/>
     <w:p>
       <w:pPr>
         <w:pStyle w:val="Heading3"/>
@@ -2753,7 +3071,7 @@
       <w:pPr>
         <w:numPr>
           <w:ilvl w:val="0"/>
-          <w:numId w:val="1027"/>
+          <w:numId w:val="1030"/>
         </w:numPr>
         <w:pStyle w:val="Compact"/>
       </w:pPr>
@@ -2765,7 +3083,7 @@
       <w:pPr>
         <w:numPr>
           <w:ilvl w:val="0"/>
-          <w:numId w:val="1027"/>
+          <w:numId w:val="1030"/>
         </w:numPr>
         <w:pStyle w:val="Compact"/>
       </w:pPr>
@@ -2807,96 +3125,6 @@
           <w:rStyle w:val="VerbatimChar"/>
         </w:rPr>
         <w:t xml:space="preserve">docs/diagramas/00_clases_simplificado.mmd</w:t>
-      </w:r>
-      <w:r>
-        <w:t xml:space="preserve">.</w:t>
-      </w:r>
-    </w:p>
-    <w:bookmarkEnd w:id="46"/>
-    <w:bookmarkEnd w:id="47"/>
-    <w:bookmarkStart w:id="50" w:name="historias-de-usuario-word-aparte"/>
-    <w:p>
-      <w:pPr>
-        <w:pStyle w:val="Heading2"/>
-      </w:pPr>
-      <w:r>
-        <w:t xml:space="preserve">Historias de usuario (Word aparte)</w:t>
-      </w:r>
-    </w:p>
-    <w:bookmarkStart w:id="48" w:name="X1e92d85a3d5cdcebeb4530033ff4bc73fae25a4"/>
-    <w:p>
-      <w:pPr>
-        <w:pStyle w:val="Heading3"/>
-      </w:pPr>
-      <w:r>
-        <w:t xml:space="preserve">Historias de usuario v2 · 2026-10-08 · commit</w:t>
-      </w:r>
-      <w:r>
-        <w:t xml:space="preserve"> </w:t>
-      </w:r>
-      <w:r>
-        <w:rPr>
-          <w:rStyle w:val="VerbatimChar"/>
-        </w:rPr>
-        <w:t xml:space="preserve">bce4e1c</w:t>
-      </w:r>
-    </w:p>
-    <w:p>
-      <w:pPr>
-        <w:numPr>
-          <w:ilvl w:val="0"/>
-          <w:numId w:val="1028"/>
-        </w:numPr>
-        <w:pStyle w:val="Compact"/>
-      </w:pPr>
-      <w:r>
-        <w:t xml:space="preserve">Mismas 12 historias con los 40 escenarios consolidados del documento v13 (máximo 4 por historia).</w:t>
-      </w:r>
-    </w:p>
-    <w:bookmarkEnd w:id="48"/>
-    <w:bookmarkStart w:id="49" w:name="Xe7240de9be5baf05b0d81e6c0c0e2d6d32324b3"/>
-    <w:p>
-      <w:pPr>
-        <w:pStyle w:val="Heading3"/>
-      </w:pPr>
-      <w:r>
-        <w:t xml:space="preserve">Historias de usuario v1 · 2026-10-08 · commit</w:t>
-      </w:r>
-      <w:r>
-        <w:t xml:space="preserve"> </w:t>
-      </w:r>
-      <w:r>
-        <w:rPr>
-          <w:rStyle w:val="VerbatimChar"/>
-        </w:rPr>
-        <w:t xml:space="preserve">9fae723</w:t>
-      </w:r>
-    </w:p>
-    <w:p>
-      <w:pPr>
-        <w:numPr>
-          <w:ilvl w:val="0"/>
-          <w:numId w:val="1029"/>
-        </w:numPr>
-        <w:pStyle w:val="Compact"/>
-      </w:pPr>
-      <w:r>
-        <w:rPr>
-          <w:rStyle w:val="VerbatimChar"/>
-        </w:rPr>
-        <w:t xml:space="preserve">Avance1_Historias_de_Usuario_v1.docx</w:t>
-      </w:r>
-      <w:r>
-        <w:t xml:space="preserve">: solo la tabla de las 12 historias del documento v12 con sus 65 escenarios, en página horizontal con márgenes de 2,54 cm y Times New Roman, para copiarla a otro documento. Se genera con</w:t>
-      </w:r>
-      <w:r>
-        <w:t xml:space="preserve"> </w:t>
-      </w:r>
-      <w:r>
-        <w:rPr>
-          <w:rStyle w:val="VerbatimChar"/>
-        </w:rPr>
-        <w:t xml:space="preserve">docs/construir_historias.py</w:t>
       </w:r>
       <w:r>
         <w:t xml:space="preserve">.</w:t>
@@ -2904,21 +3132,308 @@
     </w:p>
     <w:bookmarkEnd w:id="49"/>
     <w:bookmarkEnd w:id="50"/>
-    <w:bookmarkStart w:id="55" w:name="código"/>
+    <w:bookmarkStart w:id="54" w:name="historias-de-usuario-word-aparte"/>
     <w:p>
       <w:pPr>
         <w:pStyle w:val="Heading2"/>
       </w:pPr>
       <w:r>
+        <w:t xml:space="preserve">Historias de usuario (Word aparte)</w:t>
+      </w:r>
+    </w:p>
+    <w:bookmarkStart w:id="51" w:name="X35f5ca1d827af95638defd72b73af3f7b96eb14"/>
+    <w:p>
+      <w:pPr>
+        <w:pStyle w:val="Heading3"/>
+      </w:pPr>
+      <w:r>
+        <w:t xml:space="preserve">Historias de usuario v3 · 2026-10-09 · commit</w:t>
+      </w:r>
+      <w:r>
+        <w:t xml:space="preserve"> </w:t>
+      </w:r>
+      <w:r>
+        <w:rPr>
+          <w:rStyle w:val="VerbatimChar"/>
+        </w:rPr>
+        <w:t xml:space="preserve">f16f28f</w:t>
+      </w:r>
+    </w:p>
+    <w:p>
+      <w:pPr>
+        <w:numPr>
+          <w:ilvl w:val="0"/>
+          <w:numId w:val="1031"/>
+        </w:numPr>
+        <w:pStyle w:val="Compact"/>
+      </w:pPr>
+      <w:r>
+        <w:t xml:space="preserve">HU 2: al crear un usuario se pide el tipo y número de cédula, y se rechaza una cédula que ya tenga otro usuario.</w:t>
+      </w:r>
+    </w:p>
+    <w:bookmarkEnd w:id="51"/>
+    <w:bookmarkStart w:id="52" w:name="X1e92d85a3d5cdcebeb4530033ff4bc73fae25a4"/>
+    <w:p>
+      <w:pPr>
+        <w:pStyle w:val="Heading3"/>
+      </w:pPr>
+      <w:r>
+        <w:t xml:space="preserve">Historias de usuario v2 · 2026-10-08 · commit</w:t>
+      </w:r>
+      <w:r>
+        <w:t xml:space="preserve"> </w:t>
+      </w:r>
+      <w:r>
+        <w:rPr>
+          <w:rStyle w:val="VerbatimChar"/>
+        </w:rPr>
+        <w:t xml:space="preserve">bce4e1c</w:t>
+      </w:r>
+    </w:p>
+    <w:p>
+      <w:pPr>
+        <w:numPr>
+          <w:ilvl w:val="0"/>
+          <w:numId w:val="1032"/>
+        </w:numPr>
+        <w:pStyle w:val="Compact"/>
+      </w:pPr>
+      <w:r>
+        <w:t xml:space="preserve">Mismas 12 historias con los 40 escenarios consolidados del documento v13 (máximo 4 por historia).</w:t>
+      </w:r>
+    </w:p>
+    <w:bookmarkEnd w:id="52"/>
+    <w:bookmarkStart w:id="53" w:name="Xe7240de9be5baf05b0d81e6c0c0e2d6d32324b3"/>
+    <w:p>
+      <w:pPr>
+        <w:pStyle w:val="Heading3"/>
+      </w:pPr>
+      <w:r>
+        <w:t xml:space="preserve">Historias de usuario v1 · 2026-10-08 · commit</w:t>
+      </w:r>
+      <w:r>
+        <w:t xml:space="preserve"> </w:t>
+      </w:r>
+      <w:r>
+        <w:rPr>
+          <w:rStyle w:val="VerbatimChar"/>
+        </w:rPr>
+        <w:t xml:space="preserve">9fae723</w:t>
+      </w:r>
+    </w:p>
+    <w:p>
+      <w:pPr>
+        <w:numPr>
+          <w:ilvl w:val="0"/>
+          <w:numId w:val="1033"/>
+        </w:numPr>
+        <w:pStyle w:val="Compact"/>
+      </w:pPr>
+      <w:r>
+        <w:rPr>
+          <w:rStyle w:val="VerbatimChar"/>
+        </w:rPr>
+        <w:t xml:space="preserve">Avance1_Historias_de_Usuario_v1.docx</w:t>
+      </w:r>
+      <w:r>
+        <w:t xml:space="preserve">: solo la tabla de las 12 historias del documento v12 con sus 65 escenarios, en página horizontal con márgenes de 2,54 cm y Times New Roman, para copiarla a otro documento. Se genera con</w:t>
+      </w:r>
+      <w:r>
+        <w:t xml:space="preserve"> </w:t>
+      </w:r>
+      <w:r>
+        <w:rPr>
+          <w:rStyle w:val="VerbatimChar"/>
+        </w:rPr>
+        <w:t xml:space="preserve">docs/construir_historias.py</w:t>
+      </w:r>
+      <w:r>
+        <w:t xml:space="preserve">.</w:t>
+      </w:r>
+    </w:p>
+    <w:bookmarkEnd w:id="53"/>
+    <w:bookmarkEnd w:id="54"/>
+    <w:bookmarkStart w:id="60" w:name="código"/>
+    <w:p>
+      <w:pPr>
+        <w:pStyle w:val="Heading2"/>
+      </w:pPr>
+      <w:r>
         <w:t xml:space="preserve">Código</w:t>
       </w:r>
     </w:p>
-    <w:bookmarkStart w:id="51" w:name="código-v4-2026-10-08-commit-34bfcec"/>
+    <w:bookmarkStart w:id="55" w:name="código-v5-2026-10-09-commit-f16f28f"/>
     <w:p>
       <w:pPr>
         <w:pStyle w:val="Heading3"/>
       </w:pPr>
       <w:r>
+        <w:t xml:space="preserve">Código v5 · 2026-10-09 · commit</w:t>
+      </w:r>
+      <w:r>
+        <w:t xml:space="preserve"> </w:t>
+      </w:r>
+      <w:r>
+        <w:rPr>
+          <w:rStyle w:val="VerbatimChar"/>
+        </w:rPr>
+        <w:t xml:space="preserve">f16f28f</w:t>
+      </w:r>
+    </w:p>
+    <w:p>
+      <w:pPr>
+        <w:numPr>
+          <w:ilvl w:val="0"/>
+          <w:numId w:val="1034"/>
+        </w:numPr>
+        <w:pStyle w:val="Compact"/>
+      </w:pPr>
+      <w:r>
+        <w:rPr>
+          <w:rStyle w:val="VerbatimChar"/>
+        </w:rPr>
+        <w:t xml:space="preserve">Persona</w:t>
+      </w:r>
+      <w:r>
+        <w:t xml:space="preserve"> </w:t>
+      </w:r>
+      <w:r>
+        <w:t xml:space="preserve">tiene</w:t>
+      </w:r>
+      <w:r>
+        <w:t xml:space="preserve"> </w:t>
+      </w:r>
+      <w:r>
+        <w:rPr>
+          <w:rStyle w:val="VerbatimChar"/>
+        </w:rPr>
+        <w:t xml:space="preserve">tipoIdentificacion</w:t>
+      </w:r>
+      <w:r>
+        <w:t xml:space="preserve"> </w:t>
+      </w:r>
+      <w:r>
+        <w:t xml:space="preserve">e</w:t>
+      </w:r>
+      <w:r>
+        <w:t xml:space="preserve"> </w:t>
+      </w:r>
+      <w:r>
+        <w:rPr>
+          <w:rStyle w:val="VerbatimChar"/>
+        </w:rPr>
+        <w:t xml:space="preserve">identificacion</w:t>
+      </w:r>
+      <w:r>
+        <w:t xml:space="preserve"> </w:t>
+      </w:r>
+      <w:r>
+        <w:t xml:space="preserve">(con sus get y set);</w:t>
+      </w:r>
+      <w:r>
+        <w:t xml:space="preserve"> </w:t>
+      </w:r>
+      <w:r>
+        <w:rPr>
+          <w:rStyle w:val="VerbatimChar"/>
+        </w:rPr>
+        <w:t xml:space="preserve">Cliente</w:t>
+      </w:r>
+      <w:r>
+        <w:t xml:space="preserve"> </w:t>
+      </w:r>
+      <w:r>
+        <w:t xml:space="preserve">los pasa a</w:t>
+      </w:r>
+      <w:r>
+        <w:t xml:space="preserve"> </w:t>
+      </w:r>
+      <w:r>
+        <w:rPr>
+          <w:rStyle w:val="VerbatimChar"/>
+        </w:rPr>
+        <w:t xml:space="preserve">super(...)</w:t>
+      </w:r>
+      <w:r>
+        <w:t xml:space="preserve"> </w:t>
+      </w:r>
+      <w:r>
+        <w:t xml:space="preserve">y</w:t>
+      </w:r>
+      <w:r>
+        <w:t xml:space="preserve"> </w:t>
+      </w:r>
+      <w:r>
+        <w:rPr>
+          <w:rStyle w:val="VerbatimChar"/>
+        </w:rPr>
+        <w:t xml:space="preserve">Usuario</w:t>
+      </w:r>
+      <w:r>
+        <w:t xml:space="preserve"> </w:t>
+      </w:r>
+      <w:r>
+        <w:t xml:space="preserve">los recibe en su constructor.</w:t>
+      </w:r>
+    </w:p>
+    <w:p>
+      <w:pPr>
+        <w:numPr>
+          <w:ilvl w:val="0"/>
+          <w:numId w:val="1034"/>
+        </w:numPr>
+        <w:pStyle w:val="Compact"/>
+      </w:pPr>
+      <w:r>
+        <w:rPr>
+          <w:rStyle w:val="VerbatimChar"/>
+        </w:rPr>
+        <w:t xml:space="preserve">RegistroUsuarios.agregarUsuario</w:t>
+      </w:r>
+      <w:r>
+        <w:t xml:space="preserve"> </w:t>
+      </w:r>
+      <w:r>
+        <w:t xml:space="preserve">rechaza una identificación repetida, igual que</w:t>
+      </w:r>
+      <w:r>
+        <w:t xml:space="preserve"> </w:t>
+      </w:r>
+      <w:r>
+        <w:rPr>
+          <w:rStyle w:val="VerbatimChar"/>
+        </w:rPr>
+        <w:t xml:space="preserve">RegistroClientes</w:t>
+      </w:r>
+      <w:r>
+        <w:t xml:space="preserve">.</w:t>
+      </w:r>
+    </w:p>
+    <w:p>
+      <w:pPr>
+        <w:numPr>
+          <w:ilvl w:val="0"/>
+          <w:numId w:val="1034"/>
+        </w:numPr>
+        <w:pStyle w:val="Compact"/>
+      </w:pPr>
+      <w:r>
+        <w:rPr>
+          <w:rStyle w:val="VerbatimChar"/>
+        </w:rPr>
+        <w:t xml:space="preserve">Fidecompro-codigo_v5.zip</w:t>
+      </w:r>
+      <w:r>
+        <w:t xml:space="preserve">.</w:t>
+      </w:r>
+    </w:p>
+    <w:bookmarkEnd w:id="55"/>
+    <w:bookmarkStart w:id="56" w:name="código-v4-2026-10-08-commit-34bfcec"/>
+    <w:p>
+      <w:pPr>
+        <w:pStyle w:val="Heading3"/>
+      </w:pPr>
+      <w:r>
         <w:t xml:space="preserve">Código v4 · 2026-10-08 · commit</w:t>
       </w:r>
       <w:r>
@@ -2935,7 +3450,7 @@
       <w:pPr>
         <w:numPr>
           <w:ilvl w:val="0"/>
-          <w:numId w:val="1030"/>
+          <w:numId w:val="1035"/>
         </w:numPr>
         <w:pStyle w:val="Compact"/>
       </w:pPr>
@@ -2958,8 +3473,8 @@
         <w:t xml:space="preserve">a la nueva numeración de historias (documento v12).</w:t>
       </w:r>
     </w:p>
-    <w:bookmarkEnd w:id="51"/>
-    <w:bookmarkStart w:id="52" w:name="código-v3-2026-10-08-commit-626c373"/>
+    <w:bookmarkEnd w:id="56"/>
+    <w:bookmarkStart w:id="57" w:name="código-v3-2026-10-08-commit-626c373"/>
     <w:p>
       <w:pPr>
         <w:pStyle w:val="Heading3"/>
@@ -2981,7 +3496,7 @@
       <w:pPr>
         <w:numPr>
           <w:ilvl w:val="0"/>
-          <w:numId w:val="1031"/>
+          <w:numId w:val="1036"/>
         </w:numPr>
         <w:pStyle w:val="Compact"/>
       </w:pPr>
@@ -3062,7 +3577,7 @@
       <w:pPr>
         <w:numPr>
           <w:ilvl w:val="0"/>
-          <w:numId w:val="1031"/>
+          <w:numId w:val="1036"/>
         </w:numPr>
         <w:pStyle w:val="Compact"/>
       </w:pPr>
@@ -3107,7 +3622,7 @@
       <w:pPr>
         <w:numPr>
           <w:ilvl w:val="0"/>
-          <w:numId w:val="1031"/>
+          <w:numId w:val="1036"/>
         </w:numPr>
         <w:pStyle w:val="Compact"/>
       </w:pPr>
@@ -3160,8 +3675,8 @@
         <w:t xml:space="preserve">da la primera y la última factura.</w:t>
       </w:r>
     </w:p>
-    <w:bookmarkEnd w:id="52"/>
-    <w:bookmarkStart w:id="53" w:name="código-v2-2026-10-08-commit-99f55d4"/>
+    <w:bookmarkEnd w:id="57"/>
+    <w:bookmarkStart w:id="58" w:name="código-v2-2026-10-08-commit-99f55d4"/>
     <w:p>
       <w:pPr>
         <w:pStyle w:val="Heading3"/>
@@ -3183,7 +3698,7 @@
       <w:pPr>
         <w:numPr>
           <w:ilvl w:val="0"/>
-          <w:numId w:val="1032"/>
+          <w:numId w:val="1037"/>
         </w:numPr>
         <w:pStyle w:val="Compact"/>
       </w:pPr>
@@ -3261,7 +3776,7 @@
       <w:pPr>
         <w:numPr>
           <w:ilvl w:val="0"/>
-          <w:numId w:val="1032"/>
+          <w:numId w:val="1037"/>
         </w:numPr>
         <w:pStyle w:val="Compact"/>
       </w:pPr>
@@ -3284,8 +3799,8 @@
         <w:t xml:space="preserve">muestra la regla: un cliente con facturas se desactiva y uno sin facturas se elimina.</w:t>
       </w:r>
     </w:p>
-    <w:bookmarkEnd w:id="53"/>
-    <w:bookmarkStart w:id="54" w:name="código-v1-2026-10-08-commit-442187a"/>
+    <w:bookmarkEnd w:id="58"/>
+    <w:bookmarkStart w:id="59" w:name="código-v1-2026-10-08-commit-442187a"/>
     <w:p>
       <w:pPr>
         <w:pStyle w:val="Heading3"/>
@@ -3307,7 +3822,7 @@
       <w:pPr>
         <w:numPr>
           <w:ilvl w:val="0"/>
-          <w:numId w:val="1033"/>
+          <w:numId w:val="1038"/>
         </w:numPr>
         <w:pStyle w:val="Compact"/>
       </w:pPr>
@@ -3334,7 +3849,7 @@
       <w:pPr>
         <w:numPr>
           <w:ilvl w:val="0"/>
-          <w:numId w:val="1033"/>
+          <w:numId w:val="1038"/>
         </w:numPr>
         <w:pStyle w:val="Compact"/>
       </w:pPr>
@@ -3355,7 +3870,7 @@
       <w:pPr>
         <w:numPr>
           <w:ilvl w:val="0"/>
-          <w:numId w:val="1033"/>
+          <w:numId w:val="1038"/>
         </w:numPr>
         <w:pStyle w:val="Compact"/>
       </w:pPr>
@@ -3363,9 +3878,9 @@
         <w:t xml:space="preserve">Código de referencia para entender el diseño; no es un entregable.</w:t>
       </w:r>
     </w:p>
-    <w:bookmarkEnd w:id="54"/>
-    <w:bookmarkEnd w:id="55"/>
-    <w:bookmarkEnd w:id="56"/>
+    <w:bookmarkEnd w:id="59"/>
+    <w:bookmarkEnd w:id="60"/>
+    <w:bookmarkEnd w:id="61"/>
     <w:sectPr>
       <w:pgSz w:w="12240" w:h="15840"/>
       <w:pgMar w:left="1134" w:right="1134"/>
@@ -3651,6 +4166,21 @@
     <w:abstractNumId w:val="991"/>
   </w:num>
   <w:num w:numId="1033">
+    <w:abstractNumId w:val="991"/>
+  </w:num>
+  <w:num w:numId="1034">
+    <w:abstractNumId w:val="991"/>
+  </w:num>
+  <w:num w:numId="1035">
+    <w:abstractNumId w:val="991"/>
+  </w:num>
+  <w:num w:numId="1036">
+    <w:abstractNumId w:val="991"/>
+  </w:num>
+  <w:num w:numId="1037">
+    <w:abstractNumId w:val="991"/>
+  </w:num>
+  <w:num w:numId="1038">
     <w:abstractNumId w:val="991"/>
   </w:num>
 </w:numbering>

</xml_diff>

<commit_message>
CHANGELOG: código v6 (sistema completo) y capturas v1
Co-Authored-By: Claude Opus 5.5 (1M context) <noreply@anthropic.com>
Claude-Session: https://claude.ai/code/session_013ySw2yJZ9aPzWT1E5vL7gF
</commit_message>
<xml_diff>
--- a/docs/Historial_de_versiones.docx
+++ b/docs/Historial_de_versiones.docx
@@ -2,7 +2,7 @@
 <file path=word/document.xml><?xml version="1.0" encoding="utf-8"?>
 <w:document xmlns:w="http://schemas.openxmlformats.org/wordprocessingml/2006/main" xmlns:m="http://schemas.openxmlformats.org/officeDocument/2006/math" xmlns:r="http://schemas.openxmlformats.org/officeDocument/2006/relationships" xmlns:o="urn:schemas-microsoft-com:office:office" xmlns:v="urn:schemas-microsoft-com:vml" xmlns:w10="urn:schemas-microsoft-com:office:word" xmlns:a="http://schemas.openxmlformats.org/drawingml/2006/main" xmlns:pic="http://schemas.openxmlformats.org/drawingml/2006/picture" xmlns:wp="http://schemas.openxmlformats.org/drawingml/2006/wordprocessingDrawing">
   <w:body>
-    <w:bookmarkStart w:id="61" w:name="historial-de-versiones"/>
+    <w:bookmarkStart w:id="62" w:name="historial-de-versiones"/>
     <w:p>
       <w:pPr>
         <w:pStyle w:val="Heading1"/>
@@ -3253,7 +3253,7 @@
     </w:p>
     <w:bookmarkEnd w:id="53"/>
     <w:bookmarkEnd w:id="54"/>
-    <w:bookmarkStart w:id="60" w:name="código"/>
+    <w:bookmarkStart w:id="61" w:name="código"/>
     <w:p>
       <w:pPr>
         <w:pStyle w:val="Heading2"/>
@@ -3262,12 +3262,461 @@
         <w:t xml:space="preserve">Código</w:t>
       </w:r>
     </w:p>
-    <w:bookmarkStart w:id="55" w:name="código-v5-2026-10-09-commit-f16f28f"/>
+    <w:bookmarkStart w:id="55" w:name="código-v6-2026-10-10-commit-1b5331f"/>
     <w:p>
       <w:pPr>
         <w:pStyle w:val="Heading3"/>
       </w:pPr>
       <w:r>
+        <w:t xml:space="preserve">Código v6 · 2026-10-10 · commit</w:t>
+      </w:r>
+      <w:r>
+        <w:t xml:space="preserve"> </w:t>
+      </w:r>
+      <w:r>
+        <w:rPr>
+          <w:rStyle w:val="VerbatimChar"/>
+        </w:rPr>
+        <w:t xml:space="preserve">1b5331f</w:t>
+      </w:r>
+    </w:p>
+    <w:p>
+      <w:pPr>
+        <w:numPr>
+          <w:ilvl w:val="0"/>
+          <w:numId w:val="1034"/>
+        </w:numPr>
+        <w:pStyle w:val="Compact"/>
+      </w:pPr>
+      <w:r>
+        <w:rPr>
+          <w:bCs/>
+          <w:b/>
+        </w:rPr>
+        <w:t xml:space="preserve">Sistema completo</w:t>
+      </w:r>
+      <w:r>
+        <w:t xml:space="preserve">, como el que pide el profesor para el proyecto final: servidor con</w:t>
+      </w:r>
+      <w:r>
+        <w:t xml:space="preserve"> </w:t>
+      </w:r>
+      <w:r>
+        <w:rPr>
+          <w:rStyle w:val="VerbatimChar"/>
+        </w:rPr>
+        <w:t xml:space="preserve">ServerSocket</w:t>
+      </w:r>
+      <w:r>
+        <w:t xml:space="preserve"> </w:t>
+      </w:r>
+      <w:r>
+        <w:t xml:space="preserve">y pool de 10 hilos (</w:t>
+      </w:r>
+      <w:r>
+        <w:rPr>
+          <w:rStyle w:val="VerbatimChar"/>
+        </w:rPr>
+        <w:t xml:space="preserve">ManejadorCliente</w:t>
+      </w:r>
+      <w:r>
+        <w:t xml:space="preserve"> </w:t>
+      </w:r>
+      <w:r>
+        <w:t xml:space="preserve">por caja), ventanas JFrame cliente para las 12 historias de usuario y base de datos Apache Derby (MySQL opcional desde la ventana del servidor).</w:t>
+      </w:r>
+    </w:p>
+    <w:p>
+      <w:pPr>
+        <w:numPr>
+          <w:ilvl w:val="0"/>
+          <w:numId w:val="1034"/>
+        </w:numPr>
+        <w:pStyle w:val="Compact"/>
+      </w:pPr>
+      <w:r>
+        <w:t xml:space="preserve">Paquetes nuevos:</w:t>
+      </w:r>
+      <w:r>
+        <w:t xml:space="preserve"> </w:t>
+      </w:r>
+      <w:r>
+        <w:rPr>
+          <w:rStyle w:val="VerbatimChar"/>
+        </w:rPr>
+        <w:t xml:space="preserve">red</w:t>
+      </w:r>
+      <w:r>
+        <w:t xml:space="preserve"> </w:t>
+      </w:r>
+      <w:r>
+        <w:t xml:space="preserve">(</w:t>
+      </w:r>
+      <w:r>
+        <w:rPr>
+          <w:rStyle w:val="VerbatimChar"/>
+        </w:rPr>
+        <w:t xml:space="preserve">Solicitud</w:t>
+      </w:r>
+      <w:r>
+        <w:t xml:space="preserve">,</w:t>
+      </w:r>
+      <w:r>
+        <w:t xml:space="preserve"> </w:t>
+      </w:r>
+      <w:r>
+        <w:rPr>
+          <w:rStyle w:val="VerbatimChar"/>
+        </w:rPr>
+        <w:t xml:space="preserve">Respuesta</w:t>
+      </w:r>
+      <w:r>
+        <w:t xml:space="preserve">,</w:t>
+      </w:r>
+      <w:r>
+        <w:t xml:space="preserve"> </w:t>
+      </w:r>
+      <w:r>
+        <w:rPr>
+          <w:rStyle w:val="VerbatimChar"/>
+        </w:rPr>
+        <w:t xml:space="preserve">TipoOperacion</w:t>
+      </w:r>
+      <w:r>
+        <w:t xml:space="preserve">),</w:t>
+      </w:r>
+      <w:r>
+        <w:t xml:space="preserve"> </w:t>
+      </w:r>
+      <w:r>
+        <w:rPr>
+          <w:rStyle w:val="VerbatimChar"/>
+        </w:rPr>
+        <w:t xml:space="preserve">servidor</w:t>
+      </w:r>
+      <w:r>
+        <w:t xml:space="preserve"> </w:t>
+      </w:r>
+      <w:r>
+        <w:t xml:space="preserve">(servidor, servicios y</w:t>
+      </w:r>
+      <w:r>
+        <w:t xml:space="preserve"> </w:t>
+      </w:r>
+      <w:r>
+        <w:rPr>
+          <w:rStyle w:val="VerbatimChar"/>
+        </w:rPr>
+        <w:t xml:space="preserve">VentanaServidor</w:t>
+      </w:r>
+      <w:r>
+        <w:t xml:space="preserve"> </w:t>
+      </w:r>
+      <w:r>
+        <w:t xml:space="preserve">con clientes conectados, bitácora y pestaña Base de datos),</w:t>
+      </w:r>
+      <w:r>
+        <w:t xml:space="preserve"> </w:t>
+      </w:r>
+      <w:r>
+        <w:rPr>
+          <w:rStyle w:val="VerbatimChar"/>
+        </w:rPr>
+        <w:t xml:space="preserve">datos</w:t>
+      </w:r>
+      <w:r>
+        <w:t xml:space="preserve"> </w:t>
+      </w:r>
+      <w:r>
+        <w:t xml:space="preserve">(</w:t>
+      </w:r>
+      <w:r>
+        <w:rPr>
+          <w:rStyle w:val="VerbatimChar"/>
+        </w:rPr>
+        <w:t xml:space="preserve">ConexionBD</w:t>
+      </w:r>
+      <w:r>
+        <w:t xml:space="preserve"> </w:t>
+      </w:r>
+      <w:r>
+        <w:t xml:space="preserve">Singleton, DAO y creación de tablas con datos de ejemplo),</w:t>
+      </w:r>
+      <w:r>
+        <w:t xml:space="preserve"> </w:t>
+      </w:r>
+      <w:r>
+        <w:rPr>
+          <w:rStyle w:val="VerbatimChar"/>
+        </w:rPr>
+        <w:t xml:space="preserve">cliente</w:t>
+      </w:r>
+      <w:r>
+        <w:t xml:space="preserve"> </w:t>
+      </w:r>
+      <w:r>
+        <w:t xml:space="preserve">(login, menú, clientes, productos/categorías/bajo el mínimo, ajuste de stock, nueva factura, vista previa, historial con anulación y usuarios) y</w:t>
+      </w:r>
+      <w:r>
+        <w:t xml:space="preserve"> </w:t>
+      </w:r>
+      <w:r>
+        <w:rPr>
+          <w:rStyle w:val="VerbatimChar"/>
+        </w:rPr>
+        <w:t xml:space="preserve">util</w:t>
+      </w:r>
+      <w:r>
+        <w:t xml:space="preserve">.</w:t>
+      </w:r>
+    </w:p>
+    <w:p>
+      <w:pPr>
+        <w:numPr>
+          <w:ilvl w:val="0"/>
+          <w:numId w:val="1034"/>
+        </w:numPr>
+        <w:pStyle w:val="Compact"/>
+      </w:pPr>
+      <w:r>
+        <w:t xml:space="preserve">Facturas, ajustes y anulaciones en bloque</w:t>
+      </w:r>
+      <w:r>
+        <w:t xml:space="preserve"> </w:t>
+      </w:r>
+      <w:r>
+        <w:rPr>
+          <w:rStyle w:val="VerbatimChar"/>
+        </w:rPr>
+        <w:t xml:space="preserve">synchronized</w:t>
+      </w:r>
+      <w:r>
+        <w:t xml:space="preserve"> </w:t>
+      </w:r>
+      <w:r>
+        <w:t xml:space="preserve">con transacción JDBC: probado con dos cajas que piden el último stock a la vez, solo una factura pasa y las existencias nunca quedan negativas (HU 9).</w:t>
+      </w:r>
+    </w:p>
+    <w:p>
+      <w:pPr>
+        <w:numPr>
+          <w:ilvl w:val="0"/>
+          <w:numId w:val="1034"/>
+        </w:numPr>
+        <w:pStyle w:val="Compact"/>
+      </w:pPr>
+      <w:r>
+        <w:t xml:space="preserve">Cambios al modelo: clases</w:t>
+      </w:r>
+      <w:r>
+        <w:t xml:space="preserve"> </w:t>
+      </w:r>
+      <w:r>
+        <w:rPr>
+          <w:rStyle w:val="VerbatimChar"/>
+        </w:rPr>
+        <w:t xml:space="preserve">Serializable</w:t>
+      </w:r>
+      <w:r>
+        <w:t xml:space="preserve"> </w:t>
+      </w:r>
+      <w:r>
+        <w:t xml:space="preserve">para viajar por el socket,</w:t>
+      </w:r>
+      <w:r>
+        <w:t xml:space="preserve"> </w:t>
+      </w:r>
+      <w:r>
+        <w:rPr>
+          <w:rStyle w:val="VerbatimChar"/>
+        </w:rPr>
+        <w:t xml:space="preserve">setId</w:t>
+      </w:r>
+      <w:r>
+        <w:t xml:space="preserve"> </w:t>
+      </w:r>
+      <w:r>
+        <w:t xml:space="preserve">para los ids de la base,</w:t>
+      </w:r>
+      <w:r>
+        <w:t xml:space="preserve"> </w:t>
+      </w:r>
+      <w:r>
+        <w:rPr>
+          <w:rStyle w:val="VerbatimChar"/>
+        </w:rPr>
+        <w:t xml:space="preserve">Producto.activo</w:t>
+      </w:r>
+      <w:r>
+        <w:t xml:space="preserve"> </w:t>
+      </w:r>
+      <w:r>
+        <w:t xml:space="preserve">y</w:t>
+      </w:r>
+      <w:r>
+        <w:t xml:space="preserve"> </w:t>
+      </w:r>
+      <w:r>
+        <w:rPr>
+          <w:rStyle w:val="VerbatimChar"/>
+        </w:rPr>
+        <w:t xml:space="preserve">obtenerTipo()</w:t>
+      </w:r>
+      <w:r>
+        <w:t xml:space="preserve">,</w:t>
+      </w:r>
+      <w:r>
+        <w:t xml:space="preserve"> </w:t>
+      </w:r>
+      <w:r>
+        <w:rPr>
+          <w:rStyle w:val="VerbatimChar"/>
+        </w:rPr>
+        <w:t xml:space="preserve">DetalleFactura</w:t>
+      </w:r>
+      <w:r>
+        <w:t xml:space="preserve"> </w:t>
+      </w:r>
+      <w:r>
+        <w:t xml:space="preserve">guarda el IVA del momento de la venta, montos con formato de Costa Rica (1 950,00).</w:t>
+      </w:r>
+    </w:p>
+    <w:p>
+      <w:pPr>
+        <w:numPr>
+          <w:ilvl w:val="0"/>
+          <w:numId w:val="1034"/>
+        </w:numPr>
+        <w:pStyle w:val="Compact"/>
+      </w:pPr>
+      <w:r>
+        <w:t xml:space="preserve">El</w:t>
+      </w:r>
+      <w:r>
+        <w:t xml:space="preserve"> </w:t>
+      </w:r>
+      <w:r>
+        <w:rPr>
+          <w:rStyle w:val="VerbatimChar"/>
+        </w:rPr>
+        <w:t xml:space="preserve">main</w:t>
+      </w:r>
+      <w:r>
+        <w:t xml:space="preserve"> </w:t>
+      </w:r>
+      <w:r>
+        <w:t xml:space="preserve">de consola anterior pasa a</w:t>
+      </w:r>
+      <w:r>
+        <w:t xml:space="preserve"> </w:t>
+      </w:r>
+      <w:r>
+        <w:rPr>
+          <w:rStyle w:val="VerbatimChar"/>
+        </w:rPr>
+        <w:t xml:space="preserve">PruebaModeloConsola</w:t>
+      </w:r>
+      <w:r>
+        <w:t xml:space="preserve">;</w:t>
+      </w:r>
+      <w:r>
+        <w:t xml:space="preserve"> </w:t>
+      </w:r>
+      <w:r>
+        <w:rPr>
+          <w:rStyle w:val="VerbatimChar"/>
+        </w:rPr>
+        <w:t xml:space="preserve">Fidecompro</w:t>
+      </w:r>
+      <w:r>
+        <w:t xml:space="preserve"> </w:t>
+      </w:r>
+      <w:r>
+        <w:t xml:space="preserve">ahora abre un lanzador para abrir el servidor y varias cajas desde un solo Run.</w:t>
+      </w:r>
+    </w:p>
+    <w:p>
+      <w:pPr>
+        <w:numPr>
+          <w:ilvl w:val="0"/>
+          <w:numId w:val="1034"/>
+        </w:numPr>
+        <w:pStyle w:val="Compact"/>
+      </w:pPr>
+      <w:r>
+        <w:t xml:space="preserve">Capturas del sistema funcionando en</w:t>
+      </w:r>
+      <w:r>
+        <w:t xml:space="preserve"> </w:t>
+      </w:r>
+      <w:r>
+        <w:rPr>
+          <w:rStyle w:val="VerbatimChar"/>
+        </w:rPr>
+        <w:t xml:space="preserve">docs/capturas_sistema/</w:t>
+      </w:r>
+      <w:r>
+        <w:t xml:space="preserve"> </w:t>
+      </w:r>
+      <w:r>
+        <w:t xml:space="preserve">y en Word:</w:t>
+      </w:r>
+      <w:r>
+        <w:t xml:space="preserve"> </w:t>
+      </w:r>
+      <w:r>
+        <w:rPr>
+          <w:rStyle w:val="VerbatimChar"/>
+        </w:rPr>
+        <w:t xml:space="preserve">Fidecompro_Sistema_Funcionando_v1.docx</w:t>
+      </w:r>
+      <w:r>
+        <w:t xml:space="preserve">.</w:t>
+      </w:r>
+    </w:p>
+    <w:p>
+      <w:pPr>
+        <w:numPr>
+          <w:ilvl w:val="0"/>
+          <w:numId w:val="1034"/>
+        </w:numPr>
+        <w:pStyle w:val="Compact"/>
+      </w:pPr>
+      <w:r>
+        <w:rPr>
+          <w:rStyle w:val="VerbatimChar"/>
+        </w:rPr>
+        <w:t xml:space="preserve">Fidecompro-codigo_v6.zip</w:t>
+      </w:r>
+      <w:r>
+        <w:t xml:space="preserve"> </w:t>
+      </w:r>
+      <w:r>
+        <w:t xml:space="preserve">y</w:t>
+      </w:r>
+      <w:r>
+        <w:t xml:space="preserve"> </w:t>
+      </w:r>
+      <w:r>
+        <w:rPr>
+          <w:rStyle w:val="VerbatimChar"/>
+        </w:rPr>
+        <w:t xml:space="preserve">Fidecompro-6.jar</w:t>
+      </w:r>
+      <w:r>
+        <w:t xml:space="preserve"> </w:t>
+      </w:r>
+      <w:r>
+        <w:t xml:space="preserve">(ejecutable con todo adentro).</w:t>
+      </w:r>
+    </w:p>
+    <w:bookmarkEnd w:id="55"/>
+    <w:bookmarkStart w:id="56" w:name="código-v5-2026-10-09-commit-f16f28f"/>
+    <w:p>
+      <w:pPr>
+        <w:pStyle w:val="Heading3"/>
+      </w:pPr>
+      <w:r>
         <w:t xml:space="preserve">Código v5 · 2026-10-09 · commit</w:t>
       </w:r>
       <w:r>
@@ -3284,7 +3733,7 @@
       <w:pPr>
         <w:numPr>
           <w:ilvl w:val="0"/>
-          <w:numId w:val="1034"/>
+          <w:numId w:val="1035"/>
         </w:numPr>
         <w:pStyle w:val="Compact"/>
       </w:pPr>
@@ -3380,7 +3829,7 @@
       <w:pPr>
         <w:numPr>
           <w:ilvl w:val="0"/>
-          <w:numId w:val="1034"/>
+          <w:numId w:val="1035"/>
         </w:numPr>
         <w:pStyle w:val="Compact"/>
       </w:pPr>
@@ -3413,7 +3862,7 @@
       <w:pPr>
         <w:numPr>
           <w:ilvl w:val="0"/>
-          <w:numId w:val="1034"/>
+          <w:numId w:val="1035"/>
         </w:numPr>
         <w:pStyle w:val="Compact"/>
       </w:pPr>
@@ -3427,8 +3876,8 @@
         <w:t xml:space="preserve">.</w:t>
       </w:r>
     </w:p>
-    <w:bookmarkEnd w:id="55"/>
-    <w:bookmarkStart w:id="56" w:name="código-v4-2026-10-08-commit-34bfcec"/>
+    <w:bookmarkEnd w:id="56"/>
+    <w:bookmarkStart w:id="57" w:name="código-v4-2026-10-08-commit-34bfcec"/>
     <w:p>
       <w:pPr>
         <w:pStyle w:val="Heading3"/>
@@ -3450,7 +3899,7 @@
       <w:pPr>
         <w:numPr>
           <w:ilvl w:val="0"/>
-          <w:numId w:val="1035"/>
+          <w:numId w:val="1036"/>
         </w:numPr>
         <w:pStyle w:val="Compact"/>
       </w:pPr>
@@ -3473,8 +3922,8 @@
         <w:t xml:space="preserve">a la nueva numeración de historias (documento v12).</w:t>
       </w:r>
     </w:p>
-    <w:bookmarkEnd w:id="56"/>
-    <w:bookmarkStart w:id="57" w:name="código-v3-2026-10-08-commit-626c373"/>
+    <w:bookmarkEnd w:id="57"/>
+    <w:bookmarkStart w:id="58" w:name="código-v3-2026-10-08-commit-626c373"/>
     <w:p>
       <w:pPr>
         <w:pStyle w:val="Heading3"/>
@@ -3496,7 +3945,7 @@
       <w:pPr>
         <w:numPr>
           <w:ilvl w:val="0"/>
-          <w:numId w:val="1036"/>
+          <w:numId w:val="1037"/>
         </w:numPr>
         <w:pStyle w:val="Compact"/>
       </w:pPr>
@@ -3577,7 +4026,7 @@
       <w:pPr>
         <w:numPr>
           <w:ilvl w:val="0"/>
-          <w:numId w:val="1036"/>
+          <w:numId w:val="1037"/>
         </w:numPr>
         <w:pStyle w:val="Compact"/>
       </w:pPr>
@@ -3622,7 +4071,7 @@
       <w:pPr>
         <w:numPr>
           <w:ilvl w:val="0"/>
-          <w:numId w:val="1036"/>
+          <w:numId w:val="1037"/>
         </w:numPr>
         <w:pStyle w:val="Compact"/>
       </w:pPr>
@@ -3675,8 +4124,8 @@
         <w:t xml:space="preserve">da la primera y la última factura.</w:t>
       </w:r>
     </w:p>
-    <w:bookmarkEnd w:id="57"/>
-    <w:bookmarkStart w:id="58" w:name="código-v2-2026-10-08-commit-99f55d4"/>
+    <w:bookmarkEnd w:id="58"/>
+    <w:bookmarkStart w:id="59" w:name="código-v2-2026-10-08-commit-99f55d4"/>
     <w:p>
       <w:pPr>
         <w:pStyle w:val="Heading3"/>
@@ -3698,7 +4147,7 @@
       <w:pPr>
         <w:numPr>
           <w:ilvl w:val="0"/>
-          <w:numId w:val="1037"/>
+          <w:numId w:val="1038"/>
         </w:numPr>
         <w:pStyle w:val="Compact"/>
       </w:pPr>
@@ -3776,7 +4225,7 @@
       <w:pPr>
         <w:numPr>
           <w:ilvl w:val="0"/>
-          <w:numId w:val="1037"/>
+          <w:numId w:val="1038"/>
         </w:numPr>
         <w:pStyle w:val="Compact"/>
       </w:pPr>
@@ -3799,8 +4248,8 @@
         <w:t xml:space="preserve">muestra la regla: un cliente con facturas se desactiva y uno sin facturas se elimina.</w:t>
       </w:r>
     </w:p>
-    <w:bookmarkEnd w:id="58"/>
-    <w:bookmarkStart w:id="59" w:name="código-v1-2026-10-08-commit-442187a"/>
+    <w:bookmarkEnd w:id="59"/>
+    <w:bookmarkStart w:id="60" w:name="código-v1-2026-10-08-commit-442187a"/>
     <w:p>
       <w:pPr>
         <w:pStyle w:val="Heading3"/>
@@ -3822,7 +4271,7 @@
       <w:pPr>
         <w:numPr>
           <w:ilvl w:val="0"/>
-          <w:numId w:val="1038"/>
+          <w:numId w:val="1039"/>
         </w:numPr>
         <w:pStyle w:val="Compact"/>
       </w:pPr>
@@ -3849,7 +4298,7 @@
       <w:pPr>
         <w:numPr>
           <w:ilvl w:val="0"/>
-          <w:numId w:val="1038"/>
+          <w:numId w:val="1039"/>
         </w:numPr>
         <w:pStyle w:val="Compact"/>
       </w:pPr>
@@ -3870,7 +4319,7 @@
       <w:pPr>
         <w:numPr>
           <w:ilvl w:val="0"/>
-          <w:numId w:val="1038"/>
+          <w:numId w:val="1039"/>
         </w:numPr>
         <w:pStyle w:val="Compact"/>
       </w:pPr>
@@ -3878,13 +4327,10 @@
         <w:t xml:space="preserve">Código de referencia para entender el diseño; no es un entregable.</w:t>
       </w:r>
     </w:p>
-    <w:bookmarkEnd w:id="59"/>
     <w:bookmarkEnd w:id="60"/>
     <w:bookmarkEnd w:id="61"/>
-    <w:sectPr>
-      <w:pgSz w:w="12240" w:h="15840"/>
-      <w:pgMar w:left="1134" w:right="1134"/>
-    </w:sectPr>
+    <w:bookmarkEnd w:id="62"/>
+    <w:sectPr/>
   </w:body>
 </w:document>
 </file>
@@ -4181,6 +4627,9 @@
     <w:abstractNumId w:val="991"/>
   </w:num>
   <w:num w:numId="1038">
+    <w:abstractNumId w:val="991"/>
+  </w:num>
+  <w:num w:numId="1039">
     <w:abstractNumId w:val="991"/>
   </w:num>
 </w:numbering>

</xml_diff>